<commit_message>
merging folders and such
</commit_message>
<xml_diff>
--- a/Capstone Proposal.docx
+++ b/Capstone Proposal.docx
@@ -4,18 +4,16 @@
   <w:body>
     <w:sdt>
       <w:sdtPr>
+        <w:rPr>
+          <w:rFonts w:ascii="Arial" w:eastAsiaTheme="minorHAnsi" w:hAnsi="Arial"/>
+          <w:lang w:val="en-AU" w:eastAsia="en-US"/>
+        </w:rPr>
         <w:id w:val="-1466038143"/>
         <w:docPartObj>
           <w:docPartGallery w:val="Cover Pages"/>
           <w:docPartUnique/>
         </w:docPartObj>
       </w:sdtPr>
-      <w:sdtEndPr>
-        <w:rPr>
-          <w:rFonts w:ascii="Arial" w:eastAsiaTheme="minorHAnsi" w:hAnsi="Arial"/>
-          <w:lang w:val="en-AU" w:eastAsia="en-US"/>
-        </w:rPr>
-      </w:sdtEndPr>
       <w:sdtContent>
         <w:p>
           <w:pPr>
@@ -3350,7 +3348,7 @@
               </mc:Choice>
               <mc:Fallback>
                 <w:pict>
-                  <v:group w14:anchorId="68B24F1B" id="Group 26" o:spid="_x0000_s1026" style="position:absolute;margin-left:0;margin-top:0;width:168pt;height:718.55pt;z-index:-251657216;mso-height-percent:950;mso-left-percent:40;mso-position-horizontal-relative:page;mso-position-vertical:center;mso-position-vertical-relative:page;mso-height-percent:950;mso-left-percent:40" coordsize="21336,91257" o:gfxdata="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">
+                  <v:group w14:anchorId="4C34F6CE" id="Group 26" o:spid="_x0000_s1026" style="position:absolute;margin-left:0;margin-top:0;width:168pt;height:718.55pt;z-index:-251657216;mso-height-percent:950;mso-left-percent:40;mso-position-horizontal-relative:page;mso-position-vertical:center;mso-position-vertical-relative:page;mso-height-percent:950;mso-left-percent:40" coordsize="21336,91257" o:gfxdata="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">
                     <v:rect id="Rectangle 3" o:spid="_x0000_s1027" style="position:absolute;width:1945;height:91257;visibility:visible;mso-wrap-style:square;v-text-anchor:middle" o:gfxdata="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" fillcolor="#0e2841 [3215]" stroked="f" strokeweight="1.5pt"/>
                     <v:group id="Group 5" o:spid="_x0000_s1028" style="position:absolute;left:762;top:42100;width:20574;height:49103" coordorigin="806,42118" coordsize="13062,31210" o:gfxdata="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">
                       <v:group id="Group 6" o:spid="_x0000_s1029" style="position:absolute;left:1410;top:42118;width:10478;height:31210" coordorigin="1410,42118" coordsize="10477,31210" o:gfxdata="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">
@@ -3858,7 +3856,7 @@
                                     <wp:inline distT="0" distB="0" distL="0" distR="0" wp14:anchorId="082B65A4" wp14:editId="256F4C92">
                                       <wp:extent cx="3810000" cy="1409700"/>
                                       <wp:effectExtent l="0" t="0" r="0" b="0"/>
-                                      <wp:docPr id="638330847" name="Picture 1"/>
+                                      <wp:docPr id="2025960691" name="Picture 1"/>
                                       <wp:cNvGraphicFramePr>
                                         <a:graphicFrameLocks xmlns:a="http://schemas.openxmlformats.org/drawingml/2006/main" noChangeAspect="1"/>
                                       </wp:cNvGraphicFramePr>
@@ -4088,7 +4086,7 @@
                               <wp:inline distT="0" distB="0" distL="0" distR="0" wp14:anchorId="082B65A4" wp14:editId="256F4C92">
                                 <wp:extent cx="3810000" cy="1409700"/>
                                 <wp:effectExtent l="0" t="0" r="0" b="0"/>
-                                <wp:docPr id="638330847" name="Picture 1"/>
+                                <wp:docPr id="2025960691" name="Picture 1"/>
                                 <wp:cNvGraphicFramePr>
                                   <a:graphicFrameLocks xmlns:a="http://schemas.openxmlformats.org/drawingml/2006/main" noChangeAspect="1"/>
                                 </wp:cNvGraphicFramePr>
@@ -4200,7 +4198,11 @@
     <w:sdt>
       <w:sdtPr>
         <w:rPr>
-          <w:lang w:val="en-GB"/>
+          <w:rFonts w:ascii="Arial" w:eastAsiaTheme="minorHAnsi" w:hAnsi="Arial" w:cstheme="minorBidi"/>
+          <w:color w:val="auto"/>
+          <w:sz w:val="22"/>
+          <w:szCs w:val="22"/>
+          <w:lang w:val="en-GB" w:eastAsia="en-US"/>
         </w:rPr>
         <w:id w:val="679470824"/>
         <w:docPartObj>
@@ -4210,13 +4212,8 @@
       </w:sdtPr>
       <w:sdtEndPr>
         <w:rPr>
-          <w:rFonts w:ascii="Arial" w:eastAsiaTheme="minorHAnsi" w:hAnsi="Arial" w:cstheme="minorBidi"/>
           <w:b/>
           <w:bCs/>
-          <w:color w:val="auto"/>
-          <w:sz w:val="22"/>
-          <w:szCs w:val="22"/>
-          <w:lang w:eastAsia="en-US"/>
         </w:rPr>
       </w:sdtEndPr>
       <w:sdtContent>
@@ -6094,7 +6091,6 @@
       </w:pPr>
       <w:bookmarkStart w:id="0" w:name="_Toc236403127"/>
       <w:r>
-        <w:lastRenderedPageBreak/>
         <w:t>Project Objective</w:t>
       </w:r>
       <w:bookmarkEnd w:id="0"/>
@@ -6111,10 +6107,24 @@
     </w:p>
     <w:p>
       <w:pPr>
+        <w:rPr>
+          <w:lang w:val="en-NZ"/>
+        </w:rPr>
+      </w:pPr>
+      <w:r>
+        <w:rPr>
+          <w:lang w:val="en-NZ"/>
+        </w:rPr>
+        <w:t>Our client is Geoff Gordon</w:t>
+      </w:r>
+    </w:p>
+    <w:p>
+      <w:pPr>
         <w:pStyle w:val="Heading2"/>
       </w:pPr>
       <w:bookmarkStart w:id="2" w:name="_Toc236403129"/>
       <w:r>
+        <w:lastRenderedPageBreak/>
         <w:t>Deliverables</w:t>
       </w:r>
       <w:bookmarkEnd w:id="2"/>
@@ -6386,13 +6396,7 @@
               <w:rPr>
                 <w:lang w:val="en-NZ"/>
               </w:rPr>
-              <w:t>Group project mana</w:t>
-            </w:r>
-            <w:r>
-              <w:rPr>
-                <w:lang w:val="en-NZ"/>
-              </w:rPr>
-              <w:t>ger</w:t>
+              <w:t>Group project manager</w:t>
             </w:r>
             <w:r>
               <w:rPr>
@@ -6566,7 +6570,6 @@
       </w:pPr>
       <w:bookmarkStart w:id="15" w:name="_Toc236403142"/>
       <w:r>
-        <w:lastRenderedPageBreak/>
         <w:t>Conflict of Interest statement</w:t>
       </w:r>
       <w:bookmarkEnd w:id="15"/>
@@ -6623,6 +6626,7 @@
               <w:rPr>
                 <w:lang w:val="en-NZ"/>
               </w:rPr>
+              <w:lastRenderedPageBreak/>
               <w:t>Requirement</w:t>
             </w:r>
           </w:p>
@@ -6830,38 +6834,44 @@
         <w:tblLook w:val="04A0" w:firstRow="1" w:lastRow="0" w:firstColumn="1" w:lastColumn="0" w:noHBand="0" w:noVBand="1"/>
       </w:tblPr>
       <w:tblGrid>
-        <w:gridCol w:w="1502"/>
-        <w:gridCol w:w="1502"/>
-        <w:gridCol w:w="1503"/>
-        <w:gridCol w:w="1503"/>
-        <w:gridCol w:w="1503"/>
-        <w:gridCol w:w="1503"/>
+        <w:gridCol w:w="1316"/>
+        <w:gridCol w:w="1356"/>
+        <w:gridCol w:w="1769"/>
+        <w:gridCol w:w="2352"/>
+        <w:gridCol w:w="1932"/>
+        <w:gridCol w:w="1731"/>
       </w:tblGrid>
       <w:tr>
         <w:tc>
           <w:tcPr>
-            <w:tcW w:w="1502" w:type="dxa"/>
-          </w:tcPr>
-          <w:p>
-            <w:pPr>
-              <w:rPr>
-                <w:lang w:val="en-NZ"/>
-              </w:rPr>
-            </w:pPr>
-          </w:p>
-        </w:tc>
-        <w:tc>
-          <w:tcPr>
-            <w:tcW w:w="1502" w:type="dxa"/>
-          </w:tcPr>
-          <w:p>
-            <w:pPr>
-              <w:rPr>
-                <w:lang w:val="en-NZ"/>
-              </w:rPr>
-            </w:pPr>
-            <w:r>
-              <w:rPr>
+            <w:tcW w:w="1317" w:type="dxa"/>
+          </w:tcPr>
+          <w:p>
+            <w:pPr>
+              <w:rPr>
+                <w:b/>
+                <w:bCs/>
+                <w:lang w:val="en-NZ"/>
+              </w:rPr>
+            </w:pPr>
+          </w:p>
+        </w:tc>
+        <w:tc>
+          <w:tcPr>
+            <w:tcW w:w="1366" w:type="dxa"/>
+          </w:tcPr>
+          <w:p>
+            <w:pPr>
+              <w:rPr>
+                <w:b/>
+                <w:bCs/>
+                <w:lang w:val="en-NZ"/>
+              </w:rPr>
+            </w:pPr>
+            <w:r>
+              <w:rPr>
+                <w:b/>
+                <w:bCs/>
                 <w:lang w:val="en-NZ"/>
               </w:rPr>
               <w:t>Severity</w:t>
@@ -6870,47 +6880,55 @@
         </w:tc>
         <w:tc>
           <w:tcPr>
-            <w:tcW w:w="1503" w:type="dxa"/>
-          </w:tcPr>
-          <w:p>
-            <w:pPr>
-              <w:rPr>
-                <w:lang w:val="en-NZ"/>
-              </w:rPr>
-            </w:pPr>
-          </w:p>
-        </w:tc>
-        <w:tc>
-          <w:tcPr>
-            <w:tcW w:w="1503" w:type="dxa"/>
-          </w:tcPr>
-          <w:p>
-            <w:pPr>
-              <w:rPr>
-                <w:lang w:val="en-NZ"/>
-              </w:rPr>
-            </w:pPr>
-          </w:p>
-        </w:tc>
-        <w:tc>
-          <w:tcPr>
-            <w:tcW w:w="1503" w:type="dxa"/>
-          </w:tcPr>
-          <w:p>
-            <w:pPr>
-              <w:rPr>
-                <w:lang w:val="en-NZ"/>
-              </w:rPr>
-            </w:pPr>
-          </w:p>
-        </w:tc>
-        <w:tc>
-          <w:tcPr>
-            <w:tcW w:w="1503" w:type="dxa"/>
-          </w:tcPr>
-          <w:p>
-            <w:pPr>
-              <w:rPr>
+            <w:tcW w:w="1707" w:type="dxa"/>
+          </w:tcPr>
+          <w:p>
+            <w:pPr>
+              <w:rPr>
+                <w:b/>
+                <w:bCs/>
+                <w:lang w:val="en-NZ"/>
+              </w:rPr>
+            </w:pPr>
+          </w:p>
+        </w:tc>
+        <w:tc>
+          <w:tcPr>
+            <w:tcW w:w="2377" w:type="dxa"/>
+          </w:tcPr>
+          <w:p>
+            <w:pPr>
+              <w:rPr>
+                <w:b/>
+                <w:bCs/>
+                <w:lang w:val="en-NZ"/>
+              </w:rPr>
+            </w:pPr>
+          </w:p>
+        </w:tc>
+        <w:tc>
+          <w:tcPr>
+            <w:tcW w:w="1940" w:type="dxa"/>
+          </w:tcPr>
+          <w:p>
+            <w:pPr>
+              <w:rPr>
+                <w:b/>
+                <w:bCs/>
+                <w:lang w:val="en-NZ"/>
+              </w:rPr>
+            </w:pPr>
+          </w:p>
+        </w:tc>
+        <w:tc>
+          <w:tcPr>
+            <w:tcW w:w="1749" w:type="dxa"/>
+          </w:tcPr>
+          <w:p>
+            <w:pPr>
+              <w:rPr>
+                <w:b/>
+                <w:bCs/>
                 <w:lang w:val="en-NZ"/>
               </w:rPr>
             </w:pPr>
@@ -6920,16 +6938,20 @@
       <w:tr>
         <w:tc>
           <w:tcPr>
-            <w:tcW w:w="1502" w:type="dxa"/>
-          </w:tcPr>
-          <w:p>
-            <w:pPr>
-              <w:rPr>
-                <w:lang w:val="en-NZ"/>
-              </w:rPr>
-            </w:pPr>
-            <w:r>
-              <w:rPr>
+            <w:tcW w:w="1317" w:type="dxa"/>
+          </w:tcPr>
+          <w:p>
+            <w:pPr>
+              <w:rPr>
+                <w:b/>
+                <w:bCs/>
+                <w:lang w:val="en-NZ"/>
+              </w:rPr>
+            </w:pPr>
+            <w:r>
+              <w:rPr>
+                <w:b/>
+                <w:bCs/>
                 <w:lang w:val="en-NZ"/>
               </w:rPr>
               <w:t>Likelihood</w:t>
@@ -6938,16 +6960,20 @@
         </w:tc>
         <w:tc>
           <w:tcPr>
-            <w:tcW w:w="1502" w:type="dxa"/>
-          </w:tcPr>
-          <w:p>
-            <w:pPr>
-              <w:rPr>
-                <w:lang w:val="en-NZ"/>
-              </w:rPr>
-            </w:pPr>
-            <w:r>
-              <w:rPr>
+            <w:tcW w:w="1366" w:type="dxa"/>
+          </w:tcPr>
+          <w:p>
+            <w:pPr>
+              <w:rPr>
+                <w:b/>
+                <w:bCs/>
+                <w:lang w:val="en-NZ"/>
+              </w:rPr>
+            </w:pPr>
+            <w:r>
+              <w:rPr>
+                <w:b/>
+                <w:bCs/>
                 <w:lang w:val="en-NZ"/>
               </w:rPr>
               <w:t>1</w:t>
@@ -6956,16 +6982,20 @@
         </w:tc>
         <w:tc>
           <w:tcPr>
-            <w:tcW w:w="1503" w:type="dxa"/>
-          </w:tcPr>
-          <w:p>
-            <w:pPr>
-              <w:rPr>
-                <w:lang w:val="en-NZ"/>
-              </w:rPr>
-            </w:pPr>
-            <w:r>
-              <w:rPr>
+            <w:tcW w:w="1707" w:type="dxa"/>
+          </w:tcPr>
+          <w:p>
+            <w:pPr>
+              <w:rPr>
+                <w:b/>
+                <w:bCs/>
+                <w:lang w:val="en-NZ"/>
+              </w:rPr>
+            </w:pPr>
+            <w:r>
+              <w:rPr>
+                <w:b/>
+                <w:bCs/>
                 <w:lang w:val="en-NZ"/>
               </w:rPr>
               <w:t>2</w:t>
@@ -6974,16 +7004,20 @@
         </w:tc>
         <w:tc>
           <w:tcPr>
-            <w:tcW w:w="1503" w:type="dxa"/>
-          </w:tcPr>
-          <w:p>
-            <w:pPr>
-              <w:rPr>
-                <w:lang w:val="en-NZ"/>
-              </w:rPr>
-            </w:pPr>
-            <w:r>
-              <w:rPr>
+            <w:tcW w:w="2377" w:type="dxa"/>
+          </w:tcPr>
+          <w:p>
+            <w:pPr>
+              <w:rPr>
+                <w:b/>
+                <w:bCs/>
+                <w:lang w:val="en-NZ"/>
+              </w:rPr>
+            </w:pPr>
+            <w:r>
+              <w:rPr>
+                <w:b/>
+                <w:bCs/>
                 <w:lang w:val="en-NZ"/>
               </w:rPr>
               <w:t>3</w:t>
@@ -6992,16 +7026,20 @@
         </w:tc>
         <w:tc>
           <w:tcPr>
-            <w:tcW w:w="1503" w:type="dxa"/>
-          </w:tcPr>
-          <w:p>
-            <w:pPr>
-              <w:rPr>
-                <w:lang w:val="en-NZ"/>
-              </w:rPr>
-            </w:pPr>
-            <w:r>
-              <w:rPr>
+            <w:tcW w:w="1940" w:type="dxa"/>
+          </w:tcPr>
+          <w:p>
+            <w:pPr>
+              <w:rPr>
+                <w:b/>
+                <w:bCs/>
+                <w:lang w:val="en-NZ"/>
+              </w:rPr>
+            </w:pPr>
+            <w:r>
+              <w:rPr>
+                <w:b/>
+                <w:bCs/>
                 <w:lang w:val="en-NZ"/>
               </w:rPr>
               <w:t>4</w:t>
@@ -7010,16 +7048,20 @@
         </w:tc>
         <w:tc>
           <w:tcPr>
-            <w:tcW w:w="1503" w:type="dxa"/>
-          </w:tcPr>
-          <w:p>
-            <w:pPr>
-              <w:rPr>
-                <w:lang w:val="en-NZ"/>
-              </w:rPr>
-            </w:pPr>
-            <w:r>
-              <w:rPr>
+            <w:tcW w:w="1749" w:type="dxa"/>
+          </w:tcPr>
+          <w:p>
+            <w:pPr>
+              <w:rPr>
+                <w:b/>
+                <w:bCs/>
+                <w:lang w:val="en-NZ"/>
+              </w:rPr>
+            </w:pPr>
+            <w:r>
+              <w:rPr>
+                <w:b/>
+                <w:bCs/>
                 <w:lang w:val="en-NZ"/>
               </w:rPr>
               <w:t>5</w:t>
@@ -7030,16 +7072,20 @@
       <w:tr>
         <w:tc>
           <w:tcPr>
-            <w:tcW w:w="1502" w:type="dxa"/>
-          </w:tcPr>
-          <w:p>
-            <w:pPr>
-              <w:rPr>
-                <w:lang w:val="en-NZ"/>
-              </w:rPr>
-            </w:pPr>
-            <w:r>
-              <w:rPr>
+            <w:tcW w:w="1317" w:type="dxa"/>
+          </w:tcPr>
+          <w:p>
+            <w:pPr>
+              <w:rPr>
+                <w:b/>
+                <w:bCs/>
+                <w:lang w:val="en-NZ"/>
+              </w:rPr>
+            </w:pPr>
+            <w:r>
+              <w:rPr>
+                <w:b/>
+                <w:bCs/>
                 <w:lang w:val="en-NZ"/>
               </w:rPr>
               <w:t>5</w:t>
@@ -7048,55 +7094,114 @@
         </w:tc>
         <w:tc>
           <w:tcPr>
-            <w:tcW w:w="1502" w:type="dxa"/>
-          </w:tcPr>
-          <w:p>
-            <w:pPr>
-              <w:rPr>
-                <w:lang w:val="en-NZ"/>
-              </w:rPr>
-            </w:pPr>
-          </w:p>
-        </w:tc>
-        <w:tc>
-          <w:tcPr>
-            <w:tcW w:w="1503" w:type="dxa"/>
-          </w:tcPr>
-          <w:p>
-            <w:pPr>
-              <w:rPr>
-                <w:lang w:val="en-NZ"/>
-              </w:rPr>
-            </w:pPr>
-          </w:p>
-        </w:tc>
-        <w:tc>
-          <w:tcPr>
-            <w:tcW w:w="1503" w:type="dxa"/>
-          </w:tcPr>
-          <w:p>
-            <w:pPr>
-              <w:rPr>
-                <w:lang w:val="en-NZ"/>
-              </w:rPr>
-            </w:pPr>
-          </w:p>
-        </w:tc>
-        <w:tc>
-          <w:tcPr>
-            <w:tcW w:w="1503" w:type="dxa"/>
-          </w:tcPr>
-          <w:p>
-            <w:pPr>
-              <w:rPr>
-                <w:lang w:val="en-NZ"/>
-              </w:rPr>
-            </w:pPr>
-          </w:p>
-        </w:tc>
-        <w:tc>
-          <w:tcPr>
-            <w:tcW w:w="1503" w:type="dxa"/>
+            <w:tcW w:w="1366" w:type="dxa"/>
+            <w:shd w:val="clear" w:color="auto" w:fill="C1F0C7" w:themeFill="accent3" w:themeFillTint="33"/>
+          </w:tcPr>
+          <w:p>
+            <w:pPr>
+              <w:rPr>
+                <w:lang w:val="en-NZ"/>
+              </w:rPr>
+            </w:pPr>
+          </w:p>
+        </w:tc>
+        <w:tc>
+          <w:tcPr>
+            <w:tcW w:w="1707" w:type="dxa"/>
+            <w:shd w:val="clear" w:color="auto" w:fill="F4EE9A"/>
+          </w:tcPr>
+          <w:p>
+            <w:pPr>
+              <w:rPr>
+                <w:lang w:val="en-NZ"/>
+              </w:rPr>
+            </w:pPr>
+            <w:r>
+              <w:rPr>
+                <w:lang w:val="en-NZ"/>
+              </w:rPr>
+              <w:t>R0</w:t>
+            </w:r>
+            <w:r>
+              <w:rPr>
+                <w:lang w:val="en-NZ"/>
+              </w:rPr>
+              <w:t>4</w:t>
+            </w:r>
+            <w:r>
+              <w:rPr>
+                <w:lang w:val="en-NZ"/>
+              </w:rPr>
+              <w:t xml:space="preserve"> </w:t>
+            </w:r>
+            <w:r>
+              <w:rPr>
+                <w:lang w:val="en-NZ"/>
+              </w:rPr>
+              <w:t>Format</w:t>
+            </w:r>
+            <w:r>
+              <w:rPr>
+                <w:lang w:val="en-NZ"/>
+              </w:rPr>
+              <w:t>ting</w:t>
+            </w:r>
+            <w:r>
+              <w:rPr>
+                <w:lang w:val="en-NZ"/>
+              </w:rPr>
+              <w:t xml:space="preserve"> </w:t>
+            </w:r>
+            <w:r>
+              <w:rPr>
+                <w:lang w:val="en-NZ"/>
+              </w:rPr>
+              <w:t>i</w:t>
+            </w:r>
+            <w:r>
+              <w:rPr>
+                <w:lang w:val="en-NZ"/>
+              </w:rPr>
+              <w:t>nconsistencies</w:t>
+            </w:r>
+            <w:r>
+              <w:rPr>
+                <w:lang w:val="en-NZ"/>
+              </w:rPr>
+              <w:t>.</w:t>
+            </w:r>
+          </w:p>
+        </w:tc>
+        <w:tc>
+          <w:tcPr>
+            <w:tcW w:w="2377" w:type="dxa"/>
+            <w:shd w:val="clear" w:color="auto" w:fill="F49A9A"/>
+          </w:tcPr>
+          <w:p>
+            <w:pPr>
+              <w:rPr>
+                <w:lang w:val="en-NZ"/>
+              </w:rPr>
+            </w:pPr>
+          </w:p>
+        </w:tc>
+        <w:tc>
+          <w:tcPr>
+            <w:tcW w:w="1940" w:type="dxa"/>
+            <w:shd w:val="clear" w:color="auto" w:fill="F49A9A"/>
+          </w:tcPr>
+          <w:p>
+            <w:pPr>
+              <w:rPr>
+                <w:lang w:val="en-NZ"/>
+              </w:rPr>
+            </w:pPr>
+          </w:p>
+        </w:tc>
+        <w:tc>
+          <w:tcPr>
+            <w:tcW w:w="1749" w:type="dxa"/>
+            <w:shd w:val="clear" w:color="auto" w:fill="F49A9A"/>
           </w:tcPr>
           <w:p>
             <w:pPr>
@@ -7110,16 +7215,20 @@
       <w:tr>
         <w:tc>
           <w:tcPr>
-            <w:tcW w:w="1502" w:type="dxa"/>
-          </w:tcPr>
-          <w:p>
-            <w:pPr>
-              <w:rPr>
-                <w:lang w:val="en-NZ"/>
-              </w:rPr>
-            </w:pPr>
-            <w:r>
-              <w:rPr>
+            <w:tcW w:w="1317" w:type="dxa"/>
+          </w:tcPr>
+          <w:p>
+            <w:pPr>
+              <w:rPr>
+                <w:b/>
+                <w:bCs/>
+                <w:lang w:val="en-NZ"/>
+              </w:rPr>
+            </w:pPr>
+            <w:r>
+              <w:rPr>
+                <w:b/>
+                <w:bCs/>
                 <w:lang w:val="en-NZ"/>
               </w:rPr>
               <w:t>4</w:t>
@@ -7128,55 +7237,138 @@
         </w:tc>
         <w:tc>
           <w:tcPr>
-            <w:tcW w:w="1502" w:type="dxa"/>
-          </w:tcPr>
-          <w:p>
-            <w:pPr>
-              <w:rPr>
-                <w:lang w:val="en-NZ"/>
-              </w:rPr>
-            </w:pPr>
-          </w:p>
-        </w:tc>
-        <w:tc>
-          <w:tcPr>
-            <w:tcW w:w="1503" w:type="dxa"/>
-          </w:tcPr>
-          <w:p>
-            <w:pPr>
-              <w:rPr>
-                <w:lang w:val="en-NZ"/>
-              </w:rPr>
-            </w:pPr>
-          </w:p>
-        </w:tc>
-        <w:tc>
-          <w:tcPr>
-            <w:tcW w:w="1503" w:type="dxa"/>
-          </w:tcPr>
-          <w:p>
-            <w:pPr>
-              <w:rPr>
-                <w:lang w:val="en-NZ"/>
-              </w:rPr>
-            </w:pPr>
-          </w:p>
-        </w:tc>
-        <w:tc>
-          <w:tcPr>
-            <w:tcW w:w="1503" w:type="dxa"/>
-          </w:tcPr>
-          <w:p>
-            <w:pPr>
-              <w:rPr>
-                <w:lang w:val="en-NZ"/>
-              </w:rPr>
-            </w:pPr>
-          </w:p>
-        </w:tc>
-        <w:tc>
-          <w:tcPr>
-            <w:tcW w:w="1503" w:type="dxa"/>
+            <w:tcW w:w="1366" w:type="dxa"/>
+            <w:shd w:val="clear" w:color="auto" w:fill="C1F0C7" w:themeFill="accent3" w:themeFillTint="33"/>
+          </w:tcPr>
+          <w:p>
+            <w:pPr>
+              <w:rPr>
+                <w:lang w:val="en-NZ"/>
+              </w:rPr>
+            </w:pPr>
+            <w:r>
+              <w:rPr>
+                <w:lang w:val="en-NZ"/>
+              </w:rPr>
+              <w:t>R1</w:t>
+            </w:r>
+            <w:r>
+              <w:rPr>
+                <w:lang w:val="en-NZ"/>
+              </w:rPr>
+              <w:t>5</w:t>
+            </w:r>
+            <w:r>
+              <w:rPr>
+                <w:lang w:val="en-NZ"/>
+              </w:rPr>
+              <w:t xml:space="preserve"> </w:t>
+            </w:r>
+            <w:r>
+              <w:rPr>
+                <w:lang w:val="en-NZ"/>
+              </w:rPr>
+              <w:t>Version control conflicts</w:t>
+            </w:r>
+            <w:r>
+              <w:rPr>
+                <w:lang w:val="en-NZ"/>
+              </w:rPr>
+              <w:t>.</w:t>
+            </w:r>
+          </w:p>
+        </w:tc>
+        <w:tc>
+          <w:tcPr>
+            <w:tcW w:w="1707" w:type="dxa"/>
+            <w:shd w:val="clear" w:color="auto" w:fill="F4EE9A"/>
+          </w:tcPr>
+          <w:p>
+            <w:pPr>
+              <w:rPr>
+                <w:lang w:val="en-NZ"/>
+              </w:rPr>
+            </w:pPr>
+          </w:p>
+        </w:tc>
+        <w:tc>
+          <w:tcPr>
+            <w:tcW w:w="2377" w:type="dxa"/>
+            <w:shd w:val="clear" w:color="auto" w:fill="F4EE9A"/>
+          </w:tcPr>
+          <w:p>
+            <w:pPr>
+              <w:rPr>
+                <w:lang w:val="en-NZ"/>
+              </w:rPr>
+            </w:pPr>
+            <w:r>
+              <w:rPr>
+                <w:lang w:val="en-NZ"/>
+              </w:rPr>
+              <w:t xml:space="preserve">R02 </w:t>
+            </w:r>
+            <w:r>
+              <w:rPr>
+                <w:lang w:val="en-NZ"/>
+              </w:rPr>
+              <w:t xml:space="preserve">Team member becomes </w:t>
+            </w:r>
+            <w:r>
+              <w:rPr>
+                <w:lang w:val="en-NZ"/>
+              </w:rPr>
+              <w:t>unavailable.</w:t>
+            </w:r>
+          </w:p>
+        </w:tc>
+        <w:tc>
+          <w:tcPr>
+            <w:tcW w:w="1940" w:type="dxa"/>
+            <w:shd w:val="clear" w:color="auto" w:fill="F49A9A"/>
+          </w:tcPr>
+          <w:p>
+            <w:pPr>
+              <w:rPr>
+                <w:lang w:val="en-NZ"/>
+              </w:rPr>
+            </w:pPr>
+            <w:r>
+              <w:rPr>
+                <w:lang w:val="en-NZ"/>
+              </w:rPr>
+              <w:t xml:space="preserve">R01 </w:t>
+            </w:r>
+            <w:r>
+              <w:rPr>
+                <w:lang w:val="en-NZ"/>
+              </w:rPr>
+              <w:t xml:space="preserve">Missed </w:t>
+            </w:r>
+            <w:r>
+              <w:rPr>
+                <w:lang w:val="en-NZ"/>
+              </w:rPr>
+              <w:t>d</w:t>
+            </w:r>
+            <w:r>
+              <w:rPr>
+                <w:lang w:val="en-NZ"/>
+              </w:rPr>
+              <w:t>eadlines</w:t>
+            </w:r>
+            <w:r>
+              <w:rPr>
+                <w:lang w:val="en-NZ"/>
+              </w:rPr>
+              <w:t>.</w:t>
+            </w:r>
+          </w:p>
+        </w:tc>
+        <w:tc>
+          <w:tcPr>
+            <w:tcW w:w="1749" w:type="dxa"/>
+            <w:shd w:val="clear" w:color="auto" w:fill="F49A9A"/>
           </w:tcPr>
           <w:p>
             <w:pPr>
@@ -7190,16 +7382,20 @@
       <w:tr>
         <w:tc>
           <w:tcPr>
-            <w:tcW w:w="1502" w:type="dxa"/>
-          </w:tcPr>
-          <w:p>
-            <w:pPr>
-              <w:rPr>
-                <w:lang w:val="en-NZ"/>
-              </w:rPr>
-            </w:pPr>
-            <w:r>
-              <w:rPr>
+            <w:tcW w:w="1317" w:type="dxa"/>
+          </w:tcPr>
+          <w:p>
+            <w:pPr>
+              <w:rPr>
+                <w:b/>
+                <w:bCs/>
+                <w:lang w:val="en-NZ"/>
+              </w:rPr>
+            </w:pPr>
+            <w:r>
+              <w:rPr>
+                <w:b/>
+                <w:bCs/>
                 <w:lang w:val="en-NZ"/>
               </w:rPr>
               <w:t>3</w:t>
@@ -7208,55 +7404,182 @@
         </w:tc>
         <w:tc>
           <w:tcPr>
-            <w:tcW w:w="1502" w:type="dxa"/>
-          </w:tcPr>
-          <w:p>
-            <w:pPr>
-              <w:rPr>
-                <w:lang w:val="en-NZ"/>
-              </w:rPr>
-            </w:pPr>
-          </w:p>
-        </w:tc>
-        <w:tc>
-          <w:tcPr>
-            <w:tcW w:w="1503" w:type="dxa"/>
-          </w:tcPr>
-          <w:p>
-            <w:pPr>
-              <w:rPr>
-                <w:lang w:val="en-NZ"/>
-              </w:rPr>
-            </w:pPr>
-          </w:p>
-        </w:tc>
-        <w:tc>
-          <w:tcPr>
-            <w:tcW w:w="1503" w:type="dxa"/>
-          </w:tcPr>
-          <w:p>
-            <w:pPr>
-              <w:rPr>
-                <w:lang w:val="en-NZ"/>
-              </w:rPr>
-            </w:pPr>
-          </w:p>
-        </w:tc>
-        <w:tc>
-          <w:tcPr>
-            <w:tcW w:w="1503" w:type="dxa"/>
-          </w:tcPr>
-          <w:p>
-            <w:pPr>
-              <w:rPr>
-                <w:lang w:val="en-NZ"/>
-              </w:rPr>
-            </w:pPr>
-          </w:p>
-        </w:tc>
-        <w:tc>
-          <w:tcPr>
-            <w:tcW w:w="1503" w:type="dxa"/>
+            <w:tcW w:w="1366" w:type="dxa"/>
+            <w:shd w:val="clear" w:color="auto" w:fill="C1F0C7" w:themeFill="accent3" w:themeFillTint="33"/>
+          </w:tcPr>
+          <w:p>
+            <w:pPr>
+              <w:rPr>
+                <w:lang w:val="en-NZ"/>
+              </w:rPr>
+            </w:pPr>
+          </w:p>
+        </w:tc>
+        <w:tc>
+          <w:tcPr>
+            <w:tcW w:w="1707" w:type="dxa"/>
+            <w:shd w:val="clear" w:color="auto" w:fill="C1F0C7" w:themeFill="accent3" w:themeFillTint="33"/>
+          </w:tcPr>
+          <w:p>
+            <w:pPr>
+              <w:rPr>
+                <w:lang w:val="en-NZ"/>
+              </w:rPr>
+            </w:pPr>
+            <w:r>
+              <w:rPr>
+                <w:lang w:val="en-NZ"/>
+              </w:rPr>
+              <w:t>R</w:t>
+            </w:r>
+            <w:r>
+              <w:rPr>
+                <w:lang w:val="en-NZ"/>
+              </w:rPr>
+              <w:t>1</w:t>
+            </w:r>
+            <w:r>
+              <w:rPr>
+                <w:lang w:val="en-NZ"/>
+              </w:rPr>
+              <w:t>2</w:t>
+            </w:r>
+            <w:r>
+              <w:rPr>
+                <w:lang w:val="en-NZ"/>
+              </w:rPr>
+              <w:t xml:space="preserve"> </w:t>
+            </w:r>
+            <w:r>
+              <w:rPr>
+                <w:lang w:val="en-NZ"/>
+              </w:rPr>
+              <w:t xml:space="preserve">Internet </w:t>
+            </w:r>
+            <w:r>
+              <w:rPr>
+                <w:lang w:val="en-NZ"/>
+              </w:rPr>
+              <w:t>outage</w:t>
+            </w:r>
+            <w:r>
+              <w:rPr>
+                <w:lang w:val="en-NZ"/>
+              </w:rPr>
+              <w:t>.</w:t>
+            </w:r>
+          </w:p>
+        </w:tc>
+        <w:tc>
+          <w:tcPr>
+            <w:tcW w:w="2377" w:type="dxa"/>
+            <w:shd w:val="clear" w:color="auto" w:fill="F4EE9A"/>
+          </w:tcPr>
+          <w:p>
+            <w:pPr>
+              <w:rPr>
+                <w:lang w:val="en-NZ"/>
+              </w:rPr>
+            </w:pPr>
+            <w:r>
+              <w:rPr>
+                <w:lang w:val="en-NZ"/>
+              </w:rPr>
+              <w:t>R0</w:t>
+            </w:r>
+            <w:r>
+              <w:rPr>
+                <w:lang w:val="en-NZ"/>
+              </w:rPr>
+              <w:t>5</w:t>
+            </w:r>
+            <w:r>
+              <w:rPr>
+                <w:lang w:val="en-NZ"/>
+              </w:rPr>
+              <w:t xml:space="preserve"> </w:t>
+            </w:r>
+            <w:r>
+              <w:rPr>
+                <w:lang w:val="en-NZ"/>
+              </w:rPr>
+              <w:t>Misunderstood requirements</w:t>
+            </w:r>
+            <w:r>
+              <w:rPr>
+                <w:lang w:val="en-NZ"/>
+              </w:rPr>
+              <w:t>.</w:t>
+            </w:r>
+          </w:p>
+          <w:p>
+            <w:pPr>
+              <w:rPr>
+                <w:lang w:val="en-NZ"/>
+              </w:rPr>
+            </w:pPr>
+            <w:r>
+              <w:rPr>
+                <w:lang w:val="en-NZ"/>
+              </w:rPr>
+              <w:t>R0</w:t>
+            </w:r>
+            <w:r>
+              <w:rPr>
+                <w:lang w:val="en-NZ"/>
+              </w:rPr>
+              <w:t>6</w:t>
+            </w:r>
+            <w:r>
+              <w:rPr>
+                <w:lang w:val="en-NZ"/>
+              </w:rPr>
+              <w:t xml:space="preserve"> </w:t>
+            </w:r>
+            <w:r>
+              <w:rPr>
+                <w:lang w:val="en-NZ"/>
+              </w:rPr>
+              <w:t>S</w:t>
+            </w:r>
+            <w:r>
+              <w:rPr>
+                <w:lang w:val="en-NZ"/>
+              </w:rPr>
+              <w:t>oftware</w:t>
+            </w:r>
+            <w:r>
+              <w:rPr>
+                <w:lang w:val="en-NZ"/>
+              </w:rPr>
+              <w:t xml:space="preserve"> difficulties</w:t>
+            </w:r>
+            <w:r>
+              <w:rPr>
+                <w:lang w:val="en-NZ"/>
+              </w:rPr>
+              <w:t>.</w:t>
+            </w:r>
+          </w:p>
+        </w:tc>
+        <w:tc>
+          <w:tcPr>
+            <w:tcW w:w="1940" w:type="dxa"/>
+            <w:shd w:val="clear" w:color="auto" w:fill="F4EE9A"/>
+          </w:tcPr>
+          <w:p>
+            <w:pPr>
+              <w:ind w:firstLine="720"/>
+              <w:rPr>
+                <w:lang w:val="en-NZ"/>
+              </w:rPr>
+            </w:pPr>
+          </w:p>
+        </w:tc>
+        <w:tc>
+          <w:tcPr>
+            <w:tcW w:w="1749" w:type="dxa"/>
+            <w:shd w:val="clear" w:color="auto" w:fill="F49A9A"/>
           </w:tcPr>
           <w:p>
             <w:pPr>
@@ -7270,16 +7593,20 @@
       <w:tr>
         <w:tc>
           <w:tcPr>
-            <w:tcW w:w="1502" w:type="dxa"/>
-          </w:tcPr>
-          <w:p>
-            <w:pPr>
-              <w:rPr>
-                <w:lang w:val="en-NZ"/>
-              </w:rPr>
-            </w:pPr>
-            <w:r>
-              <w:rPr>
+            <w:tcW w:w="1317" w:type="dxa"/>
+          </w:tcPr>
+          <w:p>
+            <w:pPr>
+              <w:rPr>
+                <w:b/>
+                <w:bCs/>
+                <w:lang w:val="en-NZ"/>
+              </w:rPr>
+            </w:pPr>
+            <w:r>
+              <w:rPr>
+                <w:b/>
+                <w:bCs/>
                 <w:lang w:val="en-NZ"/>
               </w:rPr>
               <w:t>2</w:t>
@@ -7288,78 +7615,288 @@
         </w:tc>
         <w:tc>
           <w:tcPr>
-            <w:tcW w:w="1502" w:type="dxa"/>
-          </w:tcPr>
-          <w:p>
-            <w:pPr>
-              <w:rPr>
-                <w:lang w:val="en-NZ"/>
-              </w:rPr>
-            </w:pPr>
-          </w:p>
-        </w:tc>
-        <w:tc>
-          <w:tcPr>
-            <w:tcW w:w="1503" w:type="dxa"/>
-          </w:tcPr>
-          <w:p>
-            <w:pPr>
-              <w:rPr>
-                <w:lang w:val="en-NZ"/>
-              </w:rPr>
-            </w:pPr>
-          </w:p>
-        </w:tc>
-        <w:tc>
-          <w:tcPr>
-            <w:tcW w:w="1503" w:type="dxa"/>
-          </w:tcPr>
-          <w:p>
-            <w:pPr>
-              <w:rPr>
-                <w:lang w:val="en-NZ"/>
-              </w:rPr>
-            </w:pPr>
-          </w:p>
-        </w:tc>
-        <w:tc>
-          <w:tcPr>
-            <w:tcW w:w="1503" w:type="dxa"/>
-          </w:tcPr>
-          <w:p>
-            <w:pPr>
-              <w:rPr>
-                <w:lang w:val="en-NZ"/>
-              </w:rPr>
-            </w:pPr>
-          </w:p>
-        </w:tc>
-        <w:tc>
-          <w:tcPr>
-            <w:tcW w:w="1503" w:type="dxa"/>
-          </w:tcPr>
-          <w:p>
-            <w:pPr>
-              <w:rPr>
-                <w:lang w:val="en-NZ"/>
-              </w:rPr>
-            </w:pPr>
+            <w:tcW w:w="1366" w:type="dxa"/>
+            <w:shd w:val="clear" w:color="auto" w:fill="C1F0C7" w:themeFill="accent3" w:themeFillTint="33"/>
+          </w:tcPr>
+          <w:p>
+            <w:pPr>
+              <w:rPr>
+                <w:lang w:val="en-NZ"/>
+              </w:rPr>
+            </w:pPr>
+          </w:p>
+        </w:tc>
+        <w:tc>
+          <w:tcPr>
+            <w:tcW w:w="1707" w:type="dxa"/>
+            <w:shd w:val="clear" w:color="auto" w:fill="C1F0C7" w:themeFill="accent3" w:themeFillTint="33"/>
+          </w:tcPr>
+          <w:p>
+            <w:pPr>
+              <w:rPr>
+                <w:lang w:val="en-NZ"/>
+              </w:rPr>
+            </w:pPr>
+            <w:r>
+              <w:rPr>
+                <w:lang w:val="en-NZ"/>
+              </w:rPr>
+              <w:t>R1</w:t>
+            </w:r>
+            <w:r>
+              <w:rPr>
+                <w:lang w:val="en-NZ"/>
+              </w:rPr>
+              <w:t>4</w:t>
+            </w:r>
+            <w:r>
+              <w:rPr>
+                <w:lang w:val="en-NZ"/>
+              </w:rPr>
+              <w:t xml:space="preserve"> </w:t>
+            </w:r>
+            <w:r>
+              <w:rPr>
+                <w:lang w:val="en-NZ"/>
+              </w:rPr>
+              <w:t>Power outage</w:t>
+            </w:r>
+            <w:r>
+              <w:rPr>
+                <w:lang w:val="en-NZ"/>
+              </w:rPr>
+              <w:t>.</w:t>
+            </w:r>
+          </w:p>
+        </w:tc>
+        <w:tc>
+          <w:tcPr>
+            <w:tcW w:w="2377" w:type="dxa"/>
+            <w:shd w:val="clear" w:color="auto" w:fill="C1F0C7" w:themeFill="accent3" w:themeFillTint="33"/>
+          </w:tcPr>
+          <w:p>
+            <w:pPr>
+              <w:rPr>
+                <w:lang w:val="en-NZ"/>
+              </w:rPr>
+            </w:pPr>
+            <w:r>
+              <w:rPr>
+                <w:lang w:val="en-NZ"/>
+              </w:rPr>
+              <w:t>R0</w:t>
+            </w:r>
+            <w:r>
+              <w:rPr>
+                <w:lang w:val="en-NZ"/>
+              </w:rPr>
+              <w:t>9</w:t>
+            </w:r>
+            <w:r>
+              <w:rPr>
+                <w:lang w:val="en-NZ"/>
+              </w:rPr>
+              <w:t xml:space="preserve"> </w:t>
+            </w:r>
+            <w:r>
+              <w:rPr>
+                <w:lang w:val="en-NZ"/>
+              </w:rPr>
+              <w:t>Client becomes unavailable.</w:t>
+            </w:r>
+          </w:p>
+          <w:p>
+            <w:pPr>
+              <w:rPr>
+                <w:lang w:val="en-NZ"/>
+              </w:rPr>
+            </w:pPr>
+            <w:r>
+              <w:rPr>
+                <w:lang w:val="en-NZ"/>
+              </w:rPr>
+              <w:t>R10 Advisor becomes unavailable.</w:t>
+            </w:r>
+          </w:p>
+          <w:p>
+            <w:pPr>
+              <w:rPr>
+                <w:lang w:val="en-NZ"/>
+              </w:rPr>
+            </w:pPr>
+            <w:r>
+              <w:rPr>
+                <w:lang w:val="en-NZ"/>
+              </w:rPr>
+              <w:t>R</w:t>
+            </w:r>
+            <w:r>
+              <w:rPr>
+                <w:lang w:val="en-NZ"/>
+              </w:rPr>
+              <w:t>1</w:t>
+            </w:r>
+            <w:r>
+              <w:rPr>
+                <w:lang w:val="en-NZ"/>
+              </w:rPr>
+              <w:t>1</w:t>
+            </w:r>
+            <w:r>
+              <w:rPr>
+                <w:lang w:val="en-NZ"/>
+              </w:rPr>
+              <w:t xml:space="preserve"> </w:t>
+            </w:r>
+            <w:r>
+              <w:rPr>
+                <w:lang w:val="en-NZ"/>
+              </w:rPr>
+              <w:t>Tech/V</w:t>
+            </w:r>
+            <w:r>
+              <w:rPr>
+                <w:lang w:val="en-NZ"/>
+              </w:rPr>
+              <w:t xml:space="preserve">endor </w:t>
+            </w:r>
+            <w:r>
+              <w:rPr>
+                <w:lang w:val="en-NZ"/>
+              </w:rPr>
+              <w:t>becomes unavailable</w:t>
+            </w:r>
+            <w:r>
+              <w:rPr>
+                <w:lang w:val="en-NZ"/>
+              </w:rPr>
+              <w:t>.</w:t>
+            </w:r>
+          </w:p>
+        </w:tc>
+        <w:tc>
+          <w:tcPr>
+            <w:tcW w:w="1940" w:type="dxa"/>
+            <w:shd w:val="clear" w:color="auto" w:fill="F4EE9A"/>
+          </w:tcPr>
+          <w:p>
+            <w:pPr>
+              <w:rPr>
+                <w:lang w:val="en-NZ"/>
+              </w:rPr>
+            </w:pPr>
+            <w:r>
+              <w:rPr>
+                <w:lang w:val="en-NZ"/>
+              </w:rPr>
+              <w:t xml:space="preserve">R07 </w:t>
+            </w:r>
+            <w:r>
+              <w:rPr>
+                <w:lang w:val="en-NZ"/>
+              </w:rPr>
+              <w:t>Hardware stolen</w:t>
+            </w:r>
+            <w:r>
+              <w:rPr>
+                <w:lang w:val="en-NZ"/>
+              </w:rPr>
+              <w:t xml:space="preserve">. </w:t>
+            </w:r>
+          </w:p>
+          <w:p>
+            <w:pPr>
+              <w:rPr>
+                <w:lang w:val="en-NZ"/>
+              </w:rPr>
+            </w:pPr>
+            <w:r>
+              <w:rPr>
+                <w:lang w:val="en-NZ"/>
+              </w:rPr>
+              <w:t xml:space="preserve">R08 </w:t>
+            </w:r>
+            <w:r>
+              <w:rPr>
+                <w:lang w:val="en-NZ"/>
+              </w:rPr>
+              <w:t>Data/</w:t>
+            </w:r>
+            <w:r>
+              <w:rPr>
+                <w:lang w:val="en-NZ"/>
+              </w:rPr>
+              <w:t>F</w:t>
+            </w:r>
+            <w:r>
+              <w:rPr>
+                <w:lang w:val="en-NZ"/>
+              </w:rPr>
+              <w:t>ile loss/corruption</w:t>
+            </w:r>
+            <w:r>
+              <w:rPr>
+                <w:lang w:val="en-NZ"/>
+              </w:rPr>
+              <w:t>.</w:t>
+            </w:r>
+          </w:p>
+        </w:tc>
+        <w:tc>
+          <w:tcPr>
+            <w:tcW w:w="1749" w:type="dxa"/>
+            <w:shd w:val="clear" w:color="auto" w:fill="F4EE9A"/>
+          </w:tcPr>
+          <w:p>
+            <w:pPr>
+              <w:rPr>
+                <w:lang w:val="en-NZ"/>
+              </w:rPr>
+            </w:pPr>
+            <w:r>
+              <w:rPr>
+                <w:lang w:val="en-NZ"/>
+              </w:rPr>
+              <w:t>R0</w:t>
+            </w:r>
+            <w:r>
+              <w:rPr>
+                <w:lang w:val="en-NZ"/>
+              </w:rPr>
+              <w:t xml:space="preserve">3 </w:t>
+            </w:r>
+            <w:r>
+              <w:rPr>
+                <w:lang w:val="en-NZ"/>
+              </w:rPr>
+              <w:t>Academic integrity violation</w:t>
+            </w:r>
+            <w:r>
+              <w:rPr>
+                <w:lang w:val="en-NZ"/>
+              </w:rPr>
+              <w:t>.</w:t>
+            </w:r>
           </w:p>
         </w:tc>
       </w:tr>
       <w:tr>
         <w:tc>
           <w:tcPr>
-            <w:tcW w:w="1502" w:type="dxa"/>
-          </w:tcPr>
-          <w:p>
-            <w:pPr>
-              <w:rPr>
-                <w:lang w:val="en-NZ"/>
-              </w:rPr>
-            </w:pPr>
-            <w:r>
-              <w:rPr>
+            <w:tcW w:w="1317" w:type="dxa"/>
+          </w:tcPr>
+          <w:p>
+            <w:pPr>
+              <w:rPr>
+                <w:b/>
+                <w:bCs/>
+                <w:lang w:val="en-NZ"/>
+              </w:rPr>
+            </w:pPr>
+            <w:r>
+              <w:rPr>
+                <w:b/>
+                <w:bCs/>
                 <w:lang w:val="en-NZ"/>
               </w:rPr>
               <w:t>1</w:t>
@@ -7368,62 +7905,109 @@
         </w:tc>
         <w:tc>
           <w:tcPr>
-            <w:tcW w:w="1502" w:type="dxa"/>
-          </w:tcPr>
-          <w:p>
-            <w:pPr>
-              <w:rPr>
-                <w:lang w:val="en-NZ"/>
-              </w:rPr>
-            </w:pPr>
-          </w:p>
-        </w:tc>
-        <w:tc>
-          <w:tcPr>
-            <w:tcW w:w="1503" w:type="dxa"/>
-          </w:tcPr>
-          <w:p>
-            <w:pPr>
-              <w:rPr>
-                <w:lang w:val="en-NZ"/>
-              </w:rPr>
-            </w:pPr>
-          </w:p>
-        </w:tc>
-        <w:tc>
-          <w:tcPr>
-            <w:tcW w:w="1503" w:type="dxa"/>
-          </w:tcPr>
-          <w:p>
-            <w:pPr>
-              <w:rPr>
-                <w:lang w:val="en-NZ"/>
-              </w:rPr>
-            </w:pPr>
-          </w:p>
-        </w:tc>
-        <w:tc>
-          <w:tcPr>
-            <w:tcW w:w="1503" w:type="dxa"/>
-          </w:tcPr>
-          <w:p>
-            <w:pPr>
-              <w:rPr>
-                <w:lang w:val="en-NZ"/>
-              </w:rPr>
-            </w:pPr>
-          </w:p>
-        </w:tc>
-        <w:tc>
-          <w:tcPr>
-            <w:tcW w:w="1503" w:type="dxa"/>
-          </w:tcPr>
-          <w:p>
-            <w:pPr>
-              <w:rPr>
-                <w:lang w:val="en-NZ"/>
-              </w:rPr>
-            </w:pPr>
+            <w:tcW w:w="1366" w:type="dxa"/>
+            <w:shd w:val="clear" w:color="auto" w:fill="C1F0C7" w:themeFill="accent3" w:themeFillTint="33"/>
+          </w:tcPr>
+          <w:p>
+            <w:pPr>
+              <w:rPr>
+                <w:lang w:val="en-NZ"/>
+              </w:rPr>
+            </w:pPr>
+          </w:p>
+        </w:tc>
+        <w:tc>
+          <w:tcPr>
+            <w:tcW w:w="1707" w:type="dxa"/>
+            <w:shd w:val="clear" w:color="auto" w:fill="C1F0C7" w:themeFill="accent3" w:themeFillTint="33"/>
+          </w:tcPr>
+          <w:p>
+            <w:pPr>
+              <w:rPr>
+                <w:lang w:val="en-NZ"/>
+              </w:rPr>
+            </w:pPr>
+          </w:p>
+        </w:tc>
+        <w:tc>
+          <w:tcPr>
+            <w:tcW w:w="2377" w:type="dxa"/>
+            <w:shd w:val="clear" w:color="auto" w:fill="C1F0C7" w:themeFill="accent3" w:themeFillTint="33"/>
+          </w:tcPr>
+          <w:p>
+            <w:pPr>
+              <w:rPr>
+                <w:lang w:val="en-NZ"/>
+              </w:rPr>
+            </w:pPr>
+          </w:p>
+        </w:tc>
+        <w:tc>
+          <w:tcPr>
+            <w:tcW w:w="1940" w:type="dxa"/>
+            <w:shd w:val="clear" w:color="auto" w:fill="C1F0C7" w:themeFill="accent3" w:themeFillTint="33"/>
+          </w:tcPr>
+          <w:p>
+            <w:pPr>
+              <w:rPr>
+                <w:lang w:val="en-NZ"/>
+              </w:rPr>
+            </w:pPr>
+          </w:p>
+        </w:tc>
+        <w:tc>
+          <w:tcPr>
+            <w:tcW w:w="1749" w:type="dxa"/>
+            <w:shd w:val="clear" w:color="auto" w:fill="C1F0C7" w:themeFill="accent3" w:themeFillTint="33"/>
+          </w:tcPr>
+          <w:p>
+            <w:pPr>
+              <w:rPr>
+                <w:lang w:val="en-NZ"/>
+              </w:rPr>
+            </w:pPr>
+            <w:r>
+              <w:rPr>
+                <w:lang w:val="en-NZ"/>
+              </w:rPr>
+              <w:t>R1</w:t>
+            </w:r>
+            <w:r>
+              <w:rPr>
+                <w:lang w:val="en-NZ"/>
+              </w:rPr>
+              <w:t>3</w:t>
+            </w:r>
+            <w:r>
+              <w:rPr>
+                <w:lang w:val="en-NZ"/>
+              </w:rPr>
+              <w:t xml:space="preserve"> </w:t>
+            </w:r>
+            <w:r>
+              <w:rPr>
+                <w:lang w:val="en-NZ"/>
+              </w:rPr>
+              <w:t>Natural disaster</w:t>
+            </w:r>
+            <w:r>
+              <w:rPr>
+                <w:lang w:val="en-NZ"/>
+              </w:rPr>
+              <w:t xml:space="preserve"> or </w:t>
+            </w:r>
+            <w:r>
+              <w:rPr>
+                <w:lang w:val="en-NZ"/>
+              </w:rPr>
+              <w:t>pandemic</w:t>
+            </w:r>
+            <w:r>
+              <w:rPr>
+                <w:lang w:val="en-NZ"/>
+              </w:rPr>
+              <w:t>.</w:t>
+            </w:r>
           </w:p>
         </w:tc>
       </w:tr>
@@ -7466,6 +8050,9 @@
         <w:t>ssessment Matrix</w:t>
       </w:r>
     </w:p>
+    <w:p/>
+    <w:p/>
+    <w:p/>
     <w:tbl>
       <w:tblPr>
         <w:tblStyle w:val="TableGrid"/>
@@ -7484,13 +8071,18 @@
           <w:p>
             <w:pPr>
               <w:rPr>
-                <w:lang w:val="en-NZ"/>
-              </w:rPr>
-            </w:pPr>
-            <w:r>
-              <w:rPr>
-                <w:lang w:val="en-NZ"/>
-              </w:rPr>
+                <w:b/>
+                <w:bCs/>
+                <w:lang w:val="en-NZ"/>
+              </w:rPr>
+            </w:pPr>
+            <w:r>
+              <w:rPr>
+                <w:b/>
+                <w:bCs/>
+                <w:lang w:val="en-NZ"/>
+              </w:rPr>
+              <w:lastRenderedPageBreak/>
               <w:t>Risk</w:t>
             </w:r>
           </w:p>
@@ -7502,11 +8094,15 @@
           <w:p>
             <w:pPr>
               <w:rPr>
-                <w:lang w:val="en-NZ"/>
-              </w:rPr>
-            </w:pPr>
-            <w:r>
-              <w:rPr>
+                <w:b/>
+                <w:bCs/>
+                <w:lang w:val="en-NZ"/>
+              </w:rPr>
+            </w:pPr>
+            <w:r>
+              <w:rPr>
+                <w:b/>
+                <w:bCs/>
                 <w:lang w:val="en-NZ"/>
               </w:rPr>
               <w:t>Mitigation</w:t>
@@ -7529,7 +8125,19 @@
               <w:rPr>
                 <w:lang w:val="en-NZ"/>
               </w:rPr>
-              <w:t>R001 Data/File Lost/Corruption</w:t>
+              <w:t xml:space="preserve">R01 Missed </w:t>
+            </w:r>
+            <w:r>
+              <w:rPr>
+                <w:lang w:val="en-NZ"/>
+              </w:rPr>
+              <w:t>d</w:t>
+            </w:r>
+            <w:r>
+              <w:rPr>
+                <w:lang w:val="en-NZ"/>
+              </w:rPr>
+              <w:t>eadlines</w:t>
             </w:r>
           </w:p>
         </w:tc>
@@ -7547,7 +8155,20 @@
               <w:rPr>
                 <w:lang w:val="en-NZ"/>
               </w:rPr>
-              <w:t>Regular backups should be done in multiple locations.</w:t>
+              <w:t>Have regular team meetings to check everyone’s progress</w:t>
+            </w:r>
+            <w:r>
+              <w:rPr>
+                <w:lang w:val="en-NZ"/>
+              </w:rPr>
+              <w:t>, see what’s lacking.</w:t>
+            </w:r>
+            <w:r>
+              <w:rPr>
+                <w:lang w:val="en-NZ"/>
+              </w:rPr>
+              <w:br/>
+              <w:t>Break work into set milestones with internal deadlines.</w:t>
             </w:r>
           </w:p>
         </w:tc>
@@ -7567,7 +8188,13 @@
               <w:rPr>
                 <w:lang w:val="en-NZ"/>
               </w:rPr>
-              <w:t>R002</w:t>
+              <w:t>R02</w:t>
+            </w:r>
+            <w:r>
+              <w:rPr>
+                <w:lang w:val="en-NZ"/>
+              </w:rPr>
+              <w:t xml:space="preserve"> Team member becomes unavailable</w:t>
             </w:r>
           </w:p>
         </w:tc>
@@ -7581,6 +8208,18 @@
                 <w:lang w:val="en-NZ"/>
               </w:rPr>
             </w:pPr>
+            <w:r>
+              <w:rPr>
+                <w:lang w:val="en-NZ"/>
+              </w:rPr>
+              <w:t xml:space="preserve">Ensure multiple </w:t>
+            </w:r>
+            <w:r>
+              <w:rPr>
+                <w:lang w:val="en-NZ"/>
+              </w:rPr>
+              <w:t>team members can do the same tasks. Keep documentation current and have required tasks be visible for the whole team.</w:t>
+            </w:r>
           </w:p>
         </w:tc>
       </w:tr>
@@ -7599,7 +8238,13 @@
               <w:rPr>
                 <w:lang w:val="en-NZ"/>
               </w:rPr>
-              <w:t>R003</w:t>
+              <w:t>R03</w:t>
+            </w:r>
+            <w:r>
+              <w:rPr>
+                <w:lang w:val="en-NZ"/>
+              </w:rPr>
+              <w:t xml:space="preserve"> Academic integrity violation</w:t>
             </w:r>
           </w:p>
         </w:tc>
@@ -7613,6 +8258,18 @@
                 <w:lang w:val="en-NZ"/>
               </w:rPr>
             </w:pPr>
+            <w:r>
+              <w:rPr>
+                <w:lang w:val="en-NZ"/>
+              </w:rPr>
+              <w:t>Clearly attribute any external code, sources, and AI tool use. Individual contributions tracked via commit history</w:t>
+            </w:r>
+            <w:r>
+              <w:rPr>
+                <w:lang w:val="en-NZ"/>
+              </w:rPr>
+              <w:t xml:space="preserve"> so authorship can be verified.</w:t>
+            </w:r>
           </w:p>
         </w:tc>
       </w:tr>
@@ -7631,7 +8288,13 @@
               <w:rPr>
                 <w:lang w:val="en-NZ"/>
               </w:rPr>
-              <w:t>R004</w:t>
+              <w:t>R04</w:t>
+            </w:r>
+            <w:r>
+              <w:rPr>
+                <w:lang w:val="en-NZ"/>
+              </w:rPr>
+              <w:t xml:space="preserve"> Formatting inconsistencies</w:t>
             </w:r>
           </w:p>
         </w:tc>
@@ -7659,6 +8322,420 @@
                 <w:lang w:val="en-NZ"/>
               </w:rPr>
             </w:pPr>
+            <w:r>
+              <w:rPr>
+                <w:lang w:val="en-NZ"/>
+              </w:rPr>
+              <w:t>R05 Misunderstood requirements</w:t>
+            </w:r>
+          </w:p>
+        </w:tc>
+        <w:tc>
+          <w:tcPr>
+            <w:tcW w:w="4508" w:type="dxa"/>
+          </w:tcPr>
+          <w:p>
+            <w:pPr>
+              <w:keepNext/>
+              <w:rPr>
+                <w:lang w:val="en-NZ"/>
+              </w:rPr>
+            </w:pPr>
+          </w:p>
+        </w:tc>
+      </w:tr>
+      <w:tr>
+        <w:tc>
+          <w:tcPr>
+            <w:tcW w:w="4508" w:type="dxa"/>
+          </w:tcPr>
+          <w:p>
+            <w:pPr>
+              <w:rPr>
+                <w:lang w:val="en-NZ"/>
+              </w:rPr>
+            </w:pPr>
+            <w:r>
+              <w:rPr>
+                <w:lang w:val="en-NZ"/>
+              </w:rPr>
+              <w:t xml:space="preserve">R06 </w:t>
+            </w:r>
+            <w:r>
+              <w:rPr>
+                <w:lang w:val="en-NZ"/>
+              </w:rPr>
+              <w:t>Software difficulties</w:t>
+            </w:r>
+          </w:p>
+        </w:tc>
+        <w:tc>
+          <w:tcPr>
+            <w:tcW w:w="4508" w:type="dxa"/>
+          </w:tcPr>
+          <w:p>
+            <w:pPr>
+              <w:keepNext/>
+              <w:rPr>
+                <w:lang w:val="en-NZ"/>
+              </w:rPr>
+            </w:pPr>
+          </w:p>
+        </w:tc>
+      </w:tr>
+      <w:tr>
+        <w:tc>
+          <w:tcPr>
+            <w:tcW w:w="4508" w:type="dxa"/>
+          </w:tcPr>
+          <w:p>
+            <w:pPr>
+              <w:rPr>
+                <w:lang w:val="en-NZ"/>
+              </w:rPr>
+            </w:pPr>
+            <w:r>
+              <w:rPr>
+                <w:lang w:val="en-NZ"/>
+              </w:rPr>
+              <w:t>R07</w:t>
+            </w:r>
+            <w:r>
+              <w:rPr>
+                <w:lang w:val="en-NZ"/>
+              </w:rPr>
+              <w:t xml:space="preserve"> Hardware stolen</w:t>
+            </w:r>
+          </w:p>
+        </w:tc>
+        <w:tc>
+          <w:tcPr>
+            <w:tcW w:w="4508" w:type="dxa"/>
+          </w:tcPr>
+          <w:p>
+            <w:pPr>
+              <w:keepNext/>
+              <w:rPr>
+                <w:lang w:val="en-NZ"/>
+              </w:rPr>
+            </w:pPr>
+          </w:p>
+        </w:tc>
+      </w:tr>
+      <w:tr>
+        <w:tc>
+          <w:tcPr>
+            <w:tcW w:w="4508" w:type="dxa"/>
+          </w:tcPr>
+          <w:p>
+            <w:pPr>
+              <w:rPr>
+                <w:lang w:val="en-NZ"/>
+              </w:rPr>
+            </w:pPr>
+            <w:r>
+              <w:rPr>
+                <w:lang w:val="en-NZ"/>
+              </w:rPr>
+              <w:t xml:space="preserve">R08 Data/File </w:t>
+            </w:r>
+            <w:r>
+              <w:rPr>
+                <w:lang w:val="en-NZ"/>
+              </w:rPr>
+              <w:t>loss</w:t>
+            </w:r>
+            <w:r>
+              <w:rPr>
+                <w:lang w:val="en-NZ"/>
+              </w:rPr>
+              <w:t>/</w:t>
+            </w:r>
+            <w:r>
+              <w:rPr>
+                <w:lang w:val="en-NZ"/>
+              </w:rPr>
+              <w:t>c</w:t>
+            </w:r>
+            <w:r>
+              <w:rPr>
+                <w:lang w:val="en-NZ"/>
+              </w:rPr>
+              <w:t>orruption</w:t>
+            </w:r>
+          </w:p>
+        </w:tc>
+        <w:tc>
+          <w:tcPr>
+            <w:tcW w:w="4508" w:type="dxa"/>
+          </w:tcPr>
+          <w:p>
+            <w:pPr>
+              <w:keepNext/>
+              <w:rPr>
+                <w:lang w:val="en-NZ"/>
+              </w:rPr>
+            </w:pPr>
+            <w:r>
+              <w:rPr>
+                <w:lang w:val="en-NZ"/>
+              </w:rPr>
+              <w:t>Regular backups should be done in multiple locations.</w:t>
+            </w:r>
+          </w:p>
+        </w:tc>
+      </w:tr>
+      <w:tr>
+        <w:tc>
+          <w:tcPr>
+            <w:tcW w:w="4508" w:type="dxa"/>
+          </w:tcPr>
+          <w:p>
+            <w:pPr>
+              <w:rPr>
+                <w:lang w:val="en-NZ"/>
+              </w:rPr>
+            </w:pPr>
+            <w:r>
+              <w:rPr>
+                <w:lang w:val="en-NZ"/>
+              </w:rPr>
+              <w:t>R09</w:t>
+            </w:r>
+            <w:r>
+              <w:rPr>
+                <w:lang w:val="en-NZ"/>
+              </w:rPr>
+              <w:t xml:space="preserve"> Client becomes unavailable</w:t>
+            </w:r>
+          </w:p>
+        </w:tc>
+        <w:tc>
+          <w:tcPr>
+            <w:tcW w:w="4508" w:type="dxa"/>
+          </w:tcPr>
+          <w:p>
+            <w:pPr>
+              <w:keepNext/>
+              <w:rPr>
+                <w:lang w:val="en-NZ"/>
+              </w:rPr>
+            </w:pPr>
+          </w:p>
+        </w:tc>
+      </w:tr>
+      <w:tr>
+        <w:tc>
+          <w:tcPr>
+            <w:tcW w:w="4508" w:type="dxa"/>
+          </w:tcPr>
+          <w:p>
+            <w:pPr>
+              <w:rPr>
+                <w:lang w:val="en-NZ"/>
+              </w:rPr>
+            </w:pPr>
+            <w:r>
+              <w:rPr>
+                <w:lang w:val="en-NZ"/>
+              </w:rPr>
+              <w:t>R10</w:t>
+            </w:r>
+            <w:r>
+              <w:rPr>
+                <w:lang w:val="en-NZ"/>
+              </w:rPr>
+              <w:t xml:space="preserve"> Advisor becomes unavailable</w:t>
+            </w:r>
+          </w:p>
+        </w:tc>
+        <w:tc>
+          <w:tcPr>
+            <w:tcW w:w="4508" w:type="dxa"/>
+          </w:tcPr>
+          <w:p>
+            <w:pPr>
+              <w:keepNext/>
+              <w:rPr>
+                <w:lang w:val="en-NZ"/>
+              </w:rPr>
+            </w:pPr>
+          </w:p>
+        </w:tc>
+      </w:tr>
+      <w:tr>
+        <w:tc>
+          <w:tcPr>
+            <w:tcW w:w="4508" w:type="dxa"/>
+          </w:tcPr>
+          <w:p>
+            <w:pPr>
+              <w:rPr>
+                <w:lang w:val="en-NZ"/>
+              </w:rPr>
+            </w:pPr>
+            <w:r>
+              <w:rPr>
+                <w:lang w:val="en-NZ"/>
+              </w:rPr>
+              <w:t>R11</w:t>
+            </w:r>
+            <w:r>
+              <w:rPr>
+                <w:lang w:val="en-NZ"/>
+              </w:rPr>
+              <w:t xml:space="preserve"> Tech/Vendor becomes unavailable</w:t>
+            </w:r>
+          </w:p>
+        </w:tc>
+        <w:tc>
+          <w:tcPr>
+            <w:tcW w:w="4508" w:type="dxa"/>
+          </w:tcPr>
+          <w:p>
+            <w:pPr>
+              <w:keepNext/>
+              <w:rPr>
+                <w:lang w:val="en-NZ"/>
+              </w:rPr>
+            </w:pPr>
+          </w:p>
+        </w:tc>
+      </w:tr>
+      <w:tr>
+        <w:tc>
+          <w:tcPr>
+            <w:tcW w:w="4508" w:type="dxa"/>
+          </w:tcPr>
+          <w:p>
+            <w:pPr>
+              <w:rPr>
+                <w:lang w:val="en-NZ"/>
+              </w:rPr>
+            </w:pPr>
+            <w:r>
+              <w:rPr>
+                <w:lang w:val="en-NZ"/>
+              </w:rPr>
+              <w:t>R12</w:t>
+            </w:r>
+            <w:r>
+              <w:rPr>
+                <w:lang w:val="en-NZ"/>
+              </w:rPr>
+              <w:t xml:space="preserve"> Internet outage</w:t>
+            </w:r>
+          </w:p>
+        </w:tc>
+        <w:tc>
+          <w:tcPr>
+            <w:tcW w:w="4508" w:type="dxa"/>
+          </w:tcPr>
+          <w:p>
+            <w:pPr>
+              <w:keepNext/>
+              <w:rPr>
+                <w:lang w:val="en-NZ"/>
+              </w:rPr>
+            </w:pPr>
+          </w:p>
+        </w:tc>
+      </w:tr>
+      <w:tr>
+        <w:tc>
+          <w:tcPr>
+            <w:tcW w:w="4508" w:type="dxa"/>
+          </w:tcPr>
+          <w:p>
+            <w:pPr>
+              <w:rPr>
+                <w:lang w:val="en-NZ"/>
+              </w:rPr>
+            </w:pPr>
+            <w:r>
+              <w:rPr>
+                <w:lang w:val="en-NZ"/>
+              </w:rPr>
+              <w:t>R13</w:t>
+            </w:r>
+            <w:r>
+              <w:rPr>
+                <w:lang w:val="en-NZ"/>
+              </w:rPr>
+              <w:t xml:space="preserve"> Natural disaster or pandemic</w:t>
+            </w:r>
+          </w:p>
+        </w:tc>
+        <w:tc>
+          <w:tcPr>
+            <w:tcW w:w="4508" w:type="dxa"/>
+          </w:tcPr>
+          <w:p>
+            <w:pPr>
+              <w:keepNext/>
+              <w:rPr>
+                <w:lang w:val="en-NZ"/>
+              </w:rPr>
+            </w:pPr>
+          </w:p>
+        </w:tc>
+      </w:tr>
+      <w:tr>
+        <w:tc>
+          <w:tcPr>
+            <w:tcW w:w="4508" w:type="dxa"/>
+          </w:tcPr>
+          <w:p>
+            <w:pPr>
+              <w:rPr>
+                <w:lang w:val="en-NZ"/>
+              </w:rPr>
+            </w:pPr>
+            <w:r>
+              <w:rPr>
+                <w:lang w:val="en-NZ"/>
+              </w:rPr>
+              <w:t>R14</w:t>
+            </w:r>
+            <w:r>
+              <w:rPr>
+                <w:lang w:val="en-NZ"/>
+              </w:rPr>
+              <w:t xml:space="preserve"> Power outage</w:t>
+            </w:r>
+          </w:p>
+        </w:tc>
+        <w:tc>
+          <w:tcPr>
+            <w:tcW w:w="4508" w:type="dxa"/>
+          </w:tcPr>
+          <w:p>
+            <w:pPr>
+              <w:keepNext/>
+              <w:rPr>
+                <w:lang w:val="en-NZ"/>
+              </w:rPr>
+            </w:pPr>
+          </w:p>
+        </w:tc>
+      </w:tr>
+      <w:tr>
+        <w:tc>
+          <w:tcPr>
+            <w:tcW w:w="4508" w:type="dxa"/>
+          </w:tcPr>
+          <w:p>
+            <w:pPr>
+              <w:rPr>
+                <w:lang w:val="en-NZ"/>
+              </w:rPr>
+            </w:pPr>
+            <w:r>
+              <w:rPr>
+                <w:lang w:val="en-NZ"/>
+              </w:rPr>
+              <w:t>R15 Version control conflicts</w:t>
+            </w:r>
           </w:p>
         </w:tc>
         <w:tc>
@@ -7723,11 +8800,15 @@
           <w:p>
             <w:pPr>
               <w:rPr>
-                <w:lang w:val="en-NZ"/>
-              </w:rPr>
-            </w:pPr>
-            <w:r>
-              <w:rPr>
+                <w:b/>
+                <w:bCs/>
+                <w:lang w:val="en-NZ"/>
+              </w:rPr>
+            </w:pPr>
+            <w:r>
+              <w:rPr>
+                <w:b/>
+                <w:bCs/>
                 <w:lang w:val="en-NZ"/>
               </w:rPr>
               <w:t>Risk</w:t>
@@ -7741,11 +8822,15 @@
           <w:p>
             <w:pPr>
               <w:rPr>
-                <w:lang w:val="en-NZ"/>
-              </w:rPr>
-            </w:pPr>
-            <w:r>
-              <w:rPr>
+                <w:b/>
+                <w:bCs/>
+                <w:lang w:val="en-NZ"/>
+              </w:rPr>
+            </w:pPr>
+            <w:r>
+              <w:rPr>
+                <w:b/>
+                <w:bCs/>
                 <w:lang w:val="en-NZ"/>
               </w:rPr>
               <w:t>Contingency actions</w:t>
@@ -7768,7 +8853,7 @@
               <w:rPr>
                 <w:lang w:val="en-NZ"/>
               </w:rPr>
-              <w:t>R001 Data/File Lost/Corruption</w:t>
+              <w:t>R01 Missed deadlines</w:t>
             </w:r>
           </w:p>
         </w:tc>
@@ -7782,9 +8867,6 @@
                 <w:lang w:val="en-NZ"/>
               </w:rPr>
             </w:pPr>
-            <w:r>
-              <w:t>Set an urgent meeting and inform project coordinator or supervisor that there is a critical problem. Use Backup</w:t>
-            </w:r>
           </w:p>
         </w:tc>
       </w:tr>
@@ -7799,6 +8881,12 @@
                 <w:lang w:val="en-NZ"/>
               </w:rPr>
             </w:pPr>
+            <w:r>
+              <w:rPr>
+                <w:lang w:val="en-NZ"/>
+              </w:rPr>
+              <w:t>R02 Team member becomes unavailable</w:t>
+            </w:r>
           </w:p>
         </w:tc>
         <w:tc>
@@ -7825,6 +8913,12 @@
                 <w:lang w:val="en-NZ"/>
               </w:rPr>
             </w:pPr>
+            <w:r>
+              <w:rPr>
+                <w:lang w:val="en-NZ"/>
+              </w:rPr>
+              <w:t>R03 Academic integrity violation</w:t>
+            </w:r>
           </w:p>
         </w:tc>
         <w:tc>
@@ -7851,6 +8945,12 @@
                 <w:lang w:val="en-NZ"/>
               </w:rPr>
             </w:pPr>
+            <w:r>
+              <w:rPr>
+                <w:lang w:val="en-NZ"/>
+              </w:rPr>
+              <w:t>R04 Formatting inconsistencies</w:t>
+            </w:r>
           </w:p>
         </w:tc>
         <w:tc>
@@ -7877,6 +8977,367 @@
                 <w:lang w:val="en-NZ"/>
               </w:rPr>
             </w:pPr>
+            <w:r>
+              <w:rPr>
+                <w:lang w:val="en-NZ"/>
+              </w:rPr>
+              <w:t>R05 Misunderstood requirements</w:t>
+            </w:r>
+          </w:p>
+        </w:tc>
+        <w:tc>
+          <w:tcPr>
+            <w:tcW w:w="4508" w:type="dxa"/>
+          </w:tcPr>
+          <w:p>
+            <w:pPr>
+              <w:keepNext/>
+              <w:rPr>
+                <w:lang w:val="en-NZ"/>
+              </w:rPr>
+            </w:pPr>
+          </w:p>
+        </w:tc>
+      </w:tr>
+      <w:tr>
+        <w:tc>
+          <w:tcPr>
+            <w:tcW w:w="4508" w:type="dxa"/>
+          </w:tcPr>
+          <w:p>
+            <w:pPr>
+              <w:rPr>
+                <w:lang w:val="en-NZ"/>
+              </w:rPr>
+            </w:pPr>
+            <w:r>
+              <w:rPr>
+                <w:lang w:val="en-NZ"/>
+              </w:rPr>
+              <w:t>R06 Software difficulties</w:t>
+            </w:r>
+          </w:p>
+        </w:tc>
+        <w:tc>
+          <w:tcPr>
+            <w:tcW w:w="4508" w:type="dxa"/>
+          </w:tcPr>
+          <w:p>
+            <w:pPr>
+              <w:keepNext/>
+              <w:rPr>
+                <w:lang w:val="en-NZ"/>
+              </w:rPr>
+            </w:pPr>
+          </w:p>
+        </w:tc>
+      </w:tr>
+      <w:tr>
+        <w:tc>
+          <w:tcPr>
+            <w:tcW w:w="4508" w:type="dxa"/>
+          </w:tcPr>
+          <w:p>
+            <w:pPr>
+              <w:rPr>
+                <w:lang w:val="en-NZ"/>
+              </w:rPr>
+            </w:pPr>
+            <w:r>
+              <w:rPr>
+                <w:lang w:val="en-NZ"/>
+              </w:rPr>
+              <w:lastRenderedPageBreak/>
+              <w:t>R07 Hardware stolen</w:t>
+            </w:r>
+          </w:p>
+        </w:tc>
+        <w:tc>
+          <w:tcPr>
+            <w:tcW w:w="4508" w:type="dxa"/>
+          </w:tcPr>
+          <w:p>
+            <w:pPr>
+              <w:keepNext/>
+              <w:rPr>
+                <w:lang w:val="en-NZ"/>
+              </w:rPr>
+            </w:pPr>
+          </w:p>
+        </w:tc>
+      </w:tr>
+      <w:tr>
+        <w:tc>
+          <w:tcPr>
+            <w:tcW w:w="4508" w:type="dxa"/>
+          </w:tcPr>
+          <w:p>
+            <w:pPr>
+              <w:rPr>
+                <w:lang w:val="en-NZ"/>
+              </w:rPr>
+            </w:pPr>
+            <w:r>
+              <w:rPr>
+                <w:lang w:val="en-NZ"/>
+              </w:rPr>
+              <w:t>R08 Data/File loss/corruption</w:t>
+            </w:r>
+          </w:p>
+        </w:tc>
+        <w:tc>
+          <w:tcPr>
+            <w:tcW w:w="4508" w:type="dxa"/>
+          </w:tcPr>
+          <w:p>
+            <w:pPr>
+              <w:keepNext/>
+              <w:rPr>
+                <w:lang w:val="en-NZ"/>
+              </w:rPr>
+            </w:pPr>
+            <w:r>
+              <w:t>Set an urgent meeting</w:t>
+            </w:r>
+            <w:r>
+              <w:t>, a</w:t>
+            </w:r>
+            <w:r>
+              <w:t>ttempt to recover from backup.</w:t>
+            </w:r>
+            <w:r>
+              <w:t xml:space="preserve"> </w:t>
+            </w:r>
+            <w:r>
+              <w:t>I</w:t>
+            </w:r>
+            <w:r>
+              <w:t xml:space="preserve">nform project coordinator or </w:t>
+            </w:r>
+            <w:r>
+              <w:t xml:space="preserve">advisor </w:t>
+            </w:r>
+            <w:r>
+              <w:t>of the issue.</w:t>
+            </w:r>
+          </w:p>
+        </w:tc>
+      </w:tr>
+      <w:tr>
+        <w:tc>
+          <w:tcPr>
+            <w:tcW w:w="4508" w:type="dxa"/>
+          </w:tcPr>
+          <w:p>
+            <w:pPr>
+              <w:rPr>
+                <w:lang w:val="en-NZ"/>
+              </w:rPr>
+            </w:pPr>
+            <w:r>
+              <w:rPr>
+                <w:lang w:val="en-NZ"/>
+              </w:rPr>
+              <w:t>R09 Client becomes unavailable</w:t>
+            </w:r>
+          </w:p>
+        </w:tc>
+        <w:tc>
+          <w:tcPr>
+            <w:tcW w:w="4508" w:type="dxa"/>
+          </w:tcPr>
+          <w:p>
+            <w:pPr>
+              <w:keepNext/>
+              <w:rPr>
+                <w:lang w:val="en-NZ"/>
+              </w:rPr>
+            </w:pPr>
+          </w:p>
+        </w:tc>
+      </w:tr>
+      <w:tr>
+        <w:tc>
+          <w:tcPr>
+            <w:tcW w:w="4508" w:type="dxa"/>
+          </w:tcPr>
+          <w:p>
+            <w:pPr>
+              <w:rPr>
+                <w:lang w:val="en-NZ"/>
+              </w:rPr>
+            </w:pPr>
+            <w:r>
+              <w:rPr>
+                <w:lang w:val="en-NZ"/>
+              </w:rPr>
+              <w:t>R10 Advisor becomes unavailable</w:t>
+            </w:r>
+          </w:p>
+        </w:tc>
+        <w:tc>
+          <w:tcPr>
+            <w:tcW w:w="4508" w:type="dxa"/>
+          </w:tcPr>
+          <w:p>
+            <w:pPr>
+              <w:keepNext/>
+              <w:rPr>
+                <w:lang w:val="en-NZ"/>
+              </w:rPr>
+            </w:pPr>
+          </w:p>
+        </w:tc>
+      </w:tr>
+      <w:tr>
+        <w:tc>
+          <w:tcPr>
+            <w:tcW w:w="4508" w:type="dxa"/>
+          </w:tcPr>
+          <w:p>
+            <w:pPr>
+              <w:rPr>
+                <w:lang w:val="en-NZ"/>
+              </w:rPr>
+            </w:pPr>
+            <w:r>
+              <w:rPr>
+                <w:lang w:val="en-NZ"/>
+              </w:rPr>
+              <w:t>R11 Tech/Vendor becomes unavailable</w:t>
+            </w:r>
+          </w:p>
+        </w:tc>
+        <w:tc>
+          <w:tcPr>
+            <w:tcW w:w="4508" w:type="dxa"/>
+          </w:tcPr>
+          <w:p>
+            <w:pPr>
+              <w:keepNext/>
+              <w:rPr>
+                <w:lang w:val="en-NZ"/>
+              </w:rPr>
+            </w:pPr>
+          </w:p>
+        </w:tc>
+      </w:tr>
+      <w:tr>
+        <w:tc>
+          <w:tcPr>
+            <w:tcW w:w="4508" w:type="dxa"/>
+          </w:tcPr>
+          <w:p>
+            <w:pPr>
+              <w:rPr>
+                <w:lang w:val="en-NZ"/>
+              </w:rPr>
+            </w:pPr>
+            <w:r>
+              <w:rPr>
+                <w:lang w:val="en-NZ"/>
+              </w:rPr>
+              <w:t>R12 Internet outage</w:t>
+            </w:r>
+          </w:p>
+        </w:tc>
+        <w:tc>
+          <w:tcPr>
+            <w:tcW w:w="4508" w:type="dxa"/>
+          </w:tcPr>
+          <w:p>
+            <w:pPr>
+              <w:keepNext/>
+              <w:rPr>
+                <w:lang w:val="en-NZ"/>
+              </w:rPr>
+            </w:pPr>
+          </w:p>
+        </w:tc>
+      </w:tr>
+      <w:tr>
+        <w:tc>
+          <w:tcPr>
+            <w:tcW w:w="4508" w:type="dxa"/>
+          </w:tcPr>
+          <w:p>
+            <w:pPr>
+              <w:rPr>
+                <w:lang w:val="en-NZ"/>
+              </w:rPr>
+            </w:pPr>
+            <w:r>
+              <w:rPr>
+                <w:lang w:val="en-NZ"/>
+              </w:rPr>
+              <w:t>R13 Natural disaster or pandemic</w:t>
+            </w:r>
+          </w:p>
+        </w:tc>
+        <w:tc>
+          <w:tcPr>
+            <w:tcW w:w="4508" w:type="dxa"/>
+          </w:tcPr>
+          <w:p>
+            <w:pPr>
+              <w:keepNext/>
+              <w:rPr>
+                <w:lang w:val="en-NZ"/>
+              </w:rPr>
+            </w:pPr>
+          </w:p>
+        </w:tc>
+      </w:tr>
+      <w:tr>
+        <w:tc>
+          <w:tcPr>
+            <w:tcW w:w="4508" w:type="dxa"/>
+          </w:tcPr>
+          <w:p>
+            <w:pPr>
+              <w:rPr>
+                <w:lang w:val="en-NZ"/>
+              </w:rPr>
+            </w:pPr>
+            <w:r>
+              <w:rPr>
+                <w:lang w:val="en-NZ"/>
+              </w:rPr>
+              <w:t>R14 Power outage</w:t>
+            </w:r>
+          </w:p>
+        </w:tc>
+        <w:tc>
+          <w:tcPr>
+            <w:tcW w:w="4508" w:type="dxa"/>
+          </w:tcPr>
+          <w:p>
+            <w:pPr>
+              <w:keepNext/>
+              <w:rPr>
+                <w:lang w:val="en-NZ"/>
+              </w:rPr>
+            </w:pPr>
+          </w:p>
+        </w:tc>
+      </w:tr>
+      <w:tr>
+        <w:tc>
+          <w:tcPr>
+            <w:tcW w:w="4508" w:type="dxa"/>
+          </w:tcPr>
+          <w:p>
+            <w:pPr>
+              <w:rPr>
+                <w:lang w:val="en-NZ"/>
+              </w:rPr>
+            </w:pPr>
+            <w:r>
+              <w:rPr>
+                <w:lang w:val="en-NZ"/>
+              </w:rPr>
+              <w:t>R15 Version control conflicts</w:t>
+            </w:r>
           </w:p>
         </w:tc>
         <w:tc>
@@ -8089,7 +9550,6 @@
         <w:rPr>
           <w:lang w:val="en-NZ"/>
         </w:rPr>
-        <w:lastRenderedPageBreak/>
         <w:t>The video should be recorded using Zoom, Teams or similar software.</w:t>
       </w:r>
     </w:p>
@@ -8103,6 +9563,7 @@
         <w:rPr>
           <w:lang w:val="en-NZ"/>
         </w:rPr>
+        <w:lastRenderedPageBreak/>
         <w:t>Team members should have their cameras on as should the client.</w:t>
       </w:r>
     </w:p>
@@ -8292,7 +9753,7 @@
     <w:sectPr>
       <w:footerReference w:type="default" r:id="rId9"/>
       <w:pgSz w:w="11906" w:h="16838"/>
-      <w:pgMar w:top="1440" w:right="1440" w:bottom="1440" w:left="1440" w:header="708" w:footer="708" w:gutter="0"/>
+      <w:pgMar w:top="720" w:right="720" w:bottom="720" w:left="720" w:header="708" w:footer="708" w:gutter="0"/>
       <w:pgNumType w:start="0"/>
       <w:cols w:space="708"/>
       <w:titlePg/>

</xml_diff>

<commit_message>
added personnel section to main proposal
</commit_message>
<xml_diff>
--- a/Capstone Proposal.docx
+++ b/Capstone Proposal.docx
@@ -14,7 +14,6 @@
           <w:docPartUnique/>
         </w:docPartObj>
       </w:sdtPr>
-      <w:sdtEndPr/>
       <w:sdtContent>
         <w:p>
           <w:pPr>
@@ -3552,7 +3551,6 @@
                                     <w:dataBinding w:prefixMappings="xmlns:ns0='http://schemas.openxmlformats.org/officeDocument/2006/extended-properties' " w:xpath="/ns0:Properties[1]/ns0:Company[1]" w:storeItemID="{6668398D-A668-4E3E-A5EB-62B293D839F1}"/>
                                     <w:text/>
                                   </w:sdtPr>
-                                  <w:sdtEndPr/>
                                   <w:sdtContent>
                                     <w:r>
                                       <w:rPr>
@@ -3722,7 +3720,6 @@
                                     <w:dataBinding w:prefixMappings="xmlns:ns0='http://purl.org/dc/elements/1.1/' xmlns:ns1='http://schemas.openxmlformats.org/package/2006/metadata/core-properties' " w:xpath="/ns1:coreProperties[1]/ns0:title[1]" w:storeItemID="{6C3C8BC8-F283-45AE-878A-BAB7291924A1}"/>
                                     <w:text/>
                                   </w:sdtPr>
-                                  <w:sdtEndPr/>
                                   <w:sdtContent>
                                     <w:r>
                                       <w:rPr>
@@ -3758,7 +3755,6 @@
                                     <w:dataBinding w:prefixMappings="xmlns:ns0='http://purl.org/dc/elements/1.1/' xmlns:ns1='http://schemas.openxmlformats.org/package/2006/metadata/core-properties' " w:xpath="/ns1:coreProperties[1]/ns0:subject[1]" w:storeItemID="{6C3C8BC8-F283-45AE-878A-BAB7291924A1}"/>
                                     <w:text/>
                                   </w:sdtPr>
-                                  <w:sdtEndPr/>
                                   <w:sdtContent>
                                     <w:r>
                                       <w:rPr>
@@ -4104,7 +4100,7 @@
                                         </pic:cNvPicPr>
                                       </pic:nvPicPr>
                                       <pic:blipFill>
-                                        <a:blip r:embed="rId9">
+                                        <a:blip r:embed="rId8">
                                           <a:extLst>
                                             <a:ext uri="{28A0092B-C50C-407E-A947-70E740481C1C}">
                                               <a14:useLocalDpi xmlns:a14="http://schemas.microsoft.com/office/drawing/2010/main" val="0"/>
@@ -6205,53 +6201,221 @@
     </w:p>
     <w:p>
       <w:pPr>
-        <w:pStyle w:val="Heading1"/>
+        <w:rPr>
+          <w:lang w:val="en-NZ"/>
+        </w:rPr>
       </w:pPr>
-      <w:bookmarkStart w:id="10" w:name="_Toc236403137"/>
-      <w:r>
-        <w:t>Project Personnel</w:t>
-      </w:r>
-      <w:bookmarkEnd w:id="10"/>
     </w:p>
     <w:p>
       <w:pPr>
-        <w:pStyle w:val="Heading2"/>
+        <w:rPr>
+          <w:lang w:val="en-NZ"/>
+        </w:rPr>
       </w:pPr>
-      <w:bookmarkStart w:id="11" w:name="_Toc236403138"/>
+    </w:p>
+    <w:p>
+      <w:pPr>
+        <w:rPr>
+          <w:lang w:val="en-NZ"/>
+        </w:rPr>
+      </w:pPr>
+    </w:p>
+    <w:p>
+      <w:pPr>
+        <w:rPr>
+          <w:lang w:val="en-NZ"/>
+        </w:rPr>
+      </w:pPr>
+    </w:p>
+    <w:p>
+      <w:pPr>
+        <w:rPr>
+          <w:lang w:val="en-NZ"/>
+        </w:rPr>
+      </w:pPr>
+    </w:p>
+    <w:p>
+      <w:pPr>
+        <w:rPr>
+          <w:lang w:val="en-NZ"/>
+        </w:rPr>
+      </w:pPr>
+    </w:p>
+    <w:p>
+      <w:pPr>
+        <w:rPr>
+          <w:lang w:val="en-NZ"/>
+        </w:rPr>
+      </w:pPr>
+    </w:p>
+    <w:p>
+      <w:pPr>
+        <w:rPr>
+          <w:lang w:val="en-NZ"/>
+        </w:rPr>
+      </w:pPr>
+    </w:p>
+    <w:p>
+      <w:pPr>
+        <w:rPr>
+          <w:lang w:val="en-NZ"/>
+        </w:rPr>
+      </w:pPr>
+    </w:p>
+    <w:p>
+      <w:pPr>
+        <w:rPr>
+          <w:lang w:val="en-NZ"/>
+        </w:rPr>
+      </w:pPr>
+    </w:p>
+    <w:p>
+      <w:pPr>
+        <w:rPr>
+          <w:lang w:val="en-NZ"/>
+        </w:rPr>
+      </w:pPr>
+    </w:p>
+    <w:p>
+      <w:pPr>
+        <w:rPr>
+          <w:lang w:val="en-NZ"/>
+        </w:rPr>
+      </w:pPr>
+    </w:p>
+    <w:p>
+      <w:pPr>
+        <w:rPr>
+          <w:lang w:val="en-NZ"/>
+        </w:rPr>
+      </w:pPr>
+    </w:p>
+    <w:p>
+      <w:pPr>
+        <w:rPr>
+          <w:lang w:val="en-NZ"/>
+        </w:rPr>
+      </w:pPr>
+    </w:p>
+    <w:p>
+      <w:pPr>
+        <w:rPr>
+          <w:lang w:val="en-NZ"/>
+        </w:rPr>
+      </w:pPr>
+    </w:p>
+    <w:p>
+      <w:pPr>
+        <w:rPr>
+          <w:lang w:val="en-NZ"/>
+        </w:rPr>
+      </w:pPr>
+    </w:p>
+    <w:p>
+      <w:pPr>
+        <w:rPr>
+          <w:lang w:val="en-NZ"/>
+        </w:rPr>
+      </w:pPr>
+    </w:p>
+    <w:p>
+      <w:pPr>
+        <w:rPr>
+          <w:lang w:val="en-NZ"/>
+        </w:rPr>
+      </w:pPr>
+    </w:p>
+    <w:p>
+      <w:pPr>
+        <w:pStyle w:val="Heading1"/>
+        <w:rPr>
+          <w:highlight w:val="cyan"/>
+        </w:rPr>
+      </w:pPr>
+      <w:bookmarkStart w:id="10" w:name="_Toc236403144"/>
+      <w:bookmarkStart w:id="11" w:name="_Toc236665775"/>
       <w:r>
-        <w:t>Client details including organisation</w:t>
+        <w:rPr>
+          <w:highlight w:val="cyan"/>
+        </w:rPr>
+        <w:lastRenderedPageBreak/>
+        <w:t>Project Personnel</w:t>
       </w:r>
       <w:bookmarkEnd w:id="11"/>
     </w:p>
     <w:p>
       <w:pPr>
         <w:pStyle w:val="Heading2"/>
+        <w:rPr>
+          <w:highlight w:val="cyan"/>
+        </w:rPr>
       </w:pPr>
-      <w:bookmarkStart w:id="12" w:name="_Toc236403139"/>
+      <w:bookmarkStart w:id="12" w:name="_Toc236665776"/>
       <w:r>
-        <w:t>Group Members</w:t>
+        <w:rPr>
+          <w:highlight w:val="cyan"/>
+        </w:rPr>
+        <w:t>Client details including organisation</w:t>
       </w:r>
       <w:bookmarkEnd w:id="12"/>
     </w:p>
     <w:p>
       <w:pPr>
-        <w:pStyle w:val="Heading2"/>
+        <w:pStyle w:val="TNR"/>
+        <w:rPr>
+          <w:highlight w:val="cyan"/>
+        </w:rPr>
       </w:pPr>
-      <w:bookmarkStart w:id="13" w:name="_Toc236403140"/>
       <w:r>
-        <w:t>Project Advisor</w:t>
+        <w:rPr>
+          <w:highlight w:val="cyan"/>
+        </w:rPr>
+        <w:t xml:space="preserve">Geoff Gordon is a staff member of </w:t>
       </w:r>
-      <w:bookmarkEnd w:id="13"/>
+      <w:proofErr w:type="spellStart"/>
+      <w:r>
+        <w:rPr>
+          <w:highlight w:val="cyan"/>
+        </w:rPr>
+        <w:t>WelTec</w:t>
+      </w:r>
+      <w:proofErr w:type="spellEnd"/>
+      <w:r>
+        <w:rPr>
+          <w:highlight w:val="cyan"/>
+        </w:rPr>
+        <w:t>, he provides technical networking expertise in the context of the tertiary environment. He has familiarity, curiosity and deep interest in AI models and their behaviour, as well as their associated hardware/platforms. He is interested in whether AI is has a place in the field of digital forensics.</w:t>
+      </w:r>
+    </w:p>
+    <w:p>
+      <w:pPr>
+        <w:pStyle w:val="TNR"/>
+        <w:rPr>
+          <w:highlight w:val="cyan"/>
+        </w:rPr>
+      </w:pPr>
+      <w:r>
+        <w:rPr>
+          <w:highlight w:val="cyan"/>
+        </w:rPr>
+        <w:t xml:space="preserve">Geoff has been the client on multiple previous capstone IT projects with a focus on AI. One example is an AI chatbot for IT support at the school. </w:t>
+      </w:r>
     </w:p>
     <w:p>
       <w:pPr>
         <w:pStyle w:val="Heading2"/>
+        <w:rPr>
+          <w:highlight w:val="cyan"/>
+        </w:rPr>
       </w:pPr>
-      <w:bookmarkStart w:id="14" w:name="_Toc236403141"/>
+      <w:bookmarkStart w:id="13" w:name="_Toc236665777"/>
       <w:r>
-        <w:t>Communication plan</w:t>
+        <w:rPr>
+          <w:highlight w:val="cyan"/>
+        </w:rPr>
+        <w:t>Group Members</w:t>
       </w:r>
-      <w:bookmarkEnd w:id="14"/>
+      <w:bookmarkEnd w:id="13"/>
     </w:p>
     <w:tbl>
       <w:tblPr>
@@ -6260,23 +6424,25 @@
         <w:tblLook w:val="04A0" w:firstRow="1" w:lastRow="0" w:firstColumn="1" w:lastColumn="0" w:noHBand="0" w:noVBand="1"/>
       </w:tblPr>
       <w:tblGrid>
-        <w:gridCol w:w="4508"/>
-        <w:gridCol w:w="4508"/>
+        <w:gridCol w:w="1980"/>
+        <w:gridCol w:w="1276"/>
+        <w:gridCol w:w="7200"/>
       </w:tblGrid>
       <w:tr>
         <w:tc>
           <w:tcPr>
-            <w:tcW w:w="4508" w:type="dxa"/>
-          </w:tcPr>
-          <w:p>
-            <w:pPr>
-              <w:rPr>
-                <w:lang w:val="en-NZ"/>
-              </w:rPr>
-            </w:pPr>
-            <w:r>
-              <w:rPr>
-                <w:lang w:val="en-NZ"/>
+            <w:tcW w:w="1980" w:type="dxa"/>
+          </w:tcPr>
+          <w:p>
+            <w:pPr>
+              <w:pStyle w:val="TNR"/>
+              <w:rPr>
+                <w:highlight w:val="cyan"/>
+              </w:rPr>
+            </w:pPr>
+            <w:r>
+              <w:rPr>
+                <w:highlight w:val="cyan"/>
               </w:rPr>
               <w:t>Name</w:t>
             </w:r>
@@ -6284,19 +6450,39 @@
         </w:tc>
         <w:tc>
           <w:tcPr>
-            <w:tcW w:w="4508" w:type="dxa"/>
-          </w:tcPr>
-          <w:p>
-            <w:pPr>
-              <w:rPr>
-                <w:lang w:val="en-NZ"/>
-              </w:rPr>
-            </w:pPr>
-            <w:r>
-              <w:rPr>
-                <w:lang w:val="en-NZ"/>
-              </w:rPr>
-              <w:t>Email address</w:t>
+            <w:tcW w:w="1276" w:type="dxa"/>
+          </w:tcPr>
+          <w:p>
+            <w:pPr>
+              <w:pStyle w:val="TNR"/>
+              <w:rPr>
+                <w:highlight w:val="cyan"/>
+              </w:rPr>
+            </w:pPr>
+            <w:r>
+              <w:rPr>
+                <w:highlight w:val="cyan"/>
+              </w:rPr>
+              <w:t>Role</w:t>
+            </w:r>
+          </w:p>
+        </w:tc>
+        <w:tc>
+          <w:tcPr>
+            <w:tcW w:w="7200" w:type="dxa"/>
+          </w:tcPr>
+          <w:p>
+            <w:pPr>
+              <w:pStyle w:val="TNR"/>
+              <w:rPr>
+                <w:highlight w:val="cyan"/>
+              </w:rPr>
+            </w:pPr>
+            <w:r>
+              <w:rPr>
+                <w:highlight w:val="cyan"/>
+              </w:rPr>
+              <w:t>Main duties</w:t>
             </w:r>
           </w:p>
         </w:tc>
@@ -6304,237 +6490,743 @@
       <w:tr>
         <w:tc>
           <w:tcPr>
-            <w:tcW w:w="4508" w:type="dxa"/>
-          </w:tcPr>
-          <w:p>
-            <w:pPr>
-              <w:rPr>
-                <w:lang w:val="en-NZ"/>
-              </w:rPr>
-            </w:pPr>
-            <w:r>
-              <w:rPr>
-                <w:lang w:val="en-NZ"/>
-              </w:rPr>
-              <w:t>Client</w:t>
-            </w:r>
-            <w:r>
-              <w:rPr>
-                <w:lang w:val="en-NZ"/>
-              </w:rPr>
-              <w:t>: Geoff Gordon</w:t>
-            </w:r>
-          </w:p>
-        </w:tc>
-        <w:tc>
-          <w:tcPr>
-            <w:tcW w:w="4508" w:type="dxa"/>
-          </w:tcPr>
-          <w:p>
-            <w:pPr>
-              <w:rPr>
-                <w:lang w:val="en-NZ"/>
-              </w:rPr>
-            </w:pPr>
+            <w:tcW w:w="1980" w:type="dxa"/>
+          </w:tcPr>
+          <w:p>
+            <w:pPr>
+              <w:pStyle w:val="TNR"/>
+              <w:rPr>
+                <w:highlight w:val="cyan"/>
+              </w:rPr>
+            </w:pPr>
+            <w:r>
+              <w:rPr>
+                <w:highlight w:val="cyan"/>
+              </w:rPr>
+              <w:t>Matt Baker</w:t>
+            </w:r>
+          </w:p>
+        </w:tc>
+        <w:tc>
+          <w:tcPr>
+            <w:tcW w:w="1276" w:type="dxa"/>
+          </w:tcPr>
+          <w:p>
+            <w:pPr>
+              <w:pStyle w:val="TNR"/>
+              <w:rPr>
+                <w:highlight w:val="cyan"/>
+              </w:rPr>
+            </w:pPr>
+            <w:r>
+              <w:rPr>
+                <w:highlight w:val="cyan"/>
+              </w:rPr>
+              <w:t>Developer</w:t>
+            </w:r>
+          </w:p>
+        </w:tc>
+        <w:tc>
+          <w:tcPr>
+            <w:tcW w:w="7200" w:type="dxa"/>
+          </w:tcPr>
+          <w:p>
+            <w:pPr>
+              <w:pStyle w:val="TNR"/>
+              <w:rPr>
+                <w:highlight w:val="cyan"/>
+              </w:rPr>
+            </w:pPr>
+            <w:r>
+              <w:rPr>
+                <w:highlight w:val="cyan"/>
+              </w:rPr>
+              <w:t xml:space="preserve">Installation, configuration, research, troubleshooting, and implementation of software/tools/operating systems required to support our investigation. Integration of AI into our forensics tools. Designing testing environments and performing forensic activities with legacy and AI based forensics tools, recording the results under a reliable doctrine. </w:t>
+            </w:r>
           </w:p>
         </w:tc>
       </w:tr>
       <w:tr>
         <w:tc>
           <w:tcPr>
-            <w:tcW w:w="4508" w:type="dxa"/>
-          </w:tcPr>
-          <w:p>
-            <w:pPr>
-              <w:rPr>
-                <w:lang w:val="en-NZ"/>
-              </w:rPr>
-            </w:pPr>
-            <w:r>
-              <w:rPr>
-                <w:lang w:val="en-NZ"/>
-              </w:rPr>
-              <w:t>Project advisor</w:t>
-            </w:r>
-            <w:r>
-              <w:rPr>
-                <w:lang w:val="en-NZ"/>
-              </w:rPr>
-              <w:t xml:space="preserve">: Clement </w:t>
-            </w:r>
-            <w:proofErr w:type="spellStart"/>
-            <w:r>
-              <w:rPr>
-                <w:lang w:val="en-NZ"/>
-              </w:rPr>
-              <w:t>Swarnappa</w:t>
-            </w:r>
-            <w:proofErr w:type="spellEnd"/>
-          </w:p>
-        </w:tc>
-        <w:tc>
-          <w:tcPr>
-            <w:tcW w:w="4508" w:type="dxa"/>
-          </w:tcPr>
-          <w:p>
-            <w:pPr>
-              <w:rPr>
-                <w:lang w:val="en-NZ"/>
-              </w:rPr>
-            </w:pPr>
+            <w:tcW w:w="1980" w:type="dxa"/>
+          </w:tcPr>
+          <w:p>
+            <w:pPr>
+              <w:pStyle w:val="TNR"/>
+              <w:rPr>
+                <w:highlight w:val="cyan"/>
+              </w:rPr>
+            </w:pPr>
+            <w:r>
+              <w:rPr>
+                <w:highlight w:val="cyan"/>
+              </w:rPr>
+              <w:t>Sam Davies</w:t>
+            </w:r>
+          </w:p>
+        </w:tc>
+        <w:tc>
+          <w:tcPr>
+            <w:tcW w:w="1276" w:type="dxa"/>
+          </w:tcPr>
+          <w:p>
+            <w:pPr>
+              <w:pStyle w:val="TNR"/>
+              <w:rPr>
+                <w:highlight w:val="cyan"/>
+              </w:rPr>
+            </w:pPr>
+            <w:r>
+              <w:rPr>
+                <w:highlight w:val="cyan"/>
+              </w:rPr>
+              <w:t>Developer</w:t>
+            </w:r>
+          </w:p>
+        </w:tc>
+        <w:tc>
+          <w:tcPr>
+            <w:tcW w:w="7200" w:type="dxa"/>
+          </w:tcPr>
+          <w:p>
+            <w:pPr>
+              <w:pStyle w:val="TNR"/>
+              <w:rPr>
+                <w:highlight w:val="cyan"/>
+              </w:rPr>
+            </w:pPr>
+            <w:r>
+              <w:rPr>
+                <w:highlight w:val="cyan"/>
+              </w:rPr>
+              <w:t>Maintain availability of the physical PC used to power the AI models. Ensures that processing power is consistent before testing via benchmark. Employing forensics tools during tests and communicating lessons from previous similar projects.</w:t>
+            </w:r>
           </w:p>
         </w:tc>
       </w:tr>
       <w:tr>
         <w:tc>
           <w:tcPr>
-            <w:tcW w:w="4508" w:type="dxa"/>
-          </w:tcPr>
-          <w:p>
-            <w:pPr>
-              <w:rPr>
-                <w:lang w:val="en-NZ"/>
-              </w:rPr>
-            </w:pPr>
-            <w:r>
-              <w:rPr>
-                <w:lang w:val="en-NZ"/>
-              </w:rPr>
-              <w:t>Group project manager</w:t>
-            </w:r>
-            <w:r>
-              <w:rPr>
-                <w:lang w:val="en-NZ"/>
-              </w:rPr>
-              <w:t xml:space="preserve">: </w:t>
-            </w:r>
-            <w:r>
-              <w:rPr>
-                <w:lang w:val="en-NZ"/>
-              </w:rPr>
-              <w:t>Dave Sushames</w:t>
-            </w:r>
-          </w:p>
-        </w:tc>
-        <w:tc>
-          <w:tcPr>
-            <w:tcW w:w="4508" w:type="dxa"/>
-          </w:tcPr>
-          <w:p>
-            <w:pPr>
-              <w:rPr>
-                <w:lang w:val="en-NZ"/>
-              </w:rPr>
-            </w:pPr>
+            <w:tcW w:w="1980" w:type="dxa"/>
+          </w:tcPr>
+          <w:p>
+            <w:pPr>
+              <w:pStyle w:val="TNR"/>
+              <w:rPr>
+                <w:highlight w:val="cyan"/>
+              </w:rPr>
+            </w:pPr>
+            <w:r>
+              <w:rPr>
+                <w:highlight w:val="cyan"/>
+              </w:rPr>
+              <w:t>Olivia Hey</w:t>
+            </w:r>
+          </w:p>
+        </w:tc>
+        <w:tc>
+          <w:tcPr>
+            <w:tcW w:w="1276" w:type="dxa"/>
+          </w:tcPr>
+          <w:p>
+            <w:pPr>
+              <w:pStyle w:val="TNR"/>
+              <w:rPr>
+                <w:highlight w:val="cyan"/>
+              </w:rPr>
+            </w:pPr>
+            <w:r>
+              <w:rPr>
+                <w:highlight w:val="cyan"/>
+              </w:rPr>
+              <w:t>Developer</w:t>
+            </w:r>
+          </w:p>
+        </w:tc>
+        <w:tc>
+          <w:tcPr>
+            <w:tcW w:w="7200" w:type="dxa"/>
+          </w:tcPr>
+          <w:p>
+            <w:pPr>
+              <w:pStyle w:val="TNR"/>
+              <w:rPr>
+                <w:highlight w:val="cyan"/>
+              </w:rPr>
+            </w:pPr>
+            <w:r>
+              <w:rPr>
+                <w:highlight w:val="cyan"/>
+              </w:rPr>
+              <w:t>Documentation, organization of evidence, forensic disk images and datasets, research material as well as partaking in the testing itself. Keeping track of testing documentation, organizing results for testing under diverse criteria.</w:t>
+            </w:r>
           </w:p>
         </w:tc>
       </w:tr>
       <w:tr>
         <w:tc>
           <w:tcPr>
-            <w:tcW w:w="4508" w:type="dxa"/>
-          </w:tcPr>
-          <w:p>
-            <w:pPr>
-              <w:rPr>
-                <w:lang w:val="en-NZ"/>
-              </w:rPr>
-            </w:pPr>
-            <w:r>
-              <w:rPr>
-                <w:lang w:val="en-NZ"/>
-              </w:rPr>
-              <w:t>Group member</w:t>
-            </w:r>
-            <w:r>
-              <w:rPr>
-                <w:lang w:val="en-NZ"/>
-              </w:rPr>
-              <w:t>: Olivia Hey</w:t>
-            </w:r>
-          </w:p>
-        </w:tc>
-        <w:tc>
-          <w:tcPr>
-            <w:tcW w:w="4508" w:type="dxa"/>
-          </w:tcPr>
-          <w:p>
-            <w:pPr>
-              <w:rPr>
-                <w:lang w:val="en-NZ"/>
-              </w:rPr>
-            </w:pPr>
+            <w:tcW w:w="1980" w:type="dxa"/>
+          </w:tcPr>
+          <w:p>
+            <w:pPr>
+              <w:pStyle w:val="TNR"/>
+              <w:rPr>
+                <w:highlight w:val="cyan"/>
+              </w:rPr>
+            </w:pPr>
+            <w:r>
+              <w:rPr>
+                <w:highlight w:val="cyan"/>
+              </w:rPr>
+              <w:t>Dave Sushames</w:t>
+            </w:r>
+          </w:p>
+        </w:tc>
+        <w:tc>
+          <w:tcPr>
+            <w:tcW w:w="1276" w:type="dxa"/>
+          </w:tcPr>
+          <w:p>
+            <w:pPr>
+              <w:pStyle w:val="TNR"/>
+              <w:rPr>
+                <w:highlight w:val="cyan"/>
+              </w:rPr>
+            </w:pPr>
+            <w:r>
+              <w:rPr>
+                <w:highlight w:val="cyan"/>
+              </w:rPr>
+              <w:t>Project Manager</w:t>
+            </w:r>
+          </w:p>
+        </w:tc>
+        <w:tc>
+          <w:tcPr>
+            <w:tcW w:w="7200" w:type="dxa"/>
+          </w:tcPr>
+          <w:p>
+            <w:pPr>
+              <w:pStyle w:val="TNR"/>
+              <w:rPr>
+                <w:highlight w:val="cyan"/>
+              </w:rPr>
+            </w:pPr>
+            <w:r>
+              <w:rPr>
+                <w:highlight w:val="cyan"/>
+              </w:rPr>
+              <w:t>Organises meetings with the client/advisor, consolidates individual log hours into the group hours log, manages the git repository, contributes to collaborative documents and conducts research. Ensures we are following the chosen methodology.</w:t>
+            </w:r>
+          </w:p>
+        </w:tc>
+      </w:tr>
+    </w:tbl>
+    <w:p>
+      <w:pPr>
+        <w:rPr>
+          <w:highlight w:val="cyan"/>
+          <w:lang w:val="en-NZ"/>
+        </w:rPr>
+      </w:pPr>
+    </w:p>
+    <w:p>
+      <w:pPr>
+        <w:pStyle w:val="Heading2"/>
+        <w:rPr>
+          <w:highlight w:val="cyan"/>
+        </w:rPr>
+      </w:pPr>
+      <w:bookmarkStart w:id="14" w:name="_Toc236665778"/>
+      <w:r>
+        <w:rPr>
+          <w:highlight w:val="cyan"/>
+        </w:rPr>
+        <w:t>Project Advisor</w:t>
+      </w:r>
+      <w:bookmarkEnd w:id="14"/>
+    </w:p>
+    <w:p>
+      <w:pPr>
+        <w:pStyle w:val="TNR"/>
+        <w:rPr>
+          <w:highlight w:val="cyan"/>
+        </w:rPr>
+      </w:pPr>
+      <w:r>
+        <w:rPr>
+          <w:highlight w:val="cyan"/>
+        </w:rPr>
+        <w:t>The project advisor for this project is Clement Swarnappa.</w:t>
+      </w:r>
+    </w:p>
+    <w:p>
+      <w:pPr>
+        <w:pStyle w:val="TNR"/>
+        <w:rPr>
+          <w:highlight w:val="cyan"/>
+        </w:rPr>
+      </w:pPr>
+      <w:bookmarkStart w:id="15" w:name="_Toc236665779"/>
+      <w:r>
+        <w:rPr>
+          <w:highlight w:val="cyan"/>
+        </w:rPr>
+        <w:t>Communication plan</w:t>
+      </w:r>
+      <w:bookmarkEnd w:id="15"/>
+    </w:p>
+    <w:tbl>
+      <w:tblPr>
+        <w:tblStyle w:val="TableGrid"/>
+        <w:tblW w:w="0" w:type="auto"/>
+        <w:tblLook w:val="04A0" w:firstRow="1" w:lastRow="0" w:firstColumn="1" w:lastColumn="0" w:noHBand="0" w:noVBand="1"/>
+      </w:tblPr>
+      <w:tblGrid>
+        <w:gridCol w:w="3361"/>
+        <w:gridCol w:w="4134"/>
+        <w:gridCol w:w="2961"/>
+      </w:tblGrid>
+      <w:tr>
+        <w:tc>
+          <w:tcPr>
+            <w:tcW w:w="3361" w:type="dxa"/>
+          </w:tcPr>
+          <w:p>
+            <w:pPr>
+              <w:pStyle w:val="TNR"/>
+              <w:rPr>
+                <w:highlight w:val="cyan"/>
+              </w:rPr>
+            </w:pPr>
+            <w:r>
+              <w:rPr>
+                <w:highlight w:val="cyan"/>
+              </w:rPr>
+              <w:t>Name</w:t>
+            </w:r>
+          </w:p>
+        </w:tc>
+        <w:tc>
+          <w:tcPr>
+            <w:tcW w:w="4134" w:type="dxa"/>
+          </w:tcPr>
+          <w:p>
+            <w:pPr>
+              <w:pStyle w:val="TNR"/>
+              <w:rPr>
+                <w:highlight w:val="cyan"/>
+              </w:rPr>
+            </w:pPr>
+            <w:r>
+              <w:rPr>
+                <w:highlight w:val="cyan"/>
+              </w:rPr>
+              <w:t>Email address</w:t>
+            </w:r>
+          </w:p>
+        </w:tc>
+        <w:tc>
+          <w:tcPr>
+            <w:tcW w:w="2961" w:type="dxa"/>
+          </w:tcPr>
+          <w:p>
+            <w:pPr>
+              <w:pStyle w:val="TNR"/>
+              <w:rPr>
+                <w:highlight w:val="cyan"/>
+              </w:rPr>
+            </w:pPr>
+            <w:r>
+              <w:rPr>
+                <w:highlight w:val="cyan"/>
+              </w:rPr>
+              <w:t>Primary Method of Contact</w:t>
+            </w:r>
           </w:p>
         </w:tc>
       </w:tr>
       <w:tr>
         <w:tc>
           <w:tcPr>
-            <w:tcW w:w="4508" w:type="dxa"/>
-          </w:tcPr>
-          <w:p>
-            <w:pPr>
-              <w:rPr>
-                <w:lang w:val="en-NZ"/>
-              </w:rPr>
-            </w:pPr>
-            <w:r>
-              <w:rPr>
-                <w:lang w:val="en-NZ"/>
-              </w:rPr>
-              <w:t>Group member</w:t>
-            </w:r>
-            <w:r>
-              <w:rPr>
-                <w:lang w:val="en-NZ"/>
-              </w:rPr>
-              <w:t>: Matt Baker</w:t>
-            </w:r>
-          </w:p>
-        </w:tc>
-        <w:tc>
-          <w:tcPr>
-            <w:tcW w:w="4508" w:type="dxa"/>
-          </w:tcPr>
-          <w:p>
-            <w:pPr>
-              <w:rPr>
-                <w:lang w:val="en-NZ"/>
-              </w:rPr>
-            </w:pPr>
+            <w:tcW w:w="3361" w:type="dxa"/>
+          </w:tcPr>
+          <w:p>
+            <w:pPr>
+              <w:pStyle w:val="TNR"/>
+              <w:rPr>
+                <w:highlight w:val="cyan"/>
+              </w:rPr>
+            </w:pPr>
+            <w:r>
+              <w:rPr>
+                <w:highlight w:val="cyan"/>
+              </w:rPr>
+              <w:t>Client: Geoff Gordon</w:t>
+            </w:r>
+          </w:p>
+        </w:tc>
+        <w:tc>
+          <w:tcPr>
+            <w:tcW w:w="4134" w:type="dxa"/>
+          </w:tcPr>
+          <w:p>
+            <w:pPr>
+              <w:pStyle w:val="TNR"/>
+              <w:rPr>
+                <w:highlight w:val="cyan"/>
+              </w:rPr>
+            </w:pPr>
+            <w:r>
+              <w:rPr>
+                <w:highlight w:val="cyan"/>
+              </w:rPr>
+              <w:t>Geoff.Gordon@whitireia.ac.nz</w:t>
+            </w:r>
+          </w:p>
+        </w:tc>
+        <w:tc>
+          <w:tcPr>
+            <w:tcW w:w="2961" w:type="dxa"/>
+          </w:tcPr>
+          <w:p>
+            <w:pPr>
+              <w:pStyle w:val="TNR"/>
+              <w:rPr>
+                <w:highlight w:val="cyan"/>
+              </w:rPr>
+            </w:pPr>
+            <w:r>
+              <w:rPr>
+                <w:highlight w:val="cyan"/>
+              </w:rPr>
+              <w:t>Email</w:t>
+            </w:r>
           </w:p>
         </w:tc>
       </w:tr>
       <w:tr>
         <w:tc>
           <w:tcPr>
-            <w:tcW w:w="4508" w:type="dxa"/>
-          </w:tcPr>
-          <w:p>
-            <w:pPr>
-              <w:rPr>
-                <w:lang w:val="en-NZ"/>
-              </w:rPr>
-            </w:pPr>
-            <w:r>
-              <w:rPr>
-                <w:lang w:val="en-NZ"/>
-              </w:rPr>
+            <w:tcW w:w="3361" w:type="dxa"/>
+          </w:tcPr>
+          <w:p>
+            <w:pPr>
+              <w:pStyle w:val="TNR"/>
+              <w:rPr>
+                <w:highlight w:val="cyan"/>
+              </w:rPr>
+            </w:pPr>
+            <w:r>
+              <w:rPr>
+                <w:highlight w:val="cyan"/>
+              </w:rPr>
+              <w:t xml:space="preserve">Project advisor: Clement </w:t>
+            </w:r>
+            <w:proofErr w:type="spellStart"/>
+            <w:r>
+              <w:rPr>
+                <w:highlight w:val="cyan"/>
+              </w:rPr>
+              <w:t>Swarnappa</w:t>
+            </w:r>
+            <w:proofErr w:type="spellEnd"/>
+          </w:p>
+        </w:tc>
+        <w:tc>
+          <w:tcPr>
+            <w:tcW w:w="4134" w:type="dxa"/>
+          </w:tcPr>
+          <w:p>
+            <w:pPr>
+              <w:pStyle w:val="TNR"/>
+              <w:rPr>
+                <w:highlight w:val="cyan"/>
+              </w:rPr>
+            </w:pPr>
+            <w:r>
+              <w:rPr>
+                <w:highlight w:val="cyan"/>
+              </w:rPr>
+              <w:t>Clement.Sudhakar@weltec.ac.nz</w:t>
+            </w:r>
+          </w:p>
+        </w:tc>
+        <w:tc>
+          <w:tcPr>
+            <w:tcW w:w="2961" w:type="dxa"/>
+          </w:tcPr>
+          <w:p>
+            <w:pPr>
+              <w:pStyle w:val="TNR"/>
+              <w:rPr>
+                <w:highlight w:val="cyan"/>
+              </w:rPr>
+            </w:pPr>
+            <w:r>
+              <w:rPr>
+                <w:highlight w:val="cyan"/>
+              </w:rPr>
+              <w:t>Email</w:t>
+            </w:r>
+          </w:p>
+        </w:tc>
+      </w:tr>
+      <w:tr>
+        <w:tc>
+          <w:tcPr>
+            <w:tcW w:w="3361" w:type="dxa"/>
+          </w:tcPr>
+          <w:p>
+            <w:pPr>
+              <w:pStyle w:val="TNR"/>
+              <w:rPr>
+                <w:highlight w:val="cyan"/>
+              </w:rPr>
+            </w:pPr>
+            <w:r>
+              <w:rPr>
+                <w:highlight w:val="cyan"/>
+              </w:rPr>
+              <w:t>Group project manager: Dave Sushames</w:t>
+            </w:r>
+          </w:p>
+        </w:tc>
+        <w:tc>
+          <w:tcPr>
+            <w:tcW w:w="4134" w:type="dxa"/>
+          </w:tcPr>
+          <w:p>
+            <w:pPr>
+              <w:pStyle w:val="TNR"/>
+              <w:rPr>
+                <w:highlight w:val="cyan"/>
+              </w:rPr>
+            </w:pPr>
+            <w:r>
+              <w:rPr>
+                <w:highlight w:val="cyan"/>
+              </w:rPr>
+              <w:t>david.sushames@gmail.com</w:t>
+            </w:r>
+          </w:p>
+        </w:tc>
+        <w:tc>
+          <w:tcPr>
+            <w:tcW w:w="2961" w:type="dxa"/>
+          </w:tcPr>
+          <w:p>
+            <w:pPr>
+              <w:pStyle w:val="TNR"/>
+              <w:rPr>
+                <w:highlight w:val="cyan"/>
+              </w:rPr>
+            </w:pPr>
+            <w:r>
+              <w:rPr>
+                <w:highlight w:val="cyan"/>
+              </w:rPr>
+              <w:t>Discord</w:t>
+            </w:r>
+          </w:p>
+        </w:tc>
+      </w:tr>
+      <w:tr>
+        <w:tc>
+          <w:tcPr>
+            <w:tcW w:w="3361" w:type="dxa"/>
+          </w:tcPr>
+          <w:p>
+            <w:pPr>
+              <w:pStyle w:val="TNR"/>
+              <w:rPr>
+                <w:highlight w:val="cyan"/>
+              </w:rPr>
+            </w:pPr>
+            <w:r>
+              <w:rPr>
+                <w:highlight w:val="cyan"/>
+              </w:rPr>
+              <w:t>Group member: Olivia Hey</w:t>
+            </w:r>
+          </w:p>
+        </w:tc>
+        <w:tc>
+          <w:tcPr>
+            <w:tcW w:w="4134" w:type="dxa"/>
+          </w:tcPr>
+          <w:p>
+            <w:pPr>
+              <w:pStyle w:val="TNR"/>
+              <w:rPr>
+                <w:highlight w:val="cyan"/>
+              </w:rPr>
+            </w:pPr>
+            <w:r>
+              <w:rPr>
+                <w:highlight w:val="cyan"/>
+              </w:rPr>
+              <w:t>Olivia-</w:t>
+            </w:r>
+            <w:proofErr w:type="gramStart"/>
+            <w:r>
+              <w:rPr>
+                <w:highlight w:val="cyan"/>
+              </w:rPr>
+              <w:t>hey.hey</w:t>
+            </w:r>
+            <w:proofErr w:type="gramEnd"/>
+            <w:r>
+              <w:rPr>
+                <w:highlight w:val="cyan"/>
+              </w:rPr>
+              <w:t>01</w:t>
+            </w:r>
+          </w:p>
+        </w:tc>
+        <w:tc>
+          <w:tcPr>
+            <w:tcW w:w="2961" w:type="dxa"/>
+          </w:tcPr>
+          <w:p>
+            <w:pPr>
+              <w:pStyle w:val="TNR"/>
+              <w:rPr>
+                <w:highlight w:val="cyan"/>
+              </w:rPr>
+            </w:pPr>
+            <w:r>
+              <w:rPr>
+                <w:highlight w:val="cyan"/>
+              </w:rPr>
+              <w:t>Discord</w:t>
+            </w:r>
+          </w:p>
+        </w:tc>
+      </w:tr>
+      <w:tr>
+        <w:tc>
+          <w:tcPr>
+            <w:tcW w:w="3361" w:type="dxa"/>
+          </w:tcPr>
+          <w:p>
+            <w:pPr>
+              <w:pStyle w:val="TNR"/>
+              <w:rPr>
+                <w:highlight w:val="cyan"/>
+              </w:rPr>
+            </w:pPr>
+            <w:r>
+              <w:rPr>
+                <w:highlight w:val="cyan"/>
+              </w:rPr>
+              <w:t>Group member: Matt Baker</w:t>
+            </w:r>
+          </w:p>
+        </w:tc>
+        <w:tc>
+          <w:tcPr>
+            <w:tcW w:w="4134" w:type="dxa"/>
+          </w:tcPr>
+          <w:p>
+            <w:pPr>
+              <w:pStyle w:val="TNR"/>
+              <w:rPr>
+                <w:highlight w:val="cyan"/>
+              </w:rPr>
+            </w:pPr>
+            <w:r>
+              <w:rPr>
+                <w:highlight w:val="cyan"/>
+              </w:rPr>
+              <w:t>mattwillbaker1@gmail.com</w:t>
+            </w:r>
+          </w:p>
+        </w:tc>
+        <w:tc>
+          <w:tcPr>
+            <w:tcW w:w="2961" w:type="dxa"/>
+          </w:tcPr>
+          <w:p>
+            <w:pPr>
+              <w:pStyle w:val="TNR"/>
+              <w:rPr>
+                <w:highlight w:val="cyan"/>
+              </w:rPr>
+            </w:pPr>
+            <w:r>
+              <w:rPr>
+                <w:highlight w:val="cyan"/>
+              </w:rPr>
+              <w:t>Discord</w:t>
+            </w:r>
+          </w:p>
+        </w:tc>
+      </w:tr>
+      <w:tr>
+        <w:tc>
+          <w:tcPr>
+            <w:tcW w:w="3361" w:type="dxa"/>
+          </w:tcPr>
+          <w:p>
+            <w:pPr>
+              <w:rPr>
+                <w:highlight w:val="cyan"/>
+                <w:lang w:val="en-NZ"/>
+              </w:rPr>
+            </w:pPr>
+            <w:r>
+              <w:rPr>
+                <w:highlight w:val="cyan"/>
+                <w:lang w:val="en-NZ"/>
+              </w:rPr>
+              <w:lastRenderedPageBreak/>
               <w:t>Group member: Sam Davies</w:t>
             </w:r>
           </w:p>
         </w:tc>
         <w:tc>
           <w:tcPr>
-            <w:tcW w:w="4508" w:type="dxa"/>
+            <w:tcW w:w="4134" w:type="dxa"/>
           </w:tcPr>
           <w:p>
             <w:pPr>
               <w:keepNext/>
               <w:rPr>
-                <w:lang w:val="en-NZ"/>
-              </w:rPr>
-            </w:pPr>
+                <w:highlight w:val="cyan"/>
+                <w:lang w:val="en-NZ"/>
+              </w:rPr>
+            </w:pPr>
+            <w:r>
+              <w:rPr>
+                <w:highlight w:val="cyan"/>
+                <w:lang w:val="en-NZ"/>
+              </w:rPr>
+              <w:t>Samueldavies0220@gmail.com</w:t>
+            </w:r>
+          </w:p>
+        </w:tc>
+        <w:tc>
+          <w:tcPr>
+            <w:tcW w:w="2961" w:type="dxa"/>
+          </w:tcPr>
+          <w:p>
+            <w:pPr>
+              <w:keepNext/>
+              <w:rPr>
+                <w:highlight w:val="cyan"/>
+                <w:lang w:val="en-NZ"/>
+              </w:rPr>
+            </w:pPr>
+            <w:r>
+              <w:rPr>
+                <w:highlight w:val="cyan"/>
+                <w:lang w:val="en-NZ"/>
+              </w:rPr>
+              <w:t>Discord</w:t>
+            </w:r>
           </w:p>
         </w:tc>
       </w:tr>
@@ -6572,31 +7264,1562 @@
       <w:pPr>
         <w:pStyle w:val="Heading2"/>
       </w:pPr>
-      <w:bookmarkStart w:id="15" w:name="_Toc236403142"/>
+      <w:bookmarkStart w:id="16" w:name="_Toc236665780"/>
       <w:r>
+        <w:rPr>
+          <w:highlight w:val="cyan"/>
+        </w:rPr>
         <w:t>Conflict of Interest statement</w:t>
-      </w:r>
-      <w:bookmarkEnd w:id="15"/>
-    </w:p>
-    <w:p>
-      <w:pPr>
-        <w:pStyle w:val="Heading2"/>
-      </w:pPr>
-      <w:bookmarkStart w:id="16" w:name="_Toc236403143"/>
-      <w:r>
-        <w:t>RACI assessment matrix</w:t>
       </w:r>
       <w:bookmarkEnd w:id="16"/>
     </w:p>
     <w:p>
       <w:pPr>
+        <w:jc w:val="both"/>
+        <w:rPr>
+          <w:rFonts w:cs="Arial"/>
+          <w:sz w:val="24"/>
+          <w:szCs w:val="24"/>
+          <w:lang w:val="en-NZ"/>
+        </w:rPr>
+      </w:pPr>
+      <w:r>
+        <w:rPr>
+          <w:rFonts w:cs="Arial"/>
+          <w:sz w:val="24"/>
+          <w:szCs w:val="24"/>
+          <w:highlight w:val="cyan"/>
+          <w:lang w:val="en-NZ"/>
+        </w:rPr>
+        <w:t xml:space="preserve">As our client Geoff Gordon is a member of the </w:t>
+      </w:r>
+      <w:proofErr w:type="spellStart"/>
+      <w:r>
+        <w:rPr>
+          <w:rFonts w:cs="Arial"/>
+          <w:sz w:val="24"/>
+          <w:szCs w:val="24"/>
+          <w:highlight w:val="cyan"/>
+          <w:lang w:val="en-NZ"/>
+        </w:rPr>
+        <w:t>WelTec</w:t>
+      </w:r>
+      <w:proofErr w:type="spellEnd"/>
+      <w:r>
+        <w:rPr>
+          <w:rFonts w:cs="Arial"/>
+          <w:sz w:val="24"/>
+          <w:szCs w:val="24"/>
+          <w:highlight w:val="cyan"/>
+          <w:lang w:val="en-NZ"/>
+        </w:rPr>
+        <w:t xml:space="preserve"> staff, his employer is the same as the institution that runs this capstone course, this constitutes a conflict of interest. The prevailing vague familiarity with Geoff within the team also means a relationship exists that could compromise the sincerity of the transaction of client to student.</w:t>
+      </w:r>
+      <w:r>
+        <w:rPr>
+          <w:rFonts w:cs="Arial"/>
+          <w:sz w:val="24"/>
+          <w:szCs w:val="24"/>
+          <w:lang w:val="en-NZ"/>
+        </w:rPr>
+        <w:t xml:space="preserve"> </w:t>
+      </w:r>
+    </w:p>
+    <w:p>
+      <w:pPr>
+        <w:pStyle w:val="Heading2"/>
+        <w:rPr>
+          <w:highlight w:val="cyan"/>
+        </w:rPr>
+      </w:pPr>
+      <w:bookmarkStart w:id="17" w:name="_Toc236665781"/>
+      <w:r>
+        <w:rPr>
+          <w:highlight w:val="cyan"/>
+        </w:rPr>
+        <w:t>RACI assessment matrix</w:t>
+      </w:r>
+      <w:bookmarkEnd w:id="17"/>
+    </w:p>
+    <w:p>
+      <w:pPr>
+        <w:rPr>
+          <w:lang w:val="en-NZ"/>
+        </w:rPr>
+      </w:pPr>
+      <w:r>
+        <w:rPr>
+          <w:highlight w:val="cyan"/>
+          <w:lang w:val="en-NZ"/>
+        </w:rPr>
+        <w:t>This matrix divulges the relative responsibility the stakeholders of this project possess with regards to each task.</w:t>
+      </w:r>
+      <w:r>
+        <w:rPr>
+          <w:lang w:val="en-NZ"/>
+        </w:rPr>
+        <w:t xml:space="preserve"> </w:t>
+      </w:r>
+      <w:r>
+        <w:rPr>
+          <w:highlight w:val="red"/>
+          <w:lang w:val="en-NZ"/>
+        </w:rPr>
+        <w:t>R – Responsible</w:t>
+      </w:r>
+      <w:r>
+        <w:rPr>
+          <w:lang w:val="en-NZ"/>
+        </w:rPr>
+        <w:t xml:space="preserve"> </w:t>
+      </w:r>
+      <w:r>
+        <w:rPr>
+          <w:highlight w:val="magenta"/>
+          <w:lang w:val="en-NZ"/>
+        </w:rPr>
+        <w:t>A – Accountable</w:t>
+      </w:r>
+      <w:r>
+        <w:rPr>
+          <w:lang w:val="en-NZ"/>
+        </w:rPr>
+        <w:t xml:space="preserve"> </w:t>
+      </w:r>
+      <w:r>
+        <w:rPr>
+          <w:highlight w:val="yellow"/>
+          <w:lang w:val="en-NZ"/>
+        </w:rPr>
+        <w:t>C – Consulted</w:t>
+      </w:r>
+      <w:r>
+        <w:rPr>
+          <w:lang w:val="en-NZ"/>
+        </w:rPr>
+        <w:t xml:space="preserve"> </w:t>
+      </w:r>
+      <w:r>
+        <w:rPr>
+          <w:highlight w:val="green"/>
+          <w:lang w:val="en-NZ"/>
+        </w:rPr>
+        <w:t>I - Informed</w:t>
+      </w:r>
+    </w:p>
+    <w:p>
+      <w:pPr>
+        <w:rPr>
+          <w:lang w:val="en-NZ"/>
+        </w:rPr>
+      </w:pPr>
+    </w:p>
+    <w:tbl>
+      <w:tblPr>
+        <w:tblStyle w:val="TableGrid"/>
+        <w:tblW w:w="0" w:type="auto"/>
+        <w:tblLook w:val="04A0" w:firstRow="1" w:lastRow="0" w:firstColumn="1" w:lastColumn="0" w:noHBand="0" w:noVBand="1"/>
+      </w:tblPr>
+      <w:tblGrid>
+        <w:gridCol w:w="2857"/>
+        <w:gridCol w:w="1255"/>
+        <w:gridCol w:w="1482"/>
+        <w:gridCol w:w="1439"/>
+        <w:gridCol w:w="1162"/>
+        <w:gridCol w:w="1147"/>
+        <w:gridCol w:w="1114"/>
+      </w:tblGrid>
+      <w:tr>
+        <w:tc>
+          <w:tcPr>
+            <w:tcW w:w="2857" w:type="dxa"/>
+          </w:tcPr>
+          <w:p>
+            <w:pPr>
+              <w:rPr>
+                <w:highlight w:val="cyan"/>
+                <w:lang w:val="en-NZ"/>
+              </w:rPr>
+            </w:pPr>
+            <w:r>
+              <w:rPr>
+                <w:highlight w:val="cyan"/>
+                <w:lang w:val="en-NZ"/>
+              </w:rPr>
+              <w:t>Tasks</w:t>
+            </w:r>
+          </w:p>
+        </w:tc>
+        <w:tc>
+          <w:tcPr>
+            <w:tcW w:w="1255" w:type="dxa"/>
+          </w:tcPr>
+          <w:p>
+            <w:pPr>
+              <w:rPr>
+                <w:highlight w:val="cyan"/>
+                <w:lang w:val="en-NZ"/>
+              </w:rPr>
+            </w:pPr>
+            <w:r>
+              <w:rPr>
+                <w:highlight w:val="cyan"/>
+                <w:lang w:val="en-NZ"/>
+              </w:rPr>
+              <w:t>Geoff Gordon (Client)</w:t>
+            </w:r>
+          </w:p>
+        </w:tc>
+        <w:tc>
+          <w:tcPr>
+            <w:tcW w:w="1482" w:type="dxa"/>
+          </w:tcPr>
+          <w:p>
+            <w:pPr>
+              <w:rPr>
+                <w:highlight w:val="cyan"/>
+                <w:lang w:val="en-NZ"/>
+              </w:rPr>
+            </w:pPr>
+            <w:r>
+              <w:rPr>
+                <w:highlight w:val="cyan"/>
+                <w:lang w:val="en-NZ"/>
+              </w:rPr>
+              <w:t xml:space="preserve">Clement </w:t>
+            </w:r>
+            <w:proofErr w:type="spellStart"/>
+            <w:r>
+              <w:rPr>
+                <w:highlight w:val="cyan"/>
+                <w:lang w:val="en-NZ"/>
+              </w:rPr>
+              <w:t>Swarnappa</w:t>
+            </w:r>
+            <w:proofErr w:type="spellEnd"/>
+            <w:r>
+              <w:rPr>
+                <w:highlight w:val="cyan"/>
+                <w:lang w:val="en-NZ"/>
+              </w:rPr>
+              <w:t xml:space="preserve"> (Advisor)</w:t>
+            </w:r>
+          </w:p>
+        </w:tc>
+        <w:tc>
+          <w:tcPr>
+            <w:tcW w:w="1439" w:type="dxa"/>
+          </w:tcPr>
+          <w:p>
+            <w:pPr>
+              <w:rPr>
+                <w:highlight w:val="cyan"/>
+                <w:lang w:val="en-NZ"/>
+              </w:rPr>
+            </w:pPr>
+            <w:r>
+              <w:rPr>
+                <w:highlight w:val="cyan"/>
+                <w:lang w:val="en-NZ"/>
+              </w:rPr>
+              <w:t>Dave Sushames (PM)</w:t>
+            </w:r>
+          </w:p>
+        </w:tc>
+        <w:tc>
+          <w:tcPr>
+            <w:tcW w:w="1162" w:type="dxa"/>
+          </w:tcPr>
+          <w:p>
+            <w:pPr>
+              <w:rPr>
+                <w:highlight w:val="cyan"/>
+                <w:lang w:val="en-NZ"/>
+              </w:rPr>
+            </w:pPr>
+            <w:r>
+              <w:rPr>
+                <w:highlight w:val="cyan"/>
+                <w:lang w:val="en-NZ"/>
+              </w:rPr>
+              <w:t>Matt Baker</w:t>
+            </w:r>
+          </w:p>
+        </w:tc>
+        <w:tc>
+          <w:tcPr>
+            <w:tcW w:w="1147" w:type="dxa"/>
+          </w:tcPr>
+          <w:p>
+            <w:pPr>
+              <w:rPr>
+                <w:highlight w:val="cyan"/>
+                <w:lang w:val="en-NZ"/>
+              </w:rPr>
+            </w:pPr>
+            <w:r>
+              <w:rPr>
+                <w:highlight w:val="cyan"/>
+                <w:lang w:val="en-NZ"/>
+              </w:rPr>
+              <w:t>Olivia Hey</w:t>
+            </w:r>
+          </w:p>
+        </w:tc>
+        <w:tc>
+          <w:tcPr>
+            <w:tcW w:w="1114" w:type="dxa"/>
+          </w:tcPr>
+          <w:p>
+            <w:pPr>
+              <w:rPr>
+                <w:highlight w:val="cyan"/>
+                <w:lang w:val="en-NZ"/>
+              </w:rPr>
+            </w:pPr>
+            <w:r>
+              <w:rPr>
+                <w:highlight w:val="cyan"/>
+                <w:lang w:val="en-NZ"/>
+              </w:rPr>
+              <w:t>Sam Davies</w:t>
+            </w:r>
+          </w:p>
+        </w:tc>
+      </w:tr>
+      <w:tr>
+        <w:tc>
+          <w:tcPr>
+            <w:tcW w:w="2857" w:type="dxa"/>
+          </w:tcPr>
+          <w:p>
+            <w:pPr>
+              <w:rPr>
+                <w:highlight w:val="cyan"/>
+                <w:lang w:val="en-NZ"/>
+              </w:rPr>
+            </w:pPr>
+            <w:r>
+              <w:rPr>
+                <w:highlight w:val="cyan"/>
+                <w:lang w:val="en-NZ"/>
+              </w:rPr>
+              <w:t>Installation, management of physical hardware.</w:t>
+            </w:r>
+          </w:p>
+        </w:tc>
+        <w:tc>
+          <w:tcPr>
+            <w:tcW w:w="1255" w:type="dxa"/>
+          </w:tcPr>
+          <w:p>
+            <w:pPr>
+              <w:rPr>
+                <w:lang w:val="en-NZ"/>
+              </w:rPr>
+            </w:pPr>
+            <w:r>
+              <w:rPr>
+                <w:highlight w:val="red"/>
+                <w:lang w:val="en-NZ"/>
+              </w:rPr>
+              <w:t>R</w:t>
+            </w:r>
+          </w:p>
+        </w:tc>
+        <w:tc>
+          <w:tcPr>
+            <w:tcW w:w="1482" w:type="dxa"/>
+          </w:tcPr>
+          <w:p>
+            <w:pPr>
+              <w:rPr>
+                <w:lang w:val="en-NZ"/>
+              </w:rPr>
+            </w:pPr>
+            <w:r>
+              <w:rPr>
+                <w:highlight w:val="green"/>
+                <w:lang w:val="en-NZ"/>
+              </w:rPr>
+              <w:t>I</w:t>
+            </w:r>
+          </w:p>
+        </w:tc>
+        <w:tc>
+          <w:tcPr>
+            <w:tcW w:w="1439" w:type="dxa"/>
+          </w:tcPr>
+          <w:p>
+            <w:pPr>
+              <w:rPr>
+                <w:highlight w:val="yellow"/>
+                <w:lang w:val="en-NZ"/>
+              </w:rPr>
+            </w:pPr>
+            <w:r>
+              <w:rPr>
+                <w:highlight w:val="yellow"/>
+                <w:lang w:val="en-NZ"/>
+              </w:rPr>
+              <w:t>C</w:t>
+            </w:r>
+          </w:p>
+        </w:tc>
+        <w:tc>
+          <w:tcPr>
+            <w:tcW w:w="1162" w:type="dxa"/>
+          </w:tcPr>
+          <w:p>
+            <w:pPr>
+              <w:rPr>
+                <w:highlight w:val="yellow"/>
+                <w:lang w:val="en-NZ"/>
+              </w:rPr>
+            </w:pPr>
+            <w:r>
+              <w:rPr>
+                <w:highlight w:val="yellow"/>
+                <w:lang w:val="en-NZ"/>
+              </w:rPr>
+              <w:t>C</w:t>
+            </w:r>
+          </w:p>
+        </w:tc>
+        <w:tc>
+          <w:tcPr>
+            <w:tcW w:w="1147" w:type="dxa"/>
+          </w:tcPr>
+          <w:p>
+            <w:pPr>
+              <w:rPr>
+                <w:highlight w:val="yellow"/>
+                <w:lang w:val="en-NZ"/>
+              </w:rPr>
+            </w:pPr>
+            <w:r>
+              <w:rPr>
+                <w:highlight w:val="yellow"/>
+                <w:lang w:val="en-NZ"/>
+              </w:rPr>
+              <w:t>C</w:t>
+            </w:r>
+          </w:p>
+        </w:tc>
+        <w:tc>
+          <w:tcPr>
+            <w:tcW w:w="1114" w:type="dxa"/>
+          </w:tcPr>
+          <w:p>
+            <w:pPr>
+              <w:rPr>
+                <w:lang w:val="en-NZ"/>
+              </w:rPr>
+            </w:pPr>
+            <w:r>
+              <w:rPr>
+                <w:highlight w:val="red"/>
+                <w:lang w:val="en-NZ"/>
+              </w:rPr>
+              <w:t>R</w:t>
+            </w:r>
+          </w:p>
+        </w:tc>
+      </w:tr>
+      <w:tr>
+        <w:tc>
+          <w:tcPr>
+            <w:tcW w:w="2857" w:type="dxa"/>
+          </w:tcPr>
+          <w:p>
+            <w:pPr>
+              <w:rPr>
+                <w:highlight w:val="cyan"/>
+                <w:lang w:val="en-NZ"/>
+              </w:rPr>
+            </w:pPr>
+            <w:r>
+              <w:rPr>
+                <w:highlight w:val="cyan"/>
+                <w:lang w:val="en-NZ"/>
+              </w:rPr>
+              <w:t>Installation/configuration of operating systems and software (</w:t>
+            </w:r>
+            <w:proofErr w:type="spellStart"/>
+            <w:r>
+              <w:rPr>
+                <w:highlight w:val="cyan"/>
+                <w:lang w:val="en-NZ"/>
+              </w:rPr>
+              <w:t>LMStudio</w:t>
+            </w:r>
+            <w:proofErr w:type="spellEnd"/>
+            <w:r>
+              <w:rPr>
+                <w:highlight w:val="cyan"/>
+                <w:lang w:val="en-NZ"/>
+              </w:rPr>
+              <w:t>, forensic tools such as volatility/</w:t>
+            </w:r>
+            <w:proofErr w:type="spellStart"/>
+            <w:r>
+              <w:rPr>
+                <w:highlight w:val="cyan"/>
+                <w:lang w:val="en-NZ"/>
+              </w:rPr>
+              <w:t>exiftools</w:t>
+            </w:r>
+            <w:proofErr w:type="spellEnd"/>
+            <w:r>
+              <w:rPr>
+                <w:highlight w:val="cyan"/>
+                <w:lang w:val="en-NZ"/>
+              </w:rPr>
+              <w:t>/foremost)</w:t>
+            </w:r>
+          </w:p>
+        </w:tc>
+        <w:tc>
+          <w:tcPr>
+            <w:tcW w:w="1255" w:type="dxa"/>
+          </w:tcPr>
+          <w:p>
+            <w:pPr>
+              <w:rPr>
+                <w:lang w:val="en-NZ"/>
+              </w:rPr>
+            </w:pPr>
+            <w:r>
+              <w:rPr>
+                <w:highlight w:val="yellow"/>
+                <w:lang w:val="en-NZ"/>
+              </w:rPr>
+              <w:t>C</w:t>
+            </w:r>
+          </w:p>
+        </w:tc>
+        <w:tc>
+          <w:tcPr>
+            <w:tcW w:w="1482" w:type="dxa"/>
+          </w:tcPr>
+          <w:p>
+            <w:pPr>
+              <w:rPr>
+                <w:highlight w:val="green"/>
+                <w:lang w:val="en-NZ"/>
+              </w:rPr>
+            </w:pPr>
+            <w:r>
+              <w:rPr>
+                <w:highlight w:val="green"/>
+                <w:lang w:val="en-NZ"/>
+              </w:rPr>
+              <w:t>I</w:t>
+            </w:r>
+          </w:p>
+        </w:tc>
+        <w:tc>
+          <w:tcPr>
+            <w:tcW w:w="1439" w:type="dxa"/>
+          </w:tcPr>
+          <w:p>
+            <w:pPr>
+              <w:rPr>
+                <w:highlight w:val="green"/>
+                <w:lang w:val="en-NZ"/>
+              </w:rPr>
+            </w:pPr>
+            <w:r>
+              <w:rPr>
+                <w:highlight w:val="green"/>
+                <w:lang w:val="en-NZ"/>
+              </w:rPr>
+              <w:t>I</w:t>
+            </w:r>
+          </w:p>
+        </w:tc>
+        <w:tc>
+          <w:tcPr>
+            <w:tcW w:w="1162" w:type="dxa"/>
+          </w:tcPr>
+          <w:p>
+            <w:pPr>
+              <w:rPr>
+                <w:lang w:val="en-NZ"/>
+              </w:rPr>
+            </w:pPr>
+            <w:r>
+              <w:rPr>
+                <w:highlight w:val="red"/>
+                <w:lang w:val="en-NZ"/>
+              </w:rPr>
+              <w:t>R</w:t>
+            </w:r>
+          </w:p>
+        </w:tc>
+        <w:tc>
+          <w:tcPr>
+            <w:tcW w:w="1147" w:type="dxa"/>
+          </w:tcPr>
+          <w:p>
+            <w:pPr>
+              <w:rPr>
+                <w:lang w:val="en-NZ"/>
+              </w:rPr>
+            </w:pPr>
+            <w:r>
+              <w:rPr>
+                <w:highlight w:val="magenta"/>
+                <w:lang w:val="en-NZ"/>
+              </w:rPr>
+              <w:t>A</w:t>
+            </w:r>
+          </w:p>
+        </w:tc>
+        <w:tc>
+          <w:tcPr>
+            <w:tcW w:w="1114" w:type="dxa"/>
+          </w:tcPr>
+          <w:p>
+            <w:pPr>
+              <w:rPr>
+                <w:lang w:val="en-NZ"/>
+              </w:rPr>
+            </w:pPr>
+            <w:r>
+              <w:rPr>
+                <w:highlight w:val="magenta"/>
+                <w:lang w:val="en-NZ"/>
+              </w:rPr>
+              <w:t>A</w:t>
+            </w:r>
+          </w:p>
+        </w:tc>
+      </w:tr>
+      <w:tr>
+        <w:tc>
+          <w:tcPr>
+            <w:tcW w:w="2857" w:type="dxa"/>
+          </w:tcPr>
+          <w:p>
+            <w:pPr>
+              <w:rPr>
+                <w:highlight w:val="cyan"/>
+                <w:lang w:val="en-NZ"/>
+              </w:rPr>
+            </w:pPr>
+            <w:r>
+              <w:rPr>
+                <w:highlight w:val="cyan"/>
+                <w:lang w:val="en-NZ"/>
+              </w:rPr>
+              <w:t>Acquisition of forensic datasets/disk images for analysis</w:t>
+            </w:r>
+          </w:p>
+        </w:tc>
+        <w:tc>
+          <w:tcPr>
+            <w:tcW w:w="1255" w:type="dxa"/>
+          </w:tcPr>
+          <w:p>
+            <w:pPr>
+              <w:rPr>
+                <w:highlight w:val="green"/>
+                <w:lang w:val="en-NZ"/>
+              </w:rPr>
+            </w:pPr>
+            <w:r>
+              <w:rPr>
+                <w:highlight w:val="green"/>
+                <w:lang w:val="en-NZ"/>
+              </w:rPr>
+              <w:t>I</w:t>
+            </w:r>
+          </w:p>
+        </w:tc>
+        <w:tc>
+          <w:tcPr>
+            <w:tcW w:w="1482" w:type="dxa"/>
+          </w:tcPr>
+          <w:p>
+            <w:pPr>
+              <w:rPr>
+                <w:highlight w:val="green"/>
+                <w:lang w:val="en-NZ"/>
+              </w:rPr>
+            </w:pPr>
+            <w:r>
+              <w:rPr>
+                <w:highlight w:val="green"/>
+                <w:lang w:val="en-NZ"/>
+              </w:rPr>
+              <w:t>I</w:t>
+            </w:r>
+          </w:p>
+        </w:tc>
+        <w:tc>
+          <w:tcPr>
+            <w:tcW w:w="1439" w:type="dxa"/>
+          </w:tcPr>
+          <w:p>
+            <w:pPr>
+              <w:rPr>
+                <w:highlight w:val="yellow"/>
+                <w:lang w:val="en-NZ"/>
+              </w:rPr>
+            </w:pPr>
+            <w:r>
+              <w:rPr>
+                <w:highlight w:val="yellow"/>
+                <w:lang w:val="en-NZ"/>
+              </w:rPr>
+              <w:t>C</w:t>
+            </w:r>
+          </w:p>
+        </w:tc>
+        <w:tc>
+          <w:tcPr>
+            <w:tcW w:w="1162" w:type="dxa"/>
+          </w:tcPr>
+          <w:p>
+            <w:pPr>
+              <w:rPr>
+                <w:highlight w:val="yellow"/>
+                <w:lang w:val="en-NZ"/>
+              </w:rPr>
+            </w:pPr>
+            <w:r>
+              <w:rPr>
+                <w:highlight w:val="yellow"/>
+                <w:lang w:val="en-NZ"/>
+              </w:rPr>
+              <w:t>C</w:t>
+            </w:r>
+          </w:p>
+        </w:tc>
+        <w:tc>
+          <w:tcPr>
+            <w:tcW w:w="1147" w:type="dxa"/>
+          </w:tcPr>
+          <w:p>
+            <w:pPr>
+              <w:rPr>
+                <w:lang w:val="en-NZ"/>
+              </w:rPr>
+            </w:pPr>
+            <w:r>
+              <w:rPr>
+                <w:highlight w:val="red"/>
+                <w:lang w:val="en-NZ"/>
+              </w:rPr>
+              <w:t>R</w:t>
+            </w:r>
+          </w:p>
+        </w:tc>
+        <w:tc>
+          <w:tcPr>
+            <w:tcW w:w="1114" w:type="dxa"/>
+          </w:tcPr>
+          <w:p>
+            <w:pPr>
+              <w:rPr>
+                <w:lang w:val="en-NZ"/>
+              </w:rPr>
+            </w:pPr>
+            <w:r>
+              <w:rPr>
+                <w:highlight w:val="yellow"/>
+                <w:lang w:val="en-NZ"/>
+              </w:rPr>
+              <w:t>C</w:t>
+            </w:r>
+          </w:p>
+        </w:tc>
+      </w:tr>
+      <w:tr>
+        <w:tc>
+          <w:tcPr>
+            <w:tcW w:w="2857" w:type="dxa"/>
+          </w:tcPr>
+          <w:p>
+            <w:pPr>
+              <w:rPr>
+                <w:highlight w:val="cyan"/>
+                <w:lang w:val="en-NZ"/>
+              </w:rPr>
+            </w:pPr>
+            <w:r>
+              <w:rPr>
+                <w:highlight w:val="cyan"/>
+                <w:lang w:val="en-NZ"/>
+              </w:rPr>
+              <w:t>AI integration with digital forensics tools</w:t>
+            </w:r>
+          </w:p>
+        </w:tc>
+        <w:tc>
+          <w:tcPr>
+            <w:tcW w:w="1255" w:type="dxa"/>
+          </w:tcPr>
+          <w:p>
+            <w:pPr>
+              <w:rPr>
+                <w:lang w:val="en-NZ"/>
+              </w:rPr>
+            </w:pPr>
+            <w:r>
+              <w:rPr>
+                <w:highlight w:val="yellow"/>
+                <w:lang w:val="en-NZ"/>
+              </w:rPr>
+              <w:t>C</w:t>
+            </w:r>
+          </w:p>
+        </w:tc>
+        <w:tc>
+          <w:tcPr>
+            <w:tcW w:w="1482" w:type="dxa"/>
+          </w:tcPr>
+          <w:p>
+            <w:pPr>
+              <w:rPr>
+                <w:lang w:val="en-NZ"/>
+              </w:rPr>
+            </w:pPr>
+            <w:r>
+              <w:rPr>
+                <w:highlight w:val="green"/>
+                <w:lang w:val="en-NZ"/>
+              </w:rPr>
+              <w:t>I</w:t>
+            </w:r>
+          </w:p>
+        </w:tc>
+        <w:tc>
+          <w:tcPr>
+            <w:tcW w:w="1439" w:type="dxa"/>
+          </w:tcPr>
+          <w:p>
+            <w:pPr>
+              <w:rPr>
+                <w:lang w:val="en-NZ"/>
+              </w:rPr>
+            </w:pPr>
+            <w:r>
+              <w:rPr>
+                <w:highlight w:val="yellow"/>
+                <w:lang w:val="en-NZ"/>
+              </w:rPr>
+              <w:t>C</w:t>
+            </w:r>
+          </w:p>
+        </w:tc>
+        <w:tc>
+          <w:tcPr>
+            <w:tcW w:w="1162" w:type="dxa"/>
+          </w:tcPr>
+          <w:p>
+            <w:pPr>
+              <w:rPr>
+                <w:lang w:val="en-NZ"/>
+              </w:rPr>
+            </w:pPr>
+            <w:r>
+              <w:rPr>
+                <w:highlight w:val="red"/>
+                <w:lang w:val="en-NZ"/>
+              </w:rPr>
+              <w:t>R</w:t>
+            </w:r>
+          </w:p>
+        </w:tc>
+        <w:tc>
+          <w:tcPr>
+            <w:tcW w:w="1147" w:type="dxa"/>
+          </w:tcPr>
+          <w:p>
+            <w:pPr>
+              <w:rPr>
+                <w:highlight w:val="yellow"/>
+                <w:lang w:val="en-NZ"/>
+              </w:rPr>
+            </w:pPr>
+            <w:r>
+              <w:rPr>
+                <w:highlight w:val="yellow"/>
+                <w:lang w:val="en-NZ"/>
+              </w:rPr>
+              <w:t>C</w:t>
+            </w:r>
+          </w:p>
+        </w:tc>
+        <w:tc>
+          <w:tcPr>
+            <w:tcW w:w="1114" w:type="dxa"/>
+          </w:tcPr>
+          <w:p>
+            <w:pPr>
+              <w:rPr>
+                <w:highlight w:val="yellow"/>
+                <w:lang w:val="en-NZ"/>
+              </w:rPr>
+            </w:pPr>
+            <w:r>
+              <w:rPr>
+                <w:highlight w:val="yellow"/>
+                <w:lang w:val="en-NZ"/>
+              </w:rPr>
+              <w:t>C</w:t>
+            </w:r>
+          </w:p>
+        </w:tc>
+      </w:tr>
+      <w:tr>
+        <w:tc>
+          <w:tcPr>
+            <w:tcW w:w="2857" w:type="dxa"/>
+          </w:tcPr>
+          <w:p>
+            <w:pPr>
+              <w:rPr>
+                <w:highlight w:val="cyan"/>
+                <w:lang w:val="en-NZ"/>
+              </w:rPr>
+            </w:pPr>
+            <w:r>
+              <w:rPr>
+                <w:highlight w:val="cyan"/>
+                <w:lang w:val="en-NZ"/>
+              </w:rPr>
+              <w:t xml:space="preserve">Creation or adaption of </w:t>
+            </w:r>
+            <w:r>
+              <w:rPr>
+                <w:highlight w:val="cyan"/>
+                <w:lang w:val="en-NZ"/>
+              </w:rPr>
+              <w:t xml:space="preserve">a </w:t>
+            </w:r>
+            <w:r>
+              <w:rPr>
+                <w:highlight w:val="cyan"/>
+                <w:lang w:val="en-NZ"/>
+              </w:rPr>
+              <w:t xml:space="preserve">process </w:t>
+            </w:r>
+            <w:r>
+              <w:rPr>
+                <w:highlight w:val="cyan"/>
+                <w:lang w:val="en-NZ"/>
+              </w:rPr>
+              <w:t xml:space="preserve">(CFTT) </w:t>
+            </w:r>
+            <w:r>
+              <w:rPr>
+                <w:highlight w:val="cyan"/>
+                <w:lang w:val="en-NZ"/>
+              </w:rPr>
+              <w:t xml:space="preserve">and metrics with which to objectively assess the efficacy of </w:t>
+            </w:r>
+            <w:r>
+              <w:rPr>
+                <w:highlight w:val="cyan"/>
+                <w:lang w:val="en-NZ"/>
+              </w:rPr>
+              <w:t xml:space="preserve">two or more </w:t>
+            </w:r>
+            <w:r>
+              <w:rPr>
+                <w:highlight w:val="cyan"/>
+                <w:lang w:val="en-NZ"/>
+              </w:rPr>
+              <w:t>tools.</w:t>
+            </w:r>
+          </w:p>
+        </w:tc>
+        <w:tc>
+          <w:tcPr>
+            <w:tcW w:w="1255" w:type="dxa"/>
+          </w:tcPr>
+          <w:p>
+            <w:pPr>
+              <w:rPr>
+                <w:highlight w:val="yellow"/>
+                <w:lang w:val="en-NZ"/>
+              </w:rPr>
+            </w:pPr>
+            <w:r>
+              <w:rPr>
+                <w:highlight w:val="yellow"/>
+                <w:lang w:val="en-NZ"/>
+              </w:rPr>
+              <w:t>C</w:t>
+            </w:r>
+          </w:p>
+        </w:tc>
+        <w:tc>
+          <w:tcPr>
+            <w:tcW w:w="1482" w:type="dxa"/>
+          </w:tcPr>
+          <w:p>
+            <w:pPr>
+              <w:rPr>
+                <w:highlight w:val="yellow"/>
+                <w:lang w:val="en-NZ"/>
+              </w:rPr>
+            </w:pPr>
+            <w:r>
+              <w:rPr>
+                <w:highlight w:val="yellow"/>
+                <w:lang w:val="en-NZ"/>
+              </w:rPr>
+              <w:t>C</w:t>
+            </w:r>
+          </w:p>
+        </w:tc>
+        <w:tc>
+          <w:tcPr>
+            <w:tcW w:w="1439" w:type="dxa"/>
+          </w:tcPr>
+          <w:p>
+            <w:pPr>
+              <w:rPr>
+                <w:highlight w:val="red"/>
+                <w:lang w:val="en-NZ"/>
+              </w:rPr>
+            </w:pPr>
+            <w:r>
+              <w:rPr>
+                <w:highlight w:val="red"/>
+                <w:lang w:val="en-NZ"/>
+              </w:rPr>
+              <w:t>R</w:t>
+            </w:r>
+          </w:p>
+        </w:tc>
+        <w:tc>
+          <w:tcPr>
+            <w:tcW w:w="1162" w:type="dxa"/>
+          </w:tcPr>
+          <w:p>
+            <w:pPr>
+              <w:rPr>
+                <w:highlight w:val="magenta"/>
+                <w:lang w:val="en-NZ"/>
+              </w:rPr>
+            </w:pPr>
+            <w:r>
+              <w:rPr>
+                <w:highlight w:val="magenta"/>
+                <w:lang w:val="en-NZ"/>
+              </w:rPr>
+              <w:t>A</w:t>
+            </w:r>
+          </w:p>
+        </w:tc>
+        <w:tc>
+          <w:tcPr>
+            <w:tcW w:w="1147" w:type="dxa"/>
+          </w:tcPr>
+          <w:p>
+            <w:pPr>
+              <w:rPr>
+                <w:highlight w:val="magenta"/>
+                <w:lang w:val="en-NZ"/>
+              </w:rPr>
+            </w:pPr>
+            <w:r>
+              <w:rPr>
+                <w:highlight w:val="magenta"/>
+                <w:lang w:val="en-NZ"/>
+              </w:rPr>
+              <w:t>A</w:t>
+            </w:r>
+          </w:p>
+        </w:tc>
+        <w:tc>
+          <w:tcPr>
+            <w:tcW w:w="1114" w:type="dxa"/>
+          </w:tcPr>
+          <w:p>
+            <w:pPr>
+              <w:rPr>
+                <w:highlight w:val="magenta"/>
+                <w:lang w:val="en-NZ"/>
+              </w:rPr>
+            </w:pPr>
+            <w:r>
+              <w:rPr>
+                <w:highlight w:val="magenta"/>
+                <w:lang w:val="en-NZ"/>
+              </w:rPr>
+              <w:t>A</w:t>
+            </w:r>
+          </w:p>
+        </w:tc>
+      </w:tr>
+      <w:tr>
+        <w:tc>
+          <w:tcPr>
+            <w:tcW w:w="2857" w:type="dxa"/>
+          </w:tcPr>
+          <w:p>
+            <w:pPr>
+              <w:rPr>
+                <w:highlight w:val="cyan"/>
+                <w:lang w:val="en-NZ"/>
+              </w:rPr>
+            </w:pPr>
+            <w:r>
+              <w:rPr>
+                <w:highlight w:val="cyan"/>
+                <w:lang w:val="en-NZ"/>
+              </w:rPr>
+              <w:t>Documentation and measuring of results of testing.</w:t>
+            </w:r>
+          </w:p>
+        </w:tc>
+        <w:tc>
+          <w:tcPr>
+            <w:tcW w:w="1255" w:type="dxa"/>
+          </w:tcPr>
+          <w:p>
+            <w:pPr>
+              <w:rPr>
+                <w:highlight w:val="yellow"/>
+                <w:lang w:val="en-NZ"/>
+              </w:rPr>
+            </w:pPr>
+            <w:r>
+              <w:rPr>
+                <w:highlight w:val="yellow"/>
+                <w:lang w:val="en-NZ"/>
+              </w:rPr>
+              <w:t>C</w:t>
+            </w:r>
+          </w:p>
+        </w:tc>
+        <w:tc>
+          <w:tcPr>
+            <w:tcW w:w="1482" w:type="dxa"/>
+          </w:tcPr>
+          <w:p>
+            <w:pPr>
+              <w:rPr>
+                <w:highlight w:val="yellow"/>
+                <w:lang w:val="en-NZ"/>
+              </w:rPr>
+            </w:pPr>
+            <w:r>
+              <w:rPr>
+                <w:highlight w:val="yellow"/>
+                <w:lang w:val="en-NZ"/>
+              </w:rPr>
+              <w:t>C</w:t>
+            </w:r>
+          </w:p>
+        </w:tc>
+        <w:tc>
+          <w:tcPr>
+            <w:tcW w:w="1439" w:type="dxa"/>
+          </w:tcPr>
+          <w:p>
+            <w:pPr>
+              <w:rPr>
+                <w:highlight w:val="yellow"/>
+                <w:lang w:val="en-NZ"/>
+              </w:rPr>
+            </w:pPr>
+            <w:r>
+              <w:rPr>
+                <w:highlight w:val="yellow"/>
+                <w:lang w:val="en-NZ"/>
+              </w:rPr>
+              <w:t>C</w:t>
+            </w:r>
+          </w:p>
+        </w:tc>
+        <w:tc>
+          <w:tcPr>
+            <w:tcW w:w="1162" w:type="dxa"/>
+          </w:tcPr>
+          <w:p>
+            <w:pPr>
+              <w:rPr>
+                <w:lang w:val="en-NZ"/>
+              </w:rPr>
+            </w:pPr>
+            <w:r>
+              <w:rPr>
+                <w:highlight w:val="red"/>
+                <w:lang w:val="en-NZ"/>
+              </w:rPr>
+              <w:t>R</w:t>
+            </w:r>
+          </w:p>
+        </w:tc>
+        <w:tc>
+          <w:tcPr>
+            <w:tcW w:w="1147" w:type="dxa"/>
+          </w:tcPr>
+          <w:p>
+            <w:pPr>
+              <w:rPr>
+                <w:lang w:val="en-NZ"/>
+              </w:rPr>
+            </w:pPr>
+            <w:r>
+              <w:rPr>
+                <w:highlight w:val="red"/>
+                <w:lang w:val="en-NZ"/>
+              </w:rPr>
+              <w:t>R</w:t>
+            </w:r>
+          </w:p>
+        </w:tc>
+        <w:tc>
+          <w:tcPr>
+            <w:tcW w:w="1114" w:type="dxa"/>
+          </w:tcPr>
+          <w:p>
+            <w:pPr>
+              <w:rPr>
+                <w:lang w:val="en-NZ"/>
+              </w:rPr>
+            </w:pPr>
+            <w:r>
+              <w:rPr>
+                <w:highlight w:val="red"/>
+                <w:lang w:val="en-NZ"/>
+              </w:rPr>
+              <w:t>R</w:t>
+            </w:r>
+          </w:p>
+        </w:tc>
+      </w:tr>
+      <w:tr>
+        <w:tc>
+          <w:tcPr>
+            <w:tcW w:w="2857" w:type="dxa"/>
+          </w:tcPr>
+          <w:p>
+            <w:pPr>
+              <w:rPr>
+                <w:highlight w:val="cyan"/>
+                <w:lang w:val="en-NZ"/>
+              </w:rPr>
+            </w:pPr>
+            <w:r>
+              <w:rPr>
+                <w:highlight w:val="cyan"/>
+                <w:lang w:val="en-NZ"/>
+              </w:rPr>
+              <w:t xml:space="preserve">Testing in multiple evidence environments (mobile/desktop) on multiple types of target data (credentials, confidential information, </w:t>
+            </w:r>
+            <w:r>
+              <w:rPr>
+                <w:highlight w:val="cyan"/>
+                <w:lang w:val="en-NZ"/>
+              </w:rPr>
+              <w:lastRenderedPageBreak/>
+              <w:t>intrusion indicators, suspicious processes/media)</w:t>
+            </w:r>
+          </w:p>
+        </w:tc>
+        <w:tc>
+          <w:tcPr>
+            <w:tcW w:w="1255" w:type="dxa"/>
+          </w:tcPr>
+          <w:p>
+            <w:pPr>
+              <w:rPr>
+                <w:highlight w:val="green"/>
+                <w:lang w:val="en-NZ"/>
+              </w:rPr>
+            </w:pPr>
+            <w:r>
+              <w:rPr>
+                <w:highlight w:val="green"/>
+                <w:lang w:val="en-NZ"/>
+              </w:rPr>
+              <w:lastRenderedPageBreak/>
+              <w:t>I</w:t>
+            </w:r>
+          </w:p>
+        </w:tc>
+        <w:tc>
+          <w:tcPr>
+            <w:tcW w:w="1482" w:type="dxa"/>
+          </w:tcPr>
+          <w:p>
+            <w:pPr>
+              <w:rPr>
+                <w:highlight w:val="green"/>
+                <w:lang w:val="en-NZ"/>
+              </w:rPr>
+            </w:pPr>
+            <w:r>
+              <w:rPr>
+                <w:highlight w:val="green"/>
+                <w:lang w:val="en-NZ"/>
+              </w:rPr>
+              <w:t>I</w:t>
+            </w:r>
+          </w:p>
+        </w:tc>
+        <w:tc>
+          <w:tcPr>
+            <w:tcW w:w="1439" w:type="dxa"/>
+          </w:tcPr>
+          <w:p>
+            <w:pPr>
+              <w:rPr>
+                <w:lang w:val="en-NZ"/>
+              </w:rPr>
+            </w:pPr>
+            <w:r>
+              <w:rPr>
+                <w:highlight w:val="yellow"/>
+                <w:lang w:val="en-NZ"/>
+              </w:rPr>
+              <w:t>C</w:t>
+            </w:r>
+          </w:p>
+        </w:tc>
+        <w:tc>
+          <w:tcPr>
+            <w:tcW w:w="1162" w:type="dxa"/>
+          </w:tcPr>
+          <w:p>
+            <w:pPr>
+              <w:rPr>
+                <w:highlight w:val="red"/>
+                <w:lang w:val="en-NZ"/>
+              </w:rPr>
+            </w:pPr>
+            <w:r>
+              <w:rPr>
+                <w:highlight w:val="red"/>
+                <w:lang w:val="en-NZ"/>
+              </w:rPr>
+              <w:t>R</w:t>
+            </w:r>
+          </w:p>
+        </w:tc>
+        <w:tc>
+          <w:tcPr>
+            <w:tcW w:w="1147" w:type="dxa"/>
+          </w:tcPr>
+          <w:p>
+            <w:pPr>
+              <w:rPr>
+                <w:highlight w:val="red"/>
+                <w:lang w:val="en-NZ"/>
+              </w:rPr>
+            </w:pPr>
+            <w:r>
+              <w:rPr>
+                <w:highlight w:val="red"/>
+                <w:lang w:val="en-NZ"/>
+              </w:rPr>
+              <w:t>R</w:t>
+            </w:r>
+          </w:p>
+        </w:tc>
+        <w:tc>
+          <w:tcPr>
+            <w:tcW w:w="1114" w:type="dxa"/>
+          </w:tcPr>
+          <w:p>
+            <w:pPr>
+              <w:rPr>
+                <w:lang w:val="en-NZ"/>
+              </w:rPr>
+            </w:pPr>
+            <w:r>
+              <w:rPr>
+                <w:highlight w:val="yellow"/>
+                <w:lang w:val="en-NZ"/>
+              </w:rPr>
+              <w:t>C</w:t>
+            </w:r>
+          </w:p>
+        </w:tc>
+      </w:tr>
+      <w:tr>
+        <w:tc>
+          <w:tcPr>
+            <w:tcW w:w="2857" w:type="dxa"/>
+          </w:tcPr>
+          <w:p>
+            <w:pPr>
+              <w:rPr>
+                <w:highlight w:val="cyan"/>
+                <w:lang w:val="en-NZ"/>
+              </w:rPr>
+            </w:pPr>
+            <w:r>
+              <w:rPr>
+                <w:highlight w:val="cyan"/>
+                <w:lang w:val="en-NZ"/>
+              </w:rPr>
+              <w:t xml:space="preserve">Design a consistent test environment, ensuring all variables are the same and that available processing power is consistent before testing. </w:t>
+            </w:r>
+          </w:p>
+        </w:tc>
+        <w:tc>
+          <w:tcPr>
+            <w:tcW w:w="1255" w:type="dxa"/>
+          </w:tcPr>
+          <w:p>
+            <w:pPr>
+              <w:rPr>
+                <w:highlight w:val="green"/>
+                <w:lang w:val="en-NZ"/>
+              </w:rPr>
+            </w:pPr>
+            <w:r>
+              <w:rPr>
+                <w:highlight w:val="green"/>
+                <w:lang w:val="en-NZ"/>
+              </w:rPr>
+              <w:t>I</w:t>
+            </w:r>
+          </w:p>
+        </w:tc>
+        <w:tc>
+          <w:tcPr>
+            <w:tcW w:w="1482" w:type="dxa"/>
+          </w:tcPr>
+          <w:p>
+            <w:pPr>
+              <w:rPr>
+                <w:highlight w:val="green"/>
+                <w:lang w:val="en-NZ"/>
+              </w:rPr>
+            </w:pPr>
+            <w:r>
+              <w:rPr>
+                <w:highlight w:val="green"/>
+                <w:lang w:val="en-NZ"/>
+              </w:rPr>
+              <w:t>I</w:t>
+            </w:r>
+          </w:p>
+        </w:tc>
+        <w:tc>
+          <w:tcPr>
+            <w:tcW w:w="1439" w:type="dxa"/>
+          </w:tcPr>
+          <w:p>
+            <w:pPr>
+              <w:rPr>
+                <w:lang w:val="en-NZ"/>
+              </w:rPr>
+            </w:pPr>
+            <w:r>
+              <w:rPr>
+                <w:highlight w:val="yellow"/>
+                <w:lang w:val="en-NZ"/>
+              </w:rPr>
+              <w:t>C</w:t>
+            </w:r>
+          </w:p>
+        </w:tc>
+        <w:tc>
+          <w:tcPr>
+            <w:tcW w:w="1162" w:type="dxa"/>
+          </w:tcPr>
+          <w:p>
+            <w:pPr>
+              <w:rPr>
+                <w:highlight w:val="red"/>
+                <w:lang w:val="en-NZ"/>
+              </w:rPr>
+            </w:pPr>
+            <w:r>
+              <w:rPr>
+                <w:highlight w:val="red"/>
+                <w:lang w:val="en-NZ"/>
+              </w:rPr>
+              <w:t>R</w:t>
+            </w:r>
+          </w:p>
+        </w:tc>
+        <w:tc>
+          <w:tcPr>
+            <w:tcW w:w="1147" w:type="dxa"/>
+          </w:tcPr>
+          <w:p>
+            <w:pPr>
+              <w:rPr>
+                <w:highlight w:val="red"/>
+                <w:lang w:val="en-NZ"/>
+              </w:rPr>
+            </w:pPr>
+            <w:r>
+              <w:rPr>
+                <w:highlight w:val="red"/>
+                <w:lang w:val="en-NZ"/>
+              </w:rPr>
+              <w:t>R</w:t>
+            </w:r>
+          </w:p>
+        </w:tc>
+        <w:tc>
+          <w:tcPr>
+            <w:tcW w:w="1114" w:type="dxa"/>
+          </w:tcPr>
+          <w:p>
+            <w:pPr>
+              <w:rPr>
+                <w:highlight w:val="red"/>
+                <w:lang w:val="en-NZ"/>
+              </w:rPr>
+            </w:pPr>
+            <w:r>
+              <w:rPr>
+                <w:highlight w:val="red"/>
+                <w:lang w:val="en-NZ"/>
+              </w:rPr>
+              <w:t>R</w:t>
+            </w:r>
+          </w:p>
+        </w:tc>
+      </w:tr>
+    </w:tbl>
+    <w:p/>
+    <w:p/>
+    <w:p/>
+    <w:p/>
+    <w:p/>
+    <w:p/>
+    <w:p/>
+    <w:p/>
+    <w:p/>
+    <w:p/>
+    <w:p/>
+    <w:p/>
+    <w:p/>
+    <w:p/>
+    <w:p/>
+    <w:p/>
+    <w:p/>
+    <w:p/>
+    <w:p/>
+    <w:p/>
+    <w:p/>
+    <w:p/>
+    <w:p/>
+    <w:p>
+      <w:pPr>
         <w:pStyle w:val="Heading1"/>
       </w:pPr>
-      <w:bookmarkStart w:id="17" w:name="_Toc236403144"/>
       <w:r>
+        <w:lastRenderedPageBreak/>
         <w:t>Project timeline and milestones</w:t>
       </w:r>
-      <w:bookmarkEnd w:id="17"/>
+      <w:bookmarkEnd w:id="10"/>
     </w:p>
     <w:p>
       <w:pPr>
@@ -6630,7 +8853,6 @@
               <w:rPr>
                 <w:lang w:val="en-NZ"/>
               </w:rPr>
-              <w:lastRenderedPageBreak/>
               <w:t>Requirement</w:t>
             </w:r>
           </w:p>
@@ -6825,12 +9047,12 @@
       <w:pPr>
         <w:pStyle w:val="Heading1"/>
       </w:pPr>
-      <w:bookmarkStart w:id="18" w:name="_Toc236403146"/>
-      <w:bookmarkStart w:id="19" w:name="_Toc236403145"/>
+      <w:bookmarkStart w:id="18" w:name="_Toc236403145"/>
+      <w:bookmarkStart w:id="19" w:name="_Toc236403146"/>
       <w:r>
         <w:t>Project Risk Analysis</w:t>
       </w:r>
-      <w:bookmarkEnd w:id="19"/>
+      <w:bookmarkEnd w:id="18"/>
     </w:p>
     <w:tbl>
       <w:tblPr>
@@ -7709,7 +9931,6 @@
                 <w:bCs/>
                 <w:lang w:val="en-NZ"/>
               </w:rPr>
-              <w:lastRenderedPageBreak/>
               <w:t>Risk</w:t>
             </w:r>
           </w:p>
@@ -8184,6 +10405,7 @@
               <w:rPr>
                 <w:lang w:val="en-NZ"/>
               </w:rPr>
+              <w:lastRenderedPageBreak/>
               <w:t>R12 Internet outage</w:t>
             </w:r>
           </w:p>
@@ -8223,7 +10445,6 @@
               <w:rPr>
                 <w:lang w:val="en-NZ"/>
               </w:rPr>
-              <w:lastRenderedPageBreak/>
               <w:t>R13 Natural disaster or pandemic</w:t>
             </w:r>
           </w:p>
@@ -8243,7 +10464,21 @@
               <w:rPr>
                 <w:lang w:val="en-NZ"/>
               </w:rPr>
-              <w:t>Make sure the majority of work can be completed from home and doesn’t require onsite presence.</w:t>
+              <w:t xml:space="preserve">Make sure </w:t>
+            </w:r>
+            <w:proofErr w:type="gramStart"/>
+            <w:r>
+              <w:rPr>
+                <w:lang w:val="en-NZ"/>
+              </w:rPr>
+              <w:t>the majority of</w:t>
+            </w:r>
+            <w:proofErr w:type="gramEnd"/>
+            <w:r>
+              <w:rPr>
+                <w:lang w:val="en-NZ"/>
+              </w:rPr>
+              <w:t xml:space="preserve"> work can be completed from home and doesn’t require onsite presence.</w:t>
             </w:r>
           </w:p>
         </w:tc>
@@ -8483,7 +10718,21 @@
               <w:rPr>
                 <w:lang w:val="en-NZ"/>
               </w:rPr>
-              <w:t>Redistribute missing team member’s tasks to the rest of the team. Inform advisor if unavailability is for an extended period of time. Possibly request scope adjustment.</w:t>
+              <w:t xml:space="preserve">Redistribute missing team member’s tasks to the rest of the team. Inform advisor if unavailability is for an extended </w:t>
+            </w:r>
+            <w:proofErr w:type="gramStart"/>
+            <w:r>
+              <w:rPr>
+                <w:lang w:val="en-NZ"/>
+              </w:rPr>
+              <w:t>period of time</w:t>
+            </w:r>
+            <w:proofErr w:type="gramEnd"/>
+            <w:r>
+              <w:rPr>
+                <w:lang w:val="en-NZ"/>
+              </w:rPr>
+              <w:t>. Possibly request scope adjustment.</w:t>
             </w:r>
           </w:p>
         </w:tc>
@@ -8797,6 +11046,7 @@
               <w:rPr>
                 <w:lang w:val="en-NZ"/>
               </w:rPr>
+              <w:lastRenderedPageBreak/>
               <w:t>R10 Advisor becomes unavailable</w:t>
             </w:r>
           </w:p>
@@ -8836,7 +11086,6 @@
               <w:rPr>
                 <w:lang w:val="en-NZ"/>
               </w:rPr>
-              <w:lastRenderedPageBreak/>
               <w:t>R11 Tech/Vendor becomes unavailable</w:t>
             </w:r>
           </w:p>
@@ -8895,7 +11144,21 @@
               <w:rPr>
                 <w:lang w:val="en-NZ"/>
               </w:rPr>
-              <w:t>Fall back to phone/text to stay coordinated. Work offline, or tether/hotspot using mobile data to stay online.</w:t>
+              <w:t xml:space="preserve">Fall back to phone/text to stay coordinated. Work </w:t>
+            </w:r>
+            <w:proofErr w:type="gramStart"/>
+            <w:r>
+              <w:rPr>
+                <w:lang w:val="en-NZ"/>
+              </w:rPr>
+              <w:t>offline, or</w:t>
+            </w:r>
+            <w:proofErr w:type="gramEnd"/>
+            <w:r>
+              <w:rPr>
+                <w:lang w:val="en-NZ"/>
+              </w:rPr>
+              <w:t xml:space="preserve"> tether/hotspot using mobile data to stay online.</w:t>
             </w:r>
           </w:p>
         </w:tc>
@@ -9054,7 +11317,7 @@
       <w:r>
         <w:t>References</w:t>
       </w:r>
-      <w:bookmarkEnd w:id="18"/>
+      <w:bookmarkEnd w:id="19"/>
     </w:p>
     <w:p>
       <w:pPr>
@@ -9199,6 +11462,7 @@
         <w:rPr>
           <w:lang w:val="en-NZ"/>
         </w:rPr>
+        <w:lastRenderedPageBreak/>
         <w:t>the final video meets the following requirements.</w:t>
       </w:r>
     </w:p>
@@ -9225,7 +11489,6 @@
         <w:rPr>
           <w:lang w:val="en-NZ"/>
         </w:rPr>
-        <w:lastRenderedPageBreak/>
         <w:t>Team members should have their cameras on as should the client.</w:t>
       </w:r>
     </w:p>
@@ -9239,7 +11502,21 @@
         <w:rPr>
           <w:lang w:val="en-NZ"/>
         </w:rPr>
-        <w:t>If there are technical or other reasons why this cannot be done they need to be discussed with the</w:t>
+        <w:t xml:space="preserve">If there are technical or other reasons why this cannot be </w:t>
+      </w:r>
+      <w:proofErr w:type="gramStart"/>
+      <w:r>
+        <w:rPr>
+          <w:lang w:val="en-NZ"/>
+        </w:rPr>
+        <w:t>done</w:t>
+      </w:r>
+      <w:proofErr w:type="gramEnd"/>
+      <w:r>
+        <w:rPr>
+          <w:lang w:val="en-NZ"/>
+        </w:rPr>
+        <w:t xml:space="preserve"> they need to be discussed with the</w:t>
       </w:r>
       <w:r>
         <w:rPr>
@@ -9317,7 +11594,21 @@
         <w:rPr>
           <w:lang w:val="en-NZ"/>
         </w:rPr>
-        <w:t xml:space="preserve">/questions of the client, or answering the client’s </w:t>
+        <w:t xml:space="preserve">/questions of the </w:t>
+      </w:r>
+      <w:proofErr w:type="gramStart"/>
+      <w:r>
+        <w:rPr>
+          <w:lang w:val="en-NZ"/>
+        </w:rPr>
+        <w:t>client, or</w:t>
+      </w:r>
+      <w:proofErr w:type="gramEnd"/>
+      <w:r>
+        <w:rPr>
+          <w:lang w:val="en-NZ"/>
+        </w:rPr>
+        <w:t xml:space="preserve"> answering the client’s </w:t>
       </w:r>
       <w:proofErr w:type="spellStart"/>
       <w:r>
@@ -9399,7 +11690,7 @@
       </w:r>
     </w:p>
     <w:sectPr>
-      <w:footerReference w:type="default" r:id="rId10"/>
+      <w:footerReference w:type="default" r:id="rId9"/>
       <w:pgSz w:w="11906" w:h="16838"/>
       <w:pgMar w:top="720" w:right="720" w:bottom="720" w:left="720" w:header="708" w:footer="708" w:gutter="0"/>
       <w:pgNumType w:start="0"/>
@@ -9446,7 +11737,6 @@
         <w:docPartUnique/>
       </w:docPartObj>
     </w:sdtPr>
-    <w:sdtEndPr/>
     <w:sdtContent>
       <w:p>
         <w:pPr>
@@ -10688,6 +12978,33 @@
       <w:u w:val="single"/>
     </w:rPr>
   </w:style>
+  <w:style w:type="paragraph" w:customStyle="1" w:styleId="TNR">
+    <w:name w:val="TNR"/>
+    <w:basedOn w:val="Normal"/>
+    <w:link w:val="TNRChar"/>
+    <w:qFormat/>
+    <w:rsid w:val="00C45261"/>
+    <w:pPr>
+      <w:jc w:val="both"/>
+    </w:pPr>
+    <w:rPr>
+      <w:rFonts w:ascii="Times New Roman" w:hAnsi="Times New Roman"/>
+      <w:lang w:val="en-NZ"/>
+    </w:rPr>
+  </w:style>
+  <w:style w:type="character" w:customStyle="1" w:styleId="TNRChar">
+    <w:name w:val="TNR Char"/>
+    <w:basedOn w:val="DefaultParagraphFont"/>
+    <w:link w:val="TNR"/>
+    <w:rsid w:val="00C45261"/>
+    <w:rPr>
+      <w:rFonts w:ascii="Times New Roman" w:hAnsi="Times New Roman"/>
+      <w:kern w:val="0"/>
+      <w:sz w:val="22"/>
+      <w:szCs w:val="22"/>
+      <w14:ligatures w14:val="none"/>
+    </w:rPr>
+  </w:style>
 </w:styles>
 </file>
 

</xml_diff>

<commit_message>
appended client contract to capstone proposal document
</commit_message>
<xml_diff>
--- a/Capstone Proposal.docx
+++ b/Capstone Proposal.docx
@@ -3870,7 +3870,7 @@
                                               </pic:cNvPicPr>
                                             </pic:nvPicPr>
                                             <pic:blipFill>
-                                              <a:blip r:embed="rId8">
+                                              <a:blip r:embed="rId9">
                                                 <a:extLst>
                                                   <a:ext uri="{28A0092B-C50C-407E-A947-70E740481C1C}">
                                                     <a14:useLocalDpi xmlns:a14="http://schemas.microsoft.com/office/drawing/2010/main" val="0"/>
@@ -4100,7 +4100,7 @@
                                         </pic:cNvPicPr>
                                       </pic:nvPicPr>
                                       <pic:blipFill>
-                                        <a:blip r:embed="rId8">
+                                        <a:blip r:embed="rId9">
                                           <a:extLst>
                                             <a:ext uri="{28A0092B-C50C-407E-A947-70E740481C1C}">
                                               <a14:useLocalDpi xmlns:a14="http://schemas.microsoft.com/office/drawing/2010/main" val="0"/>
@@ -11680,17 +11680,3203 @@
       </w:r>
     </w:p>
     <w:p>
+      <w:r>
+        <w:t>Special note: The meeting minutes for the week that you select will need to highlight that each member led at least one of the discussion points in the agenda/meeting minutes.</w:t>
+      </w:r>
+    </w:p>
+    <w:p>
+      <w:pPr>
+        <w:pStyle w:val="Heading1"/>
+      </w:pPr>
+      <w:r>
+        <w:t>Appendices</w:t>
+      </w:r>
+    </w:p>
+    <w:p>
       <w:pPr>
         <w:rPr>
           <w:lang w:val="en-NZ"/>
         </w:rPr>
       </w:pPr>
-      <w:r>
-        <w:t>Special note: The meeting minutes for the week that you select will need to highlight that each member led at least one of the discussion points in the agenda/meeting minutes.</w:t>
-      </w:r>
+    </w:p>
+    <w:p>
+      <w:pPr>
+        <w:pStyle w:val="Heading2"/>
+      </w:pPr>
+      <w:r>
+        <w:t>Appendix A</w:t>
+      </w:r>
+    </w:p>
+    <w:p>
+      <w:pPr>
+        <w:rPr>
+          <w:lang w:val="en-NZ"/>
+        </w:rPr>
+      </w:pPr>
+      <w:r>
+        <w:rPr>
+          <w:lang w:val="en-NZ"/>
+        </w:rPr>
+        <w:t>(GANNT CHART)</w:t>
+      </w:r>
+    </w:p>
+    <w:p>
+      <w:pPr>
+        <w:rPr>
+          <w:lang w:val="en-NZ"/>
+        </w:rPr>
+      </w:pPr>
+    </w:p>
+    <w:p>
+      <w:pPr>
+        <w:rPr>
+          <w:lang w:val="en-NZ"/>
+        </w:rPr>
+      </w:pPr>
+    </w:p>
+    <w:p>
+      <w:pPr>
+        <w:rPr>
+          <w:lang w:val="en-NZ"/>
+        </w:rPr>
+      </w:pPr>
+    </w:p>
+    <w:p>
+      <w:pPr>
+        <w:rPr>
+          <w:lang w:val="en-NZ"/>
+        </w:rPr>
+      </w:pPr>
+    </w:p>
+    <w:p>
+      <w:pPr>
+        <w:rPr>
+          <w:lang w:val="en-NZ"/>
+        </w:rPr>
+      </w:pPr>
+    </w:p>
+    <w:p>
+      <w:pPr>
+        <w:rPr>
+          <w:lang w:val="en-NZ"/>
+        </w:rPr>
+      </w:pPr>
+    </w:p>
+    <w:p>
+      <w:pPr>
+        <w:rPr>
+          <w:lang w:val="en-NZ"/>
+        </w:rPr>
+      </w:pPr>
+    </w:p>
+    <w:p>
+      <w:pPr>
+        <w:rPr>
+          <w:lang w:val="en-NZ"/>
+        </w:rPr>
+      </w:pPr>
+    </w:p>
+    <w:p>
+      <w:pPr>
+        <w:pStyle w:val="Heading2"/>
+      </w:pPr>
+      <w:r>
+        <w:lastRenderedPageBreak/>
+        <w:t xml:space="preserve">Appendix </w:t>
+      </w:r>
+      <w:r>
+        <w:t>B</w:t>
+      </w:r>
+    </w:p>
+    <w:p>
+      <w:pPr>
+        <w:spacing w:after="0" w:line="259" w:lineRule="auto"/>
+      </w:pPr>
+      <w:r>
+        <w:rPr>
+          <w:i/>
+          <w:color w:val="006F00"/>
+          <w:sz w:val="48"/>
+        </w:rPr>
+        <w:t xml:space="preserve">IT7510 Project Client Contract </w:t>
+      </w:r>
+    </w:p>
+    <w:p>
+      <w:pPr>
+        <w:spacing w:after="408" w:line="259" w:lineRule="auto"/>
+        <w:ind w:left="-29" w:right="-755"/>
+      </w:pPr>
+      <w:r>
+        <w:rPr>
+          <w:rFonts w:ascii="Calibri" w:eastAsia="Calibri" w:hAnsi="Calibri" w:cs="Calibri"/>
+          <w:noProof/>
+        </w:rPr>
+        <mc:AlternateContent>
+          <mc:Choice Requires="wpg">
+            <w:drawing>
+              <wp:inline distT="0" distB="0" distL="0" distR="0" wp14:anchorId="58123F14" wp14:editId="4F0AC88B">
+                <wp:extent cx="6697981" cy="9144"/>
+                <wp:effectExtent l="0" t="0" r="0" b="0"/>
+                <wp:docPr id="3184" name="Group 3184"/>
+                <wp:cNvGraphicFramePr/>
+                <a:graphic xmlns:a="http://schemas.openxmlformats.org/drawingml/2006/main">
+                  <a:graphicData uri="http://schemas.microsoft.com/office/word/2010/wordprocessingGroup">
+                    <wpg:wgp>
+                      <wpg:cNvGrpSpPr/>
+                      <wpg:grpSpPr>
+                        <a:xfrm>
+                          <a:off x="0" y="0"/>
+                          <a:ext cx="6697981" cy="9144"/>
+                          <a:chOff x="0" y="0"/>
+                          <a:chExt cx="6697981" cy="9144"/>
+                        </a:xfrm>
+                      </wpg:grpSpPr>
+                      <wps:wsp>
+                        <wps:cNvPr id="4615" name="Shape 4615"/>
+                        <wps:cNvSpPr/>
+                        <wps:spPr>
+                          <a:xfrm>
+                            <a:off x="0" y="0"/>
+                            <a:ext cx="6697981" cy="9144"/>
+                          </a:xfrm>
+                          <a:custGeom>
+                            <a:avLst/>
+                            <a:gdLst/>
+                            <a:ahLst/>
+                            <a:cxnLst/>
+                            <a:rect l="0" t="0" r="0" b="0"/>
+                            <a:pathLst>
+                              <a:path w="6697981" h="9144">
+                                <a:moveTo>
+                                  <a:pt x="0" y="0"/>
+                                </a:moveTo>
+                                <a:lnTo>
+                                  <a:pt x="6697981" y="0"/>
+                                </a:lnTo>
+                                <a:lnTo>
+                                  <a:pt x="6697981" y="9144"/>
+                                </a:lnTo>
+                                <a:lnTo>
+                                  <a:pt x="0" y="9144"/>
+                                </a:lnTo>
+                                <a:lnTo>
+                                  <a:pt x="0" y="0"/>
+                                </a:lnTo>
+                              </a:path>
+                            </a:pathLst>
+                          </a:custGeom>
+                          <a:ln w="0" cap="flat">
+                            <a:miter lim="127000"/>
+                          </a:ln>
+                        </wps:spPr>
+                        <wps:style>
+                          <a:lnRef idx="0">
+                            <a:srgbClr val="000000">
+                              <a:alpha val="0"/>
+                            </a:srgbClr>
+                          </a:lnRef>
+                          <a:fillRef idx="1">
+                            <a:srgbClr val="C0C0C0"/>
+                          </a:fillRef>
+                          <a:effectRef idx="0">
+                            <a:scrgbClr r="0" g="0" b="0"/>
+                          </a:effectRef>
+                          <a:fontRef idx="none"/>
+                        </wps:style>
+                        <wps:bodyPr/>
+                      </wps:wsp>
+                    </wpg:wgp>
+                  </a:graphicData>
+                </a:graphic>
+              </wp:inline>
+            </w:drawing>
+          </mc:Choice>
+          <mc:Fallback>
+            <w:pict>
+              <v:group w14:anchorId="5CE4B382" id="Group 3184" o:spid="_x0000_s1026" style="width:527.4pt;height:.7pt;mso-position-horizontal-relative:char;mso-position-vertical-relative:line" coordsize="66979,91" o:gfxdata="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">
+                <v:shape id="Shape 4615" o:spid="_x0000_s1027" style="position:absolute;width:66979;height:91;visibility:visible;mso-wrap-style:square;v-text-anchor:top" coordsize="6697981,9144" o:gfxdata="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" path="m,l6697981,r,9144l,9144,,e" fillcolor="silver" stroked="f" strokeweight="0">
+                  <v:stroke miterlimit="83231f" joinstyle="miter"/>
+                  <v:path arrowok="t" textboxrect="0,0,6697981,9144"/>
+                </v:shape>
+                <w10:anchorlock/>
+              </v:group>
+            </w:pict>
+          </mc:Fallback>
+        </mc:AlternateContent>
+      </w:r>
+    </w:p>
+    <w:p>
+      <w:pPr>
+        <w:ind w:left="279"/>
+      </w:pPr>
+      <w:r>
+        <w:t xml:space="preserve">WHITIREIA and WELTEC NEW ZEALAND </w:t>
+      </w:r>
+    </w:p>
+    <w:p>
+      <w:pPr>
+        <w:ind w:left="279"/>
+      </w:pPr>
+      <w:r>
+        <w:t xml:space="preserve">SCHOOL OF INNOVATION, DESIGN and TECHNOLOGY </w:t>
+      </w:r>
+    </w:p>
+    <w:p>
+      <w:pPr>
+        <w:ind w:left="279"/>
+      </w:pPr>
+      <w:r>
+        <w:t xml:space="preserve">PROJECT AGREEMENT </w:t>
+      </w:r>
+    </w:p>
+    <w:p>
+      <w:pPr>
+        <w:spacing w:after="158" w:line="259" w:lineRule="auto"/>
+        <w:ind w:left="284"/>
+      </w:pPr>
+      <w:r>
+        <w:t xml:space="preserve"> </w:t>
+      </w:r>
+    </w:p>
+    <w:p>
+      <w:pPr>
+        <w:pStyle w:val="Heading1"/>
+        <w:ind w:left="279"/>
+      </w:pPr>
+      <w:r>
+        <w:t xml:space="preserve">The Parties </w:t>
+      </w:r>
+    </w:p>
+    <w:p>
+      <w:pPr>
+        <w:spacing w:after="160" w:line="259" w:lineRule="auto"/>
+        <w:ind w:left="284"/>
+      </w:pPr>
+      <w:r>
+        <w:t xml:space="preserve"> </w:t>
+      </w:r>
+    </w:p>
+    <w:p>
+      <w:pPr>
+        <w:ind w:left="279"/>
+      </w:pPr>
+      <w:r>
+        <w:t xml:space="preserve">This Student(s) Project Agreement (the “Agreement”) is made between: </w:t>
+      </w:r>
+    </w:p>
+    <w:p>
+      <w:pPr>
+        <w:numPr>
+          <w:ilvl w:val="0"/>
+          <w:numId w:val="1"/>
+        </w:numPr>
+        <w:spacing w:after="170" w:line="249" w:lineRule="auto"/>
+        <w:ind w:hanging="427"/>
+        <w:jc w:val="both"/>
+      </w:pPr>
+      <w:r>
+        <w:t xml:space="preserve">Whitireia and </w:t>
+      </w:r>
+      <w:proofErr w:type="spellStart"/>
+      <w:r>
+        <w:t>Weltec</w:t>
+      </w:r>
+      <w:proofErr w:type="spellEnd"/>
+      <w:r>
+        <w:t xml:space="preserve"> New Zealand School of Innovation, Design and Technology </w:t>
+      </w:r>
+    </w:p>
+    <w:p>
+      <w:pPr>
+        <w:ind w:left="279"/>
+      </w:pPr>
+      <w:r>
+        <w:t xml:space="preserve">(the “Faculty”); </w:t>
+      </w:r>
+    </w:p>
+    <w:p>
+      <w:pPr>
+        <w:numPr>
+          <w:ilvl w:val="0"/>
+          <w:numId w:val="1"/>
+        </w:numPr>
+        <w:spacing w:after="28" w:line="249" w:lineRule="auto"/>
+        <w:ind w:hanging="427"/>
+        <w:jc w:val="both"/>
+      </w:pPr>
+      <w:r>
+        <w:t xml:space="preserve">the nominated computing student(s) (the “Student(s)”) (as listed under section 6); and </w:t>
+      </w:r>
+    </w:p>
+    <w:p>
+      <w:pPr>
+        <w:tabs>
+          <w:tab w:val="center" w:pos="2668"/>
+          <w:tab w:val="center" w:pos="5079"/>
+          <w:tab w:val="center" w:pos="5992"/>
+          <w:tab w:val="center" w:pos="7142"/>
+          <w:tab w:val="center" w:pos="8457"/>
+          <w:tab w:val="right" w:pos="9764"/>
+        </w:tabs>
+        <w:spacing w:after="4" w:line="259" w:lineRule="auto"/>
+      </w:pPr>
+      <w:r>
+        <w:rPr>
+          <w:rFonts w:ascii="Calibri" w:eastAsia="Calibri" w:hAnsi="Calibri" w:cs="Calibri"/>
+        </w:rPr>
+        <w:tab/>
+      </w:r>
+      <w:r>
+        <w:t xml:space="preserve">________________________________ </w:t>
+      </w:r>
+      <w:r>
+        <w:tab/>
+        <w:t xml:space="preserve">the </w:t>
+      </w:r>
+      <w:r>
+        <w:tab/>
+        <w:t xml:space="preserve">proposed </w:t>
+      </w:r>
+      <w:r>
+        <w:tab/>
+        <w:t xml:space="preserve">Industry </w:t>
+      </w:r>
+      <w:r>
+        <w:tab/>
+        <w:t xml:space="preserve">Organisation </w:t>
+      </w:r>
+      <w:r>
+        <w:tab/>
+        <w:t xml:space="preserve">(the </w:t>
+      </w:r>
+    </w:p>
+    <w:p>
+      <w:pPr>
+        <w:ind w:left="721"/>
+      </w:pPr>
+      <w:r>
+        <w:t xml:space="preserve">“Organisation”). </w:t>
+      </w:r>
+    </w:p>
+    <w:p>
+      <w:pPr>
+        <w:spacing w:after="158" w:line="259" w:lineRule="auto"/>
+        <w:ind w:left="284"/>
+      </w:pPr>
+      <w:r>
+        <w:t xml:space="preserve"> </w:t>
+      </w:r>
+    </w:p>
+    <w:p>
+      <w:pPr>
+        <w:ind w:left="279"/>
+      </w:pPr>
+      <w:r>
+        <w:t xml:space="preserve">BACKGROUND </w:t>
+      </w:r>
+    </w:p>
+    <w:p>
+      <w:pPr>
+        <w:spacing w:after="160" w:line="259" w:lineRule="auto"/>
+        <w:ind w:left="284"/>
+      </w:pPr>
+      <w:r>
+        <w:t xml:space="preserve"> </w:t>
+      </w:r>
+    </w:p>
+    <w:p>
+      <w:pPr>
+        <w:numPr>
+          <w:ilvl w:val="0"/>
+          <w:numId w:val="2"/>
+        </w:numPr>
+        <w:spacing w:after="170" w:line="249" w:lineRule="auto"/>
+        <w:ind w:hanging="427"/>
+        <w:jc w:val="both"/>
+      </w:pPr>
+      <w:r>
+        <w:t xml:space="preserve">As part of an established course of study at the Faculty, Bachelor of Information Technology students take a course module IT7x01, in which the </w:t>
+      </w:r>
+      <w:proofErr w:type="gramStart"/>
+      <w:r>
+        <w:t>Student</w:t>
+      </w:r>
+      <w:proofErr w:type="gramEnd"/>
+      <w:r>
+        <w:t xml:space="preserve">(s) completes a project (“the Project”) with the Organisation on the basis set out in this Agreement. </w:t>
+      </w:r>
+    </w:p>
+    <w:p>
+      <w:pPr>
+        <w:numPr>
+          <w:ilvl w:val="0"/>
+          <w:numId w:val="2"/>
+        </w:numPr>
+        <w:spacing w:after="170" w:line="249" w:lineRule="auto"/>
+        <w:ind w:hanging="427"/>
+        <w:jc w:val="both"/>
+      </w:pPr>
+      <w:r>
+        <w:t xml:space="preserve">The Organisation agrees to allow the </w:t>
+      </w:r>
+      <w:proofErr w:type="gramStart"/>
+      <w:r>
+        <w:t>Student</w:t>
+      </w:r>
+      <w:proofErr w:type="gramEnd"/>
+      <w:r>
+        <w:t xml:space="preserve">(s) access to its premises if needed to undertake that Project on the basis set out in this Agreement. </w:t>
+      </w:r>
+    </w:p>
+    <w:p>
+      <w:pPr>
+        <w:numPr>
+          <w:ilvl w:val="0"/>
+          <w:numId w:val="2"/>
+        </w:numPr>
+        <w:spacing w:after="170" w:line="249" w:lineRule="auto"/>
+        <w:ind w:hanging="427"/>
+        <w:jc w:val="both"/>
+      </w:pPr>
+      <w:r>
+        <w:t xml:space="preserve">The </w:t>
+      </w:r>
+      <w:proofErr w:type="gramStart"/>
+      <w:r>
+        <w:t>Faculty</w:t>
+      </w:r>
+      <w:proofErr w:type="gramEnd"/>
+      <w:r>
+        <w:t xml:space="preserve"> is satisfied that the Organisation is suitable for the Student(s) Project. </w:t>
+      </w:r>
+    </w:p>
+    <w:p>
+      <w:pPr>
+        <w:spacing w:after="158" w:line="259" w:lineRule="auto"/>
+        <w:ind w:left="283"/>
+      </w:pPr>
+      <w:r>
+        <w:t xml:space="preserve"> </w:t>
+      </w:r>
+    </w:p>
+    <w:p>
+      <w:pPr>
+        <w:ind w:left="279"/>
+      </w:pPr>
+      <w:r>
+        <w:t xml:space="preserve">TERMS </w:t>
+      </w:r>
+    </w:p>
+    <w:p>
+      <w:pPr>
+        <w:spacing w:after="160" w:line="259" w:lineRule="auto"/>
+        <w:ind w:left="283"/>
+      </w:pPr>
+      <w:r>
+        <w:t xml:space="preserve"> </w:t>
+      </w:r>
+    </w:p>
+    <w:p>
+      <w:pPr>
+        <w:spacing w:after="0" w:line="259" w:lineRule="auto"/>
+        <w:ind w:left="279"/>
+      </w:pPr>
+      <w:r>
+        <w:rPr>
+          <w:b/>
+        </w:rPr>
+        <w:t xml:space="preserve">1. Effective Date </w:t>
+      </w:r>
+    </w:p>
+    <w:p>
+      <w:pPr>
+        <w:spacing w:after="0" w:line="259" w:lineRule="auto"/>
+        <w:ind w:left="703"/>
+      </w:pPr>
+      <w:r>
+        <w:rPr>
+          <w:b/>
+        </w:rPr>
+        <w:t xml:space="preserve"> </w:t>
+      </w:r>
+    </w:p>
+    <w:p>
+      <w:pPr>
+        <w:ind w:left="713"/>
+      </w:pPr>
+      <w:r>
+        <w:t xml:space="preserve">This Agreement shall be effective as of ____________________ until ________________ </w:t>
+      </w:r>
+    </w:p>
+    <w:p>
+      <w:pPr>
+        <w:spacing w:after="158" w:line="259" w:lineRule="auto"/>
+        <w:ind w:left="283"/>
+      </w:pPr>
+      <w:r>
+        <w:rPr>
+          <w:b/>
+        </w:rPr>
+        <w:t xml:space="preserve"> </w:t>
+      </w:r>
+    </w:p>
+    <w:p>
+      <w:pPr>
+        <w:pStyle w:val="Heading1"/>
+        <w:ind w:left="279"/>
+      </w:pPr>
+      <w:r>
+        <w:t xml:space="preserve">2. Undertakings </w:t>
+      </w:r>
+    </w:p>
+    <w:p>
+      <w:pPr>
+        <w:spacing w:after="160" w:line="259" w:lineRule="auto"/>
+        <w:ind w:left="283"/>
+      </w:pPr>
+      <w:r>
+        <w:rPr>
+          <w:b/>
+        </w:rPr>
+        <w:t xml:space="preserve"> </w:t>
+      </w:r>
+    </w:p>
+    <w:p>
+      <w:pPr>
+        <w:ind w:left="696" w:hanging="427"/>
+      </w:pPr>
+      <w:r>
+        <w:lastRenderedPageBreak/>
+        <w:t xml:space="preserve">2.1 The Organisation has accepted the </w:t>
+      </w:r>
+      <w:proofErr w:type="gramStart"/>
+      <w:r>
+        <w:t>Student</w:t>
+      </w:r>
+      <w:proofErr w:type="gramEnd"/>
+      <w:r>
+        <w:t xml:space="preserve">(s) and agrees to allow that Student(s) access to its premises as needed. </w:t>
+      </w:r>
+    </w:p>
+    <w:p>
+      <w:pPr>
+        <w:ind w:left="696" w:hanging="427"/>
+      </w:pPr>
+      <w:r>
+        <w:t xml:space="preserve">2.2 The Organisation agrees to be responsible for meeting the requirements of its statutory obligations, e.g. Health and Safety in Employment Act, Human Rights Act, etc., for the </w:t>
+      </w:r>
+      <w:proofErr w:type="gramStart"/>
+      <w:r>
+        <w:t>Student</w:t>
+      </w:r>
+      <w:proofErr w:type="gramEnd"/>
+      <w:r>
+        <w:t xml:space="preserve">(s). </w:t>
+      </w:r>
+    </w:p>
+    <w:p>
+      <w:pPr>
+        <w:ind w:left="696" w:hanging="427"/>
+      </w:pPr>
+      <w:r>
+        <w:t xml:space="preserve">2.3 The Student(s) will use their best efforts in undertaking the Project for the Organisation, as mutually agreed by the parties and set out in a separate written proposal which will form part of this Agreement. </w:t>
+      </w:r>
+    </w:p>
+    <w:p>
+      <w:pPr>
+        <w:ind w:left="696" w:hanging="427"/>
+      </w:pPr>
+      <w:r>
+        <w:t xml:space="preserve">2.4 The Organisation understands that the primary reason for the Project is education and advancement of knowledge, and, consequently, the Project must further that purpose. </w:t>
+      </w:r>
+    </w:p>
+    <w:p>
+      <w:pPr>
+        <w:ind w:left="696" w:hanging="427"/>
+      </w:pPr>
+      <w:r>
+        <w:t xml:space="preserve">2.5 Neither the Faculty nor the </w:t>
+      </w:r>
+      <w:proofErr w:type="gramStart"/>
+      <w:r>
+        <w:t>Student</w:t>
+      </w:r>
+      <w:proofErr w:type="gramEnd"/>
+      <w:r>
+        <w:t xml:space="preserve">(s) guarantee specific results and the Project will be undertaken only on a </w:t>
+      </w:r>
+      <w:proofErr w:type="gramStart"/>
+      <w:r>
+        <w:t>best efforts</w:t>
+      </w:r>
+      <w:proofErr w:type="gramEnd"/>
+      <w:r>
+        <w:t xml:space="preserve"> basis. </w:t>
+      </w:r>
+    </w:p>
+    <w:p>
+      <w:pPr>
+        <w:ind w:left="696" w:hanging="427"/>
+      </w:pPr>
+      <w:r>
+        <w:t xml:space="preserve">2.6 The Student(s) agrees to submit their IT7510 report to their nominated supervisor at the Organisation. </w:t>
+      </w:r>
+    </w:p>
+    <w:p>
+      <w:pPr>
+        <w:spacing w:after="180" w:line="259" w:lineRule="auto"/>
+        <w:ind w:left="282"/>
+      </w:pPr>
+      <w:r>
+        <w:t xml:space="preserve"> </w:t>
+      </w:r>
+    </w:p>
+    <w:p>
+      <w:pPr>
+        <w:pStyle w:val="Heading1"/>
+        <w:tabs>
+          <w:tab w:val="center" w:pos="344"/>
+          <w:tab w:val="center" w:pos="4390"/>
+        </w:tabs>
+      </w:pPr>
+      <w:r>
+        <w:rPr>
+          <w:rFonts w:ascii="Calibri" w:eastAsia="Calibri" w:hAnsi="Calibri" w:cs="Calibri"/>
+          <w:b w:val="0"/>
+        </w:rPr>
+        <w:tab/>
+      </w:r>
+      <w:r>
+        <w:t xml:space="preserve">3 </w:t>
+      </w:r>
+      <w:r>
+        <w:tab/>
+        <w:t xml:space="preserve">Copyright, Patents, </w:t>
+      </w:r>
+      <w:proofErr w:type="gramStart"/>
+      <w:r>
+        <w:t>Trade Marks</w:t>
+      </w:r>
+      <w:proofErr w:type="gramEnd"/>
+      <w:r>
+        <w:t xml:space="preserve"> and other Intellectual Property Rights </w:t>
+      </w:r>
+    </w:p>
+    <w:p>
+      <w:pPr>
+        <w:spacing w:after="160" w:line="259" w:lineRule="auto"/>
+        <w:ind w:left="282"/>
+      </w:pPr>
+      <w:r>
+        <w:rPr>
+          <w:b/>
+        </w:rPr>
+        <w:t xml:space="preserve"> </w:t>
+      </w:r>
+    </w:p>
+    <w:p>
+      <w:pPr>
+        <w:ind w:left="279"/>
+      </w:pPr>
+      <w:r>
+        <w:t xml:space="preserve">The Faculty and Student(s) each acknowledge that all copyright, trademarks, trade names, patents and other intellectual property rights belonging to the Organisation that the Faculty and Student(s) come into contact with are and shall remain the sole property of the Organisation, and no claim or right to them is to be made by or created in the Faculty or Student(s). </w:t>
+      </w:r>
+    </w:p>
+    <w:p>
+      <w:pPr>
+        <w:spacing w:after="177" w:line="259" w:lineRule="auto"/>
+        <w:ind w:left="282"/>
+      </w:pPr>
+      <w:r>
+        <w:t xml:space="preserve"> </w:t>
+      </w:r>
+    </w:p>
+    <w:p>
+      <w:pPr>
+        <w:pStyle w:val="Heading1"/>
+        <w:tabs>
+          <w:tab w:val="center" w:pos="343"/>
+          <w:tab w:val="center" w:pos="1980"/>
+        </w:tabs>
+      </w:pPr>
+      <w:r>
+        <w:rPr>
+          <w:rFonts w:ascii="Calibri" w:eastAsia="Calibri" w:hAnsi="Calibri" w:cs="Calibri"/>
+          <w:b w:val="0"/>
+        </w:rPr>
+        <w:tab/>
+      </w:r>
+      <w:r>
+        <w:t xml:space="preserve">4 </w:t>
+      </w:r>
+      <w:r>
+        <w:tab/>
+        <w:t xml:space="preserve">Confidential Information </w:t>
+      </w:r>
+    </w:p>
+    <w:p>
+      <w:pPr>
+        <w:spacing w:after="160" w:line="259" w:lineRule="auto"/>
+        <w:ind w:left="282"/>
+      </w:pPr>
+      <w:r>
+        <w:t xml:space="preserve"> </w:t>
+      </w:r>
+    </w:p>
+    <w:p>
+      <w:pPr>
+        <w:ind w:left="696" w:hanging="427"/>
+      </w:pPr>
+      <w:r>
+        <w:t xml:space="preserve">4.1 The parties may wish, from time to time, in connection with the Project undertaken under this Agreement, to disclose certain information of a confidential nature (“Confidential Information”) to each other.  Each party will use reasonable efforts to prevent the disclosure of any of the other parties Confidential Information to third parties for a period of three (3) years from receipt of that information, provided that the recipient party’s obligation shall not apply to information that: </w:t>
+      </w:r>
+    </w:p>
+    <w:p>
+      <w:pPr>
+        <w:spacing w:after="160" w:line="259" w:lineRule="auto"/>
+        <w:ind w:left="282"/>
+      </w:pPr>
+      <w:r>
+        <w:t xml:space="preserve"> </w:t>
+      </w:r>
+    </w:p>
+    <w:p>
+      <w:pPr>
+        <w:numPr>
+          <w:ilvl w:val="0"/>
+          <w:numId w:val="3"/>
+        </w:numPr>
+        <w:spacing w:after="170" w:line="249" w:lineRule="auto"/>
+        <w:ind w:hanging="425"/>
+        <w:jc w:val="both"/>
+      </w:pPr>
+      <w:r>
+        <w:t xml:space="preserve">is not disclosed in writing or reduced to writing and marked with an appropriate confidentiality legend or designated in writing as Confidential Information within thirty (30) days of disclosure; </w:t>
+      </w:r>
+    </w:p>
+    <w:p>
+      <w:pPr>
+        <w:numPr>
+          <w:ilvl w:val="0"/>
+          <w:numId w:val="3"/>
+        </w:numPr>
+        <w:spacing w:after="170" w:line="249" w:lineRule="auto"/>
+        <w:ind w:hanging="425"/>
+        <w:jc w:val="both"/>
+      </w:pPr>
+      <w:r>
+        <w:t xml:space="preserve">is already in the recipient party’s possession at the time of disclosure; </w:t>
+      </w:r>
+    </w:p>
+    <w:p>
+      <w:pPr>
+        <w:numPr>
+          <w:ilvl w:val="0"/>
+          <w:numId w:val="3"/>
+        </w:numPr>
+        <w:spacing w:after="170" w:line="249" w:lineRule="auto"/>
+        <w:ind w:hanging="425"/>
+        <w:jc w:val="both"/>
+      </w:pPr>
+      <w:r>
+        <w:t xml:space="preserve">is or later becomes part of the public domain through no fault of the recipient party; </w:t>
+      </w:r>
+    </w:p>
+    <w:p>
+      <w:pPr>
+        <w:numPr>
+          <w:ilvl w:val="0"/>
+          <w:numId w:val="3"/>
+        </w:numPr>
+        <w:spacing w:after="170" w:line="249" w:lineRule="auto"/>
+        <w:ind w:hanging="425"/>
+        <w:jc w:val="both"/>
+      </w:pPr>
+      <w:r>
+        <w:t xml:space="preserve">is received from a third party having no obligations of confidentiality to the disclosing party; </w:t>
+      </w:r>
+    </w:p>
+    <w:p>
+      <w:pPr>
+        <w:numPr>
+          <w:ilvl w:val="0"/>
+          <w:numId w:val="3"/>
+        </w:numPr>
+        <w:spacing w:after="170" w:line="249" w:lineRule="auto"/>
+        <w:ind w:hanging="425"/>
+        <w:jc w:val="both"/>
+      </w:pPr>
+      <w:r>
+        <w:t xml:space="preserve">is independently developed by the recipient party; or </w:t>
+      </w:r>
+    </w:p>
+    <w:p>
+      <w:pPr>
+        <w:numPr>
+          <w:ilvl w:val="0"/>
+          <w:numId w:val="3"/>
+        </w:numPr>
+        <w:spacing w:after="170" w:line="249" w:lineRule="auto"/>
+        <w:ind w:hanging="425"/>
+        <w:jc w:val="both"/>
+      </w:pPr>
+      <w:r>
+        <w:t xml:space="preserve">is required by law or regulation to be disclosed. </w:t>
+      </w:r>
+    </w:p>
+    <w:p>
+      <w:pPr>
+        <w:spacing w:after="160" w:line="259" w:lineRule="auto"/>
+        <w:ind w:left="709"/>
+      </w:pPr>
+      <w:r>
+        <w:lastRenderedPageBreak/>
+        <w:t xml:space="preserve"> </w:t>
+      </w:r>
+    </w:p>
+    <w:p>
+      <w:pPr>
+        <w:numPr>
+          <w:ilvl w:val="1"/>
+          <w:numId w:val="4"/>
+        </w:numPr>
+        <w:spacing w:after="9" w:line="249" w:lineRule="auto"/>
+        <w:ind w:hanging="427"/>
+        <w:jc w:val="both"/>
+      </w:pPr>
+      <w:r>
+        <w:t xml:space="preserve">Application may be made to any party for written permission to use Confidential Information.  </w:t>
+      </w:r>
+    </w:p>
+    <w:p>
+      <w:pPr>
+        <w:ind w:left="719"/>
+      </w:pPr>
+      <w:r>
+        <w:t xml:space="preserve">No party shall unreasonably withhold such permission. </w:t>
+      </w:r>
+    </w:p>
+    <w:p>
+      <w:pPr>
+        <w:numPr>
+          <w:ilvl w:val="1"/>
+          <w:numId w:val="4"/>
+        </w:numPr>
+        <w:spacing w:after="170" w:line="249" w:lineRule="auto"/>
+        <w:ind w:hanging="427"/>
+        <w:jc w:val="both"/>
+      </w:pPr>
+      <w:r>
+        <w:t xml:space="preserve">If permission to use Confidential Information is withheld by a party, then that party will state the reason or basis for refusal of permission. </w:t>
+      </w:r>
+    </w:p>
+    <w:p>
+      <w:pPr>
+        <w:spacing w:after="177" w:line="259" w:lineRule="auto"/>
+        <w:ind w:left="283"/>
+      </w:pPr>
+      <w:r>
+        <w:t xml:space="preserve"> </w:t>
+      </w:r>
+    </w:p>
+    <w:p>
+      <w:pPr>
+        <w:pStyle w:val="Heading1"/>
+        <w:tabs>
+          <w:tab w:val="center" w:pos="344"/>
+          <w:tab w:val="center" w:pos="2141"/>
+        </w:tabs>
+      </w:pPr>
+      <w:r>
+        <w:rPr>
+          <w:rFonts w:ascii="Calibri" w:eastAsia="Calibri" w:hAnsi="Calibri" w:cs="Calibri"/>
+          <w:b w:val="0"/>
+        </w:rPr>
+        <w:tab/>
+      </w:r>
+      <w:r>
+        <w:t xml:space="preserve">5 </w:t>
+      </w:r>
+      <w:r>
+        <w:tab/>
+        <w:t xml:space="preserve">Intellectual Property Rights </w:t>
+      </w:r>
+    </w:p>
+    <w:p>
+      <w:pPr>
+        <w:ind w:left="696" w:hanging="427"/>
+      </w:pPr>
+      <w:r>
+        <w:t xml:space="preserve">5.1 The parties agree that both the Faculty and the Student(s) may use the intellectual property rights that are created </w:t>
+      </w:r>
+      <w:proofErr w:type="gramStart"/>
+      <w:r>
+        <w:t>as a result of</w:t>
+      </w:r>
+      <w:proofErr w:type="gramEnd"/>
+      <w:r>
+        <w:t xml:space="preserve"> the Project work undertaken by each Student for the Organisation for portfolio purposes to promote the </w:t>
+      </w:r>
+      <w:proofErr w:type="gramStart"/>
+      <w:r>
+        <w:t>Faculty</w:t>
+      </w:r>
+      <w:proofErr w:type="gramEnd"/>
+      <w:r>
+        <w:t xml:space="preserve"> and/or the </w:t>
+      </w:r>
+      <w:proofErr w:type="gramStart"/>
+      <w:r>
+        <w:t>Student</w:t>
+      </w:r>
+      <w:proofErr w:type="gramEnd"/>
+      <w:r>
+        <w:t xml:space="preserve">(s). </w:t>
+      </w:r>
+    </w:p>
+    <w:p>
+      <w:pPr>
+        <w:ind w:left="279"/>
+      </w:pPr>
+      <w:r>
+        <w:t xml:space="preserve">5.2 The following intellectual property rights are agreed between the parties: </w:t>
+      </w:r>
+    </w:p>
+    <w:p>
+      <w:pPr>
+        <w:spacing w:after="163" w:line="259" w:lineRule="auto"/>
+        <w:ind w:left="282"/>
+      </w:pPr>
+      <w:r>
+        <w:t xml:space="preserve"> </w:t>
+      </w:r>
+    </w:p>
+    <w:p>
+      <w:pPr>
+        <w:spacing w:after="163" w:line="257" w:lineRule="auto"/>
+        <w:ind w:left="705"/>
+      </w:pPr>
+      <w:r>
+        <w:rPr>
+          <w:i/>
+        </w:rPr>
+        <w:t xml:space="preserve">(Please indicate which option is agreed upon by placing a tick in the appropriate box and deleting the options that do not apply.) </w:t>
+      </w:r>
+    </w:p>
+    <w:p>
+      <w:pPr>
+        <w:spacing w:after="133" w:line="259" w:lineRule="auto"/>
+        <w:ind w:left="710"/>
+      </w:pPr>
+      <w:r>
+        <w:rPr>
+          <w:i/>
+        </w:rPr>
+        <w:t xml:space="preserve"> </w:t>
+      </w:r>
+    </w:p>
+    <w:p>
+      <w:pPr>
+        <w:tabs>
+          <w:tab w:val="center" w:pos="554"/>
+          <w:tab w:val="center" w:pos="3018"/>
+        </w:tabs>
+        <w:spacing w:after="133" w:line="259" w:lineRule="auto"/>
+      </w:pPr>
+      <w:r>
+        <w:rPr>
+          <w:rFonts w:ascii="Calibri" w:eastAsia="Calibri" w:hAnsi="Calibri" w:cs="Calibri"/>
+        </w:rPr>
+        <w:tab/>
+      </w:r>
+      <w:r>
+        <w:rPr>
+          <w:rFonts w:ascii="Calibri" w:eastAsia="Calibri" w:hAnsi="Calibri" w:cs="Calibri"/>
+          <w:noProof/>
+        </w:rPr>
+        <mc:AlternateContent>
+          <mc:Choice Requires="wpg">
+            <w:drawing>
+              <wp:inline distT="0" distB="0" distL="0" distR="0" wp14:anchorId="6BBC5403" wp14:editId="32EFD6ED">
+                <wp:extent cx="182880" cy="182880"/>
+                <wp:effectExtent l="0" t="0" r="0" b="0"/>
+                <wp:docPr id="3400" name="Group 3400"/>
+                <wp:cNvGraphicFramePr/>
+                <a:graphic xmlns:a="http://schemas.openxmlformats.org/drawingml/2006/main">
+                  <a:graphicData uri="http://schemas.microsoft.com/office/word/2010/wordprocessingGroup">
+                    <wpg:wgp>
+                      <wpg:cNvGrpSpPr/>
+                      <wpg:grpSpPr>
+                        <a:xfrm>
+                          <a:off x="0" y="0"/>
+                          <a:ext cx="182880" cy="182880"/>
+                          <a:chOff x="0" y="0"/>
+                          <a:chExt cx="182880" cy="182880"/>
+                        </a:xfrm>
+                      </wpg:grpSpPr>
+                      <wps:wsp>
+                        <wps:cNvPr id="185" name="Shape 185"/>
+                        <wps:cNvSpPr/>
+                        <wps:spPr>
+                          <a:xfrm>
+                            <a:off x="0" y="0"/>
+                            <a:ext cx="182880" cy="182880"/>
+                          </a:xfrm>
+                          <a:custGeom>
+                            <a:avLst/>
+                            <a:gdLst/>
+                            <a:ahLst/>
+                            <a:cxnLst/>
+                            <a:rect l="0" t="0" r="0" b="0"/>
+                            <a:pathLst>
+                              <a:path w="182880" h="182880">
+                                <a:moveTo>
+                                  <a:pt x="0" y="0"/>
+                                </a:moveTo>
+                                <a:lnTo>
+                                  <a:pt x="182880" y="0"/>
+                                </a:lnTo>
+                                <a:lnTo>
+                                  <a:pt x="182880" y="182880"/>
+                                </a:lnTo>
+                                <a:lnTo>
+                                  <a:pt x="0" y="182880"/>
+                                </a:lnTo>
+                                <a:lnTo>
+                                  <a:pt x="0" y="0"/>
+                                </a:lnTo>
+                                <a:close/>
+                              </a:path>
+                            </a:pathLst>
+                          </a:custGeom>
+                          <a:ln w="9525" cap="flat">
+                            <a:miter lim="101600"/>
+                          </a:ln>
+                        </wps:spPr>
+                        <wps:style>
+                          <a:lnRef idx="1">
+                            <a:srgbClr val="000000"/>
+                          </a:lnRef>
+                          <a:fillRef idx="0">
+                            <a:srgbClr val="FFFFFF"/>
+                          </a:fillRef>
+                          <a:effectRef idx="0">
+                            <a:scrgbClr r="0" g="0" b="0"/>
+                          </a:effectRef>
+                          <a:fontRef idx="none"/>
+                        </wps:style>
+                        <wps:bodyPr/>
+                      </wps:wsp>
+                    </wpg:wgp>
+                  </a:graphicData>
+                </a:graphic>
+              </wp:inline>
+            </w:drawing>
+          </mc:Choice>
+          <mc:Fallback>
+            <w:pict>
+              <v:group w14:anchorId="4B204673" id="Group 3400" o:spid="_x0000_s1026" style="width:14.4pt;height:14.4pt;mso-position-horizontal-relative:char;mso-position-vertical-relative:line" coordsize="182880,182880" o:gfxdata="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">
+                <v:shape id="Shape 185" o:spid="_x0000_s1027" style="position:absolute;width:182880;height:182880;visibility:visible;mso-wrap-style:square;v-text-anchor:top" coordsize="182880,182880" o:gfxdata="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" path="m,l182880,r,182880l,182880,,xe" filled="f">
+                  <v:stroke miterlimit="66585f" joinstyle="miter"/>
+                  <v:path arrowok="t" textboxrect="0,0,182880,182880"/>
+                </v:shape>
+                <w10:anchorlock/>
+              </v:group>
+            </w:pict>
+          </mc:Fallback>
+        </mc:AlternateContent>
+      </w:r>
+      <w:r>
+        <w:rPr>
+          <w:b/>
+        </w:rPr>
+        <w:tab/>
+        <w:t xml:space="preserve">Option 1 – Organisation Ownership: </w:t>
+      </w:r>
+    </w:p>
+    <w:p>
+      <w:pPr>
+        <w:spacing w:after="6"/>
+        <w:ind w:left="1144"/>
+      </w:pPr>
+      <w:r>
+        <w:t xml:space="preserve">All intellectual property rights that are created </w:t>
+      </w:r>
+      <w:proofErr w:type="gramStart"/>
+      <w:r>
+        <w:t>as a result of</w:t>
+      </w:r>
+      <w:proofErr w:type="gramEnd"/>
+      <w:r>
+        <w:t xml:space="preserve"> the Project work undertaken by the Student(s) for the Organisation shall vest absolutely in the Organisation.  </w:t>
+      </w:r>
+    </w:p>
+    <w:p>
+      <w:pPr>
+        <w:spacing w:after="177" w:line="259" w:lineRule="auto"/>
+        <w:ind w:left="1134"/>
+      </w:pPr>
+      <w:r>
+        <w:t xml:space="preserve"> </w:t>
+      </w:r>
+    </w:p>
+    <w:p>
+      <w:pPr>
+        <w:tabs>
+          <w:tab w:val="center" w:pos="554"/>
+          <w:tab w:val="center" w:pos="2882"/>
+        </w:tabs>
+        <w:spacing w:after="48" w:line="259" w:lineRule="auto"/>
+      </w:pPr>
+      <w:r>
+        <w:rPr>
+          <w:rFonts w:ascii="Calibri" w:eastAsia="Calibri" w:hAnsi="Calibri" w:cs="Calibri"/>
+        </w:rPr>
+        <w:tab/>
+      </w:r>
+      <w:r>
+        <w:rPr>
+          <w:rFonts w:ascii="Calibri" w:eastAsia="Calibri" w:hAnsi="Calibri" w:cs="Calibri"/>
+          <w:noProof/>
+        </w:rPr>
+        <mc:AlternateContent>
+          <mc:Choice Requires="wpg">
+            <w:drawing>
+              <wp:inline distT="0" distB="0" distL="0" distR="0" wp14:anchorId="361501DD" wp14:editId="5EF544DD">
+                <wp:extent cx="182880" cy="182880"/>
+                <wp:effectExtent l="0" t="0" r="0" b="0"/>
+                <wp:docPr id="3401" name="Group 3401"/>
+                <wp:cNvGraphicFramePr/>
+                <a:graphic xmlns:a="http://schemas.openxmlformats.org/drawingml/2006/main">
+                  <a:graphicData uri="http://schemas.microsoft.com/office/word/2010/wordprocessingGroup">
+                    <wpg:wgp>
+                      <wpg:cNvGrpSpPr/>
+                      <wpg:grpSpPr>
+                        <a:xfrm>
+                          <a:off x="0" y="0"/>
+                          <a:ext cx="182880" cy="182880"/>
+                          <a:chOff x="0" y="0"/>
+                          <a:chExt cx="182880" cy="182880"/>
+                        </a:xfrm>
+                      </wpg:grpSpPr>
+                      <wps:wsp>
+                        <wps:cNvPr id="186" name="Shape 186"/>
+                        <wps:cNvSpPr/>
+                        <wps:spPr>
+                          <a:xfrm>
+                            <a:off x="0" y="0"/>
+                            <a:ext cx="182880" cy="182880"/>
+                          </a:xfrm>
+                          <a:custGeom>
+                            <a:avLst/>
+                            <a:gdLst/>
+                            <a:ahLst/>
+                            <a:cxnLst/>
+                            <a:rect l="0" t="0" r="0" b="0"/>
+                            <a:pathLst>
+                              <a:path w="182880" h="182880">
+                                <a:moveTo>
+                                  <a:pt x="0" y="0"/>
+                                </a:moveTo>
+                                <a:lnTo>
+                                  <a:pt x="182880" y="0"/>
+                                </a:lnTo>
+                                <a:lnTo>
+                                  <a:pt x="182880" y="182880"/>
+                                </a:lnTo>
+                                <a:lnTo>
+                                  <a:pt x="0" y="182880"/>
+                                </a:lnTo>
+                                <a:lnTo>
+                                  <a:pt x="0" y="0"/>
+                                </a:lnTo>
+                                <a:close/>
+                              </a:path>
+                            </a:pathLst>
+                          </a:custGeom>
+                          <a:ln w="9525" cap="flat">
+                            <a:miter lim="101600"/>
+                          </a:ln>
+                        </wps:spPr>
+                        <wps:style>
+                          <a:lnRef idx="1">
+                            <a:srgbClr val="000000"/>
+                          </a:lnRef>
+                          <a:fillRef idx="0">
+                            <a:srgbClr val="FFFFFF"/>
+                          </a:fillRef>
+                          <a:effectRef idx="0">
+                            <a:scrgbClr r="0" g="0" b="0"/>
+                          </a:effectRef>
+                          <a:fontRef idx="none"/>
+                        </wps:style>
+                        <wps:bodyPr/>
+                      </wps:wsp>
+                    </wpg:wgp>
+                  </a:graphicData>
+                </a:graphic>
+              </wp:inline>
+            </w:drawing>
+          </mc:Choice>
+          <mc:Fallback>
+            <w:pict>
+              <v:group w14:anchorId="18FF15BE" id="Group 3401" o:spid="_x0000_s1026" style="width:14.4pt;height:14.4pt;mso-position-horizontal-relative:char;mso-position-vertical-relative:line" coordsize="182880,182880" o:gfxdata="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">
+                <v:shape id="Shape 186" o:spid="_x0000_s1027" style="position:absolute;width:182880;height:182880;visibility:visible;mso-wrap-style:square;v-text-anchor:top" coordsize="182880,182880" o:gfxdata="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" path="m,l182880,r,182880l,182880,,xe" filled="f">
+                  <v:stroke miterlimit="66585f" joinstyle="miter"/>
+                  <v:path arrowok="t" textboxrect="0,0,182880,182880"/>
+                </v:shape>
+                <w10:anchorlock/>
+              </v:group>
+            </w:pict>
+          </mc:Fallback>
+        </mc:AlternateContent>
+      </w:r>
+      <w:r>
+        <w:rPr>
+          <w:b/>
+        </w:rPr>
+        <w:tab/>
+        <w:t xml:space="preserve">Option 2 – Student(s) Ownership: </w:t>
+      </w:r>
+    </w:p>
+    <w:p>
+      <w:pPr>
+        <w:ind w:left="1144"/>
+      </w:pPr>
+      <w:r>
+        <w:t xml:space="preserve">All intellectual property rights that are created </w:t>
+      </w:r>
+      <w:proofErr w:type="gramStart"/>
+      <w:r>
+        <w:t>as a result of</w:t>
+      </w:r>
+      <w:proofErr w:type="gramEnd"/>
+      <w:r>
+        <w:t xml:space="preserve"> the Project work undertaken by each Student for the Organisation shall vest absolutely in each respective Student.  Each Student hereby grants the Organisation, and where more than one Student has been involved in the Project, the other Student(s) are granted, a perpetual non-exclusive licence for that intellectual property. </w:t>
+      </w:r>
+    </w:p>
+    <w:p>
+      <w:pPr>
+        <w:spacing w:after="147" w:line="259" w:lineRule="auto"/>
+        <w:ind w:left="1134"/>
+      </w:pPr>
+      <w:r>
+        <w:t xml:space="preserve"> </w:t>
+      </w:r>
+    </w:p>
+    <w:p>
+      <w:pPr>
+        <w:pStyle w:val="Heading1"/>
+        <w:tabs>
+          <w:tab w:val="center" w:pos="554"/>
+          <w:tab w:val="center" w:pos="2541"/>
+        </w:tabs>
+        <w:spacing w:after="117"/>
+        <w:rPr>
+          <w:sz w:val="22"/>
+          <w:szCs w:val="22"/>
+          <w:u w:val="none"/>
+        </w:rPr>
+      </w:pPr>
+      <w:r>
+        <w:rPr>
+          <w:rFonts w:ascii="Calibri" w:eastAsia="Calibri" w:hAnsi="Calibri" w:cs="Calibri"/>
+          <w:b w:val="0"/>
+          <w:sz w:val="22"/>
+          <w:szCs w:val="22"/>
+          <w:u w:val="none"/>
+        </w:rPr>
+        <w:tab/>
+      </w:r>
+      <w:r>
+        <w:rPr>
+          <w:rFonts w:ascii="Calibri" w:eastAsia="Calibri" w:hAnsi="Calibri" w:cs="Calibri"/>
+          <w:noProof/>
+          <w:sz w:val="22"/>
+          <w:szCs w:val="22"/>
+          <w:u w:val="none"/>
+        </w:rPr>
+        <mc:AlternateContent>
+          <mc:Choice Requires="wpg">
+            <w:drawing>
+              <wp:inline distT="0" distB="0" distL="0" distR="0" wp14:anchorId="025FBA5D" wp14:editId="2D7D40BA">
+                <wp:extent cx="182880" cy="182880"/>
+                <wp:effectExtent l="0" t="0" r="0" b="0"/>
+                <wp:docPr id="3402" name="Group 3402"/>
+                <wp:cNvGraphicFramePr/>
+                <a:graphic xmlns:a="http://schemas.openxmlformats.org/drawingml/2006/main">
+                  <a:graphicData uri="http://schemas.microsoft.com/office/word/2010/wordprocessingGroup">
+                    <wpg:wgp>
+                      <wpg:cNvGrpSpPr/>
+                      <wpg:grpSpPr>
+                        <a:xfrm>
+                          <a:off x="0" y="0"/>
+                          <a:ext cx="182880" cy="182880"/>
+                          <a:chOff x="0" y="0"/>
+                          <a:chExt cx="182880" cy="182880"/>
+                        </a:xfrm>
+                      </wpg:grpSpPr>
+                      <wps:wsp>
+                        <wps:cNvPr id="187" name="Shape 187"/>
+                        <wps:cNvSpPr/>
+                        <wps:spPr>
+                          <a:xfrm>
+                            <a:off x="0" y="0"/>
+                            <a:ext cx="182880" cy="182880"/>
+                          </a:xfrm>
+                          <a:custGeom>
+                            <a:avLst/>
+                            <a:gdLst/>
+                            <a:ahLst/>
+                            <a:cxnLst/>
+                            <a:rect l="0" t="0" r="0" b="0"/>
+                            <a:pathLst>
+                              <a:path w="182880" h="182880">
+                                <a:moveTo>
+                                  <a:pt x="0" y="0"/>
+                                </a:moveTo>
+                                <a:lnTo>
+                                  <a:pt x="182880" y="0"/>
+                                </a:lnTo>
+                                <a:lnTo>
+                                  <a:pt x="182880" y="182880"/>
+                                </a:lnTo>
+                                <a:lnTo>
+                                  <a:pt x="0" y="182880"/>
+                                </a:lnTo>
+                                <a:lnTo>
+                                  <a:pt x="0" y="0"/>
+                                </a:lnTo>
+                                <a:close/>
+                              </a:path>
+                            </a:pathLst>
+                          </a:custGeom>
+                          <a:ln w="9525" cap="flat">
+                            <a:miter lim="101600"/>
+                          </a:ln>
+                        </wps:spPr>
+                        <wps:style>
+                          <a:lnRef idx="1">
+                            <a:srgbClr val="000000"/>
+                          </a:lnRef>
+                          <a:fillRef idx="0">
+                            <a:srgbClr val="FFFFFF"/>
+                          </a:fillRef>
+                          <a:effectRef idx="0">
+                            <a:scrgbClr r="0" g="0" b="0"/>
+                          </a:effectRef>
+                          <a:fontRef idx="none"/>
+                        </wps:style>
+                        <wps:bodyPr/>
+                      </wps:wsp>
+                    </wpg:wgp>
+                  </a:graphicData>
+                </a:graphic>
+              </wp:inline>
+            </w:drawing>
+          </mc:Choice>
+          <mc:Fallback>
+            <w:pict>
+              <v:group w14:anchorId="0B562C4B" id="Group 3402" o:spid="_x0000_s1026" style="width:14.4pt;height:14.4pt;mso-position-horizontal-relative:char;mso-position-vertical-relative:line" coordsize="182880,182880" o:gfxdata="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">
+                <v:shape id="Shape 187" o:spid="_x0000_s1027" style="position:absolute;width:182880;height:182880;visibility:visible;mso-wrap-style:square;v-text-anchor:top" coordsize="182880,182880" o:gfxdata="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" path="m,l182880,r,182880l,182880,,xe" filled="f">
+                  <v:stroke miterlimit="66585f" joinstyle="miter"/>
+                  <v:path arrowok="t" textboxrect="0,0,182880,182880"/>
+                </v:shape>
+                <w10:anchorlock/>
+              </v:group>
+            </w:pict>
+          </mc:Fallback>
+        </mc:AlternateContent>
+      </w:r>
+      <w:r>
+        <w:rPr>
+          <w:sz w:val="22"/>
+          <w:szCs w:val="22"/>
+          <w:u w:val="none"/>
+        </w:rPr>
+        <w:tab/>
+      </w:r>
+      <w:r>
+        <w:rPr>
+          <w:sz w:val="22"/>
+          <w:szCs w:val="22"/>
+          <w:u w:val="none"/>
+        </w:rPr>
+        <w:t xml:space="preserve"> </w:t>
+      </w:r>
+      <w:r>
+        <w:rPr>
+          <w:sz w:val="22"/>
+          <w:szCs w:val="22"/>
+          <w:u w:val="none"/>
+        </w:rPr>
+        <w:t xml:space="preserve">Option 3 – Split Ownership </w:t>
+      </w:r>
+    </w:p>
+    <w:p>
+      <w:pPr>
+        <w:spacing w:after="203"/>
+        <w:ind w:left="1144"/>
+      </w:pPr>
+      <w:r>
+        <w:t xml:space="preserve">There shall be two types of intellectual property: </w:t>
+      </w:r>
+    </w:p>
+    <w:p>
+      <w:pPr>
+        <w:numPr>
+          <w:ilvl w:val="0"/>
+          <w:numId w:val="5"/>
+        </w:numPr>
+        <w:spacing w:after="6" w:line="249" w:lineRule="auto"/>
+        <w:ind w:hanging="425"/>
+        <w:jc w:val="both"/>
+      </w:pPr>
+      <w:r>
+        <w:t xml:space="preserve">Custom property (being intellectual property specifically developed by the Student(s) for the Organisation) </w:t>
+      </w:r>
+    </w:p>
+    <w:p>
+      <w:pPr>
+        <w:numPr>
+          <w:ilvl w:val="0"/>
+          <w:numId w:val="5"/>
+        </w:numPr>
+        <w:spacing w:after="0" w:line="249" w:lineRule="auto"/>
+        <w:ind w:hanging="425"/>
+        <w:jc w:val="both"/>
+      </w:pPr>
+      <w:r>
+        <w:t xml:space="preserve">Generic property (being any intellectual property not specifically developed by the Student(s) for the Organisation) </w:t>
+      </w:r>
+    </w:p>
+    <w:p>
+      <w:pPr>
+        <w:spacing w:after="160" w:line="257" w:lineRule="auto"/>
+        <w:ind w:left="1135"/>
+      </w:pPr>
+      <w:r>
+        <w:t xml:space="preserve">The Custom property will be vested solely in the Organisation whereas Generic property will vest solely in each respective Student.  Each Student hereby grants the Organisation and where more than one Student has been involved in the Project, the other Student(s), a perpetual non-exclusive licence for that Generic property. </w:t>
+      </w:r>
+    </w:p>
+    <w:p>
+      <w:pPr>
+        <w:spacing w:after="180" w:line="259" w:lineRule="auto"/>
+        <w:ind w:left="1135"/>
+      </w:pPr>
+      <w:r>
+        <w:t xml:space="preserve"> </w:t>
+      </w:r>
+    </w:p>
+    <w:p>
+      <w:pPr>
+        <w:tabs>
+          <w:tab w:val="center" w:pos="554"/>
+          <w:tab w:val="center" w:pos="4449"/>
+        </w:tabs>
+        <w:spacing w:after="63" w:line="259" w:lineRule="auto"/>
+      </w:pPr>
+      <w:r>
+        <w:rPr>
+          <w:rFonts w:ascii="Calibri" w:eastAsia="Calibri" w:hAnsi="Calibri" w:cs="Calibri"/>
+        </w:rPr>
+        <w:tab/>
+      </w:r>
+      <w:r>
+        <w:rPr>
+          <w:rFonts w:ascii="Calibri" w:eastAsia="Calibri" w:hAnsi="Calibri" w:cs="Calibri"/>
+          <w:noProof/>
+        </w:rPr>
+        <mc:AlternateContent>
+          <mc:Choice Requires="wpg">
+            <w:drawing>
+              <wp:inline distT="0" distB="0" distL="0" distR="0" wp14:anchorId="3928E93A" wp14:editId="718835C0">
+                <wp:extent cx="182880" cy="182880"/>
+                <wp:effectExtent l="0" t="0" r="0" b="0"/>
+                <wp:docPr id="3403" name="Group 3403"/>
+                <wp:cNvGraphicFramePr/>
+                <a:graphic xmlns:a="http://schemas.openxmlformats.org/drawingml/2006/main">
+                  <a:graphicData uri="http://schemas.microsoft.com/office/word/2010/wordprocessingGroup">
+                    <wpg:wgp>
+                      <wpg:cNvGrpSpPr/>
+                      <wpg:grpSpPr>
+                        <a:xfrm>
+                          <a:off x="0" y="0"/>
+                          <a:ext cx="182880" cy="182880"/>
+                          <a:chOff x="0" y="0"/>
+                          <a:chExt cx="182880" cy="182880"/>
+                        </a:xfrm>
+                      </wpg:grpSpPr>
+                      <wps:wsp>
+                        <wps:cNvPr id="188" name="Shape 188"/>
+                        <wps:cNvSpPr/>
+                        <wps:spPr>
+                          <a:xfrm>
+                            <a:off x="0" y="0"/>
+                            <a:ext cx="182880" cy="182880"/>
+                          </a:xfrm>
+                          <a:custGeom>
+                            <a:avLst/>
+                            <a:gdLst/>
+                            <a:ahLst/>
+                            <a:cxnLst/>
+                            <a:rect l="0" t="0" r="0" b="0"/>
+                            <a:pathLst>
+                              <a:path w="182880" h="182880">
+                                <a:moveTo>
+                                  <a:pt x="0" y="0"/>
+                                </a:moveTo>
+                                <a:lnTo>
+                                  <a:pt x="182880" y="0"/>
+                                </a:lnTo>
+                                <a:lnTo>
+                                  <a:pt x="182880" y="182880"/>
+                                </a:lnTo>
+                                <a:lnTo>
+                                  <a:pt x="0" y="182880"/>
+                                </a:lnTo>
+                                <a:lnTo>
+                                  <a:pt x="0" y="0"/>
+                                </a:lnTo>
+                                <a:close/>
+                              </a:path>
+                            </a:pathLst>
+                          </a:custGeom>
+                          <a:ln w="9525" cap="flat">
+                            <a:miter lim="101600"/>
+                          </a:ln>
+                        </wps:spPr>
+                        <wps:style>
+                          <a:lnRef idx="1">
+                            <a:srgbClr val="000000"/>
+                          </a:lnRef>
+                          <a:fillRef idx="0">
+                            <a:srgbClr val="FFFFFF"/>
+                          </a:fillRef>
+                          <a:effectRef idx="0">
+                            <a:scrgbClr r="0" g="0" b="0"/>
+                          </a:effectRef>
+                          <a:fontRef idx="none"/>
+                        </wps:style>
+                        <wps:bodyPr/>
+                      </wps:wsp>
+                    </wpg:wgp>
+                  </a:graphicData>
+                </a:graphic>
+              </wp:inline>
+            </w:drawing>
+          </mc:Choice>
+          <mc:Fallback>
+            <w:pict>
+              <v:group w14:anchorId="358CDD22" id="Group 3403" o:spid="_x0000_s1026" style="width:14.4pt;height:14.4pt;mso-position-horizontal-relative:char;mso-position-vertical-relative:line" coordsize="182880,182880" o:gfxdata="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">
+                <v:shape id="Shape 188" o:spid="_x0000_s1027" style="position:absolute;width:182880;height:182880;visibility:visible;mso-wrap-style:square;v-text-anchor:top" coordsize="182880,182880" o:gfxdata="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" path="m,l182880,r,182880l,182880,,xe" filled="f">
+                  <v:stroke miterlimit="66585f" joinstyle="miter"/>
+                  <v:path arrowok="t" textboxrect="0,0,182880,182880"/>
+                </v:shape>
+                <w10:anchorlock/>
+              </v:group>
+            </w:pict>
+          </mc:Fallback>
+        </mc:AlternateContent>
+      </w:r>
+      <w:r>
+        <w:rPr>
+          <w:b/>
+        </w:rPr>
+        <w:tab/>
+        <w:t xml:space="preserve">Option 4 – Client NDA and any other intellectual property rights </w:t>
+      </w:r>
+    </w:p>
+    <w:p>
+      <w:pPr>
+        <w:spacing w:after="163" w:line="257" w:lineRule="auto"/>
+        <w:ind w:left="1145"/>
+      </w:pPr>
+      <w:r>
+        <w:rPr>
+          <w:i/>
+        </w:rPr>
+        <w:lastRenderedPageBreak/>
+        <w:t xml:space="preserve">(Please </w:t>
+      </w:r>
+      <w:proofErr w:type="gramStart"/>
+      <w:r>
+        <w:rPr>
+          <w:i/>
+        </w:rPr>
+        <w:t>attach  here</w:t>
+      </w:r>
+      <w:proofErr w:type="gramEnd"/>
+      <w:r>
+        <w:rPr>
+          <w:i/>
+        </w:rPr>
+        <w:t xml:space="preserve">  any other intellectual property rights agreed between the parties) </w:t>
+      </w:r>
+    </w:p>
+    <w:p>
+      <w:pPr>
+        <w:pStyle w:val="Heading1"/>
+        <w:tabs>
+          <w:tab w:val="center" w:pos="704"/>
+          <w:tab w:val="center" w:pos="1633"/>
+        </w:tabs>
+      </w:pPr>
+      <w:r>
+        <w:t xml:space="preserve">6 </w:t>
+      </w:r>
+      <w:r>
+        <w:tab/>
+        <w:t xml:space="preserve">Signatures </w:t>
+      </w:r>
+    </w:p>
+    <w:p>
+      <w:pPr>
+        <w:spacing w:after="158" w:line="259" w:lineRule="auto"/>
+        <w:ind w:left="283"/>
+      </w:pPr>
+      <w:r>
+        <w:rPr>
+          <w:b/>
+        </w:rPr>
+        <w:t xml:space="preserve"> </w:t>
+      </w:r>
+    </w:p>
+    <w:p>
+      <w:pPr>
+        <w:spacing w:after="180" w:line="259" w:lineRule="auto"/>
+        <w:ind w:left="283"/>
+      </w:pPr>
+      <w:r>
+        <w:rPr>
+          <w:b/>
+        </w:rPr>
+        <w:t xml:space="preserve"> </w:t>
+      </w:r>
+    </w:p>
+    <w:p>
+      <w:pPr>
+        <w:tabs>
+          <w:tab w:val="center" w:pos="988"/>
+          <w:tab w:val="center" w:pos="3666"/>
+        </w:tabs>
+        <w:spacing w:after="193"/>
+      </w:pPr>
+      <w:r>
+        <w:rPr>
+          <w:rFonts w:ascii="Calibri" w:eastAsia="Calibri" w:hAnsi="Calibri" w:cs="Calibri"/>
+        </w:rPr>
+        <w:tab/>
+      </w:r>
+      <w:r>
+        <w:rPr>
+          <w:b/>
+        </w:rPr>
+        <w:t>Project Name:  AI vs</w:t>
+      </w:r>
+      <w:r>
+        <w:rPr>
+          <w:b/>
+        </w:rPr>
+        <w:t xml:space="preserve"> Legacy </w:t>
+      </w:r>
+      <w:r>
+        <w:rPr>
+          <w:b/>
+        </w:rPr>
+        <w:t>Digital Forensics Tools – A Comparative Efficacy Analysis</w:t>
+      </w:r>
+    </w:p>
+    <w:p>
+      <w:pPr>
+        <w:spacing w:after="167" w:line="259" w:lineRule="auto"/>
+        <w:ind w:left="283"/>
+      </w:pPr>
+      <w:r>
+        <w:t xml:space="preserve"> </w:t>
+      </w:r>
+      <w:r>
+        <w:tab/>
+        <w:t xml:space="preserve"> </w:t>
+      </w:r>
+    </w:p>
+    <w:p>
+      <w:pPr>
+        <w:spacing w:after="0" w:line="259" w:lineRule="auto"/>
+        <w:ind w:left="283"/>
+      </w:pPr>
+      <w:r>
+        <w:t xml:space="preserve"> </w:t>
+      </w:r>
+    </w:p>
+    <w:tbl>
+      <w:tblPr>
+        <w:tblStyle w:val="TableGrid0"/>
+        <w:tblW w:w="9463" w:type="dxa"/>
+        <w:tblInd w:w="283" w:type="dxa"/>
+        <w:tblCellMar>
+          <w:top w:w="55" w:type="dxa"/>
+          <w:right w:w="154" w:type="dxa"/>
+        </w:tblCellMar>
+        <w:tblLook w:val="04A0" w:firstRow="1" w:lastRow="0" w:firstColumn="1" w:lastColumn="0" w:noHBand="0" w:noVBand="1"/>
+      </w:tblPr>
+      <w:tblGrid>
+        <w:gridCol w:w="2022"/>
+        <w:gridCol w:w="3040"/>
+        <w:gridCol w:w="1709"/>
+        <w:gridCol w:w="1721"/>
+        <w:gridCol w:w="971"/>
+      </w:tblGrid>
+      <w:tr>
+        <w:trPr>
+          <w:trHeight w:val="413"/>
+        </w:trPr>
+        <w:tc>
+          <w:tcPr>
+            <w:tcW w:w="2149" w:type="dxa"/>
+            <w:tcBorders>
+              <w:top w:val="single" w:sz="8" w:space="0" w:color="000000"/>
+              <w:left w:val="nil"/>
+              <w:bottom w:val="single" w:sz="8" w:space="0" w:color="000000"/>
+              <w:right w:val="nil"/>
+            </w:tcBorders>
+          </w:tcPr>
+          <w:p>
+            <w:pPr>
+              <w:spacing w:after="0" w:line="259" w:lineRule="auto"/>
+              <w:ind w:left="108"/>
+            </w:pPr>
+            <w:r>
+              <w:t xml:space="preserve"> </w:t>
+            </w:r>
+          </w:p>
+        </w:tc>
+        <w:tc>
+          <w:tcPr>
+            <w:tcW w:w="1985" w:type="dxa"/>
+            <w:tcBorders>
+              <w:top w:val="single" w:sz="8" w:space="0" w:color="000000"/>
+              <w:left w:val="nil"/>
+              <w:bottom w:val="single" w:sz="8" w:space="0" w:color="000000"/>
+              <w:right w:val="nil"/>
+            </w:tcBorders>
+          </w:tcPr>
+          <w:p>
+            <w:pPr>
+              <w:spacing w:after="0" w:line="259" w:lineRule="auto"/>
+            </w:pPr>
+            <w:r>
+              <w:rPr>
+                <w:b/>
+              </w:rPr>
+              <w:t xml:space="preserve">Role </w:t>
+            </w:r>
+          </w:p>
+        </w:tc>
+        <w:tc>
+          <w:tcPr>
+            <w:tcW w:w="2016" w:type="dxa"/>
+            <w:tcBorders>
+              <w:top w:val="single" w:sz="8" w:space="0" w:color="000000"/>
+              <w:left w:val="nil"/>
+              <w:bottom w:val="single" w:sz="8" w:space="0" w:color="000000"/>
+              <w:right w:val="nil"/>
+            </w:tcBorders>
+          </w:tcPr>
+          <w:p>
+            <w:pPr>
+              <w:spacing w:after="0" w:line="259" w:lineRule="auto"/>
+            </w:pPr>
+            <w:r>
+              <w:rPr>
+                <w:b/>
+              </w:rPr>
+              <w:t xml:space="preserve">Name </w:t>
+            </w:r>
+          </w:p>
+        </w:tc>
+        <w:tc>
+          <w:tcPr>
+            <w:tcW w:w="2105" w:type="dxa"/>
+            <w:tcBorders>
+              <w:top w:val="single" w:sz="8" w:space="0" w:color="000000"/>
+              <w:left w:val="nil"/>
+              <w:bottom w:val="single" w:sz="8" w:space="0" w:color="000000"/>
+              <w:right w:val="nil"/>
+            </w:tcBorders>
+          </w:tcPr>
+          <w:p>
+            <w:pPr>
+              <w:spacing w:after="0" w:line="259" w:lineRule="auto"/>
+            </w:pPr>
+            <w:r>
+              <w:rPr>
+                <w:b/>
+              </w:rPr>
+              <w:t xml:space="preserve">Signature </w:t>
+            </w:r>
+          </w:p>
+        </w:tc>
+        <w:tc>
+          <w:tcPr>
+            <w:tcW w:w="1208" w:type="dxa"/>
+            <w:tcBorders>
+              <w:top w:val="single" w:sz="8" w:space="0" w:color="000000"/>
+              <w:left w:val="nil"/>
+              <w:bottom w:val="single" w:sz="8" w:space="0" w:color="000000"/>
+              <w:right w:val="nil"/>
+            </w:tcBorders>
+          </w:tcPr>
+          <w:p>
+            <w:pPr>
+              <w:spacing w:after="0" w:line="259" w:lineRule="auto"/>
+            </w:pPr>
+            <w:r>
+              <w:rPr>
+                <w:b/>
+              </w:rPr>
+              <w:t xml:space="preserve">Date </w:t>
+            </w:r>
+          </w:p>
+        </w:tc>
+      </w:tr>
+      <w:tr>
+        <w:trPr>
+          <w:trHeight w:val="1320"/>
+        </w:trPr>
+        <w:tc>
+          <w:tcPr>
+            <w:tcW w:w="2149" w:type="dxa"/>
+            <w:tcBorders>
+              <w:top w:val="single" w:sz="8" w:space="0" w:color="000000"/>
+              <w:left w:val="nil"/>
+              <w:bottom w:val="single" w:sz="8" w:space="0" w:color="000000"/>
+              <w:right w:val="nil"/>
+            </w:tcBorders>
+          </w:tcPr>
+          <w:p>
+            <w:pPr>
+              <w:tabs>
+                <w:tab w:val="right" w:pos="1996"/>
+              </w:tabs>
+              <w:spacing w:after="4" w:line="259" w:lineRule="auto"/>
+            </w:pPr>
+            <w:r>
+              <w:t xml:space="preserve">Project </w:t>
+            </w:r>
+            <w:r>
+              <w:tab/>
+              <w:t xml:space="preserve">       Client</w:t>
+            </w:r>
+          </w:p>
+          <w:p>
+            <w:pPr>
+              <w:spacing w:after="0" w:line="259" w:lineRule="auto"/>
+              <w:ind w:left="108"/>
+            </w:pPr>
+            <w:r>
+              <w:rPr>
+                <w:b/>
+              </w:rPr>
+              <w:t xml:space="preserve">Organisation </w:t>
+            </w:r>
+          </w:p>
+          <w:p>
+            <w:pPr>
+              <w:spacing w:after="0" w:line="259" w:lineRule="auto"/>
+              <w:ind w:left="108"/>
+            </w:pPr>
+            <w:r>
+              <w:rPr>
+                <w:b/>
+              </w:rPr>
+              <w:t>Representative</w:t>
+            </w:r>
+            <w:r>
+              <w:t xml:space="preserve"> </w:t>
+            </w:r>
+          </w:p>
+        </w:tc>
+        <w:tc>
+          <w:tcPr>
+            <w:tcW w:w="1985" w:type="dxa"/>
+            <w:tcBorders>
+              <w:top w:val="single" w:sz="8" w:space="0" w:color="000000"/>
+              <w:left w:val="nil"/>
+              <w:bottom w:val="single" w:sz="8" w:space="0" w:color="000000"/>
+              <w:right w:val="nil"/>
+            </w:tcBorders>
+          </w:tcPr>
+          <w:p>
+            <w:pPr>
+              <w:spacing w:after="158" w:line="259" w:lineRule="auto"/>
+            </w:pPr>
+            <w:r>
+              <w:t xml:space="preserve"> </w:t>
+            </w:r>
+          </w:p>
+          <w:p>
+            <w:pPr>
+              <w:spacing w:after="158" w:line="259" w:lineRule="auto"/>
+            </w:pPr>
+            <w:r>
+              <w:t xml:space="preserve"> </w:t>
+            </w:r>
+          </w:p>
+          <w:p>
+            <w:pPr>
+              <w:spacing w:after="0" w:line="259" w:lineRule="auto"/>
+            </w:pPr>
+            <w:r>
+              <w:t xml:space="preserve"> </w:t>
+            </w:r>
+          </w:p>
+        </w:tc>
+        <w:tc>
+          <w:tcPr>
+            <w:tcW w:w="2016" w:type="dxa"/>
+            <w:tcBorders>
+              <w:top w:val="single" w:sz="8" w:space="0" w:color="000000"/>
+              <w:left w:val="nil"/>
+              <w:bottom w:val="single" w:sz="8" w:space="0" w:color="000000"/>
+              <w:right w:val="nil"/>
+            </w:tcBorders>
+          </w:tcPr>
+          <w:p>
+            <w:pPr>
+              <w:spacing w:after="0" w:line="259" w:lineRule="auto"/>
+            </w:pPr>
+            <w:r>
+              <w:t>Geoff Gordon</w:t>
+            </w:r>
+          </w:p>
+        </w:tc>
+        <w:tc>
+          <w:tcPr>
+            <w:tcW w:w="2105" w:type="dxa"/>
+            <w:tcBorders>
+              <w:top w:val="single" w:sz="8" w:space="0" w:color="000000"/>
+              <w:left w:val="nil"/>
+              <w:bottom w:val="single" w:sz="8" w:space="0" w:color="000000"/>
+              <w:right w:val="nil"/>
+            </w:tcBorders>
+          </w:tcPr>
+          <w:p>
+            <w:pPr>
+              <w:spacing w:after="0" w:line="259" w:lineRule="auto"/>
+              <w:ind w:left="1"/>
+            </w:pPr>
+            <w:r>
+              <w:t xml:space="preserve"> </w:t>
+            </w:r>
+          </w:p>
+        </w:tc>
+        <w:tc>
+          <w:tcPr>
+            <w:tcW w:w="1208" w:type="dxa"/>
+            <w:tcBorders>
+              <w:top w:val="single" w:sz="8" w:space="0" w:color="000000"/>
+              <w:left w:val="nil"/>
+              <w:bottom w:val="single" w:sz="8" w:space="0" w:color="000000"/>
+              <w:right w:val="nil"/>
+            </w:tcBorders>
+          </w:tcPr>
+          <w:p>
+            <w:pPr>
+              <w:spacing w:after="0" w:line="259" w:lineRule="auto"/>
+              <w:ind w:left="1"/>
+            </w:pPr>
+            <w:r>
+              <w:t xml:space="preserve"> </w:t>
+            </w:r>
+          </w:p>
+        </w:tc>
+      </w:tr>
+      <w:tr>
+        <w:trPr>
+          <w:trHeight w:val="1231"/>
+        </w:trPr>
+        <w:tc>
+          <w:tcPr>
+            <w:tcW w:w="2149" w:type="dxa"/>
+            <w:tcBorders>
+              <w:top w:val="single" w:sz="8" w:space="0" w:color="000000"/>
+              <w:left w:val="nil"/>
+              <w:bottom w:val="single" w:sz="8" w:space="0" w:color="000000"/>
+              <w:right w:val="nil"/>
+            </w:tcBorders>
+          </w:tcPr>
+          <w:p>
+            <w:pPr>
+              <w:spacing w:after="0" w:line="259" w:lineRule="auto"/>
+              <w:ind w:left="108" w:right="58"/>
+            </w:pPr>
+            <w:r>
+              <w:t xml:space="preserve">Representative of Whitireia New Zealand/ </w:t>
+            </w:r>
+            <w:r>
+              <w:rPr>
+                <w:b/>
+              </w:rPr>
+              <w:t xml:space="preserve">Faculty </w:t>
+            </w:r>
+          </w:p>
+          <w:p>
+            <w:pPr>
+              <w:spacing w:after="0" w:line="259" w:lineRule="auto"/>
+              <w:ind w:left="108"/>
+            </w:pPr>
+            <w:r>
+              <w:rPr>
+                <w:b/>
+              </w:rPr>
+              <w:t>Representative</w:t>
+            </w:r>
+            <w:r>
+              <w:t xml:space="preserve"> </w:t>
+            </w:r>
+          </w:p>
+        </w:tc>
+        <w:tc>
+          <w:tcPr>
+            <w:tcW w:w="1985" w:type="dxa"/>
+            <w:tcBorders>
+              <w:top w:val="single" w:sz="8" w:space="0" w:color="000000"/>
+              <w:left w:val="nil"/>
+              <w:bottom w:val="single" w:sz="8" w:space="0" w:color="000000"/>
+              <w:right w:val="nil"/>
+            </w:tcBorders>
+          </w:tcPr>
+          <w:p>
+            <w:pPr>
+              <w:spacing w:after="0" w:line="259" w:lineRule="auto"/>
+            </w:pPr>
+            <w:r>
+              <w:t xml:space="preserve"> </w:t>
+            </w:r>
+          </w:p>
+        </w:tc>
+        <w:tc>
+          <w:tcPr>
+            <w:tcW w:w="2016" w:type="dxa"/>
+            <w:tcBorders>
+              <w:top w:val="single" w:sz="8" w:space="0" w:color="000000"/>
+              <w:left w:val="nil"/>
+              <w:bottom w:val="single" w:sz="8" w:space="0" w:color="000000"/>
+              <w:right w:val="nil"/>
+            </w:tcBorders>
+          </w:tcPr>
+          <w:p>
+            <w:pPr>
+              <w:spacing w:after="0" w:line="259" w:lineRule="auto"/>
+            </w:pPr>
+            <w:r>
+              <w:t xml:space="preserve">Clement </w:t>
+            </w:r>
+          </w:p>
+          <w:p>
+            <w:pPr>
+              <w:spacing w:after="0" w:line="259" w:lineRule="auto"/>
+            </w:pPr>
+            <w:proofErr w:type="spellStart"/>
+            <w:r>
+              <w:t>Swarnappa</w:t>
+            </w:r>
+            <w:proofErr w:type="spellEnd"/>
+          </w:p>
+        </w:tc>
+        <w:tc>
+          <w:tcPr>
+            <w:tcW w:w="2105" w:type="dxa"/>
+            <w:tcBorders>
+              <w:top w:val="single" w:sz="8" w:space="0" w:color="000000"/>
+              <w:left w:val="nil"/>
+              <w:bottom w:val="single" w:sz="8" w:space="0" w:color="000000"/>
+              <w:right w:val="nil"/>
+            </w:tcBorders>
+          </w:tcPr>
+          <w:p>
+            <w:pPr>
+              <w:spacing w:after="0" w:line="259" w:lineRule="auto"/>
+              <w:ind w:left="1"/>
+            </w:pPr>
+            <w:r>
+              <w:t xml:space="preserve"> </w:t>
+            </w:r>
+          </w:p>
+        </w:tc>
+        <w:tc>
+          <w:tcPr>
+            <w:tcW w:w="1208" w:type="dxa"/>
+            <w:tcBorders>
+              <w:top w:val="single" w:sz="8" w:space="0" w:color="000000"/>
+              <w:left w:val="nil"/>
+              <w:bottom w:val="single" w:sz="8" w:space="0" w:color="000000"/>
+              <w:right w:val="nil"/>
+            </w:tcBorders>
+          </w:tcPr>
+          <w:p>
+            <w:pPr>
+              <w:spacing w:after="0" w:line="259" w:lineRule="auto"/>
+              <w:ind w:left="1"/>
+            </w:pPr>
+            <w:r>
+              <w:t xml:space="preserve"> </w:t>
+            </w:r>
+          </w:p>
+        </w:tc>
+      </w:tr>
+      <w:tr>
+        <w:trPr>
+          <w:trHeight w:val="886"/>
+        </w:trPr>
+        <w:tc>
+          <w:tcPr>
+            <w:tcW w:w="2149" w:type="dxa"/>
+            <w:tcBorders>
+              <w:top w:val="single" w:sz="8" w:space="0" w:color="000000"/>
+              <w:left w:val="nil"/>
+              <w:bottom w:val="single" w:sz="8" w:space="0" w:color="000000"/>
+              <w:right w:val="nil"/>
+            </w:tcBorders>
+          </w:tcPr>
+          <w:p>
+            <w:pPr>
+              <w:spacing w:after="0" w:line="259" w:lineRule="auto"/>
+              <w:ind w:left="108"/>
+            </w:pPr>
+            <w:r>
+              <w:t xml:space="preserve">Student  </w:t>
+            </w:r>
+          </w:p>
+        </w:tc>
+        <w:tc>
+          <w:tcPr>
+            <w:tcW w:w="1985" w:type="dxa"/>
+            <w:tcBorders>
+              <w:top w:val="single" w:sz="8" w:space="0" w:color="000000"/>
+              <w:left w:val="nil"/>
+              <w:bottom w:val="single" w:sz="8" w:space="0" w:color="000000"/>
+              <w:right w:val="nil"/>
+            </w:tcBorders>
+          </w:tcPr>
+          <w:p>
+            <w:pPr>
+              <w:spacing w:after="160" w:line="259" w:lineRule="auto"/>
+            </w:pPr>
+            <w:r>
+              <w:t xml:space="preserve"> Project Manager</w:t>
+            </w:r>
+          </w:p>
+          <w:p>
+            <w:pPr>
+              <w:spacing w:after="0" w:line="259" w:lineRule="auto"/>
+            </w:pPr>
+            <w:r>
+              <w:t xml:space="preserve"> </w:t>
+            </w:r>
+          </w:p>
+        </w:tc>
+        <w:tc>
+          <w:tcPr>
+            <w:tcW w:w="2016" w:type="dxa"/>
+            <w:tcBorders>
+              <w:top w:val="single" w:sz="8" w:space="0" w:color="000000"/>
+              <w:left w:val="nil"/>
+              <w:bottom w:val="single" w:sz="8" w:space="0" w:color="000000"/>
+              <w:right w:val="nil"/>
+            </w:tcBorders>
+          </w:tcPr>
+          <w:p>
+            <w:pPr>
+              <w:spacing w:after="0" w:line="259" w:lineRule="auto"/>
+            </w:pPr>
+            <w:r>
+              <w:t>Dave    Sushames</w:t>
+            </w:r>
+          </w:p>
+        </w:tc>
+        <w:tc>
+          <w:tcPr>
+            <w:tcW w:w="2105" w:type="dxa"/>
+            <w:tcBorders>
+              <w:top w:val="single" w:sz="8" w:space="0" w:color="000000"/>
+              <w:left w:val="nil"/>
+              <w:bottom w:val="single" w:sz="8" w:space="0" w:color="000000"/>
+              <w:right w:val="nil"/>
+            </w:tcBorders>
+          </w:tcPr>
+          <w:p>
+            <w:pPr>
+              <w:spacing w:after="0" w:line="259" w:lineRule="auto"/>
+              <w:ind w:left="1"/>
+            </w:pPr>
+            <w:r>
+              <w:t xml:space="preserve"> </w:t>
+            </w:r>
+          </w:p>
+        </w:tc>
+        <w:tc>
+          <w:tcPr>
+            <w:tcW w:w="1208" w:type="dxa"/>
+            <w:tcBorders>
+              <w:top w:val="single" w:sz="8" w:space="0" w:color="000000"/>
+              <w:left w:val="nil"/>
+              <w:bottom w:val="single" w:sz="8" w:space="0" w:color="000000"/>
+              <w:right w:val="nil"/>
+            </w:tcBorders>
+          </w:tcPr>
+          <w:p>
+            <w:pPr>
+              <w:spacing w:after="0" w:line="259" w:lineRule="auto"/>
+              <w:ind w:left="1"/>
+            </w:pPr>
+            <w:r>
+              <w:t xml:space="preserve"> </w:t>
+            </w:r>
+          </w:p>
+        </w:tc>
+      </w:tr>
+      <w:tr>
+        <w:trPr>
+          <w:trHeight w:val="886"/>
+        </w:trPr>
+        <w:tc>
+          <w:tcPr>
+            <w:tcW w:w="2149" w:type="dxa"/>
+            <w:tcBorders>
+              <w:top w:val="single" w:sz="8" w:space="0" w:color="000000"/>
+              <w:left w:val="nil"/>
+              <w:bottom w:val="single" w:sz="8" w:space="0" w:color="000000"/>
+              <w:right w:val="nil"/>
+            </w:tcBorders>
+          </w:tcPr>
+          <w:p>
+            <w:pPr>
+              <w:spacing w:after="0" w:line="259" w:lineRule="auto"/>
+              <w:ind w:left="108"/>
+            </w:pPr>
+            <w:r>
+              <w:t xml:space="preserve">Student </w:t>
+            </w:r>
+          </w:p>
+        </w:tc>
+        <w:tc>
+          <w:tcPr>
+            <w:tcW w:w="1985" w:type="dxa"/>
+            <w:tcBorders>
+              <w:top w:val="single" w:sz="8" w:space="0" w:color="000000"/>
+              <w:left w:val="nil"/>
+              <w:bottom w:val="single" w:sz="8" w:space="0" w:color="000000"/>
+              <w:right w:val="nil"/>
+            </w:tcBorders>
+          </w:tcPr>
+          <w:p>
+            <w:pPr>
+              <w:spacing w:after="158" w:line="259" w:lineRule="auto"/>
+            </w:pPr>
+            <w:r>
+              <w:t xml:space="preserve"> Developer/Researcher/Tester</w:t>
+            </w:r>
+          </w:p>
+          <w:p>
+            <w:pPr>
+              <w:spacing w:after="0" w:line="259" w:lineRule="auto"/>
+            </w:pPr>
+            <w:r>
+              <w:t xml:space="preserve"> </w:t>
+            </w:r>
+          </w:p>
+        </w:tc>
+        <w:tc>
+          <w:tcPr>
+            <w:tcW w:w="2016" w:type="dxa"/>
+            <w:tcBorders>
+              <w:top w:val="single" w:sz="8" w:space="0" w:color="000000"/>
+              <w:left w:val="nil"/>
+              <w:bottom w:val="single" w:sz="8" w:space="0" w:color="000000"/>
+              <w:right w:val="nil"/>
+            </w:tcBorders>
+          </w:tcPr>
+          <w:p>
+            <w:pPr>
+              <w:spacing w:after="0" w:line="259" w:lineRule="auto"/>
+            </w:pPr>
+            <w:r>
+              <w:t xml:space="preserve"> Matt Baker</w:t>
+            </w:r>
+          </w:p>
+        </w:tc>
+        <w:tc>
+          <w:tcPr>
+            <w:tcW w:w="2105" w:type="dxa"/>
+            <w:tcBorders>
+              <w:top w:val="single" w:sz="8" w:space="0" w:color="000000"/>
+              <w:left w:val="nil"/>
+              <w:bottom w:val="single" w:sz="8" w:space="0" w:color="000000"/>
+              <w:right w:val="nil"/>
+            </w:tcBorders>
+          </w:tcPr>
+          <w:p>
+            <w:pPr>
+              <w:spacing w:after="0" w:line="259" w:lineRule="auto"/>
+              <w:ind w:left="1"/>
+            </w:pPr>
+            <w:r>
+              <w:t xml:space="preserve"> </w:t>
+            </w:r>
+          </w:p>
+        </w:tc>
+        <w:tc>
+          <w:tcPr>
+            <w:tcW w:w="1208" w:type="dxa"/>
+            <w:tcBorders>
+              <w:top w:val="single" w:sz="8" w:space="0" w:color="000000"/>
+              <w:left w:val="nil"/>
+              <w:bottom w:val="single" w:sz="8" w:space="0" w:color="000000"/>
+              <w:right w:val="nil"/>
+            </w:tcBorders>
+          </w:tcPr>
+          <w:p>
+            <w:pPr>
+              <w:spacing w:after="0" w:line="259" w:lineRule="auto"/>
+              <w:ind w:left="1"/>
+            </w:pPr>
+            <w:r>
+              <w:t xml:space="preserve"> </w:t>
+            </w:r>
+          </w:p>
+        </w:tc>
+      </w:tr>
+      <w:tr>
+        <w:trPr>
+          <w:trHeight w:val="886"/>
+        </w:trPr>
+        <w:tc>
+          <w:tcPr>
+            <w:tcW w:w="2149" w:type="dxa"/>
+            <w:tcBorders>
+              <w:top w:val="single" w:sz="8" w:space="0" w:color="000000"/>
+              <w:left w:val="nil"/>
+              <w:bottom w:val="single" w:sz="8" w:space="0" w:color="000000"/>
+              <w:right w:val="nil"/>
+            </w:tcBorders>
+          </w:tcPr>
+          <w:p>
+            <w:pPr>
+              <w:spacing w:after="0" w:line="259" w:lineRule="auto"/>
+              <w:ind w:left="108"/>
+            </w:pPr>
+            <w:r>
+              <w:t>Student</w:t>
+            </w:r>
+          </w:p>
+        </w:tc>
+        <w:tc>
+          <w:tcPr>
+            <w:tcW w:w="1985" w:type="dxa"/>
+            <w:tcBorders>
+              <w:top w:val="single" w:sz="8" w:space="0" w:color="000000"/>
+              <w:left w:val="nil"/>
+              <w:bottom w:val="single" w:sz="8" w:space="0" w:color="000000"/>
+              <w:right w:val="nil"/>
+            </w:tcBorders>
+          </w:tcPr>
+          <w:p>
+            <w:pPr>
+              <w:spacing w:after="158" w:line="259" w:lineRule="auto"/>
+            </w:pPr>
+            <w:r>
+              <w:t>Developer/Researcher/Tester</w:t>
+            </w:r>
+          </w:p>
+        </w:tc>
+        <w:tc>
+          <w:tcPr>
+            <w:tcW w:w="2016" w:type="dxa"/>
+            <w:tcBorders>
+              <w:top w:val="single" w:sz="8" w:space="0" w:color="000000"/>
+              <w:left w:val="nil"/>
+              <w:bottom w:val="single" w:sz="8" w:space="0" w:color="000000"/>
+              <w:right w:val="nil"/>
+            </w:tcBorders>
+          </w:tcPr>
+          <w:p>
+            <w:pPr>
+              <w:spacing w:after="0" w:line="259" w:lineRule="auto"/>
+            </w:pPr>
+            <w:r>
+              <w:t>Sam Davies</w:t>
+            </w:r>
+          </w:p>
+        </w:tc>
+        <w:tc>
+          <w:tcPr>
+            <w:tcW w:w="2105" w:type="dxa"/>
+            <w:tcBorders>
+              <w:top w:val="single" w:sz="8" w:space="0" w:color="000000"/>
+              <w:left w:val="nil"/>
+              <w:bottom w:val="single" w:sz="8" w:space="0" w:color="000000"/>
+              <w:right w:val="nil"/>
+            </w:tcBorders>
+          </w:tcPr>
+          <w:p>
+            <w:pPr>
+              <w:spacing w:after="0" w:line="259" w:lineRule="auto"/>
+              <w:ind w:left="1"/>
+            </w:pPr>
+          </w:p>
+        </w:tc>
+        <w:tc>
+          <w:tcPr>
+            <w:tcW w:w="1208" w:type="dxa"/>
+            <w:tcBorders>
+              <w:top w:val="single" w:sz="8" w:space="0" w:color="000000"/>
+              <w:left w:val="nil"/>
+              <w:bottom w:val="single" w:sz="8" w:space="0" w:color="000000"/>
+              <w:right w:val="nil"/>
+            </w:tcBorders>
+          </w:tcPr>
+          <w:p>
+            <w:pPr>
+              <w:spacing w:after="0" w:line="259" w:lineRule="auto"/>
+              <w:ind w:left="1"/>
+            </w:pPr>
+          </w:p>
+        </w:tc>
+      </w:tr>
+    </w:tbl>
+    <w:p>
+      <w:pPr>
+        <w:tabs>
+          <w:tab w:val="center" w:pos="771"/>
+          <w:tab w:val="center" w:pos="2434"/>
+          <w:tab w:val="center" w:pos="4418"/>
+          <w:tab w:val="center" w:pos="6434"/>
+          <w:tab w:val="center" w:pos="8539"/>
+        </w:tabs>
+        <w:spacing w:after="26"/>
+      </w:pPr>
+      <w:r>
+        <w:rPr>
+          <w:rFonts w:ascii="Calibri" w:eastAsia="Calibri" w:hAnsi="Calibri" w:cs="Calibri"/>
+        </w:rPr>
+        <w:tab/>
+      </w:r>
+      <w:r>
+        <w:t xml:space="preserve">Student                   </w:t>
+      </w:r>
+      <w:r>
+        <w:tab/>
+        <w:t>Developer Researcher/</w:t>
+      </w:r>
+      <w:proofErr w:type="gramStart"/>
+      <w:r>
+        <w:t>Tester</w:t>
+      </w:r>
+      <w:r>
+        <w:rPr>
+          <w:sz w:val="34"/>
+          <w:vertAlign w:val="superscript"/>
+        </w:rPr>
+        <w:t xml:space="preserve">  Olivia</w:t>
+      </w:r>
+      <w:proofErr w:type="gramEnd"/>
+      <w:r>
+        <w:rPr>
+          <w:sz w:val="34"/>
+          <w:vertAlign w:val="superscript"/>
+        </w:rPr>
+        <w:t xml:space="preserve"> Hey</w:t>
+      </w:r>
+      <w:r>
+        <w:rPr>
+          <w:sz w:val="34"/>
+          <w:vertAlign w:val="superscript"/>
+        </w:rPr>
+        <w:tab/>
+        <w:t xml:space="preserve"> </w:t>
+      </w:r>
+      <w:r>
+        <w:rPr>
+          <w:sz w:val="34"/>
+          <w:vertAlign w:val="superscript"/>
+        </w:rPr>
+        <w:tab/>
+        <w:t xml:space="preserve"> </w:t>
+      </w:r>
+      <w:r>
+        <w:rPr>
+          <w:sz w:val="34"/>
+          <w:vertAlign w:val="superscript"/>
+        </w:rPr>
+        <w:tab/>
+        <w:t xml:space="preserve"> </w:t>
+      </w:r>
+    </w:p>
+    <w:p>
+      <w:pPr>
+        <w:spacing w:after="0" w:line="259" w:lineRule="auto"/>
+        <w:ind w:left="2434"/>
+      </w:pPr>
+      <w:r>
+        <w:t xml:space="preserve"> </w:t>
+      </w:r>
+    </w:p>
+    <w:p>
+      <w:pPr>
+        <w:spacing w:after="46" w:line="259" w:lineRule="auto"/>
+        <w:ind w:left="269"/>
+      </w:pPr>
+      <w:r>
+        <w:rPr>
+          <w:rFonts w:ascii="Calibri" w:eastAsia="Calibri" w:hAnsi="Calibri" w:cs="Calibri"/>
+          <w:noProof/>
+        </w:rPr>
+        <mc:AlternateContent>
+          <mc:Choice Requires="wpg">
+            <w:drawing>
+              <wp:inline distT="0" distB="0" distL="0" distR="0" wp14:anchorId="1183053B" wp14:editId="6A6C7349">
+                <wp:extent cx="6018277" cy="12192"/>
+                <wp:effectExtent l="0" t="0" r="0" b="0"/>
+                <wp:docPr id="4298" name="Group 4298"/>
+                <wp:cNvGraphicFramePr/>
+                <a:graphic xmlns:a="http://schemas.openxmlformats.org/drawingml/2006/main">
+                  <a:graphicData uri="http://schemas.microsoft.com/office/word/2010/wordprocessingGroup">
+                    <wpg:wgp>
+                      <wpg:cNvGrpSpPr/>
+                      <wpg:grpSpPr>
+                        <a:xfrm>
+                          <a:off x="0" y="0"/>
+                          <a:ext cx="6018277" cy="12192"/>
+                          <a:chOff x="0" y="0"/>
+                          <a:chExt cx="6018277" cy="12192"/>
+                        </a:xfrm>
+                      </wpg:grpSpPr>
+                      <wps:wsp>
+                        <wps:cNvPr id="4617" name="Shape 4617"/>
+                        <wps:cNvSpPr/>
+                        <wps:spPr>
+                          <a:xfrm>
+                            <a:off x="0" y="0"/>
+                            <a:ext cx="1306068" cy="12192"/>
+                          </a:xfrm>
+                          <a:custGeom>
+                            <a:avLst/>
+                            <a:gdLst/>
+                            <a:ahLst/>
+                            <a:cxnLst/>
+                            <a:rect l="0" t="0" r="0" b="0"/>
+                            <a:pathLst>
+                              <a:path w="1306068" h="12192">
+                                <a:moveTo>
+                                  <a:pt x="0" y="0"/>
+                                </a:moveTo>
+                                <a:lnTo>
+                                  <a:pt x="1306068" y="0"/>
+                                </a:lnTo>
+                                <a:lnTo>
+                                  <a:pt x="1306068" y="12192"/>
+                                </a:lnTo>
+                                <a:lnTo>
+                                  <a:pt x="0" y="12192"/>
+                                </a:lnTo>
+                                <a:lnTo>
+                                  <a:pt x="0" y="0"/>
+                                </a:lnTo>
+                              </a:path>
+                            </a:pathLst>
+                          </a:custGeom>
+                          <a:ln w="0" cap="flat">
+                            <a:miter lim="127000"/>
+                          </a:ln>
+                        </wps:spPr>
+                        <wps:style>
+                          <a:lnRef idx="0">
+                            <a:srgbClr val="000000">
+                              <a:alpha val="0"/>
+                            </a:srgbClr>
+                          </a:lnRef>
+                          <a:fillRef idx="1">
+                            <a:srgbClr val="000000"/>
+                          </a:fillRef>
+                          <a:effectRef idx="0">
+                            <a:scrgbClr r="0" g="0" b="0"/>
+                          </a:effectRef>
+                          <a:fontRef idx="none"/>
+                        </wps:style>
+                        <wps:bodyPr/>
+                      </wps:wsp>
+                      <wps:wsp>
+                        <wps:cNvPr id="4618" name="Shape 4618"/>
+                        <wps:cNvSpPr/>
+                        <wps:spPr>
+                          <a:xfrm>
+                            <a:off x="1296924" y="0"/>
+                            <a:ext cx="12179" cy="12192"/>
+                          </a:xfrm>
+                          <a:custGeom>
+                            <a:avLst/>
+                            <a:gdLst/>
+                            <a:ahLst/>
+                            <a:cxnLst/>
+                            <a:rect l="0" t="0" r="0" b="0"/>
+                            <a:pathLst>
+                              <a:path w="12179" h="12192">
+                                <a:moveTo>
+                                  <a:pt x="0" y="0"/>
+                                </a:moveTo>
+                                <a:lnTo>
+                                  <a:pt x="12179" y="0"/>
+                                </a:lnTo>
+                                <a:lnTo>
+                                  <a:pt x="12179" y="12192"/>
+                                </a:lnTo>
+                                <a:lnTo>
+                                  <a:pt x="0" y="12192"/>
+                                </a:lnTo>
+                                <a:lnTo>
+                                  <a:pt x="0" y="0"/>
+                                </a:lnTo>
+                              </a:path>
+                            </a:pathLst>
+                          </a:custGeom>
+                          <a:ln w="0" cap="flat">
+                            <a:miter lim="127000"/>
+                          </a:ln>
+                        </wps:spPr>
+                        <wps:style>
+                          <a:lnRef idx="0">
+                            <a:srgbClr val="000000">
+                              <a:alpha val="0"/>
+                            </a:srgbClr>
+                          </a:lnRef>
+                          <a:fillRef idx="1">
+                            <a:srgbClr val="000000"/>
+                          </a:fillRef>
+                          <a:effectRef idx="0">
+                            <a:scrgbClr r="0" g="0" b="0"/>
+                          </a:effectRef>
+                          <a:fontRef idx="none"/>
+                        </wps:style>
+                        <wps:bodyPr/>
+                      </wps:wsp>
+                      <wps:wsp>
+                        <wps:cNvPr id="4619" name="Shape 4619"/>
+                        <wps:cNvSpPr/>
+                        <wps:spPr>
+                          <a:xfrm>
+                            <a:off x="1309116" y="0"/>
+                            <a:ext cx="1257300" cy="12192"/>
+                          </a:xfrm>
+                          <a:custGeom>
+                            <a:avLst/>
+                            <a:gdLst/>
+                            <a:ahLst/>
+                            <a:cxnLst/>
+                            <a:rect l="0" t="0" r="0" b="0"/>
+                            <a:pathLst>
+                              <a:path w="1257300" h="12192">
+                                <a:moveTo>
+                                  <a:pt x="0" y="0"/>
+                                </a:moveTo>
+                                <a:lnTo>
+                                  <a:pt x="1257300" y="0"/>
+                                </a:lnTo>
+                                <a:lnTo>
+                                  <a:pt x="1257300" y="12192"/>
+                                </a:lnTo>
+                                <a:lnTo>
+                                  <a:pt x="0" y="12192"/>
+                                </a:lnTo>
+                                <a:lnTo>
+                                  <a:pt x="0" y="0"/>
+                                </a:lnTo>
+                              </a:path>
+                            </a:pathLst>
+                          </a:custGeom>
+                          <a:ln w="0" cap="flat">
+                            <a:miter lim="127000"/>
+                          </a:ln>
+                        </wps:spPr>
+                        <wps:style>
+                          <a:lnRef idx="0">
+                            <a:srgbClr val="000000">
+                              <a:alpha val="0"/>
+                            </a:srgbClr>
+                          </a:lnRef>
+                          <a:fillRef idx="1">
+                            <a:srgbClr val="000000"/>
+                          </a:fillRef>
+                          <a:effectRef idx="0">
+                            <a:scrgbClr r="0" g="0" b="0"/>
+                          </a:effectRef>
+                          <a:fontRef idx="none"/>
+                        </wps:style>
+                        <wps:bodyPr/>
+                      </wps:wsp>
+                      <wps:wsp>
+                        <wps:cNvPr id="4620" name="Shape 4620"/>
+                        <wps:cNvSpPr/>
+                        <wps:spPr>
+                          <a:xfrm>
+                            <a:off x="2557272" y="0"/>
+                            <a:ext cx="12192" cy="12192"/>
+                          </a:xfrm>
+                          <a:custGeom>
+                            <a:avLst/>
+                            <a:gdLst/>
+                            <a:ahLst/>
+                            <a:cxnLst/>
+                            <a:rect l="0" t="0" r="0" b="0"/>
+                            <a:pathLst>
+                              <a:path w="12192" h="12192">
+                                <a:moveTo>
+                                  <a:pt x="0" y="0"/>
+                                </a:moveTo>
+                                <a:lnTo>
+                                  <a:pt x="12192" y="0"/>
+                                </a:lnTo>
+                                <a:lnTo>
+                                  <a:pt x="12192" y="12192"/>
+                                </a:lnTo>
+                                <a:lnTo>
+                                  <a:pt x="0" y="12192"/>
+                                </a:lnTo>
+                                <a:lnTo>
+                                  <a:pt x="0" y="0"/>
+                                </a:lnTo>
+                              </a:path>
+                            </a:pathLst>
+                          </a:custGeom>
+                          <a:ln w="0" cap="flat">
+                            <a:miter lim="127000"/>
+                          </a:ln>
+                        </wps:spPr>
+                        <wps:style>
+                          <a:lnRef idx="0">
+                            <a:srgbClr val="000000">
+                              <a:alpha val="0"/>
+                            </a:srgbClr>
+                          </a:lnRef>
+                          <a:fillRef idx="1">
+                            <a:srgbClr val="000000"/>
+                          </a:fillRef>
+                          <a:effectRef idx="0">
+                            <a:scrgbClr r="0" g="0" b="0"/>
+                          </a:effectRef>
+                          <a:fontRef idx="none"/>
+                        </wps:style>
+                        <wps:bodyPr/>
+                      </wps:wsp>
+                      <wps:wsp>
+                        <wps:cNvPr id="4621" name="Shape 4621"/>
+                        <wps:cNvSpPr/>
+                        <wps:spPr>
+                          <a:xfrm>
+                            <a:off x="2569464" y="0"/>
+                            <a:ext cx="1277112" cy="12192"/>
+                          </a:xfrm>
+                          <a:custGeom>
+                            <a:avLst/>
+                            <a:gdLst/>
+                            <a:ahLst/>
+                            <a:cxnLst/>
+                            <a:rect l="0" t="0" r="0" b="0"/>
+                            <a:pathLst>
+                              <a:path w="1277112" h="12192">
+                                <a:moveTo>
+                                  <a:pt x="0" y="0"/>
+                                </a:moveTo>
+                                <a:lnTo>
+                                  <a:pt x="1277112" y="0"/>
+                                </a:lnTo>
+                                <a:lnTo>
+                                  <a:pt x="1277112" y="12192"/>
+                                </a:lnTo>
+                                <a:lnTo>
+                                  <a:pt x="0" y="12192"/>
+                                </a:lnTo>
+                                <a:lnTo>
+                                  <a:pt x="0" y="0"/>
+                                </a:lnTo>
+                              </a:path>
+                            </a:pathLst>
+                          </a:custGeom>
+                          <a:ln w="0" cap="flat">
+                            <a:miter lim="127000"/>
+                          </a:ln>
+                        </wps:spPr>
+                        <wps:style>
+                          <a:lnRef idx="0">
+                            <a:srgbClr val="000000">
+                              <a:alpha val="0"/>
+                            </a:srgbClr>
+                          </a:lnRef>
+                          <a:fillRef idx="1">
+                            <a:srgbClr val="000000"/>
+                          </a:fillRef>
+                          <a:effectRef idx="0">
+                            <a:scrgbClr r="0" g="0" b="0"/>
+                          </a:effectRef>
+                          <a:fontRef idx="none"/>
+                        </wps:style>
+                        <wps:bodyPr/>
+                      </wps:wsp>
+                      <wps:wsp>
+                        <wps:cNvPr id="4622" name="Shape 4622"/>
+                        <wps:cNvSpPr/>
+                        <wps:spPr>
+                          <a:xfrm>
+                            <a:off x="3837432" y="0"/>
+                            <a:ext cx="12192" cy="12192"/>
+                          </a:xfrm>
+                          <a:custGeom>
+                            <a:avLst/>
+                            <a:gdLst/>
+                            <a:ahLst/>
+                            <a:cxnLst/>
+                            <a:rect l="0" t="0" r="0" b="0"/>
+                            <a:pathLst>
+                              <a:path w="12192" h="12192">
+                                <a:moveTo>
+                                  <a:pt x="0" y="0"/>
+                                </a:moveTo>
+                                <a:lnTo>
+                                  <a:pt x="12192" y="0"/>
+                                </a:lnTo>
+                                <a:lnTo>
+                                  <a:pt x="12192" y="12192"/>
+                                </a:lnTo>
+                                <a:lnTo>
+                                  <a:pt x="0" y="12192"/>
+                                </a:lnTo>
+                                <a:lnTo>
+                                  <a:pt x="0" y="0"/>
+                                </a:lnTo>
+                              </a:path>
+                            </a:pathLst>
+                          </a:custGeom>
+                          <a:ln w="0" cap="flat">
+                            <a:miter lim="127000"/>
+                          </a:ln>
+                        </wps:spPr>
+                        <wps:style>
+                          <a:lnRef idx="0">
+                            <a:srgbClr val="000000">
+                              <a:alpha val="0"/>
+                            </a:srgbClr>
+                          </a:lnRef>
+                          <a:fillRef idx="1">
+                            <a:srgbClr val="000000"/>
+                          </a:fillRef>
+                          <a:effectRef idx="0">
+                            <a:scrgbClr r="0" g="0" b="0"/>
+                          </a:effectRef>
+                          <a:fontRef idx="none"/>
+                        </wps:style>
+                        <wps:bodyPr/>
+                      </wps:wsp>
+                      <wps:wsp>
+                        <wps:cNvPr id="4623" name="Shape 4623"/>
+                        <wps:cNvSpPr/>
+                        <wps:spPr>
+                          <a:xfrm>
+                            <a:off x="3849624" y="0"/>
+                            <a:ext cx="1333500" cy="12192"/>
+                          </a:xfrm>
+                          <a:custGeom>
+                            <a:avLst/>
+                            <a:gdLst/>
+                            <a:ahLst/>
+                            <a:cxnLst/>
+                            <a:rect l="0" t="0" r="0" b="0"/>
+                            <a:pathLst>
+                              <a:path w="1333500" h="12192">
+                                <a:moveTo>
+                                  <a:pt x="0" y="0"/>
+                                </a:moveTo>
+                                <a:lnTo>
+                                  <a:pt x="1333500" y="0"/>
+                                </a:lnTo>
+                                <a:lnTo>
+                                  <a:pt x="1333500" y="12192"/>
+                                </a:lnTo>
+                                <a:lnTo>
+                                  <a:pt x="0" y="12192"/>
+                                </a:lnTo>
+                                <a:lnTo>
+                                  <a:pt x="0" y="0"/>
+                                </a:lnTo>
+                              </a:path>
+                            </a:pathLst>
+                          </a:custGeom>
+                          <a:ln w="0" cap="flat">
+                            <a:miter lim="127000"/>
+                          </a:ln>
+                        </wps:spPr>
+                        <wps:style>
+                          <a:lnRef idx="0">
+                            <a:srgbClr val="000000">
+                              <a:alpha val="0"/>
+                            </a:srgbClr>
+                          </a:lnRef>
+                          <a:fillRef idx="1">
+                            <a:srgbClr val="000000"/>
+                          </a:fillRef>
+                          <a:effectRef idx="0">
+                            <a:scrgbClr r="0" g="0" b="0"/>
+                          </a:effectRef>
+                          <a:fontRef idx="none"/>
+                        </wps:style>
+                        <wps:bodyPr/>
+                      </wps:wsp>
+                      <wps:wsp>
+                        <wps:cNvPr id="4624" name="Shape 4624"/>
+                        <wps:cNvSpPr/>
+                        <wps:spPr>
+                          <a:xfrm>
+                            <a:off x="5173980" y="0"/>
+                            <a:ext cx="12179" cy="12192"/>
+                          </a:xfrm>
+                          <a:custGeom>
+                            <a:avLst/>
+                            <a:gdLst/>
+                            <a:ahLst/>
+                            <a:cxnLst/>
+                            <a:rect l="0" t="0" r="0" b="0"/>
+                            <a:pathLst>
+                              <a:path w="12179" h="12192">
+                                <a:moveTo>
+                                  <a:pt x="0" y="0"/>
+                                </a:moveTo>
+                                <a:lnTo>
+                                  <a:pt x="12179" y="0"/>
+                                </a:lnTo>
+                                <a:lnTo>
+                                  <a:pt x="12179" y="12192"/>
+                                </a:lnTo>
+                                <a:lnTo>
+                                  <a:pt x="0" y="12192"/>
+                                </a:lnTo>
+                                <a:lnTo>
+                                  <a:pt x="0" y="0"/>
+                                </a:lnTo>
+                              </a:path>
+                            </a:pathLst>
+                          </a:custGeom>
+                          <a:ln w="0" cap="flat">
+                            <a:miter lim="127000"/>
+                          </a:ln>
+                        </wps:spPr>
+                        <wps:style>
+                          <a:lnRef idx="0">
+                            <a:srgbClr val="000000">
+                              <a:alpha val="0"/>
+                            </a:srgbClr>
+                          </a:lnRef>
+                          <a:fillRef idx="1">
+                            <a:srgbClr val="000000"/>
+                          </a:fillRef>
+                          <a:effectRef idx="0">
+                            <a:scrgbClr r="0" g="0" b="0"/>
+                          </a:effectRef>
+                          <a:fontRef idx="none"/>
+                        </wps:style>
+                        <wps:bodyPr/>
+                      </wps:wsp>
+                      <wps:wsp>
+                        <wps:cNvPr id="4625" name="Shape 4625"/>
+                        <wps:cNvSpPr/>
+                        <wps:spPr>
+                          <a:xfrm>
+                            <a:off x="5186172" y="0"/>
+                            <a:ext cx="832104" cy="12192"/>
+                          </a:xfrm>
+                          <a:custGeom>
+                            <a:avLst/>
+                            <a:gdLst/>
+                            <a:ahLst/>
+                            <a:cxnLst/>
+                            <a:rect l="0" t="0" r="0" b="0"/>
+                            <a:pathLst>
+                              <a:path w="832104" h="12192">
+                                <a:moveTo>
+                                  <a:pt x="0" y="0"/>
+                                </a:moveTo>
+                                <a:lnTo>
+                                  <a:pt x="832104" y="0"/>
+                                </a:lnTo>
+                                <a:lnTo>
+                                  <a:pt x="832104" y="12192"/>
+                                </a:lnTo>
+                                <a:lnTo>
+                                  <a:pt x="0" y="12192"/>
+                                </a:lnTo>
+                                <a:lnTo>
+                                  <a:pt x="0" y="0"/>
+                                </a:lnTo>
+                              </a:path>
+                            </a:pathLst>
+                          </a:custGeom>
+                          <a:ln w="0" cap="flat">
+                            <a:miter lim="127000"/>
+                          </a:ln>
+                        </wps:spPr>
+                        <wps:style>
+                          <a:lnRef idx="0">
+                            <a:srgbClr val="000000">
+                              <a:alpha val="0"/>
+                            </a:srgbClr>
+                          </a:lnRef>
+                          <a:fillRef idx="1">
+                            <a:srgbClr val="000000"/>
+                          </a:fillRef>
+                          <a:effectRef idx="0">
+                            <a:scrgbClr r="0" g="0" b="0"/>
+                          </a:effectRef>
+                          <a:fontRef idx="none"/>
+                        </wps:style>
+                        <wps:bodyPr/>
+                      </wps:wsp>
+                    </wpg:wgp>
+                  </a:graphicData>
+                </a:graphic>
+              </wp:inline>
+            </w:drawing>
+          </mc:Choice>
+          <mc:Fallback>
+            <w:pict>
+              <v:group w14:anchorId="44D447A4" id="Group 4298" o:spid="_x0000_s1026" style="width:473.9pt;height:.95pt;mso-position-horizontal-relative:char;mso-position-vertical-relative:line" coordsize="60182,121" o:gfxdata="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">
+                <v:shape id="Shape 4617" o:spid="_x0000_s1027" style="position:absolute;width:13060;height:121;visibility:visible;mso-wrap-style:square;v-text-anchor:top" coordsize="1306068,12192" o:gfxdata="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" path="m,l1306068,r,12192l,12192,,e" fillcolor="black" stroked="f" strokeweight="0">
+                  <v:stroke miterlimit="83231f" joinstyle="miter"/>
+                  <v:path arrowok="t" textboxrect="0,0,1306068,12192"/>
+                </v:shape>
+                <v:shape id="Shape 4618" o:spid="_x0000_s1028" style="position:absolute;left:12969;width:122;height:121;visibility:visible;mso-wrap-style:square;v-text-anchor:top" coordsize="12179,12192" o:gfxdata="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" path="m,l12179,r,12192l,12192,,e" fillcolor="black" stroked="f" strokeweight="0">
+                  <v:stroke miterlimit="83231f" joinstyle="miter"/>
+                  <v:path arrowok="t" textboxrect="0,0,12179,12192"/>
+                </v:shape>
+                <v:shape id="Shape 4619" o:spid="_x0000_s1029" style="position:absolute;left:13091;width:12573;height:121;visibility:visible;mso-wrap-style:square;v-text-anchor:top" coordsize="1257300,12192" o:gfxdata="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" path="m,l1257300,r,12192l,12192,,e" fillcolor="black" stroked="f" strokeweight="0">
+                  <v:stroke miterlimit="83231f" joinstyle="miter"/>
+                  <v:path arrowok="t" textboxrect="0,0,1257300,12192"/>
+                </v:shape>
+                <v:shape id="Shape 4620" o:spid="_x0000_s1030" style="position:absolute;left:25572;width:122;height:121;visibility:visible;mso-wrap-style:square;v-text-anchor:top" coordsize="12192,12192" o:gfxdata="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" path="m,l12192,r,12192l,12192,,e" fillcolor="black" stroked="f" strokeweight="0">
+                  <v:stroke miterlimit="83231f" joinstyle="miter"/>
+                  <v:path arrowok="t" textboxrect="0,0,12192,12192"/>
+                </v:shape>
+                <v:shape id="Shape 4621" o:spid="_x0000_s1031" style="position:absolute;left:25694;width:12771;height:121;visibility:visible;mso-wrap-style:square;v-text-anchor:top" coordsize="1277112,12192" o:gfxdata="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" path="m,l1277112,r,12192l,12192,,e" fillcolor="black" stroked="f" strokeweight="0">
+                  <v:stroke miterlimit="83231f" joinstyle="miter"/>
+                  <v:path arrowok="t" textboxrect="0,0,1277112,12192"/>
+                </v:shape>
+                <v:shape id="Shape 4622" o:spid="_x0000_s1032" style="position:absolute;left:38374;width:122;height:121;visibility:visible;mso-wrap-style:square;v-text-anchor:top" coordsize="12192,12192" o:gfxdata="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" path="m,l12192,r,12192l,12192,,e" fillcolor="black" stroked="f" strokeweight="0">
+                  <v:stroke miterlimit="83231f" joinstyle="miter"/>
+                  <v:path arrowok="t" textboxrect="0,0,12192,12192"/>
+                </v:shape>
+                <v:shape id="Shape 4623" o:spid="_x0000_s1033" style="position:absolute;left:38496;width:13335;height:121;visibility:visible;mso-wrap-style:square;v-text-anchor:top" coordsize="1333500,12192" o:gfxdata="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" path="m,l1333500,r,12192l,12192,,e" fillcolor="black" stroked="f" strokeweight="0">
+                  <v:stroke miterlimit="83231f" joinstyle="miter"/>
+                  <v:path arrowok="t" textboxrect="0,0,1333500,12192"/>
+                </v:shape>
+                <v:shape id="Shape 4624" o:spid="_x0000_s1034" style="position:absolute;left:51739;width:122;height:121;visibility:visible;mso-wrap-style:square;v-text-anchor:top" coordsize="12179,12192" o:gfxdata="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" path="m,l12179,r,12192l,12192,,e" fillcolor="black" stroked="f" strokeweight="0">
+                  <v:stroke miterlimit="83231f" joinstyle="miter"/>
+                  <v:path arrowok="t" textboxrect="0,0,12179,12192"/>
+                </v:shape>
+                <v:shape id="Shape 4625" o:spid="_x0000_s1035" style="position:absolute;left:51861;width:8321;height:121;visibility:visible;mso-wrap-style:square;v-text-anchor:top" coordsize="832104,12192" o:gfxdata="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" path="m,l832104,r,12192l,12192,,e" fillcolor="black" stroked="f" strokeweight="0">
+                  <v:stroke miterlimit="83231f" joinstyle="miter"/>
+                  <v:path arrowok="t" textboxrect="0,0,832104,12192"/>
+                </v:shape>
+                <w10:anchorlock/>
+              </v:group>
+            </w:pict>
+          </mc:Fallback>
+        </mc:AlternateContent>
+      </w:r>
+    </w:p>
+    <w:p>
+      <w:pPr>
+        <w:spacing w:after="158" w:line="259" w:lineRule="auto"/>
+        <w:ind w:left="283"/>
+      </w:pPr>
+      <w:r>
+        <w:t xml:space="preserve"> </w:t>
+      </w:r>
+    </w:p>
+    <w:p>
+      <w:pPr>
+        <w:spacing w:after="0" w:line="259" w:lineRule="auto"/>
+        <w:ind w:left="283"/>
+      </w:pPr>
+      <w:r>
+        <w:t xml:space="preserve"> </w:t>
+      </w:r>
+    </w:p>
+    <w:p>
+      <w:pPr>
+        <w:rPr>
+          <w:lang w:val="en-NZ"/>
+        </w:rPr>
+      </w:pPr>
+    </w:p>
+    <w:p>
+      <w:pPr>
+        <w:pStyle w:val="Heading2"/>
+      </w:pPr>
+      <w:r>
+        <w:t xml:space="preserve">Appendix C </w:t>
+      </w:r>
+    </w:p>
+    <w:p>
+      <w:pPr>
+        <w:rPr>
+          <w:lang w:val="en-NZ"/>
+        </w:rPr>
+      </w:pPr>
+      <w:r>
+        <w:rPr>
+          <w:lang w:val="en-NZ"/>
+        </w:rPr>
+        <w:t>(Statement of no NDA required)</w:t>
+      </w:r>
+    </w:p>
+    <w:p>
+      <w:pPr>
+        <w:pStyle w:val="Heading2"/>
+      </w:pPr>
+      <w:r>
+        <w:t xml:space="preserve">Appendix </w:t>
+      </w:r>
+      <w:r>
+        <w:t>D</w:t>
+      </w:r>
+    </w:p>
+    <w:p>
+      <w:pPr>
+        <w:rPr>
+          <w:lang w:val="en-NZ"/>
+        </w:rPr>
+      </w:pPr>
+      <w:r>
+        <w:rPr>
+          <w:lang w:val="en-NZ"/>
+        </w:rPr>
+        <w:t>(Weekly group log, to demonstrate meeting outcome 2)</w:t>
+      </w:r>
+    </w:p>
+    <w:p>
+      <w:pPr>
+        <w:rPr>
+          <w:lang w:val="en-NZ"/>
+        </w:rPr>
+      </w:pPr>
+    </w:p>
+    <w:p>
+      <w:pPr>
+        <w:rPr>
+          <w:lang w:val="en-NZ"/>
+        </w:rPr>
+      </w:pPr>
     </w:p>
     <w:sectPr>
-      <w:footerReference w:type="default" r:id="rId9"/>
+      <w:footerReference w:type="default" r:id="rId10"/>
       <w:pgSz w:w="11906" w:h="16838"/>
       <w:pgMar w:top="720" w:right="720" w:bottom="720" w:left="720" w:header="708" w:footer="708" w:gutter="0"/>
       <w:pgNumType w:start="0"/>
@@ -11795,6 +14981,1087 @@
     </w:p>
   </w:footnote>
 </w:footnotes>
+</file>
+
+<file path=word/numbering.xml><?xml version="1.0" encoding="utf-8"?>
+<w:numbering xmlns:wpc="http://schemas.microsoft.com/office/word/2010/wordprocessingCanvas" xmlns:cx="http://schemas.microsoft.com/office/drawing/2014/chartex" xmlns:cx1="http://schemas.microsoft.com/office/drawing/2015/9/8/chartex" xmlns:cx2="http://schemas.microsoft.com/office/drawing/2015/10/21/chartex" xmlns:cx3="http://schemas.microsoft.com/office/drawing/2016/5/9/chartex" xmlns:cx4="http://schemas.microsoft.com/office/drawing/2016/5/10/chartex" xmlns:cx5="http://schemas.microsoft.com/office/drawing/2016/5/11/chartex" xmlns:cx6="http://schemas.microsoft.com/office/drawing/2016/5/12/chartex" xmlns:cx7="http://schemas.microsoft.com/office/drawing/2016/5/13/chartex" xmlns:cx8="http://schemas.microsoft.com/office/drawing/2016/5/14/chartex" xmlns:mc="http://schemas.openxmlformats.org/markup-compatibility/2006" xmlns:aink="http://schemas.microsoft.com/office/drawing/2016/ink" xmlns:am3d="http://schemas.microsoft.com/office/drawing/2017/model3d" xmlns:o="urn:schemas-microsoft-com:office:office" xmlns:oel="http://schemas.microsoft.com/office/2019/extlst" xmlns:r="http://schemas.openxmlformats.org/officeDocument/2006/relationships" xmlns:m="http://schemas.openxmlformats.org/officeDocument/2006/math" xmlns:v="urn:schemas-microsoft-com:vml" xmlns:wp14="http://schemas.microsoft.com/office/word/2010/wordprocessingDrawing" xmlns:wp="http://schemas.openxmlformats.org/drawingml/2006/wordprocessingDrawing" xmlns:w10="urn:schemas-microsoft-com:office:word" xmlns:w="http://schemas.openxmlformats.org/wordprocessingml/2006/main" xmlns:w14="http://schemas.microsoft.com/office/word/2010/wordml" xmlns:w15="http://schemas.microsoft.com/office/word/2012/wordml" xmlns:w16cei="http://schemas.microsoft.com/office/word/2026/wordml/cei" xmlns:w16cex="http://schemas.microsoft.com/office/word/2018/wordml/cex" xmlns:w16cid="http://schemas.microsoft.com/office/word/2016/wordml/cid" xmlns:w16="http://schemas.microsoft.com/office/word/2018/wordml" xmlns:w16du="http://schemas.microsoft.com/office/word/2023/wordml/word16du" xmlns:w16sdtdh="http://schemas.microsoft.com/office/word/2020/wordml/sdtdatahash" xmlns:w16sdtfl="http://schemas.microsoft.com/office/word/2024/wordml/sdtformatlock" xmlns:w16se="http://schemas.microsoft.com/office/word/2015/wordml/symex" xmlns:wpg="http://schemas.microsoft.com/office/word/2010/wordprocessingGroup" xmlns:wpi="http://schemas.microsoft.com/office/word/2010/wordprocessingInk" xmlns:wne="http://schemas.microsoft.com/office/word/2006/wordml" xmlns:wps="http://schemas.microsoft.com/office/word/2010/wordprocessingShape" mc:Ignorable="w14 w15 w16se w16cid w16 w16cex w16sdtdh w16sdtfl w16du wp14">
+  <w:abstractNum w:abstractNumId="0" w15:restartNumberingAfterBreak="0">
+    <w:nsid w:val="021B7D22"/>
+    <w:multiLevelType w:val="multilevel"/>
+    <w:tmpl w:val="B8CA8B76"/>
+    <w:lvl w:ilvl="0">
+      <w:start w:val="4"/>
+      <w:numFmt w:val="decimal"/>
+      <w:lvlText w:val="%1"/>
+      <w:lvlJc w:val="left"/>
+      <w:pPr>
+        <w:ind w:left="360"/>
+      </w:pPr>
+      <w:rPr>
+        <w:rFonts w:ascii="Arial" w:eastAsia="Arial" w:hAnsi="Arial" w:cs="Arial"/>
+        <w:b w:val="0"/>
+        <w:i w:val="0"/>
+        <w:strike w:val="0"/>
+        <w:dstrike w:val="0"/>
+        <w:color w:val="000000"/>
+        <w:sz w:val="22"/>
+        <w:szCs w:val="22"/>
+        <w:u w:val="none" w:color="000000"/>
+        <w:bdr w:val="none" w:sz="0" w:space="0" w:color="auto"/>
+        <w:shd w:val="clear" w:color="auto" w:fill="auto"/>
+        <w:vertAlign w:val="baseline"/>
+      </w:rPr>
+    </w:lvl>
+    <w:lvl w:ilvl="1">
+      <w:start w:val="2"/>
+      <w:numFmt w:val="decimal"/>
+      <w:lvlRestart w:val="0"/>
+      <w:lvlText w:val="%1.%2"/>
+      <w:lvlJc w:val="left"/>
+      <w:pPr>
+        <w:ind w:left="696"/>
+      </w:pPr>
+      <w:rPr>
+        <w:rFonts w:ascii="Arial" w:eastAsia="Arial" w:hAnsi="Arial" w:cs="Arial"/>
+        <w:b w:val="0"/>
+        <w:i w:val="0"/>
+        <w:strike w:val="0"/>
+        <w:dstrike w:val="0"/>
+        <w:color w:val="000000"/>
+        <w:sz w:val="22"/>
+        <w:szCs w:val="22"/>
+        <w:u w:val="none" w:color="000000"/>
+        <w:bdr w:val="none" w:sz="0" w:space="0" w:color="auto"/>
+        <w:shd w:val="clear" w:color="auto" w:fill="auto"/>
+        <w:vertAlign w:val="baseline"/>
+      </w:rPr>
+    </w:lvl>
+    <w:lvl w:ilvl="2">
+      <w:start w:val="1"/>
+      <w:numFmt w:val="lowerRoman"/>
+      <w:lvlText w:val="%3"/>
+      <w:lvlJc w:val="left"/>
+      <w:pPr>
+        <w:ind w:left="1080"/>
+      </w:pPr>
+      <w:rPr>
+        <w:rFonts w:ascii="Arial" w:eastAsia="Arial" w:hAnsi="Arial" w:cs="Arial"/>
+        <w:b w:val="0"/>
+        <w:i w:val="0"/>
+        <w:strike w:val="0"/>
+        <w:dstrike w:val="0"/>
+        <w:color w:val="000000"/>
+        <w:sz w:val="22"/>
+        <w:szCs w:val="22"/>
+        <w:u w:val="none" w:color="000000"/>
+        <w:bdr w:val="none" w:sz="0" w:space="0" w:color="auto"/>
+        <w:shd w:val="clear" w:color="auto" w:fill="auto"/>
+        <w:vertAlign w:val="baseline"/>
+      </w:rPr>
+    </w:lvl>
+    <w:lvl w:ilvl="3">
+      <w:start w:val="1"/>
+      <w:numFmt w:val="decimal"/>
+      <w:lvlText w:val="%4"/>
+      <w:lvlJc w:val="left"/>
+      <w:pPr>
+        <w:ind w:left="1800"/>
+      </w:pPr>
+      <w:rPr>
+        <w:rFonts w:ascii="Arial" w:eastAsia="Arial" w:hAnsi="Arial" w:cs="Arial"/>
+        <w:b w:val="0"/>
+        <w:i w:val="0"/>
+        <w:strike w:val="0"/>
+        <w:dstrike w:val="0"/>
+        <w:color w:val="000000"/>
+        <w:sz w:val="22"/>
+        <w:szCs w:val="22"/>
+        <w:u w:val="none" w:color="000000"/>
+        <w:bdr w:val="none" w:sz="0" w:space="0" w:color="auto"/>
+        <w:shd w:val="clear" w:color="auto" w:fill="auto"/>
+        <w:vertAlign w:val="baseline"/>
+      </w:rPr>
+    </w:lvl>
+    <w:lvl w:ilvl="4">
+      <w:start w:val="1"/>
+      <w:numFmt w:val="lowerLetter"/>
+      <w:lvlText w:val="%5"/>
+      <w:lvlJc w:val="left"/>
+      <w:pPr>
+        <w:ind w:left="2520"/>
+      </w:pPr>
+      <w:rPr>
+        <w:rFonts w:ascii="Arial" w:eastAsia="Arial" w:hAnsi="Arial" w:cs="Arial"/>
+        <w:b w:val="0"/>
+        <w:i w:val="0"/>
+        <w:strike w:val="0"/>
+        <w:dstrike w:val="0"/>
+        <w:color w:val="000000"/>
+        <w:sz w:val="22"/>
+        <w:szCs w:val="22"/>
+        <w:u w:val="none" w:color="000000"/>
+        <w:bdr w:val="none" w:sz="0" w:space="0" w:color="auto"/>
+        <w:shd w:val="clear" w:color="auto" w:fill="auto"/>
+        <w:vertAlign w:val="baseline"/>
+      </w:rPr>
+    </w:lvl>
+    <w:lvl w:ilvl="5">
+      <w:start w:val="1"/>
+      <w:numFmt w:val="lowerRoman"/>
+      <w:lvlText w:val="%6"/>
+      <w:lvlJc w:val="left"/>
+      <w:pPr>
+        <w:ind w:left="3240"/>
+      </w:pPr>
+      <w:rPr>
+        <w:rFonts w:ascii="Arial" w:eastAsia="Arial" w:hAnsi="Arial" w:cs="Arial"/>
+        <w:b w:val="0"/>
+        <w:i w:val="0"/>
+        <w:strike w:val="0"/>
+        <w:dstrike w:val="0"/>
+        <w:color w:val="000000"/>
+        <w:sz w:val="22"/>
+        <w:szCs w:val="22"/>
+        <w:u w:val="none" w:color="000000"/>
+        <w:bdr w:val="none" w:sz="0" w:space="0" w:color="auto"/>
+        <w:shd w:val="clear" w:color="auto" w:fill="auto"/>
+        <w:vertAlign w:val="baseline"/>
+      </w:rPr>
+    </w:lvl>
+    <w:lvl w:ilvl="6">
+      <w:start w:val="1"/>
+      <w:numFmt w:val="decimal"/>
+      <w:lvlText w:val="%7"/>
+      <w:lvlJc w:val="left"/>
+      <w:pPr>
+        <w:ind w:left="3960"/>
+      </w:pPr>
+      <w:rPr>
+        <w:rFonts w:ascii="Arial" w:eastAsia="Arial" w:hAnsi="Arial" w:cs="Arial"/>
+        <w:b w:val="0"/>
+        <w:i w:val="0"/>
+        <w:strike w:val="0"/>
+        <w:dstrike w:val="0"/>
+        <w:color w:val="000000"/>
+        <w:sz w:val="22"/>
+        <w:szCs w:val="22"/>
+        <w:u w:val="none" w:color="000000"/>
+        <w:bdr w:val="none" w:sz="0" w:space="0" w:color="auto"/>
+        <w:shd w:val="clear" w:color="auto" w:fill="auto"/>
+        <w:vertAlign w:val="baseline"/>
+      </w:rPr>
+    </w:lvl>
+    <w:lvl w:ilvl="7">
+      <w:start w:val="1"/>
+      <w:numFmt w:val="lowerLetter"/>
+      <w:lvlText w:val="%8"/>
+      <w:lvlJc w:val="left"/>
+      <w:pPr>
+        <w:ind w:left="4680"/>
+      </w:pPr>
+      <w:rPr>
+        <w:rFonts w:ascii="Arial" w:eastAsia="Arial" w:hAnsi="Arial" w:cs="Arial"/>
+        <w:b w:val="0"/>
+        <w:i w:val="0"/>
+        <w:strike w:val="0"/>
+        <w:dstrike w:val="0"/>
+        <w:color w:val="000000"/>
+        <w:sz w:val="22"/>
+        <w:szCs w:val="22"/>
+        <w:u w:val="none" w:color="000000"/>
+        <w:bdr w:val="none" w:sz="0" w:space="0" w:color="auto"/>
+        <w:shd w:val="clear" w:color="auto" w:fill="auto"/>
+        <w:vertAlign w:val="baseline"/>
+      </w:rPr>
+    </w:lvl>
+    <w:lvl w:ilvl="8">
+      <w:start w:val="1"/>
+      <w:numFmt w:val="lowerRoman"/>
+      <w:lvlText w:val="%9"/>
+      <w:lvlJc w:val="left"/>
+      <w:pPr>
+        <w:ind w:left="5400"/>
+      </w:pPr>
+      <w:rPr>
+        <w:rFonts w:ascii="Arial" w:eastAsia="Arial" w:hAnsi="Arial" w:cs="Arial"/>
+        <w:b w:val="0"/>
+        <w:i w:val="0"/>
+        <w:strike w:val="0"/>
+        <w:dstrike w:val="0"/>
+        <w:color w:val="000000"/>
+        <w:sz w:val="22"/>
+        <w:szCs w:val="22"/>
+        <w:u w:val="none" w:color="000000"/>
+        <w:bdr w:val="none" w:sz="0" w:space="0" w:color="auto"/>
+        <w:shd w:val="clear" w:color="auto" w:fill="auto"/>
+        <w:vertAlign w:val="baseline"/>
+      </w:rPr>
+    </w:lvl>
+  </w:abstractNum>
+  <w:abstractNum w:abstractNumId="1" w15:restartNumberingAfterBreak="0">
+    <w:nsid w:val="11BC0757"/>
+    <w:multiLevelType w:val="hybridMultilevel"/>
+    <w:tmpl w:val="7D4E8138"/>
+    <w:lvl w:ilvl="0" w:tplc="9F7CD4B8">
+      <w:start w:val="1"/>
+      <w:numFmt w:val="lowerLetter"/>
+      <w:lvlText w:val="%1)"/>
+      <w:lvlJc w:val="left"/>
+      <w:pPr>
+        <w:ind w:left="696"/>
+      </w:pPr>
+      <w:rPr>
+        <w:rFonts w:ascii="Arial" w:eastAsia="Arial" w:hAnsi="Arial" w:cs="Arial"/>
+        <w:b w:val="0"/>
+        <w:i w:val="0"/>
+        <w:strike w:val="0"/>
+        <w:dstrike w:val="0"/>
+        <w:color w:val="000000"/>
+        <w:sz w:val="22"/>
+        <w:szCs w:val="22"/>
+        <w:u w:val="none" w:color="000000"/>
+        <w:bdr w:val="none" w:sz="0" w:space="0" w:color="auto"/>
+        <w:shd w:val="clear" w:color="auto" w:fill="auto"/>
+        <w:vertAlign w:val="baseline"/>
+      </w:rPr>
+    </w:lvl>
+    <w:lvl w:ilvl="1" w:tplc="2708C772">
+      <w:start w:val="1"/>
+      <w:numFmt w:val="lowerLetter"/>
+      <w:lvlText w:val="%2"/>
+      <w:lvlJc w:val="left"/>
+      <w:pPr>
+        <w:ind w:left="1363"/>
+      </w:pPr>
+      <w:rPr>
+        <w:rFonts w:ascii="Arial" w:eastAsia="Arial" w:hAnsi="Arial" w:cs="Arial"/>
+        <w:b w:val="0"/>
+        <w:i w:val="0"/>
+        <w:strike w:val="0"/>
+        <w:dstrike w:val="0"/>
+        <w:color w:val="000000"/>
+        <w:sz w:val="22"/>
+        <w:szCs w:val="22"/>
+        <w:u w:val="none" w:color="000000"/>
+        <w:bdr w:val="none" w:sz="0" w:space="0" w:color="auto"/>
+        <w:shd w:val="clear" w:color="auto" w:fill="auto"/>
+        <w:vertAlign w:val="baseline"/>
+      </w:rPr>
+    </w:lvl>
+    <w:lvl w:ilvl="2" w:tplc="1376F9EA">
+      <w:start w:val="1"/>
+      <w:numFmt w:val="lowerRoman"/>
+      <w:lvlText w:val="%3"/>
+      <w:lvlJc w:val="left"/>
+      <w:pPr>
+        <w:ind w:left="2083"/>
+      </w:pPr>
+      <w:rPr>
+        <w:rFonts w:ascii="Arial" w:eastAsia="Arial" w:hAnsi="Arial" w:cs="Arial"/>
+        <w:b w:val="0"/>
+        <w:i w:val="0"/>
+        <w:strike w:val="0"/>
+        <w:dstrike w:val="0"/>
+        <w:color w:val="000000"/>
+        <w:sz w:val="22"/>
+        <w:szCs w:val="22"/>
+        <w:u w:val="none" w:color="000000"/>
+        <w:bdr w:val="none" w:sz="0" w:space="0" w:color="auto"/>
+        <w:shd w:val="clear" w:color="auto" w:fill="auto"/>
+        <w:vertAlign w:val="baseline"/>
+      </w:rPr>
+    </w:lvl>
+    <w:lvl w:ilvl="3" w:tplc="115A0F1E">
+      <w:start w:val="1"/>
+      <w:numFmt w:val="decimal"/>
+      <w:lvlText w:val="%4"/>
+      <w:lvlJc w:val="left"/>
+      <w:pPr>
+        <w:ind w:left="2803"/>
+      </w:pPr>
+      <w:rPr>
+        <w:rFonts w:ascii="Arial" w:eastAsia="Arial" w:hAnsi="Arial" w:cs="Arial"/>
+        <w:b w:val="0"/>
+        <w:i w:val="0"/>
+        <w:strike w:val="0"/>
+        <w:dstrike w:val="0"/>
+        <w:color w:val="000000"/>
+        <w:sz w:val="22"/>
+        <w:szCs w:val="22"/>
+        <w:u w:val="none" w:color="000000"/>
+        <w:bdr w:val="none" w:sz="0" w:space="0" w:color="auto"/>
+        <w:shd w:val="clear" w:color="auto" w:fill="auto"/>
+        <w:vertAlign w:val="baseline"/>
+      </w:rPr>
+    </w:lvl>
+    <w:lvl w:ilvl="4" w:tplc="4202B08A">
+      <w:start w:val="1"/>
+      <w:numFmt w:val="lowerLetter"/>
+      <w:lvlText w:val="%5"/>
+      <w:lvlJc w:val="left"/>
+      <w:pPr>
+        <w:ind w:left="3523"/>
+      </w:pPr>
+      <w:rPr>
+        <w:rFonts w:ascii="Arial" w:eastAsia="Arial" w:hAnsi="Arial" w:cs="Arial"/>
+        <w:b w:val="0"/>
+        <w:i w:val="0"/>
+        <w:strike w:val="0"/>
+        <w:dstrike w:val="0"/>
+        <w:color w:val="000000"/>
+        <w:sz w:val="22"/>
+        <w:szCs w:val="22"/>
+        <w:u w:val="none" w:color="000000"/>
+        <w:bdr w:val="none" w:sz="0" w:space="0" w:color="auto"/>
+        <w:shd w:val="clear" w:color="auto" w:fill="auto"/>
+        <w:vertAlign w:val="baseline"/>
+      </w:rPr>
+    </w:lvl>
+    <w:lvl w:ilvl="5" w:tplc="33106564">
+      <w:start w:val="1"/>
+      <w:numFmt w:val="lowerRoman"/>
+      <w:lvlText w:val="%6"/>
+      <w:lvlJc w:val="left"/>
+      <w:pPr>
+        <w:ind w:left="4243"/>
+      </w:pPr>
+      <w:rPr>
+        <w:rFonts w:ascii="Arial" w:eastAsia="Arial" w:hAnsi="Arial" w:cs="Arial"/>
+        <w:b w:val="0"/>
+        <w:i w:val="0"/>
+        <w:strike w:val="0"/>
+        <w:dstrike w:val="0"/>
+        <w:color w:val="000000"/>
+        <w:sz w:val="22"/>
+        <w:szCs w:val="22"/>
+        <w:u w:val="none" w:color="000000"/>
+        <w:bdr w:val="none" w:sz="0" w:space="0" w:color="auto"/>
+        <w:shd w:val="clear" w:color="auto" w:fill="auto"/>
+        <w:vertAlign w:val="baseline"/>
+      </w:rPr>
+    </w:lvl>
+    <w:lvl w:ilvl="6" w:tplc="4BDA81B2">
+      <w:start w:val="1"/>
+      <w:numFmt w:val="decimal"/>
+      <w:lvlText w:val="%7"/>
+      <w:lvlJc w:val="left"/>
+      <w:pPr>
+        <w:ind w:left="4963"/>
+      </w:pPr>
+      <w:rPr>
+        <w:rFonts w:ascii="Arial" w:eastAsia="Arial" w:hAnsi="Arial" w:cs="Arial"/>
+        <w:b w:val="0"/>
+        <w:i w:val="0"/>
+        <w:strike w:val="0"/>
+        <w:dstrike w:val="0"/>
+        <w:color w:val="000000"/>
+        <w:sz w:val="22"/>
+        <w:szCs w:val="22"/>
+        <w:u w:val="none" w:color="000000"/>
+        <w:bdr w:val="none" w:sz="0" w:space="0" w:color="auto"/>
+        <w:shd w:val="clear" w:color="auto" w:fill="auto"/>
+        <w:vertAlign w:val="baseline"/>
+      </w:rPr>
+    </w:lvl>
+    <w:lvl w:ilvl="7" w:tplc="044E7452">
+      <w:start w:val="1"/>
+      <w:numFmt w:val="lowerLetter"/>
+      <w:lvlText w:val="%8"/>
+      <w:lvlJc w:val="left"/>
+      <w:pPr>
+        <w:ind w:left="5683"/>
+      </w:pPr>
+      <w:rPr>
+        <w:rFonts w:ascii="Arial" w:eastAsia="Arial" w:hAnsi="Arial" w:cs="Arial"/>
+        <w:b w:val="0"/>
+        <w:i w:val="0"/>
+        <w:strike w:val="0"/>
+        <w:dstrike w:val="0"/>
+        <w:color w:val="000000"/>
+        <w:sz w:val="22"/>
+        <w:szCs w:val="22"/>
+        <w:u w:val="none" w:color="000000"/>
+        <w:bdr w:val="none" w:sz="0" w:space="0" w:color="auto"/>
+        <w:shd w:val="clear" w:color="auto" w:fill="auto"/>
+        <w:vertAlign w:val="baseline"/>
+      </w:rPr>
+    </w:lvl>
+    <w:lvl w:ilvl="8" w:tplc="DD521D28">
+      <w:start w:val="1"/>
+      <w:numFmt w:val="lowerRoman"/>
+      <w:lvlText w:val="%9"/>
+      <w:lvlJc w:val="left"/>
+      <w:pPr>
+        <w:ind w:left="6403"/>
+      </w:pPr>
+      <w:rPr>
+        <w:rFonts w:ascii="Arial" w:eastAsia="Arial" w:hAnsi="Arial" w:cs="Arial"/>
+        <w:b w:val="0"/>
+        <w:i w:val="0"/>
+        <w:strike w:val="0"/>
+        <w:dstrike w:val="0"/>
+        <w:color w:val="000000"/>
+        <w:sz w:val="22"/>
+        <w:szCs w:val="22"/>
+        <w:u w:val="none" w:color="000000"/>
+        <w:bdr w:val="none" w:sz="0" w:space="0" w:color="auto"/>
+        <w:shd w:val="clear" w:color="auto" w:fill="auto"/>
+        <w:vertAlign w:val="baseline"/>
+      </w:rPr>
+    </w:lvl>
+  </w:abstractNum>
+  <w:abstractNum w:abstractNumId="2" w15:restartNumberingAfterBreak="0">
+    <w:nsid w:val="2F476821"/>
+    <w:multiLevelType w:val="hybridMultilevel"/>
+    <w:tmpl w:val="0C74053E"/>
+    <w:lvl w:ilvl="0" w:tplc="649ADB0A">
+      <w:start w:val="1"/>
+      <w:numFmt w:val="lowerLetter"/>
+      <w:lvlText w:val="%1)"/>
+      <w:lvlJc w:val="left"/>
+      <w:pPr>
+        <w:ind w:left="1134"/>
+      </w:pPr>
+      <w:rPr>
+        <w:rFonts w:ascii="Arial" w:eastAsia="Arial" w:hAnsi="Arial" w:cs="Arial"/>
+        <w:b w:val="0"/>
+        <w:i w:val="0"/>
+        <w:strike w:val="0"/>
+        <w:dstrike w:val="0"/>
+        <w:color w:val="000000"/>
+        <w:sz w:val="22"/>
+        <w:szCs w:val="22"/>
+        <w:u w:val="none" w:color="000000"/>
+        <w:bdr w:val="none" w:sz="0" w:space="0" w:color="auto"/>
+        <w:shd w:val="clear" w:color="auto" w:fill="auto"/>
+        <w:vertAlign w:val="baseline"/>
+      </w:rPr>
+    </w:lvl>
+    <w:lvl w:ilvl="1" w:tplc="A852C0D0">
+      <w:start w:val="1"/>
+      <w:numFmt w:val="lowerLetter"/>
+      <w:lvlText w:val="%2"/>
+      <w:lvlJc w:val="left"/>
+      <w:pPr>
+        <w:ind w:left="1507"/>
+      </w:pPr>
+      <w:rPr>
+        <w:rFonts w:ascii="Arial" w:eastAsia="Arial" w:hAnsi="Arial" w:cs="Arial"/>
+        <w:b w:val="0"/>
+        <w:i w:val="0"/>
+        <w:strike w:val="0"/>
+        <w:dstrike w:val="0"/>
+        <w:color w:val="000000"/>
+        <w:sz w:val="22"/>
+        <w:szCs w:val="22"/>
+        <w:u w:val="none" w:color="000000"/>
+        <w:bdr w:val="none" w:sz="0" w:space="0" w:color="auto"/>
+        <w:shd w:val="clear" w:color="auto" w:fill="auto"/>
+        <w:vertAlign w:val="baseline"/>
+      </w:rPr>
+    </w:lvl>
+    <w:lvl w:ilvl="2" w:tplc="6A282084">
+      <w:start w:val="1"/>
+      <w:numFmt w:val="lowerRoman"/>
+      <w:lvlText w:val="%3"/>
+      <w:lvlJc w:val="left"/>
+      <w:pPr>
+        <w:ind w:left="2227"/>
+      </w:pPr>
+      <w:rPr>
+        <w:rFonts w:ascii="Arial" w:eastAsia="Arial" w:hAnsi="Arial" w:cs="Arial"/>
+        <w:b w:val="0"/>
+        <w:i w:val="0"/>
+        <w:strike w:val="0"/>
+        <w:dstrike w:val="0"/>
+        <w:color w:val="000000"/>
+        <w:sz w:val="22"/>
+        <w:szCs w:val="22"/>
+        <w:u w:val="none" w:color="000000"/>
+        <w:bdr w:val="none" w:sz="0" w:space="0" w:color="auto"/>
+        <w:shd w:val="clear" w:color="auto" w:fill="auto"/>
+        <w:vertAlign w:val="baseline"/>
+      </w:rPr>
+    </w:lvl>
+    <w:lvl w:ilvl="3" w:tplc="B88C70B4">
+      <w:start w:val="1"/>
+      <w:numFmt w:val="decimal"/>
+      <w:lvlText w:val="%4"/>
+      <w:lvlJc w:val="left"/>
+      <w:pPr>
+        <w:ind w:left="2947"/>
+      </w:pPr>
+      <w:rPr>
+        <w:rFonts w:ascii="Arial" w:eastAsia="Arial" w:hAnsi="Arial" w:cs="Arial"/>
+        <w:b w:val="0"/>
+        <w:i w:val="0"/>
+        <w:strike w:val="0"/>
+        <w:dstrike w:val="0"/>
+        <w:color w:val="000000"/>
+        <w:sz w:val="22"/>
+        <w:szCs w:val="22"/>
+        <w:u w:val="none" w:color="000000"/>
+        <w:bdr w:val="none" w:sz="0" w:space="0" w:color="auto"/>
+        <w:shd w:val="clear" w:color="auto" w:fill="auto"/>
+        <w:vertAlign w:val="baseline"/>
+      </w:rPr>
+    </w:lvl>
+    <w:lvl w:ilvl="4" w:tplc="1D2C6900">
+      <w:start w:val="1"/>
+      <w:numFmt w:val="lowerLetter"/>
+      <w:lvlText w:val="%5"/>
+      <w:lvlJc w:val="left"/>
+      <w:pPr>
+        <w:ind w:left="3667"/>
+      </w:pPr>
+      <w:rPr>
+        <w:rFonts w:ascii="Arial" w:eastAsia="Arial" w:hAnsi="Arial" w:cs="Arial"/>
+        <w:b w:val="0"/>
+        <w:i w:val="0"/>
+        <w:strike w:val="0"/>
+        <w:dstrike w:val="0"/>
+        <w:color w:val="000000"/>
+        <w:sz w:val="22"/>
+        <w:szCs w:val="22"/>
+        <w:u w:val="none" w:color="000000"/>
+        <w:bdr w:val="none" w:sz="0" w:space="0" w:color="auto"/>
+        <w:shd w:val="clear" w:color="auto" w:fill="auto"/>
+        <w:vertAlign w:val="baseline"/>
+      </w:rPr>
+    </w:lvl>
+    <w:lvl w:ilvl="5" w:tplc="89448180">
+      <w:start w:val="1"/>
+      <w:numFmt w:val="lowerRoman"/>
+      <w:lvlText w:val="%6"/>
+      <w:lvlJc w:val="left"/>
+      <w:pPr>
+        <w:ind w:left="4387"/>
+      </w:pPr>
+      <w:rPr>
+        <w:rFonts w:ascii="Arial" w:eastAsia="Arial" w:hAnsi="Arial" w:cs="Arial"/>
+        <w:b w:val="0"/>
+        <w:i w:val="0"/>
+        <w:strike w:val="0"/>
+        <w:dstrike w:val="0"/>
+        <w:color w:val="000000"/>
+        <w:sz w:val="22"/>
+        <w:szCs w:val="22"/>
+        <w:u w:val="none" w:color="000000"/>
+        <w:bdr w:val="none" w:sz="0" w:space="0" w:color="auto"/>
+        <w:shd w:val="clear" w:color="auto" w:fill="auto"/>
+        <w:vertAlign w:val="baseline"/>
+      </w:rPr>
+    </w:lvl>
+    <w:lvl w:ilvl="6" w:tplc="73C012CC">
+      <w:start w:val="1"/>
+      <w:numFmt w:val="decimal"/>
+      <w:lvlText w:val="%7"/>
+      <w:lvlJc w:val="left"/>
+      <w:pPr>
+        <w:ind w:left="5107"/>
+      </w:pPr>
+      <w:rPr>
+        <w:rFonts w:ascii="Arial" w:eastAsia="Arial" w:hAnsi="Arial" w:cs="Arial"/>
+        <w:b w:val="0"/>
+        <w:i w:val="0"/>
+        <w:strike w:val="0"/>
+        <w:dstrike w:val="0"/>
+        <w:color w:val="000000"/>
+        <w:sz w:val="22"/>
+        <w:szCs w:val="22"/>
+        <w:u w:val="none" w:color="000000"/>
+        <w:bdr w:val="none" w:sz="0" w:space="0" w:color="auto"/>
+        <w:shd w:val="clear" w:color="auto" w:fill="auto"/>
+        <w:vertAlign w:val="baseline"/>
+      </w:rPr>
+    </w:lvl>
+    <w:lvl w:ilvl="7" w:tplc="67580CB4">
+      <w:start w:val="1"/>
+      <w:numFmt w:val="lowerLetter"/>
+      <w:lvlText w:val="%8"/>
+      <w:lvlJc w:val="left"/>
+      <w:pPr>
+        <w:ind w:left="5827"/>
+      </w:pPr>
+      <w:rPr>
+        <w:rFonts w:ascii="Arial" w:eastAsia="Arial" w:hAnsi="Arial" w:cs="Arial"/>
+        <w:b w:val="0"/>
+        <w:i w:val="0"/>
+        <w:strike w:val="0"/>
+        <w:dstrike w:val="0"/>
+        <w:color w:val="000000"/>
+        <w:sz w:val="22"/>
+        <w:szCs w:val="22"/>
+        <w:u w:val="none" w:color="000000"/>
+        <w:bdr w:val="none" w:sz="0" w:space="0" w:color="auto"/>
+        <w:shd w:val="clear" w:color="auto" w:fill="auto"/>
+        <w:vertAlign w:val="baseline"/>
+      </w:rPr>
+    </w:lvl>
+    <w:lvl w:ilvl="8" w:tplc="CB169A14">
+      <w:start w:val="1"/>
+      <w:numFmt w:val="lowerRoman"/>
+      <w:lvlText w:val="%9"/>
+      <w:lvlJc w:val="left"/>
+      <w:pPr>
+        <w:ind w:left="6547"/>
+      </w:pPr>
+      <w:rPr>
+        <w:rFonts w:ascii="Arial" w:eastAsia="Arial" w:hAnsi="Arial" w:cs="Arial"/>
+        <w:b w:val="0"/>
+        <w:i w:val="0"/>
+        <w:strike w:val="0"/>
+        <w:dstrike w:val="0"/>
+        <w:color w:val="000000"/>
+        <w:sz w:val="22"/>
+        <w:szCs w:val="22"/>
+        <w:u w:val="none" w:color="000000"/>
+        <w:bdr w:val="none" w:sz="0" w:space="0" w:color="auto"/>
+        <w:shd w:val="clear" w:color="auto" w:fill="auto"/>
+        <w:vertAlign w:val="baseline"/>
+      </w:rPr>
+    </w:lvl>
+  </w:abstractNum>
+  <w:abstractNum w:abstractNumId="3" w15:restartNumberingAfterBreak="0">
+    <w:nsid w:val="49F21884"/>
+    <w:multiLevelType w:val="hybridMultilevel"/>
+    <w:tmpl w:val="5802C03E"/>
+    <w:lvl w:ilvl="0" w:tplc="83C006A6">
+      <w:start w:val="1"/>
+      <w:numFmt w:val="lowerLetter"/>
+      <w:lvlText w:val="%1)"/>
+      <w:lvlJc w:val="left"/>
+      <w:pPr>
+        <w:ind w:left="696"/>
+      </w:pPr>
+      <w:rPr>
+        <w:rFonts w:ascii="Arial" w:eastAsia="Arial" w:hAnsi="Arial" w:cs="Arial"/>
+        <w:b w:val="0"/>
+        <w:i w:val="0"/>
+        <w:strike w:val="0"/>
+        <w:dstrike w:val="0"/>
+        <w:color w:val="000000"/>
+        <w:sz w:val="22"/>
+        <w:szCs w:val="22"/>
+        <w:u w:val="none" w:color="000000"/>
+        <w:bdr w:val="none" w:sz="0" w:space="0" w:color="auto"/>
+        <w:shd w:val="clear" w:color="auto" w:fill="auto"/>
+        <w:vertAlign w:val="baseline"/>
+      </w:rPr>
+    </w:lvl>
+    <w:lvl w:ilvl="1" w:tplc="580E9B0C">
+      <w:start w:val="1"/>
+      <w:numFmt w:val="lowerLetter"/>
+      <w:lvlText w:val="%2"/>
+      <w:lvlJc w:val="left"/>
+      <w:pPr>
+        <w:ind w:left="1364"/>
+      </w:pPr>
+      <w:rPr>
+        <w:rFonts w:ascii="Arial" w:eastAsia="Arial" w:hAnsi="Arial" w:cs="Arial"/>
+        <w:b w:val="0"/>
+        <w:i w:val="0"/>
+        <w:strike w:val="0"/>
+        <w:dstrike w:val="0"/>
+        <w:color w:val="000000"/>
+        <w:sz w:val="22"/>
+        <w:szCs w:val="22"/>
+        <w:u w:val="none" w:color="000000"/>
+        <w:bdr w:val="none" w:sz="0" w:space="0" w:color="auto"/>
+        <w:shd w:val="clear" w:color="auto" w:fill="auto"/>
+        <w:vertAlign w:val="baseline"/>
+      </w:rPr>
+    </w:lvl>
+    <w:lvl w:ilvl="2" w:tplc="CC0EDD30">
+      <w:start w:val="1"/>
+      <w:numFmt w:val="lowerRoman"/>
+      <w:lvlText w:val="%3"/>
+      <w:lvlJc w:val="left"/>
+      <w:pPr>
+        <w:ind w:left="2084"/>
+      </w:pPr>
+      <w:rPr>
+        <w:rFonts w:ascii="Arial" w:eastAsia="Arial" w:hAnsi="Arial" w:cs="Arial"/>
+        <w:b w:val="0"/>
+        <w:i w:val="0"/>
+        <w:strike w:val="0"/>
+        <w:dstrike w:val="0"/>
+        <w:color w:val="000000"/>
+        <w:sz w:val="22"/>
+        <w:szCs w:val="22"/>
+        <w:u w:val="none" w:color="000000"/>
+        <w:bdr w:val="none" w:sz="0" w:space="0" w:color="auto"/>
+        <w:shd w:val="clear" w:color="auto" w:fill="auto"/>
+        <w:vertAlign w:val="baseline"/>
+      </w:rPr>
+    </w:lvl>
+    <w:lvl w:ilvl="3" w:tplc="3ED4C918">
+      <w:start w:val="1"/>
+      <w:numFmt w:val="decimal"/>
+      <w:lvlText w:val="%4"/>
+      <w:lvlJc w:val="left"/>
+      <w:pPr>
+        <w:ind w:left="2804"/>
+      </w:pPr>
+      <w:rPr>
+        <w:rFonts w:ascii="Arial" w:eastAsia="Arial" w:hAnsi="Arial" w:cs="Arial"/>
+        <w:b w:val="0"/>
+        <w:i w:val="0"/>
+        <w:strike w:val="0"/>
+        <w:dstrike w:val="0"/>
+        <w:color w:val="000000"/>
+        <w:sz w:val="22"/>
+        <w:szCs w:val="22"/>
+        <w:u w:val="none" w:color="000000"/>
+        <w:bdr w:val="none" w:sz="0" w:space="0" w:color="auto"/>
+        <w:shd w:val="clear" w:color="auto" w:fill="auto"/>
+        <w:vertAlign w:val="baseline"/>
+      </w:rPr>
+    </w:lvl>
+    <w:lvl w:ilvl="4" w:tplc="38C67356">
+      <w:start w:val="1"/>
+      <w:numFmt w:val="lowerLetter"/>
+      <w:lvlText w:val="%5"/>
+      <w:lvlJc w:val="left"/>
+      <w:pPr>
+        <w:ind w:left="3524"/>
+      </w:pPr>
+      <w:rPr>
+        <w:rFonts w:ascii="Arial" w:eastAsia="Arial" w:hAnsi="Arial" w:cs="Arial"/>
+        <w:b w:val="0"/>
+        <w:i w:val="0"/>
+        <w:strike w:val="0"/>
+        <w:dstrike w:val="0"/>
+        <w:color w:val="000000"/>
+        <w:sz w:val="22"/>
+        <w:szCs w:val="22"/>
+        <w:u w:val="none" w:color="000000"/>
+        <w:bdr w:val="none" w:sz="0" w:space="0" w:color="auto"/>
+        <w:shd w:val="clear" w:color="auto" w:fill="auto"/>
+        <w:vertAlign w:val="baseline"/>
+      </w:rPr>
+    </w:lvl>
+    <w:lvl w:ilvl="5" w:tplc="113C679A">
+      <w:start w:val="1"/>
+      <w:numFmt w:val="lowerRoman"/>
+      <w:lvlText w:val="%6"/>
+      <w:lvlJc w:val="left"/>
+      <w:pPr>
+        <w:ind w:left="4244"/>
+      </w:pPr>
+      <w:rPr>
+        <w:rFonts w:ascii="Arial" w:eastAsia="Arial" w:hAnsi="Arial" w:cs="Arial"/>
+        <w:b w:val="0"/>
+        <w:i w:val="0"/>
+        <w:strike w:val="0"/>
+        <w:dstrike w:val="0"/>
+        <w:color w:val="000000"/>
+        <w:sz w:val="22"/>
+        <w:szCs w:val="22"/>
+        <w:u w:val="none" w:color="000000"/>
+        <w:bdr w:val="none" w:sz="0" w:space="0" w:color="auto"/>
+        <w:shd w:val="clear" w:color="auto" w:fill="auto"/>
+        <w:vertAlign w:val="baseline"/>
+      </w:rPr>
+    </w:lvl>
+    <w:lvl w:ilvl="6" w:tplc="DFE02A04">
+      <w:start w:val="1"/>
+      <w:numFmt w:val="decimal"/>
+      <w:lvlText w:val="%7"/>
+      <w:lvlJc w:val="left"/>
+      <w:pPr>
+        <w:ind w:left="4964"/>
+      </w:pPr>
+      <w:rPr>
+        <w:rFonts w:ascii="Arial" w:eastAsia="Arial" w:hAnsi="Arial" w:cs="Arial"/>
+        <w:b w:val="0"/>
+        <w:i w:val="0"/>
+        <w:strike w:val="0"/>
+        <w:dstrike w:val="0"/>
+        <w:color w:val="000000"/>
+        <w:sz w:val="22"/>
+        <w:szCs w:val="22"/>
+        <w:u w:val="none" w:color="000000"/>
+        <w:bdr w:val="none" w:sz="0" w:space="0" w:color="auto"/>
+        <w:shd w:val="clear" w:color="auto" w:fill="auto"/>
+        <w:vertAlign w:val="baseline"/>
+      </w:rPr>
+    </w:lvl>
+    <w:lvl w:ilvl="7" w:tplc="45E6E428">
+      <w:start w:val="1"/>
+      <w:numFmt w:val="lowerLetter"/>
+      <w:lvlText w:val="%8"/>
+      <w:lvlJc w:val="left"/>
+      <w:pPr>
+        <w:ind w:left="5684"/>
+      </w:pPr>
+      <w:rPr>
+        <w:rFonts w:ascii="Arial" w:eastAsia="Arial" w:hAnsi="Arial" w:cs="Arial"/>
+        <w:b w:val="0"/>
+        <w:i w:val="0"/>
+        <w:strike w:val="0"/>
+        <w:dstrike w:val="0"/>
+        <w:color w:val="000000"/>
+        <w:sz w:val="22"/>
+        <w:szCs w:val="22"/>
+        <w:u w:val="none" w:color="000000"/>
+        <w:bdr w:val="none" w:sz="0" w:space="0" w:color="auto"/>
+        <w:shd w:val="clear" w:color="auto" w:fill="auto"/>
+        <w:vertAlign w:val="baseline"/>
+      </w:rPr>
+    </w:lvl>
+    <w:lvl w:ilvl="8" w:tplc="703E7418">
+      <w:start w:val="1"/>
+      <w:numFmt w:val="lowerRoman"/>
+      <w:lvlText w:val="%9"/>
+      <w:lvlJc w:val="left"/>
+      <w:pPr>
+        <w:ind w:left="6404"/>
+      </w:pPr>
+      <w:rPr>
+        <w:rFonts w:ascii="Arial" w:eastAsia="Arial" w:hAnsi="Arial" w:cs="Arial"/>
+        <w:b w:val="0"/>
+        <w:i w:val="0"/>
+        <w:strike w:val="0"/>
+        <w:dstrike w:val="0"/>
+        <w:color w:val="000000"/>
+        <w:sz w:val="22"/>
+        <w:szCs w:val="22"/>
+        <w:u w:val="none" w:color="000000"/>
+        <w:bdr w:val="none" w:sz="0" w:space="0" w:color="auto"/>
+        <w:shd w:val="clear" w:color="auto" w:fill="auto"/>
+        <w:vertAlign w:val="baseline"/>
+      </w:rPr>
+    </w:lvl>
+  </w:abstractNum>
+  <w:abstractNum w:abstractNumId="4" w15:restartNumberingAfterBreak="0">
+    <w:nsid w:val="681C4A0B"/>
+    <w:multiLevelType w:val="hybridMultilevel"/>
+    <w:tmpl w:val="807EDC2E"/>
+    <w:lvl w:ilvl="0" w:tplc="71289584">
+      <w:start w:val="1"/>
+      <w:numFmt w:val="bullet"/>
+      <w:lvlText w:val="•"/>
+      <w:lvlJc w:val="left"/>
+      <w:pPr>
+        <w:ind w:left="1559"/>
+      </w:pPr>
+      <w:rPr>
+        <w:rFonts w:ascii="Arial" w:eastAsia="Arial" w:hAnsi="Arial" w:cs="Arial"/>
+        <w:b w:val="0"/>
+        <w:i w:val="0"/>
+        <w:strike w:val="0"/>
+        <w:dstrike w:val="0"/>
+        <w:color w:val="00006F"/>
+        <w:sz w:val="22"/>
+        <w:szCs w:val="22"/>
+        <w:u w:val="none" w:color="000000"/>
+        <w:bdr w:val="none" w:sz="0" w:space="0" w:color="auto"/>
+        <w:shd w:val="clear" w:color="auto" w:fill="auto"/>
+        <w:vertAlign w:val="baseline"/>
+      </w:rPr>
+    </w:lvl>
+    <w:lvl w:ilvl="1" w:tplc="86D070DC">
+      <w:start w:val="1"/>
+      <w:numFmt w:val="bullet"/>
+      <w:lvlText w:val="o"/>
+      <w:lvlJc w:val="left"/>
+      <w:pPr>
+        <w:ind w:left="1932"/>
+      </w:pPr>
+      <w:rPr>
+        <w:rFonts w:ascii="Segoe UI Symbol" w:eastAsia="Segoe UI Symbol" w:hAnsi="Segoe UI Symbol" w:cs="Segoe UI Symbol"/>
+        <w:b w:val="0"/>
+        <w:i w:val="0"/>
+        <w:strike w:val="0"/>
+        <w:dstrike w:val="0"/>
+        <w:color w:val="00006F"/>
+        <w:sz w:val="22"/>
+        <w:szCs w:val="22"/>
+        <w:u w:val="none" w:color="000000"/>
+        <w:bdr w:val="none" w:sz="0" w:space="0" w:color="auto"/>
+        <w:shd w:val="clear" w:color="auto" w:fill="auto"/>
+        <w:vertAlign w:val="baseline"/>
+      </w:rPr>
+    </w:lvl>
+    <w:lvl w:ilvl="2" w:tplc="32FE8ABC">
+      <w:start w:val="1"/>
+      <w:numFmt w:val="bullet"/>
+      <w:lvlText w:val="▪"/>
+      <w:lvlJc w:val="left"/>
+      <w:pPr>
+        <w:ind w:left="2652"/>
+      </w:pPr>
+      <w:rPr>
+        <w:rFonts w:ascii="Segoe UI Symbol" w:eastAsia="Segoe UI Symbol" w:hAnsi="Segoe UI Symbol" w:cs="Segoe UI Symbol"/>
+        <w:b w:val="0"/>
+        <w:i w:val="0"/>
+        <w:strike w:val="0"/>
+        <w:dstrike w:val="0"/>
+        <w:color w:val="00006F"/>
+        <w:sz w:val="22"/>
+        <w:szCs w:val="22"/>
+        <w:u w:val="none" w:color="000000"/>
+        <w:bdr w:val="none" w:sz="0" w:space="0" w:color="auto"/>
+        <w:shd w:val="clear" w:color="auto" w:fill="auto"/>
+        <w:vertAlign w:val="baseline"/>
+      </w:rPr>
+    </w:lvl>
+    <w:lvl w:ilvl="3" w:tplc="F5263ADC">
+      <w:start w:val="1"/>
+      <w:numFmt w:val="bullet"/>
+      <w:lvlText w:val="•"/>
+      <w:lvlJc w:val="left"/>
+      <w:pPr>
+        <w:ind w:left="3372"/>
+      </w:pPr>
+      <w:rPr>
+        <w:rFonts w:ascii="Arial" w:eastAsia="Arial" w:hAnsi="Arial" w:cs="Arial"/>
+        <w:b w:val="0"/>
+        <w:i w:val="0"/>
+        <w:strike w:val="0"/>
+        <w:dstrike w:val="0"/>
+        <w:color w:val="00006F"/>
+        <w:sz w:val="22"/>
+        <w:szCs w:val="22"/>
+        <w:u w:val="none" w:color="000000"/>
+        <w:bdr w:val="none" w:sz="0" w:space="0" w:color="auto"/>
+        <w:shd w:val="clear" w:color="auto" w:fill="auto"/>
+        <w:vertAlign w:val="baseline"/>
+      </w:rPr>
+    </w:lvl>
+    <w:lvl w:ilvl="4" w:tplc="59544FE0">
+      <w:start w:val="1"/>
+      <w:numFmt w:val="bullet"/>
+      <w:lvlText w:val="o"/>
+      <w:lvlJc w:val="left"/>
+      <w:pPr>
+        <w:ind w:left="4092"/>
+      </w:pPr>
+      <w:rPr>
+        <w:rFonts w:ascii="Segoe UI Symbol" w:eastAsia="Segoe UI Symbol" w:hAnsi="Segoe UI Symbol" w:cs="Segoe UI Symbol"/>
+        <w:b w:val="0"/>
+        <w:i w:val="0"/>
+        <w:strike w:val="0"/>
+        <w:dstrike w:val="0"/>
+        <w:color w:val="00006F"/>
+        <w:sz w:val="22"/>
+        <w:szCs w:val="22"/>
+        <w:u w:val="none" w:color="000000"/>
+        <w:bdr w:val="none" w:sz="0" w:space="0" w:color="auto"/>
+        <w:shd w:val="clear" w:color="auto" w:fill="auto"/>
+        <w:vertAlign w:val="baseline"/>
+      </w:rPr>
+    </w:lvl>
+    <w:lvl w:ilvl="5" w:tplc="B9A44774">
+      <w:start w:val="1"/>
+      <w:numFmt w:val="bullet"/>
+      <w:lvlText w:val="▪"/>
+      <w:lvlJc w:val="left"/>
+      <w:pPr>
+        <w:ind w:left="4812"/>
+      </w:pPr>
+      <w:rPr>
+        <w:rFonts w:ascii="Segoe UI Symbol" w:eastAsia="Segoe UI Symbol" w:hAnsi="Segoe UI Symbol" w:cs="Segoe UI Symbol"/>
+        <w:b w:val="0"/>
+        <w:i w:val="0"/>
+        <w:strike w:val="0"/>
+        <w:dstrike w:val="0"/>
+        <w:color w:val="00006F"/>
+        <w:sz w:val="22"/>
+        <w:szCs w:val="22"/>
+        <w:u w:val="none" w:color="000000"/>
+        <w:bdr w:val="none" w:sz="0" w:space="0" w:color="auto"/>
+        <w:shd w:val="clear" w:color="auto" w:fill="auto"/>
+        <w:vertAlign w:val="baseline"/>
+      </w:rPr>
+    </w:lvl>
+    <w:lvl w:ilvl="6" w:tplc="A0E4B6FC">
+      <w:start w:val="1"/>
+      <w:numFmt w:val="bullet"/>
+      <w:lvlText w:val="•"/>
+      <w:lvlJc w:val="left"/>
+      <w:pPr>
+        <w:ind w:left="5532"/>
+      </w:pPr>
+      <w:rPr>
+        <w:rFonts w:ascii="Arial" w:eastAsia="Arial" w:hAnsi="Arial" w:cs="Arial"/>
+        <w:b w:val="0"/>
+        <w:i w:val="0"/>
+        <w:strike w:val="0"/>
+        <w:dstrike w:val="0"/>
+        <w:color w:val="00006F"/>
+        <w:sz w:val="22"/>
+        <w:szCs w:val="22"/>
+        <w:u w:val="none" w:color="000000"/>
+        <w:bdr w:val="none" w:sz="0" w:space="0" w:color="auto"/>
+        <w:shd w:val="clear" w:color="auto" w:fill="auto"/>
+        <w:vertAlign w:val="baseline"/>
+      </w:rPr>
+    </w:lvl>
+    <w:lvl w:ilvl="7" w:tplc="566269E4">
+      <w:start w:val="1"/>
+      <w:numFmt w:val="bullet"/>
+      <w:lvlText w:val="o"/>
+      <w:lvlJc w:val="left"/>
+      <w:pPr>
+        <w:ind w:left="6252"/>
+      </w:pPr>
+      <w:rPr>
+        <w:rFonts w:ascii="Segoe UI Symbol" w:eastAsia="Segoe UI Symbol" w:hAnsi="Segoe UI Symbol" w:cs="Segoe UI Symbol"/>
+        <w:b w:val="0"/>
+        <w:i w:val="0"/>
+        <w:strike w:val="0"/>
+        <w:dstrike w:val="0"/>
+        <w:color w:val="00006F"/>
+        <w:sz w:val="22"/>
+        <w:szCs w:val="22"/>
+        <w:u w:val="none" w:color="000000"/>
+        <w:bdr w:val="none" w:sz="0" w:space="0" w:color="auto"/>
+        <w:shd w:val="clear" w:color="auto" w:fill="auto"/>
+        <w:vertAlign w:val="baseline"/>
+      </w:rPr>
+    </w:lvl>
+    <w:lvl w:ilvl="8" w:tplc="E9005B00">
+      <w:start w:val="1"/>
+      <w:numFmt w:val="bullet"/>
+      <w:lvlText w:val="▪"/>
+      <w:lvlJc w:val="left"/>
+      <w:pPr>
+        <w:ind w:left="6972"/>
+      </w:pPr>
+      <w:rPr>
+        <w:rFonts w:ascii="Segoe UI Symbol" w:eastAsia="Segoe UI Symbol" w:hAnsi="Segoe UI Symbol" w:cs="Segoe UI Symbol"/>
+        <w:b w:val="0"/>
+        <w:i w:val="0"/>
+        <w:strike w:val="0"/>
+        <w:dstrike w:val="0"/>
+        <w:color w:val="00006F"/>
+        <w:sz w:val="22"/>
+        <w:szCs w:val="22"/>
+        <w:u w:val="none" w:color="000000"/>
+        <w:bdr w:val="none" w:sz="0" w:space="0" w:color="auto"/>
+        <w:shd w:val="clear" w:color="auto" w:fill="auto"/>
+        <w:vertAlign w:val="baseline"/>
+      </w:rPr>
+    </w:lvl>
+  </w:abstractNum>
+  <w:num w:numId="1" w16cid:durableId="1680350313">
+    <w:abstractNumId w:val="3"/>
+  </w:num>
+  <w:num w:numId="2" w16cid:durableId="1268611101">
+    <w:abstractNumId w:val="1"/>
+  </w:num>
+  <w:num w:numId="3" w16cid:durableId="1173646095">
+    <w:abstractNumId w:val="2"/>
+  </w:num>
+  <w:num w:numId="4" w16cid:durableId="103231826">
+    <w:abstractNumId w:val="0"/>
+  </w:num>
+  <w:num w:numId="5" w16cid:durableId="1745881564">
+    <w:abstractNumId w:val="4"/>
+  </w:num>
+</w:numbering>
 </file>
 
 <file path=word/styles.xml><?xml version="1.0" encoding="utf-8"?>
@@ -13005,6 +17272,25 @@
       <w14:ligatures w14:val="none"/>
     </w:rPr>
   </w:style>
+  <w:style w:type="table" w:customStyle="1" w:styleId="TableGrid0">
+    <w:name w:val="TableGrid"/>
+    <w:rsid w:val="00450039"/>
+    <w:pPr>
+      <w:spacing w:after="0" w:line="240" w:lineRule="auto"/>
+    </w:pPr>
+    <w:rPr>
+      <w:rFonts w:eastAsiaTheme="minorEastAsia"/>
+      <w:lang w:eastAsia="en-NZ"/>
+    </w:rPr>
+    <w:tblPr>
+      <w:tblCellMar>
+        <w:top w:w="0" w:type="dxa"/>
+        <w:left w:w="0" w:type="dxa"/>
+        <w:bottom w:w="0" w:type="dxa"/>
+        <w:right w:w="0" w:type="dxa"/>
+      </w:tblCellMar>
+    </w:tblPr>
+  </w:style>
 </w:styles>
 </file>
 

</xml_diff>

<commit_message>
added Gantt to Proposal
</commit_message>
<xml_diff>
--- a/Capstone Proposal.docx
+++ b/Capstone Proposal.docx
@@ -14,6 +14,7 @@
           <w:docPartUnique/>
         </w:docPartObj>
       </w:sdtPr>
+      <w:sdtEndPr/>
       <w:sdtContent>
         <w:p>
           <w:pPr>
@@ -3551,6 +3552,7 @@
                                     <w:dataBinding w:prefixMappings="xmlns:ns0='http://schemas.openxmlformats.org/officeDocument/2006/extended-properties' " w:xpath="/ns0:Properties[1]/ns0:Company[1]" w:storeItemID="{6668398D-A668-4E3E-A5EB-62B293D839F1}"/>
                                     <w:text/>
                                   </w:sdtPr>
+                                  <w:sdtEndPr/>
                                   <w:sdtContent>
                                     <w:r>
                                       <w:rPr>
@@ -3617,6 +3619,7 @@
                               <w:dataBinding w:prefixMappings="xmlns:ns0='http://schemas.openxmlformats.org/officeDocument/2006/extended-properties' " w:xpath="/ns0:Properties[1]/ns0:Company[1]" w:storeItemID="{6668398D-A668-4E3E-A5EB-62B293D839F1}"/>
                               <w:text/>
                             </w:sdtPr>
+                            <w:sdtEndPr/>
                             <w:sdtContent>
                               <w:r>
                                 <w:rPr>
@@ -3720,6 +3723,7 @@
                                     <w:dataBinding w:prefixMappings="xmlns:ns0='http://purl.org/dc/elements/1.1/' xmlns:ns1='http://schemas.openxmlformats.org/package/2006/metadata/core-properties' " w:xpath="/ns1:coreProperties[1]/ns0:title[1]" w:storeItemID="{6C3C8BC8-F283-45AE-878A-BAB7291924A1}"/>
                                     <w:text/>
                                   </w:sdtPr>
+                                  <w:sdtEndPr/>
                                   <w:sdtContent>
                                     <w:r>
                                       <w:rPr>
@@ -3755,6 +3759,7 @@
                                     <w:dataBinding w:prefixMappings="xmlns:ns0='http://purl.org/dc/elements/1.1/' xmlns:ns1='http://schemas.openxmlformats.org/package/2006/metadata/core-properties' " w:xpath="/ns1:coreProperties[1]/ns0:subject[1]" w:storeItemID="{6C3C8BC8-F283-45AE-878A-BAB7291924A1}"/>
                                     <w:text/>
                                   </w:sdtPr>
+                                  <w:sdtEndPr/>
                                   <w:sdtContent>
                                     <w:r>
                                       <w:rPr>
@@ -3830,7 +3835,6 @@
                                     <w:szCs w:val="36"/>
                                   </w:rPr>
                                 </w:pPr>
-                                <w:proofErr w:type="spellStart"/>
                                 <w:r>
                                   <w:rPr>
                                     <w:color w:val="404040" w:themeColor="text1" w:themeTint="BF"/>
@@ -3839,7 +3843,6 @@
                                   </w:rPr>
                                   <w:t>WelTec</w:t>
                                 </w:r>
-                                <w:proofErr w:type="spellEnd"/>
                                 <w:r>
                                   <w:rPr>
                                     <w:color w:val="404040" w:themeColor="text1" w:themeTint="BF"/>
@@ -3950,6 +3953,7 @@
                               <w:dataBinding w:prefixMappings="xmlns:ns0='http://purl.org/dc/elements/1.1/' xmlns:ns1='http://schemas.openxmlformats.org/package/2006/metadata/core-properties' " w:xpath="/ns1:coreProperties[1]/ns0:title[1]" w:storeItemID="{6C3C8BC8-F283-45AE-878A-BAB7291924A1}"/>
                               <w:text/>
                             </w:sdtPr>
+                            <w:sdtEndPr/>
                             <w:sdtContent>
                               <w:r>
                                 <w:rPr>
@@ -3985,6 +3989,7 @@
                               <w:dataBinding w:prefixMappings="xmlns:ns0='http://purl.org/dc/elements/1.1/' xmlns:ns1='http://schemas.openxmlformats.org/package/2006/metadata/core-properties' " w:xpath="/ns1:coreProperties[1]/ns0:subject[1]" w:storeItemID="{6C3C8BC8-F283-45AE-878A-BAB7291924A1}"/>
                               <w:text/>
                             </w:sdtPr>
+                            <w:sdtEndPr/>
                             <w:sdtContent>
                               <w:r>
                                 <w:rPr>
@@ -4060,7 +4065,6 @@
                               <w:szCs w:val="36"/>
                             </w:rPr>
                           </w:pPr>
-                          <w:proofErr w:type="spellStart"/>
                           <w:r>
                             <w:rPr>
                               <w:color w:val="404040" w:themeColor="text1" w:themeTint="BF"/>
@@ -4069,7 +4073,6 @@
                             </w:rPr>
                             <w:t>WelTec</w:t>
                           </w:r>
-                          <w:proofErr w:type="spellEnd"/>
                           <w:r>
                             <w:rPr>
                               <w:color w:val="404040" w:themeColor="text1" w:themeTint="BF"/>
@@ -6332,8 +6335,8 @@
           <w:highlight w:val="cyan"/>
         </w:rPr>
       </w:pPr>
-      <w:bookmarkStart w:id="10" w:name="_Toc236403144"/>
-      <w:bookmarkStart w:id="11" w:name="_Toc236665775"/>
+      <w:bookmarkStart w:id="10" w:name="_Toc236665775"/>
+      <w:bookmarkStart w:id="11" w:name="_Toc236403144"/>
       <w:r>
         <w:rPr>
           <w:highlight w:val="cyan"/>
@@ -6341,7 +6344,7 @@
         <w:lastRenderedPageBreak/>
         <w:t>Project Personnel</w:t>
       </w:r>
-      <w:bookmarkEnd w:id="11"/>
+      <w:bookmarkEnd w:id="10"/>
     </w:p>
     <w:p>
       <w:pPr>
@@ -6363,39 +6366,37 @@
       <w:pPr>
         <w:pStyle w:val="TNR"/>
         <w:rPr>
+          <w:rFonts w:ascii="Arial" w:hAnsi="Arial" w:cs="Arial"/>
+          <w:sz w:val="24"/>
+          <w:szCs w:val="24"/>
           <w:highlight w:val="cyan"/>
         </w:rPr>
       </w:pPr>
       <w:r>
         <w:rPr>
+          <w:rFonts w:ascii="Arial" w:hAnsi="Arial" w:cs="Arial"/>
+          <w:sz w:val="24"/>
+          <w:szCs w:val="24"/>
           <w:highlight w:val="cyan"/>
         </w:rPr>
-        <w:t xml:space="preserve">Geoff Gordon is a staff member of </w:t>
-      </w:r>
-      <w:proofErr w:type="spellStart"/>
-      <w:r>
+        <w:t>Geoff Gordon is a staff member of WelTec, he provides technical networking expertise in the context of the tertiary environment. He has familiarity, curiosity and deep interest in AI models and their behaviour, as well as their associated hardware/platforms. He is interested in whether AI is has a place in the field of digital forensics.</w:t>
+      </w:r>
+    </w:p>
+    <w:p>
+      <w:pPr>
+        <w:pStyle w:val="TNR"/>
         <w:rPr>
+          <w:rFonts w:ascii="Arial" w:hAnsi="Arial" w:cs="Arial"/>
+          <w:sz w:val="24"/>
+          <w:szCs w:val="24"/>
           <w:highlight w:val="cyan"/>
         </w:rPr>
-        <w:t>WelTec</w:t>
-      </w:r>
-      <w:proofErr w:type="spellEnd"/>
+      </w:pPr>
       <w:r>
         <w:rPr>
-          <w:highlight w:val="cyan"/>
-        </w:rPr>
-        <w:t>, he provides technical networking expertise in the context of the tertiary environment. He has familiarity, curiosity and deep interest in AI models and their behaviour, as well as their associated hardware/platforms. He is interested in whether AI is has a place in the field of digital forensics.</w:t>
-      </w:r>
-    </w:p>
-    <w:p>
-      <w:pPr>
-        <w:pStyle w:val="TNR"/>
-        <w:rPr>
-          <w:highlight w:val="cyan"/>
-        </w:rPr>
-      </w:pPr>
-      <w:r>
-        <w:rPr>
+          <w:rFonts w:ascii="Arial" w:hAnsi="Arial" w:cs="Arial"/>
+          <w:sz w:val="24"/>
+          <w:szCs w:val="24"/>
           <w:highlight w:val="cyan"/>
         </w:rPr>
         <w:t xml:space="preserve">Geoff has been the client on multiple previous capstone IT projects with a focus on AI. One example is an AI chatbot for IT support at the school. </w:t>
@@ -6424,9 +6425,9 @@
         <w:tblLook w:val="04A0" w:firstRow="1" w:lastRow="0" w:firstColumn="1" w:lastColumn="0" w:noHBand="0" w:noVBand="1"/>
       </w:tblPr>
       <w:tblGrid>
-        <w:gridCol w:w="1980"/>
-        <w:gridCol w:w="1276"/>
-        <w:gridCol w:w="7200"/>
+        <w:gridCol w:w="1976"/>
+        <w:gridCol w:w="1310"/>
+        <w:gridCol w:w="7170"/>
       </w:tblGrid>
       <w:tr>
         <w:tc>
@@ -6496,11 +6497,17 @@
             <w:pPr>
               <w:pStyle w:val="TNR"/>
               <w:rPr>
+                <w:rFonts w:ascii="Arial" w:hAnsi="Arial" w:cs="Arial"/>
+                <w:sz w:val="24"/>
+                <w:szCs w:val="24"/>
                 <w:highlight w:val="cyan"/>
               </w:rPr>
             </w:pPr>
             <w:r>
               <w:rPr>
+                <w:rFonts w:ascii="Arial" w:hAnsi="Arial" w:cs="Arial"/>
+                <w:sz w:val="24"/>
+                <w:szCs w:val="24"/>
                 <w:highlight w:val="cyan"/>
               </w:rPr>
               <w:t>Matt Baker</w:t>
@@ -6515,11 +6522,17 @@
             <w:pPr>
               <w:pStyle w:val="TNR"/>
               <w:rPr>
+                <w:rFonts w:ascii="Arial" w:hAnsi="Arial" w:cs="Arial"/>
+                <w:sz w:val="24"/>
+                <w:szCs w:val="24"/>
                 <w:highlight w:val="cyan"/>
               </w:rPr>
             </w:pPr>
             <w:r>
               <w:rPr>
+                <w:rFonts w:ascii="Arial" w:hAnsi="Arial" w:cs="Arial"/>
+                <w:sz w:val="24"/>
+                <w:szCs w:val="24"/>
                 <w:highlight w:val="cyan"/>
               </w:rPr>
               <w:t>Developer</w:t>
@@ -6534,11 +6547,17 @@
             <w:pPr>
               <w:pStyle w:val="TNR"/>
               <w:rPr>
+                <w:rFonts w:ascii="Arial" w:hAnsi="Arial" w:cs="Arial"/>
+                <w:sz w:val="24"/>
+                <w:szCs w:val="24"/>
                 <w:highlight w:val="cyan"/>
               </w:rPr>
             </w:pPr>
             <w:r>
               <w:rPr>
+                <w:rFonts w:ascii="Arial" w:hAnsi="Arial" w:cs="Arial"/>
+                <w:sz w:val="24"/>
+                <w:szCs w:val="24"/>
                 <w:highlight w:val="cyan"/>
               </w:rPr>
               <w:t xml:space="preserve">Installation, configuration, research, troubleshooting, and implementation of software/tools/operating systems required to support our investigation. Integration of AI into our forensics tools. Designing testing environments and performing forensic activities with legacy and AI based forensics tools, recording the results under a reliable doctrine. </w:t>
@@ -6555,11 +6574,17 @@
             <w:pPr>
               <w:pStyle w:val="TNR"/>
               <w:rPr>
+                <w:rFonts w:ascii="Arial" w:hAnsi="Arial" w:cs="Arial"/>
+                <w:sz w:val="24"/>
+                <w:szCs w:val="24"/>
                 <w:highlight w:val="cyan"/>
               </w:rPr>
             </w:pPr>
             <w:r>
               <w:rPr>
+                <w:rFonts w:ascii="Arial" w:hAnsi="Arial" w:cs="Arial"/>
+                <w:sz w:val="24"/>
+                <w:szCs w:val="24"/>
                 <w:highlight w:val="cyan"/>
               </w:rPr>
               <w:t>Sam Davies</w:t>
@@ -6574,11 +6599,17 @@
             <w:pPr>
               <w:pStyle w:val="TNR"/>
               <w:rPr>
+                <w:rFonts w:ascii="Arial" w:hAnsi="Arial" w:cs="Arial"/>
+                <w:sz w:val="24"/>
+                <w:szCs w:val="24"/>
                 <w:highlight w:val="cyan"/>
               </w:rPr>
             </w:pPr>
             <w:r>
               <w:rPr>
+                <w:rFonts w:ascii="Arial" w:hAnsi="Arial" w:cs="Arial"/>
+                <w:sz w:val="24"/>
+                <w:szCs w:val="24"/>
                 <w:highlight w:val="cyan"/>
               </w:rPr>
               <w:t>Developer</w:t>
@@ -6593,11 +6624,17 @@
             <w:pPr>
               <w:pStyle w:val="TNR"/>
               <w:rPr>
+                <w:rFonts w:ascii="Arial" w:hAnsi="Arial" w:cs="Arial"/>
+                <w:sz w:val="24"/>
+                <w:szCs w:val="24"/>
                 <w:highlight w:val="cyan"/>
               </w:rPr>
             </w:pPr>
             <w:r>
               <w:rPr>
+                <w:rFonts w:ascii="Arial" w:hAnsi="Arial" w:cs="Arial"/>
+                <w:sz w:val="24"/>
+                <w:szCs w:val="24"/>
                 <w:highlight w:val="cyan"/>
               </w:rPr>
               <w:t>Maintain availability of the physical PC used to power the AI models. Ensures that processing power is consistent before testing via benchmark. Employing forensics tools during tests and communicating lessons from previous similar projects.</w:t>
@@ -6614,11 +6651,17 @@
             <w:pPr>
               <w:pStyle w:val="TNR"/>
               <w:rPr>
+                <w:rFonts w:ascii="Arial" w:hAnsi="Arial" w:cs="Arial"/>
+                <w:sz w:val="24"/>
+                <w:szCs w:val="24"/>
                 <w:highlight w:val="cyan"/>
               </w:rPr>
             </w:pPr>
             <w:r>
               <w:rPr>
+                <w:rFonts w:ascii="Arial" w:hAnsi="Arial" w:cs="Arial"/>
+                <w:sz w:val="24"/>
+                <w:szCs w:val="24"/>
                 <w:highlight w:val="cyan"/>
               </w:rPr>
               <w:t>Olivia Hey</w:t>
@@ -6633,11 +6676,17 @@
             <w:pPr>
               <w:pStyle w:val="TNR"/>
               <w:rPr>
+                <w:rFonts w:ascii="Arial" w:hAnsi="Arial" w:cs="Arial"/>
+                <w:sz w:val="24"/>
+                <w:szCs w:val="24"/>
                 <w:highlight w:val="cyan"/>
               </w:rPr>
             </w:pPr>
             <w:r>
               <w:rPr>
+                <w:rFonts w:ascii="Arial" w:hAnsi="Arial" w:cs="Arial"/>
+                <w:sz w:val="24"/>
+                <w:szCs w:val="24"/>
                 <w:highlight w:val="cyan"/>
               </w:rPr>
               <w:t>Developer</w:t>
@@ -6652,11 +6701,17 @@
             <w:pPr>
               <w:pStyle w:val="TNR"/>
               <w:rPr>
+                <w:rFonts w:ascii="Arial" w:hAnsi="Arial" w:cs="Arial"/>
+                <w:sz w:val="24"/>
+                <w:szCs w:val="24"/>
                 <w:highlight w:val="cyan"/>
               </w:rPr>
             </w:pPr>
             <w:r>
               <w:rPr>
+                <w:rFonts w:ascii="Arial" w:hAnsi="Arial" w:cs="Arial"/>
+                <w:sz w:val="24"/>
+                <w:szCs w:val="24"/>
                 <w:highlight w:val="cyan"/>
               </w:rPr>
               <w:t>Documentation, organization of evidence, forensic disk images and datasets, research material as well as partaking in the testing itself. Keeping track of testing documentation, organizing results for testing under diverse criteria.</w:t>
@@ -6673,11 +6728,17 @@
             <w:pPr>
               <w:pStyle w:val="TNR"/>
               <w:rPr>
+                <w:rFonts w:ascii="Arial" w:hAnsi="Arial" w:cs="Arial"/>
+                <w:sz w:val="24"/>
+                <w:szCs w:val="24"/>
                 <w:highlight w:val="cyan"/>
               </w:rPr>
             </w:pPr>
             <w:r>
               <w:rPr>
+                <w:rFonts w:ascii="Arial" w:hAnsi="Arial" w:cs="Arial"/>
+                <w:sz w:val="24"/>
+                <w:szCs w:val="24"/>
                 <w:highlight w:val="cyan"/>
               </w:rPr>
               <w:t>Dave Sushames</w:t>
@@ -6692,11 +6753,17 @@
             <w:pPr>
               <w:pStyle w:val="TNR"/>
               <w:rPr>
+                <w:rFonts w:ascii="Arial" w:hAnsi="Arial" w:cs="Arial"/>
+                <w:sz w:val="24"/>
+                <w:szCs w:val="24"/>
                 <w:highlight w:val="cyan"/>
               </w:rPr>
             </w:pPr>
             <w:r>
               <w:rPr>
+                <w:rFonts w:ascii="Arial" w:hAnsi="Arial" w:cs="Arial"/>
+                <w:sz w:val="24"/>
+                <w:szCs w:val="24"/>
                 <w:highlight w:val="cyan"/>
               </w:rPr>
               <w:t>Project Manager</w:t>
@@ -6711,11 +6778,17 @@
             <w:pPr>
               <w:pStyle w:val="TNR"/>
               <w:rPr>
+                <w:rFonts w:ascii="Arial" w:hAnsi="Arial" w:cs="Arial"/>
+                <w:sz w:val="24"/>
+                <w:szCs w:val="24"/>
                 <w:highlight w:val="cyan"/>
               </w:rPr>
             </w:pPr>
             <w:r>
               <w:rPr>
+                <w:rFonts w:ascii="Arial" w:hAnsi="Arial" w:cs="Arial"/>
+                <w:sz w:val="24"/>
+                <w:szCs w:val="24"/>
                 <w:highlight w:val="cyan"/>
               </w:rPr>
               <w:t>Organises meetings with the client/advisor, consolidates individual log hours into the group hours log, manages the git repository, contributes to collaborative documents and conducts research. Ensures we are following the chosen methodology.</w:t>
@@ -6752,11 +6825,17 @@
       <w:pPr>
         <w:pStyle w:val="TNR"/>
         <w:rPr>
+          <w:rFonts w:ascii="Arial" w:hAnsi="Arial" w:cs="Arial"/>
+          <w:sz w:val="24"/>
+          <w:szCs w:val="24"/>
           <w:highlight w:val="cyan"/>
         </w:rPr>
       </w:pPr>
       <w:r>
         <w:rPr>
+          <w:rFonts w:ascii="Arial" w:hAnsi="Arial" w:cs="Arial"/>
+          <w:sz w:val="24"/>
+          <w:szCs w:val="24"/>
           <w:highlight w:val="cyan"/>
         </w:rPr>
         <w:t>The project advisor for this project is Clement Swarnappa.</w:t>
@@ -6766,12 +6845,18 @@
       <w:pPr>
         <w:pStyle w:val="TNR"/>
         <w:rPr>
+          <w:rFonts w:ascii="Arial" w:hAnsi="Arial" w:cs="Arial"/>
+          <w:sz w:val="24"/>
+          <w:szCs w:val="24"/>
           <w:highlight w:val="cyan"/>
         </w:rPr>
       </w:pPr>
       <w:bookmarkStart w:id="15" w:name="_Toc236665779"/>
       <w:r>
         <w:rPr>
+          <w:rFonts w:ascii="Arial" w:hAnsi="Arial" w:cs="Arial"/>
+          <w:sz w:val="24"/>
+          <w:szCs w:val="24"/>
           <w:highlight w:val="cyan"/>
         </w:rPr>
         <w:t>Communication plan</w:t>
@@ -6798,11 +6883,17 @@
             <w:pPr>
               <w:pStyle w:val="TNR"/>
               <w:rPr>
+                <w:rFonts w:ascii="Arial" w:hAnsi="Arial" w:cs="Arial"/>
+                <w:sz w:val="24"/>
+                <w:szCs w:val="24"/>
                 <w:highlight w:val="cyan"/>
               </w:rPr>
             </w:pPr>
             <w:r>
               <w:rPr>
+                <w:rFonts w:ascii="Arial" w:hAnsi="Arial" w:cs="Arial"/>
+                <w:sz w:val="24"/>
+                <w:szCs w:val="24"/>
                 <w:highlight w:val="cyan"/>
               </w:rPr>
               <w:t>Name</w:t>
@@ -6817,11 +6908,17 @@
             <w:pPr>
               <w:pStyle w:val="TNR"/>
               <w:rPr>
+                <w:rFonts w:ascii="Arial" w:hAnsi="Arial" w:cs="Arial"/>
+                <w:sz w:val="24"/>
+                <w:szCs w:val="24"/>
                 <w:highlight w:val="cyan"/>
               </w:rPr>
             </w:pPr>
             <w:r>
               <w:rPr>
+                <w:rFonts w:ascii="Arial" w:hAnsi="Arial" w:cs="Arial"/>
+                <w:sz w:val="24"/>
+                <w:szCs w:val="24"/>
                 <w:highlight w:val="cyan"/>
               </w:rPr>
               <w:t>Email address</w:t>
@@ -6836,11 +6933,17 @@
             <w:pPr>
               <w:pStyle w:val="TNR"/>
               <w:rPr>
+                <w:rFonts w:ascii="Arial" w:hAnsi="Arial" w:cs="Arial"/>
+                <w:sz w:val="24"/>
+                <w:szCs w:val="24"/>
                 <w:highlight w:val="cyan"/>
               </w:rPr>
             </w:pPr>
             <w:r>
               <w:rPr>
+                <w:rFonts w:ascii="Arial" w:hAnsi="Arial" w:cs="Arial"/>
+                <w:sz w:val="24"/>
+                <w:szCs w:val="24"/>
                 <w:highlight w:val="cyan"/>
               </w:rPr>
               <w:t>Primary Method of Contact</w:t>
@@ -6857,11 +6960,17 @@
             <w:pPr>
               <w:pStyle w:val="TNR"/>
               <w:rPr>
+                <w:rFonts w:ascii="Arial" w:hAnsi="Arial" w:cs="Arial"/>
+                <w:sz w:val="24"/>
+                <w:szCs w:val="24"/>
                 <w:highlight w:val="cyan"/>
               </w:rPr>
             </w:pPr>
             <w:r>
               <w:rPr>
+                <w:rFonts w:ascii="Arial" w:hAnsi="Arial" w:cs="Arial"/>
+                <w:sz w:val="24"/>
+                <w:szCs w:val="24"/>
                 <w:highlight w:val="cyan"/>
               </w:rPr>
               <w:t>Client: Geoff Gordon</w:t>
@@ -6876,11 +6985,17 @@
             <w:pPr>
               <w:pStyle w:val="TNR"/>
               <w:rPr>
+                <w:rFonts w:ascii="Arial" w:hAnsi="Arial" w:cs="Arial"/>
+                <w:sz w:val="24"/>
+                <w:szCs w:val="24"/>
                 <w:highlight w:val="cyan"/>
               </w:rPr>
             </w:pPr>
             <w:r>
               <w:rPr>
+                <w:rFonts w:ascii="Arial" w:hAnsi="Arial" w:cs="Arial"/>
+                <w:sz w:val="24"/>
+                <w:szCs w:val="24"/>
                 <w:highlight w:val="cyan"/>
               </w:rPr>
               <w:t>Geoff.Gordon@whitireia.ac.nz</w:t>
@@ -6895,11 +7010,17 @@
             <w:pPr>
               <w:pStyle w:val="TNR"/>
               <w:rPr>
+                <w:rFonts w:ascii="Arial" w:hAnsi="Arial" w:cs="Arial"/>
+                <w:sz w:val="24"/>
+                <w:szCs w:val="24"/>
                 <w:highlight w:val="cyan"/>
               </w:rPr>
             </w:pPr>
             <w:r>
               <w:rPr>
+                <w:rFonts w:ascii="Arial" w:hAnsi="Arial" w:cs="Arial"/>
+                <w:sz w:val="24"/>
+                <w:szCs w:val="24"/>
                 <w:highlight w:val="cyan"/>
               </w:rPr>
               <w:t>Email</w:t>
@@ -6916,57 +7037,67 @@
             <w:pPr>
               <w:pStyle w:val="TNR"/>
               <w:rPr>
+                <w:rFonts w:ascii="Arial" w:hAnsi="Arial" w:cs="Arial"/>
+                <w:sz w:val="24"/>
+                <w:szCs w:val="24"/>
                 <w:highlight w:val="cyan"/>
               </w:rPr>
             </w:pPr>
             <w:r>
               <w:rPr>
+                <w:rFonts w:ascii="Arial" w:hAnsi="Arial" w:cs="Arial"/>
+                <w:sz w:val="24"/>
+                <w:szCs w:val="24"/>
                 <w:highlight w:val="cyan"/>
               </w:rPr>
-              <w:t xml:space="preserve">Project advisor: Clement </w:t>
-            </w:r>
-            <w:proofErr w:type="spellStart"/>
-            <w:r>
-              <w:rPr>
+              <w:t>Project advisor: Clement Swarnappa</w:t>
+            </w:r>
+          </w:p>
+        </w:tc>
+        <w:tc>
+          <w:tcPr>
+            <w:tcW w:w="4134" w:type="dxa"/>
+          </w:tcPr>
+          <w:p>
+            <w:pPr>
+              <w:pStyle w:val="TNR"/>
+              <w:rPr>
+                <w:rFonts w:ascii="Arial" w:hAnsi="Arial" w:cs="Arial"/>
+                <w:sz w:val="24"/>
+                <w:szCs w:val="24"/>
                 <w:highlight w:val="cyan"/>
               </w:rPr>
-              <w:t>Swarnappa</w:t>
-            </w:r>
-            <w:proofErr w:type="spellEnd"/>
-          </w:p>
-        </w:tc>
-        <w:tc>
-          <w:tcPr>
-            <w:tcW w:w="4134" w:type="dxa"/>
+            </w:pPr>
+            <w:r>
+              <w:rPr>
+                <w:rFonts w:ascii="Arial" w:hAnsi="Arial" w:cs="Arial"/>
+                <w:sz w:val="24"/>
+                <w:szCs w:val="24"/>
+                <w:highlight w:val="cyan"/>
+              </w:rPr>
+              <w:t>Clement.Sudhakar@weltec.ac.nz</w:t>
+            </w:r>
+          </w:p>
+        </w:tc>
+        <w:tc>
+          <w:tcPr>
+            <w:tcW w:w="2961" w:type="dxa"/>
           </w:tcPr>
           <w:p>
             <w:pPr>
               <w:pStyle w:val="TNR"/>
               <w:rPr>
+                <w:rFonts w:ascii="Arial" w:hAnsi="Arial" w:cs="Arial"/>
+                <w:sz w:val="24"/>
+                <w:szCs w:val="24"/>
                 <w:highlight w:val="cyan"/>
               </w:rPr>
             </w:pPr>
             <w:r>
               <w:rPr>
-                <w:highlight w:val="cyan"/>
-              </w:rPr>
-              <w:t>Clement.Sudhakar@weltec.ac.nz</w:t>
-            </w:r>
-          </w:p>
-        </w:tc>
-        <w:tc>
-          <w:tcPr>
-            <w:tcW w:w="2961" w:type="dxa"/>
-          </w:tcPr>
-          <w:p>
-            <w:pPr>
-              <w:pStyle w:val="TNR"/>
-              <w:rPr>
-                <w:highlight w:val="cyan"/>
-              </w:rPr>
-            </w:pPr>
-            <w:r>
-              <w:rPr>
+                <w:rFonts w:ascii="Arial" w:hAnsi="Arial" w:cs="Arial"/>
+                <w:sz w:val="24"/>
+                <w:szCs w:val="24"/>
                 <w:highlight w:val="cyan"/>
               </w:rPr>
               <w:t>Email</w:t>
@@ -6983,13 +7114,20 @@
             <w:pPr>
               <w:pStyle w:val="TNR"/>
               <w:rPr>
+                <w:rFonts w:ascii="Arial" w:hAnsi="Arial" w:cs="Arial"/>
+                <w:sz w:val="24"/>
+                <w:szCs w:val="24"/>
                 <w:highlight w:val="cyan"/>
               </w:rPr>
             </w:pPr>
             <w:r>
               <w:rPr>
+                <w:rFonts w:ascii="Arial" w:hAnsi="Arial" w:cs="Arial"/>
+                <w:sz w:val="24"/>
+                <w:szCs w:val="24"/>
                 <w:highlight w:val="cyan"/>
               </w:rPr>
+              <w:lastRenderedPageBreak/>
               <w:t>Group project manager: Dave Sushames</w:t>
             </w:r>
           </w:p>
@@ -7002,11 +7140,17 @@
             <w:pPr>
               <w:pStyle w:val="TNR"/>
               <w:rPr>
+                <w:rFonts w:ascii="Arial" w:hAnsi="Arial" w:cs="Arial"/>
+                <w:sz w:val="24"/>
+                <w:szCs w:val="24"/>
                 <w:highlight w:val="cyan"/>
               </w:rPr>
             </w:pPr>
             <w:r>
               <w:rPr>
+                <w:rFonts w:ascii="Arial" w:hAnsi="Arial" w:cs="Arial"/>
+                <w:sz w:val="24"/>
+                <w:szCs w:val="24"/>
                 <w:highlight w:val="cyan"/>
               </w:rPr>
               <w:t>david.sushames@gmail.com</w:t>
@@ -7021,11 +7165,17 @@
             <w:pPr>
               <w:pStyle w:val="TNR"/>
               <w:rPr>
+                <w:rFonts w:ascii="Arial" w:hAnsi="Arial" w:cs="Arial"/>
+                <w:sz w:val="24"/>
+                <w:szCs w:val="24"/>
                 <w:highlight w:val="cyan"/>
               </w:rPr>
             </w:pPr>
             <w:r>
               <w:rPr>
+                <w:rFonts w:ascii="Arial" w:hAnsi="Arial" w:cs="Arial"/>
+                <w:sz w:val="24"/>
+                <w:szCs w:val="24"/>
                 <w:highlight w:val="cyan"/>
               </w:rPr>
               <w:t>Discord</w:t>
@@ -7042,11 +7192,17 @@
             <w:pPr>
               <w:pStyle w:val="TNR"/>
               <w:rPr>
+                <w:rFonts w:ascii="Arial" w:hAnsi="Arial" w:cs="Arial"/>
+                <w:sz w:val="24"/>
+                <w:szCs w:val="24"/>
                 <w:highlight w:val="cyan"/>
               </w:rPr>
             </w:pPr>
             <w:r>
               <w:rPr>
+                <w:rFonts w:ascii="Arial" w:hAnsi="Arial" w:cs="Arial"/>
+                <w:sz w:val="24"/>
+                <w:szCs w:val="24"/>
                 <w:highlight w:val="cyan"/>
               </w:rPr>
               <w:t>Group member: Olivia Hey</w:t>
@@ -7061,44 +7217,42 @@
             <w:pPr>
               <w:pStyle w:val="TNR"/>
               <w:rPr>
+                <w:rFonts w:ascii="Arial" w:hAnsi="Arial" w:cs="Arial"/>
+                <w:sz w:val="24"/>
+                <w:szCs w:val="24"/>
                 <w:highlight w:val="cyan"/>
               </w:rPr>
             </w:pPr>
             <w:r>
               <w:rPr>
+                <w:rFonts w:ascii="Arial" w:hAnsi="Arial" w:cs="Arial"/>
+                <w:sz w:val="24"/>
+                <w:szCs w:val="24"/>
                 <w:highlight w:val="cyan"/>
               </w:rPr>
-              <w:t>Olivia-</w:t>
-            </w:r>
-            <w:proofErr w:type="gramStart"/>
-            <w:r>
-              <w:rPr>
+              <w:t>Olivia-hey.hey01</w:t>
+            </w:r>
+          </w:p>
+        </w:tc>
+        <w:tc>
+          <w:tcPr>
+            <w:tcW w:w="2961" w:type="dxa"/>
+          </w:tcPr>
+          <w:p>
+            <w:pPr>
+              <w:pStyle w:val="TNR"/>
+              <w:rPr>
+                <w:rFonts w:ascii="Arial" w:hAnsi="Arial" w:cs="Arial"/>
+                <w:sz w:val="24"/>
+                <w:szCs w:val="24"/>
                 <w:highlight w:val="cyan"/>
               </w:rPr>
-              <w:t>hey.hey</w:t>
-            </w:r>
-            <w:proofErr w:type="gramEnd"/>
-            <w:r>
-              <w:rPr>
-                <w:highlight w:val="cyan"/>
-              </w:rPr>
-              <w:t>01</w:t>
-            </w:r>
-          </w:p>
-        </w:tc>
-        <w:tc>
-          <w:tcPr>
-            <w:tcW w:w="2961" w:type="dxa"/>
-          </w:tcPr>
-          <w:p>
-            <w:pPr>
-              <w:pStyle w:val="TNR"/>
-              <w:rPr>
-                <w:highlight w:val="cyan"/>
-              </w:rPr>
-            </w:pPr>
-            <w:r>
-              <w:rPr>
+            </w:pPr>
+            <w:r>
+              <w:rPr>
+                <w:rFonts w:ascii="Arial" w:hAnsi="Arial" w:cs="Arial"/>
+                <w:sz w:val="24"/>
+                <w:szCs w:val="24"/>
                 <w:highlight w:val="cyan"/>
               </w:rPr>
               <w:t>Discord</w:t>
@@ -7115,11 +7269,17 @@
             <w:pPr>
               <w:pStyle w:val="TNR"/>
               <w:rPr>
+                <w:rFonts w:ascii="Arial" w:hAnsi="Arial" w:cs="Arial"/>
+                <w:sz w:val="24"/>
+                <w:szCs w:val="24"/>
                 <w:highlight w:val="cyan"/>
               </w:rPr>
             </w:pPr>
             <w:r>
               <w:rPr>
+                <w:rFonts w:ascii="Arial" w:hAnsi="Arial" w:cs="Arial"/>
+                <w:sz w:val="24"/>
+                <w:szCs w:val="24"/>
                 <w:highlight w:val="cyan"/>
               </w:rPr>
               <w:t>Group member: Matt Baker</w:t>
@@ -7134,11 +7294,17 @@
             <w:pPr>
               <w:pStyle w:val="TNR"/>
               <w:rPr>
+                <w:rFonts w:ascii="Arial" w:hAnsi="Arial" w:cs="Arial"/>
+                <w:sz w:val="24"/>
+                <w:szCs w:val="24"/>
                 <w:highlight w:val="cyan"/>
               </w:rPr>
             </w:pPr>
             <w:r>
               <w:rPr>
+                <w:rFonts w:ascii="Arial" w:hAnsi="Arial" w:cs="Arial"/>
+                <w:sz w:val="24"/>
+                <w:szCs w:val="24"/>
                 <w:highlight w:val="cyan"/>
               </w:rPr>
               <w:t>mattwillbaker1@gmail.com</w:t>
@@ -7153,11 +7319,17 @@
             <w:pPr>
               <w:pStyle w:val="TNR"/>
               <w:rPr>
+                <w:rFonts w:ascii="Arial" w:hAnsi="Arial" w:cs="Arial"/>
+                <w:sz w:val="24"/>
+                <w:szCs w:val="24"/>
                 <w:highlight w:val="cyan"/>
               </w:rPr>
             </w:pPr>
             <w:r>
               <w:rPr>
+                <w:rFonts w:ascii="Arial" w:hAnsi="Arial" w:cs="Arial"/>
+                <w:sz w:val="24"/>
+                <w:szCs w:val="24"/>
                 <w:highlight w:val="cyan"/>
               </w:rPr>
               <w:t>Discord</w:t>
@@ -7173,16 +7345,21 @@
           <w:p>
             <w:pPr>
               <w:rPr>
+                <w:rFonts w:cs="Arial"/>
+                <w:sz w:val="24"/>
+                <w:szCs w:val="24"/>
                 <w:highlight w:val="cyan"/>
                 <w:lang w:val="en-NZ"/>
               </w:rPr>
             </w:pPr>
             <w:r>
               <w:rPr>
+                <w:rFonts w:cs="Arial"/>
+                <w:sz w:val="24"/>
+                <w:szCs w:val="24"/>
                 <w:highlight w:val="cyan"/>
                 <w:lang w:val="en-NZ"/>
               </w:rPr>
-              <w:lastRenderedPageBreak/>
               <w:t>Group member: Sam Davies</w:t>
             </w:r>
           </w:p>
@@ -7195,12 +7372,18 @@
             <w:pPr>
               <w:keepNext/>
               <w:rPr>
+                <w:rFonts w:cs="Arial"/>
+                <w:sz w:val="24"/>
+                <w:szCs w:val="24"/>
                 <w:highlight w:val="cyan"/>
                 <w:lang w:val="en-NZ"/>
               </w:rPr>
             </w:pPr>
             <w:r>
               <w:rPr>
+                <w:rFonts w:cs="Arial"/>
+                <w:sz w:val="24"/>
+                <w:szCs w:val="24"/>
                 <w:highlight w:val="cyan"/>
                 <w:lang w:val="en-NZ"/>
               </w:rPr>
@@ -7216,12 +7399,18 @@
             <w:pPr>
               <w:keepNext/>
               <w:rPr>
+                <w:rFonts w:cs="Arial"/>
+                <w:sz w:val="24"/>
+                <w:szCs w:val="24"/>
                 <w:highlight w:val="cyan"/>
                 <w:lang w:val="en-NZ"/>
               </w:rPr>
             </w:pPr>
             <w:r>
               <w:rPr>
+                <w:rFonts w:cs="Arial"/>
+                <w:sz w:val="24"/>
+                <w:szCs w:val="24"/>
                 <w:highlight w:val="cyan"/>
                 <w:lang w:val="en-NZ"/>
               </w:rPr>
@@ -7291,29 +7480,7 @@
           <w:highlight w:val="cyan"/>
           <w:lang w:val="en-NZ"/>
         </w:rPr>
-        <w:t xml:space="preserve">As our client Geoff Gordon is a member of the </w:t>
-      </w:r>
-      <w:proofErr w:type="spellStart"/>
-      <w:r>
-        <w:rPr>
-          <w:rFonts w:cs="Arial"/>
-          <w:sz w:val="24"/>
-          <w:szCs w:val="24"/>
-          <w:highlight w:val="cyan"/>
-          <w:lang w:val="en-NZ"/>
-        </w:rPr>
-        <w:t>WelTec</w:t>
-      </w:r>
-      <w:proofErr w:type="spellEnd"/>
-      <w:r>
-        <w:rPr>
-          <w:rFonts w:cs="Arial"/>
-          <w:sz w:val="24"/>
-          <w:szCs w:val="24"/>
-          <w:highlight w:val="cyan"/>
-          <w:lang w:val="en-NZ"/>
-        </w:rPr>
-        <w:t xml:space="preserve"> staff, his employer is the same as the institution that runs this capstone course, this constitutes a conflict of interest. The prevailing vague familiarity with Geoff within the team also means a relationship exists that could compromise the sincerity of the transaction of client to student.</w:t>
+        <w:t>As our client Geoff Gordon is a member of the WelTec staff, his employer is the same as the institution that runs this capstone course, this constitutes a conflict of interest. The prevailing vague familiarity with Geoff within the team also means a relationship exists that could compromise the sincerity of the transaction of client to student.</w:t>
       </w:r>
       <w:r>
         <w:rPr>
@@ -7486,23 +7653,7 @@
                 <w:highlight w:val="cyan"/>
                 <w:lang w:val="en-NZ"/>
               </w:rPr>
-              <w:t xml:space="preserve">Clement </w:t>
-            </w:r>
-            <w:proofErr w:type="spellStart"/>
-            <w:r>
-              <w:rPr>
-                <w:highlight w:val="cyan"/>
-                <w:lang w:val="en-NZ"/>
-              </w:rPr>
-              <w:t>Swarnappa</w:t>
-            </w:r>
-            <w:proofErr w:type="spellEnd"/>
-            <w:r>
-              <w:rPr>
-                <w:highlight w:val="cyan"/>
-                <w:lang w:val="en-NZ"/>
-              </w:rPr>
-              <w:t xml:space="preserve"> (Advisor)</w:t>
+              <w:t>Clement Swarnappa (Advisor)</w:t>
             </w:r>
           </w:p>
         </w:tc>
@@ -7743,39 +7894,7 @@
                 <w:highlight w:val="cyan"/>
                 <w:lang w:val="en-NZ"/>
               </w:rPr>
-              <w:t>Installation/configuration of operating systems and software (</w:t>
-            </w:r>
-            <w:proofErr w:type="spellStart"/>
-            <w:r>
-              <w:rPr>
-                <w:highlight w:val="cyan"/>
-                <w:lang w:val="en-NZ"/>
-              </w:rPr>
-              <w:t>LMStudio</w:t>
-            </w:r>
-            <w:proofErr w:type="spellEnd"/>
-            <w:r>
-              <w:rPr>
-                <w:highlight w:val="cyan"/>
-                <w:lang w:val="en-NZ"/>
-              </w:rPr>
-              <w:t>, forensic tools such as volatility/</w:t>
-            </w:r>
-            <w:proofErr w:type="spellStart"/>
-            <w:r>
-              <w:rPr>
-                <w:highlight w:val="cyan"/>
-                <w:lang w:val="en-NZ"/>
-              </w:rPr>
-              <w:t>exiftools</w:t>
-            </w:r>
-            <w:proofErr w:type="spellEnd"/>
-            <w:r>
-              <w:rPr>
-                <w:highlight w:val="cyan"/>
-                <w:lang w:val="en-NZ"/>
-              </w:rPr>
-              <w:t>/foremost)</w:t>
+              <w:t>Installation/configuration of operating systems and software (LMStudio, forensic tools such as volatility/exiftools/foremost)</w:t>
             </w:r>
           </w:p>
         </w:tc>
@@ -8514,15 +8633,8 @@
                 <w:highlight w:val="cyan"/>
                 <w:lang w:val="en-NZ"/>
               </w:rPr>
-              <w:t xml:space="preserve">Testing in multiple evidence environments (mobile/desktop) on multiple types of target data (credentials, confidential information, </w:t>
-            </w:r>
-            <w:r>
-              <w:rPr>
-                <w:highlight w:val="cyan"/>
-                <w:lang w:val="en-NZ"/>
-              </w:rPr>
               <w:lastRenderedPageBreak/>
-              <w:t>intrusion indicators, suspicious processes/media)</w:t>
+              <w:t>Testing in multiple evidence environments (mobile/desktop) on multiple types of target data (credentials, confidential information, intrusion indicators, suspicious processes/media)</w:t>
             </w:r>
           </w:p>
         </w:tc>
@@ -8542,7 +8654,6 @@
                 <w:highlight w:val="green"/>
                 <w:lang w:val="en-NZ"/>
               </w:rPr>
-              <w:lastRenderedPageBreak/>
               <w:t>I</w:t>
             </w:r>
           </w:p>
@@ -8816,10 +8927,9 @@
         <w:pStyle w:val="Heading1"/>
       </w:pPr>
       <w:r>
-        <w:lastRenderedPageBreak/>
         <w:t>Project timeline and milestones</w:t>
       </w:r>
-      <w:bookmarkEnd w:id="10"/>
+      <w:bookmarkEnd w:id="11"/>
     </w:p>
     <w:p>
       <w:pPr>
@@ -9784,6 +9894,7 @@
                 <w:bCs/>
                 <w:lang w:val="en-NZ"/>
               </w:rPr>
+              <w:lastRenderedPageBreak/>
               <w:t>1</w:t>
             </w:r>
           </w:p>
@@ -10366,6 +10477,7 @@
               <w:rPr>
                 <w:lang w:val="en-NZ"/>
               </w:rPr>
+              <w:lastRenderedPageBreak/>
               <w:t>R11 Tech/Vendor becomes unavailable</w:t>
             </w:r>
           </w:p>
@@ -10405,7 +10517,6 @@
               <w:rPr>
                 <w:lang w:val="en-NZ"/>
               </w:rPr>
-              <w:lastRenderedPageBreak/>
               <w:t>R12 Internet outage</w:t>
             </w:r>
           </w:p>
@@ -10464,21 +10575,7 @@
               <w:rPr>
                 <w:lang w:val="en-NZ"/>
               </w:rPr>
-              <w:t xml:space="preserve">Make sure </w:t>
-            </w:r>
-            <w:proofErr w:type="gramStart"/>
-            <w:r>
-              <w:rPr>
-                <w:lang w:val="en-NZ"/>
-              </w:rPr>
-              <w:t>the majority of</w:t>
-            </w:r>
-            <w:proofErr w:type="gramEnd"/>
-            <w:r>
-              <w:rPr>
-                <w:lang w:val="en-NZ"/>
-              </w:rPr>
-              <w:t xml:space="preserve"> work can be completed from home and doesn’t require onsite presence.</w:t>
+              <w:t>Make sure the majority of work can be completed from home and doesn’t require onsite presence.</w:t>
             </w:r>
           </w:p>
         </w:tc>
@@ -10718,21 +10815,7 @@
               <w:rPr>
                 <w:lang w:val="en-NZ"/>
               </w:rPr>
-              <w:t xml:space="preserve">Redistribute missing team member’s tasks to the rest of the team. Inform advisor if unavailability is for an extended </w:t>
-            </w:r>
-            <w:proofErr w:type="gramStart"/>
-            <w:r>
-              <w:rPr>
-                <w:lang w:val="en-NZ"/>
-              </w:rPr>
-              <w:t>period of time</w:t>
-            </w:r>
-            <w:proofErr w:type="gramEnd"/>
-            <w:r>
-              <w:rPr>
-                <w:lang w:val="en-NZ"/>
-              </w:rPr>
-              <w:t>. Possibly request scope adjustment.</w:t>
+              <w:t>Redistribute missing team member’s tasks to the rest of the team. Inform advisor if unavailability is for an extended period of time. Possibly request scope adjustment.</w:t>
             </w:r>
           </w:p>
         </w:tc>
@@ -10925,21 +11008,7 @@
               <w:rPr>
                 <w:lang w:val="en-NZ"/>
               </w:rPr>
-              <w:t xml:space="preserve">Report to </w:t>
-            </w:r>
-            <w:proofErr w:type="spellStart"/>
-            <w:r>
-              <w:rPr>
-                <w:lang w:val="en-NZ"/>
-              </w:rPr>
-              <w:t>WelTec</w:t>
-            </w:r>
-            <w:proofErr w:type="spellEnd"/>
-            <w:r>
-              <w:rPr>
-                <w:lang w:val="en-NZ"/>
-              </w:rPr>
-              <w:t xml:space="preserve"> and police. Contact client, advisor, and possibly coordinator for further steps.</w:t>
+              <w:t>Report to WelTec and police. Contact client, advisor, and possibly coordinator for further steps.</w:t>
             </w:r>
           </w:p>
         </w:tc>
@@ -10959,6 +11028,7 @@
               <w:rPr>
                 <w:lang w:val="en-NZ"/>
               </w:rPr>
+              <w:lastRenderedPageBreak/>
               <w:t>R08 Data/File loss/corruption</w:t>
             </w:r>
           </w:p>
@@ -11046,7 +11116,6 @@
               <w:rPr>
                 <w:lang w:val="en-NZ"/>
               </w:rPr>
-              <w:lastRenderedPageBreak/>
               <w:t>R10 Advisor becomes unavailable</w:t>
             </w:r>
           </w:p>
@@ -11144,21 +11213,7 @@
               <w:rPr>
                 <w:lang w:val="en-NZ"/>
               </w:rPr>
-              <w:t xml:space="preserve">Fall back to phone/text to stay coordinated. Work </w:t>
-            </w:r>
-            <w:proofErr w:type="gramStart"/>
-            <w:r>
-              <w:rPr>
-                <w:lang w:val="en-NZ"/>
-              </w:rPr>
-              <w:t>offline, or</w:t>
-            </w:r>
-            <w:proofErr w:type="gramEnd"/>
-            <w:r>
-              <w:rPr>
-                <w:lang w:val="en-NZ"/>
-              </w:rPr>
-              <w:t xml:space="preserve"> tether/hotspot using mobile data to stay online.</w:t>
+              <w:t>Fall back to phone/text to stay coordinated. Work offline, or tether/hotspot using mobile data to stay online.</w:t>
             </w:r>
           </w:p>
         </w:tc>
@@ -11349,7 +11404,41 @@
         <w:rPr>
           <w:lang w:val="en-NZ"/>
         </w:rPr>
-        <w:t>Appendix A is the Gantt chart</w:t>
+        <w:drawing>
+          <wp:inline distT="0" distB="0" distL="0" distR="0" wp14:anchorId="586CE429" wp14:editId="5E7385C5">
+            <wp:extent cx="6645910" cy="2219960"/>
+            <wp:effectExtent l="0" t="0" r="2540" b="8890"/>
+            <wp:docPr id="357466923" name="Picture 1"/>
+            <wp:cNvGraphicFramePr>
+              <a:graphicFrameLocks xmlns:a="http://schemas.openxmlformats.org/drawingml/2006/main" noChangeAspect="1"/>
+            </wp:cNvGraphicFramePr>
+            <a:graphic xmlns:a="http://schemas.openxmlformats.org/drawingml/2006/main">
+              <a:graphicData uri="http://schemas.openxmlformats.org/drawingml/2006/picture">
+                <pic:pic xmlns:pic="http://schemas.openxmlformats.org/drawingml/2006/picture">
+                  <pic:nvPicPr>
+                    <pic:cNvPr id="357466923" name=""/>
+                    <pic:cNvPicPr/>
+                  </pic:nvPicPr>
+                  <pic:blipFill>
+                    <a:blip r:embed="rId10"/>
+                    <a:stretch>
+                      <a:fillRect/>
+                    </a:stretch>
+                  </pic:blipFill>
+                  <pic:spPr>
+                    <a:xfrm>
+                      <a:off x="0" y="0"/>
+                      <a:ext cx="6645910" cy="2219960"/>
+                    </a:xfrm>
+                    <a:prstGeom prst="rect">
+                      <a:avLst/>
+                    </a:prstGeom>
+                  </pic:spPr>
+                </pic:pic>
+              </a:graphicData>
+            </a:graphic>
+          </wp:inline>
+        </w:drawing>
       </w:r>
     </w:p>
     <w:p>
@@ -11358,6 +11447,7 @@
       </w:pPr>
       <w:bookmarkStart w:id="22" w:name="_Toc236403149"/>
       <w:r>
+        <w:lastRenderedPageBreak/>
         <w:t>Appendix B</w:t>
       </w:r>
       <w:bookmarkEnd w:id="22"/>
@@ -11462,7 +11552,6 @@
         <w:rPr>
           <w:lang w:val="en-NZ"/>
         </w:rPr>
-        <w:lastRenderedPageBreak/>
         <w:t>the final video meets the following requirements.</w:t>
       </w:r>
     </w:p>
@@ -11502,21 +11591,7 @@
         <w:rPr>
           <w:lang w:val="en-NZ"/>
         </w:rPr>
-        <w:t xml:space="preserve">If there are technical or other reasons why this cannot be </w:t>
-      </w:r>
-      <w:proofErr w:type="gramStart"/>
-      <w:r>
-        <w:rPr>
-          <w:lang w:val="en-NZ"/>
-        </w:rPr>
-        <w:t>done</w:t>
-      </w:r>
-      <w:proofErr w:type="gramEnd"/>
-      <w:r>
-        <w:rPr>
-          <w:lang w:val="en-NZ"/>
-        </w:rPr>
-        <w:t xml:space="preserve"> they need to be discussed with the</w:t>
+        <w:t>If there are technical or other reasons why this cannot be done they need to be discussed with the</w:t>
       </w:r>
       <w:r>
         <w:rPr>
@@ -11580,49 +11655,7 @@
         <w:rPr>
           <w:lang w:val="en-NZ"/>
         </w:rPr>
-        <w:t xml:space="preserve">either asking </w:t>
-      </w:r>
-      <w:proofErr w:type="spellStart"/>
-      <w:r>
-        <w:rPr>
-          <w:lang w:val="en-NZ"/>
-        </w:rPr>
-        <w:t>pātai</w:t>
-      </w:r>
-      <w:proofErr w:type="spellEnd"/>
-      <w:r>
-        <w:rPr>
-          <w:lang w:val="en-NZ"/>
-        </w:rPr>
-        <w:t xml:space="preserve">/questions of the </w:t>
-      </w:r>
-      <w:proofErr w:type="gramStart"/>
-      <w:r>
-        <w:rPr>
-          <w:lang w:val="en-NZ"/>
-        </w:rPr>
-        <w:t>client, or</w:t>
-      </w:r>
-      <w:proofErr w:type="gramEnd"/>
-      <w:r>
-        <w:rPr>
-          <w:lang w:val="en-NZ"/>
-        </w:rPr>
-        <w:t xml:space="preserve"> answering the client’s </w:t>
-      </w:r>
-      <w:proofErr w:type="spellStart"/>
-      <w:r>
-        <w:rPr>
-          <w:lang w:val="en-NZ"/>
-        </w:rPr>
-        <w:t>pātai</w:t>
-      </w:r>
-      <w:proofErr w:type="spellEnd"/>
-      <w:r>
-        <w:rPr>
-          <w:lang w:val="en-NZ"/>
-        </w:rPr>
-        <w:t>/questions.</w:t>
+        <w:t>either asking pātai/questions of the client, or answering the client’s pātai/questions.</w:t>
       </w:r>
     </w:p>
     <w:p>
@@ -11704,6 +11737,7 @@
         <w:pStyle w:val="Heading2"/>
       </w:pPr>
       <w:r>
+        <w:lastRenderedPageBreak/>
         <w:t>Appendix A</w:t>
       </w:r>
     </w:p>
@@ -11781,11 +11815,7 @@
         <w:pStyle w:val="Heading2"/>
       </w:pPr>
       <w:r>
-        <w:lastRenderedPageBreak/>
-        <w:t xml:space="preserve">Appendix </w:t>
-      </w:r>
-      <w:r>
-        <w:t>B</w:t>
+        <w:t>Appendix B</w:t>
       </w:r>
     </w:p>
     <w:p>
@@ -11975,15 +12005,7 @@
         <w:jc w:val="both"/>
       </w:pPr>
       <w:r>
-        <w:t xml:space="preserve">Whitireia and </w:t>
-      </w:r>
-      <w:proofErr w:type="spellStart"/>
-      <w:r>
-        <w:t>Weltec</w:t>
-      </w:r>
-      <w:proofErr w:type="spellEnd"/>
-      <w:r>
-        <w:t xml:space="preserve"> New Zealand School of Innovation, Design and Technology </w:t>
+        <w:t xml:space="preserve">Whitireia and Weltec New Zealand School of Innovation, Design and Technology </w:t>
       </w:r>
     </w:p>
     <w:p>
@@ -12095,15 +12117,7 @@
         <w:jc w:val="both"/>
       </w:pPr>
       <w:r>
-        <w:t xml:space="preserve">As part of an established course of study at the Faculty, Bachelor of Information Technology students take a course module IT7x01, in which the </w:t>
-      </w:r>
-      <w:proofErr w:type="gramStart"/>
-      <w:r>
-        <w:t>Student</w:t>
-      </w:r>
-      <w:proofErr w:type="gramEnd"/>
-      <w:r>
-        <w:t xml:space="preserve">(s) completes a project (“the Project”) with the Organisation on the basis set out in this Agreement. </w:t>
+        <w:t xml:space="preserve">As part of an established course of study at the Faculty, Bachelor of Information Technology students take a course module IT7x01, in which the Student(s) completes a project (“the Project”) with the Organisation on the basis set out in this Agreement. </w:t>
       </w:r>
     </w:p>
     <w:p>
@@ -12117,15 +12131,7 @@
         <w:jc w:val="both"/>
       </w:pPr>
       <w:r>
-        <w:t xml:space="preserve">The Organisation agrees to allow the </w:t>
-      </w:r>
-      <w:proofErr w:type="gramStart"/>
-      <w:r>
-        <w:t>Student</w:t>
-      </w:r>
-      <w:proofErr w:type="gramEnd"/>
-      <w:r>
-        <w:t xml:space="preserve">(s) access to its premises if needed to undertake that Project on the basis set out in this Agreement. </w:t>
+        <w:t xml:space="preserve">The Organisation agrees to allow the Student(s) access to its premises if needed to undertake that Project on the basis set out in this Agreement. </w:t>
       </w:r>
     </w:p>
     <w:p>
@@ -12139,15 +12145,8 @@
         <w:jc w:val="both"/>
       </w:pPr>
       <w:r>
-        <w:t xml:space="preserve">The </w:t>
-      </w:r>
-      <w:proofErr w:type="gramStart"/>
-      <w:r>
-        <w:t>Faculty</w:t>
-      </w:r>
-      <w:proofErr w:type="gramEnd"/>
-      <w:r>
-        <w:t xml:space="preserve"> is satisfied that the Organisation is suitable for the Student(s) Project. </w:t>
+        <w:lastRenderedPageBreak/>
+        <w:t xml:space="preserve">The Faculty is satisfied that the Organisation is suitable for the Student(s) Project. </w:t>
       </w:r>
     </w:p>
     <w:p>
@@ -12246,16 +12245,7 @@
         <w:ind w:left="696" w:hanging="427"/>
       </w:pPr>
       <w:r>
-        <w:lastRenderedPageBreak/>
-        <w:t xml:space="preserve">2.1 The Organisation has accepted the </w:t>
-      </w:r>
-      <w:proofErr w:type="gramStart"/>
-      <w:r>
-        <w:t>Student</w:t>
-      </w:r>
-      <w:proofErr w:type="gramEnd"/>
-      <w:r>
-        <w:t xml:space="preserve">(s) and agrees to allow that Student(s) access to its premises as needed. </w:t>
+        <w:t xml:space="preserve">2.1 The Organisation has accepted the Student(s) and agrees to allow that Student(s) access to its premises as needed. </w:t>
       </w:r>
     </w:p>
     <w:p>
@@ -12263,15 +12253,7 @@
         <w:ind w:left="696" w:hanging="427"/>
       </w:pPr>
       <w:r>
-        <w:t xml:space="preserve">2.2 The Organisation agrees to be responsible for meeting the requirements of its statutory obligations, e.g. Health and Safety in Employment Act, Human Rights Act, etc., for the </w:t>
-      </w:r>
-      <w:proofErr w:type="gramStart"/>
-      <w:r>
-        <w:t>Student</w:t>
-      </w:r>
-      <w:proofErr w:type="gramEnd"/>
-      <w:r>
-        <w:t xml:space="preserve">(s). </w:t>
+        <w:t xml:space="preserve">2.2 The Organisation agrees to be responsible for meeting the requirements of its statutory obligations, e.g. Health and Safety in Employment Act, Human Rights Act, etc., for the Student(s). </w:t>
       </w:r>
     </w:p>
     <w:p>
@@ -12295,23 +12277,7 @@
         <w:ind w:left="696" w:hanging="427"/>
       </w:pPr>
       <w:r>
-        <w:t xml:space="preserve">2.5 Neither the Faculty nor the </w:t>
-      </w:r>
-      <w:proofErr w:type="gramStart"/>
-      <w:r>
-        <w:t>Student</w:t>
-      </w:r>
-      <w:proofErr w:type="gramEnd"/>
-      <w:r>
-        <w:t xml:space="preserve">(s) guarantee specific results and the Project will be undertaken only on a </w:t>
-      </w:r>
-      <w:proofErr w:type="gramStart"/>
-      <w:r>
-        <w:t>best efforts</w:t>
-      </w:r>
-      <w:proofErr w:type="gramEnd"/>
-      <w:r>
-        <w:t xml:space="preserve"> basis. </w:t>
+        <w:t xml:space="preserve">2.5 Neither the Faculty nor the Student(s) guarantee specific results and the Project will be undertaken only on a best efforts basis. </w:t>
       </w:r>
     </w:p>
     <w:p>
@@ -12351,15 +12317,7 @@
       </w:r>
       <w:r>
         <w:tab/>
-        <w:t xml:space="preserve">Copyright, Patents, </w:t>
-      </w:r>
-      <w:proofErr w:type="gramStart"/>
-      <w:r>
-        <w:t>Trade Marks</w:t>
-      </w:r>
-      <w:proofErr w:type="gramEnd"/>
-      <w:r>
-        <w:t xml:space="preserve"> and other Intellectual Property Rights </w:t>
+        <w:t xml:space="preserve">Copyright, Patents, Trade Marks and other Intellectual Property Rights </w:t>
       </w:r>
     </w:p>
     <w:p>
@@ -12428,6 +12386,7 @@
         <w:ind w:left="696" w:hanging="427"/>
       </w:pPr>
       <w:r>
+        <w:lastRenderedPageBreak/>
         <w:t xml:space="preserve">4.1 The parties may wish, from time to time, in connection with the Project undertaken under this Agreement, to disclose certain information of a confidential nature (“Confidential Information”) to each other.  Each party will use reasonable efforts to prevent the disclosure of any of the other parties Confidential Information to third parties for a period of three (3) years from receipt of that information, provided that the recipient party’s obligation shall not apply to information that: </w:t>
       </w:r>
     </w:p>
@@ -12530,7 +12489,6 @@
         <w:ind w:left="709"/>
       </w:pPr>
       <w:r>
-        <w:lastRenderedPageBreak/>
         <w:t xml:space="preserve"> </w:t>
       </w:r>
     </w:p>
@@ -12607,31 +12565,7 @@
         <w:ind w:left="696" w:hanging="427"/>
       </w:pPr>
       <w:r>
-        <w:t xml:space="preserve">5.1 The parties agree that both the Faculty and the Student(s) may use the intellectual property rights that are created </w:t>
-      </w:r>
-      <w:proofErr w:type="gramStart"/>
-      <w:r>
-        <w:t>as a result of</w:t>
-      </w:r>
-      <w:proofErr w:type="gramEnd"/>
-      <w:r>
-        <w:t xml:space="preserve"> the Project work undertaken by each Student for the Organisation for portfolio purposes to promote the </w:t>
-      </w:r>
-      <w:proofErr w:type="gramStart"/>
-      <w:r>
-        <w:t>Faculty</w:t>
-      </w:r>
-      <w:proofErr w:type="gramEnd"/>
-      <w:r>
-        <w:t xml:space="preserve"> and/or the </w:t>
-      </w:r>
-      <w:proofErr w:type="gramStart"/>
-      <w:r>
-        <w:t>Student</w:t>
-      </w:r>
-      <w:proofErr w:type="gramEnd"/>
-      <w:r>
-        <w:t xml:space="preserve">(s). </w:t>
+        <w:t xml:space="preserve">5.1 The parties agree that both the Faculty and the Student(s) may use the intellectual property rights that are created as a result of the Project work undertaken by each Student for the Organisation for portfolio purposes to promote the Faculty and/or the Student(s). </w:t>
       </w:r>
     </w:p>
     <w:p>
@@ -12800,15 +12734,7 @@
         <w:ind w:left="1144"/>
       </w:pPr>
       <w:r>
-        <w:t xml:space="preserve">All intellectual property rights that are created </w:t>
-      </w:r>
-      <w:proofErr w:type="gramStart"/>
-      <w:r>
-        <w:t>as a result of</w:t>
-      </w:r>
-      <w:proofErr w:type="gramEnd"/>
-      <w:r>
-        <w:t xml:space="preserve"> the Project work undertaken by the Student(s) for the Organisation shall vest absolutely in the Organisation.  </w:t>
+        <w:t xml:space="preserve">All intellectual property rights that are created as a result of the Project work undertaken by the Student(s) for the Organisation shall vest absolutely in the Organisation.  </w:t>
       </w:r>
     </w:p>
     <w:p>
@@ -12944,15 +12870,7 @@
         <w:ind w:left="1144"/>
       </w:pPr>
       <w:r>
-        <w:t xml:space="preserve">All intellectual property rights that are created </w:t>
-      </w:r>
-      <w:proofErr w:type="gramStart"/>
-      <w:r>
-        <w:t>as a result of</w:t>
-      </w:r>
-      <w:proofErr w:type="gramEnd"/>
-      <w:r>
-        <w:t xml:space="preserve"> the Project work undertaken by each Student for the Organisation shall vest absolutely in each respective Student.  Each Student hereby grants the Organisation, and where more than one Student has been involved in the Project, the other Student(s) are granted, a perpetual non-exclusive licence for that intellectual property. </w:t>
+        <w:t xml:space="preserve">All intellectual property rights that are created as a result of the Project work undertaken by each Student for the Organisation shall vest absolutely in each respective Student.  Each Student hereby grants the Organisation, and where more than one Student has been involved in the Project, the other Student(s) are granted, a perpetual non-exclusive licence for that intellectual property. </w:t>
       </w:r>
     </w:p>
     <w:p>
@@ -12961,6 +12879,7 @@
         <w:ind w:left="1134"/>
       </w:pPr>
       <w:r>
+        <w:lastRenderedPageBreak/>
         <w:t xml:space="preserve"> </w:t>
       </w:r>
     </w:p>
@@ -13296,22 +13215,7 @@
         <w:rPr>
           <w:i/>
         </w:rPr>
-        <w:lastRenderedPageBreak/>
-        <w:t xml:space="preserve">(Please </w:t>
-      </w:r>
-      <w:proofErr w:type="gramStart"/>
-      <w:r>
-        <w:rPr>
-          <w:i/>
-        </w:rPr>
-        <w:t>attach  here</w:t>
-      </w:r>
-      <w:proofErr w:type="gramEnd"/>
-      <w:r>
-        <w:rPr>
-          <w:i/>
-        </w:rPr>
-        <w:t xml:space="preserve">  any other intellectual property rights agreed between the parties) </w:t>
+        <w:t xml:space="preserve">(Please attach  here  any other intellectual property rights agreed between the parties) </w:t>
       </w:r>
     </w:p>
     <w:p>
@@ -13778,11 +13682,9 @@
             <w:pPr>
               <w:spacing w:after="0" w:line="259" w:lineRule="auto"/>
             </w:pPr>
-            <w:proofErr w:type="spellStart"/>
             <w:r>
               <w:t>Swarnappa</w:t>
             </w:r>
-            <w:proofErr w:type="spellEnd"/>
           </w:p>
         </w:tc>
         <w:tc>
@@ -14168,26 +14070,14 @@
       </w:r>
       <w:r>
         <w:tab/>
-        <w:t>Developer Researcher/</w:t>
-      </w:r>
-      <w:proofErr w:type="gramStart"/>
-      <w:r>
-        <w:t>Tester</w:t>
+        <w:t>Developer Researcher/Tester</w:t>
       </w:r>
       <w:r>
         <w:rPr>
           <w:sz w:val="34"/>
           <w:vertAlign w:val="superscript"/>
         </w:rPr>
-        <w:t xml:space="preserve">  Olivia</w:t>
-      </w:r>
-      <w:proofErr w:type="gramEnd"/>
-      <w:r>
-        <w:rPr>
-          <w:sz w:val="34"/>
-          <w:vertAlign w:val="superscript"/>
-        </w:rPr>
-        <w:t xml:space="preserve"> Hey</w:t>
+        <w:t xml:space="preserve">  Olivia Hey</w:t>
       </w:r>
       <w:r>
         <w:rPr>
@@ -14220,6 +14110,7 @@
         <w:ind w:left="2434"/>
       </w:pPr>
       <w:r>
+        <w:lastRenderedPageBreak/>
         <w:t xml:space="preserve"> </w:t>
       </w:r>
     </w:p>
@@ -14842,10 +14733,7 @@
         <w:pStyle w:val="Heading2"/>
       </w:pPr>
       <w:r>
-        <w:t xml:space="preserve">Appendix </w:t>
-      </w:r>
-      <w:r>
-        <w:t>D</w:t>
+        <w:t>Appendix D</w:t>
       </w:r>
     </w:p>
     <w:p>
@@ -14876,7 +14764,7 @@
       </w:pPr>
     </w:p>
     <w:sectPr>
-      <w:footerReference w:type="default" r:id="rId10"/>
+      <w:footerReference w:type="default" r:id="rId11"/>
       <w:pgSz w:w="11906" w:h="16838"/>
       <w:pgMar w:top="720" w:right="720" w:bottom="720" w:left="720" w:header="708" w:footer="708" w:gutter="0"/>
       <w:pgNumType w:start="0"/>
@@ -14923,6 +14811,7 @@
         <w:docPartUnique/>
       </w:docPartObj>
     </w:sdtPr>
+    <w:sdtEndPr/>
     <w:sdtContent>
       <w:p>
         <w:pPr>

</xml_diff>

<commit_message>
small edits to scope
</commit_message>
<xml_diff>
--- a/Capstone Proposal.docx
+++ b/Capstone Proposal.docx
@@ -14,7 +14,6 @@
           <w:docPartUnique/>
         </w:docPartObj>
       </w:sdtPr>
-      <w:sdtEndPr/>
       <w:sdtContent>
         <w:p>
           <w:pPr>
@@ -27,7 +26,7 @@
             <mc:AlternateContent>
               <mc:Choice Requires="wpg">
                 <w:drawing>
-                  <wp:anchor distT="0" distB="0" distL="114300" distR="114300" simplePos="0" relativeHeight="251659264" behindDoc="1" locked="0" layoutInCell="1" allowOverlap="1" wp14:anchorId="206CF68B" wp14:editId="6D23BF52">
+                  <wp:anchor distT="0" distB="0" distL="114300" distR="114300" simplePos="0" relativeHeight="251659264" behindDoc="1" locked="0" layoutInCell="1" allowOverlap="1" wp14:anchorId="206CF68B" wp14:editId="4B65A0EA">
                     <wp:simplePos x="0" y="0"/>
                     <mc:AlternateContent>
                       <mc:Choice Requires="wp14">
@@ -3349,7 +3348,7 @@
               </mc:Choice>
               <mc:Fallback>
                 <w:pict>
-                  <v:group w14:anchorId="4C34F6CE" id="Group 26" o:spid="_x0000_s1026" style="position:absolute;margin-left:0;margin-top:0;width:168pt;height:718.55pt;z-index:-251657216;mso-height-percent:950;mso-left-percent:40;mso-position-horizontal-relative:page;mso-position-vertical:center;mso-position-vertical-relative:page;mso-height-percent:950;mso-left-percent:40" coordsize="21336,91257" o:gfxdata="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">
+                  <v:group w14:anchorId="668429CB" id="Group 26" o:spid="_x0000_s1026" style="position:absolute;margin-left:0;margin-top:0;width:168pt;height:718.55pt;z-index:-251657216;mso-height-percent:950;mso-left-percent:40;mso-position-horizontal-relative:page;mso-position-vertical:center;mso-position-vertical-relative:page;mso-height-percent:950;mso-left-percent:40" coordsize="21336,91257" o:gfxdata="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">
                     <v:rect id="Rectangle 3" o:spid="_x0000_s1027" style="position:absolute;width:1945;height:91257;visibility:visible;mso-wrap-style:square;v-text-anchor:middle" o:gfxdata="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" fillcolor="#0e2841 [3215]" stroked="f" strokeweight="1.5pt"/>
                     <v:group id="Group 5" o:spid="_x0000_s1028" style="position:absolute;left:762;top:42100;width:20574;height:49103" coordorigin="806,42118" coordsize="13062,31210" o:gfxdata="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">
                       <v:group id="Group 6" o:spid="_x0000_s1029" style="position:absolute;left:1410;top:42118;width:10478;height:31210" coordorigin="1410,42118" coordsize="10477,31210" o:gfxdata="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">
@@ -3591,13 +3590,78 @@
             <w:spacing w:after="160" w:line="278" w:lineRule="auto"/>
           </w:pPr>
           <w:r>
+            <w:drawing>
+              <wp:anchor distT="0" distB="0" distL="114300" distR="114300" simplePos="0" relativeHeight="251663360" behindDoc="1" locked="0" layoutInCell="1" allowOverlap="1" wp14:anchorId="56C5BC46" wp14:editId="52D293E3">
+                <wp:simplePos x="0" y="0"/>
+                <wp:positionH relativeFrom="column">
+                  <wp:posOffset>2503805</wp:posOffset>
+                </wp:positionH>
+                <wp:positionV relativeFrom="paragraph">
+                  <wp:posOffset>4509770</wp:posOffset>
+                </wp:positionV>
+                <wp:extent cx="2525395" cy="1162050"/>
+                <wp:effectExtent l="0" t="0" r="8255" b="0"/>
+                <wp:wrapTight wrapText="bothSides">
+                  <wp:wrapPolygon edited="0">
+                    <wp:start x="0" y="0"/>
+                    <wp:lineTo x="0" y="21246"/>
+                    <wp:lineTo x="21508" y="21246"/>
+                    <wp:lineTo x="21508" y="0"/>
+                    <wp:lineTo x="0" y="0"/>
+                  </wp:wrapPolygon>
+                </wp:wrapTight>
+                <wp:docPr id="562658478" name="Picture 1"/>
+                <wp:cNvGraphicFramePr>
+                  <a:graphicFrameLocks xmlns:a="http://schemas.openxmlformats.org/drawingml/2006/main" noChangeAspect="1"/>
+                </wp:cNvGraphicFramePr>
+                <a:graphic xmlns:a="http://schemas.openxmlformats.org/drawingml/2006/main">
+                  <a:graphicData uri="http://schemas.openxmlformats.org/drawingml/2006/picture">
+                    <pic:pic xmlns:pic="http://schemas.openxmlformats.org/drawingml/2006/picture">
+                      <pic:nvPicPr>
+                        <pic:cNvPr id="562658478" name=""/>
+                        <pic:cNvPicPr/>
+                      </pic:nvPicPr>
+                      <pic:blipFill>
+                        <a:blip r:embed="rId9" cstate="print">
+                          <a:extLst>
+                            <a:ext uri="{28A0092B-C50C-407E-A947-70E740481C1C}">
+                              <a14:useLocalDpi xmlns:a14="http://schemas.microsoft.com/office/drawing/2010/main" val="0"/>
+                            </a:ext>
+                          </a:extLst>
+                        </a:blip>
+                        <a:stretch>
+                          <a:fillRect/>
+                        </a:stretch>
+                      </pic:blipFill>
+                      <pic:spPr>
+                        <a:xfrm>
+                          <a:off x="0" y="0"/>
+                          <a:ext cx="2525395" cy="1162050"/>
+                        </a:xfrm>
+                        <a:prstGeom prst="rect">
+                          <a:avLst/>
+                        </a:prstGeom>
+                      </pic:spPr>
+                    </pic:pic>
+                  </a:graphicData>
+                </a:graphic>
+                <wp14:sizeRelH relativeFrom="margin">
+                  <wp14:pctWidth>0</wp14:pctWidth>
+                </wp14:sizeRelH>
+                <wp14:sizeRelV relativeFrom="margin">
+                  <wp14:pctHeight>0</wp14:pctHeight>
+                </wp14:sizeRelV>
+              </wp:anchor>
+            </w:drawing>
+          </w:r>
+          <w:r>
             <w:rPr>
               <w:noProof/>
             </w:rPr>
             <mc:AlternateContent>
               <mc:Choice Requires="wps">
                 <w:drawing>
-                  <wp:anchor distT="0" distB="0" distL="114300" distR="114300" simplePos="0" relativeHeight="251660288" behindDoc="0" locked="0" layoutInCell="1" allowOverlap="1" wp14:anchorId="3BA73E4B" wp14:editId="5A2B98B0">
+                  <wp:anchor distT="0" distB="0" distL="114300" distR="114300" simplePos="0" relativeHeight="251660288" behindDoc="0" locked="0" layoutInCell="1" allowOverlap="1" wp14:anchorId="3BA73E4B" wp14:editId="64A8A0A8">
                     <wp:simplePos x="0" y="0"/>
                     <wp:positionH relativeFrom="margin">
                       <wp:align>right</wp:align>
@@ -3605,8 +3669,8 @@
                     <wp:positionV relativeFrom="page">
                       <wp:posOffset>1866899</wp:posOffset>
                     </wp:positionV>
-                    <wp:extent cx="4152900" cy="7305675"/>
-                    <wp:effectExtent l="0" t="0" r="0" b="9525"/>
+                    <wp:extent cx="4152900" cy="4838700"/>
+                    <wp:effectExtent l="0" t="0" r="0" b="0"/>
                     <wp:wrapNone/>
                     <wp:docPr id="1" name="Text Box 30"/>
                     <wp:cNvGraphicFramePr/>
@@ -3617,7 +3681,7 @@
                           <wps:spPr>
                             <a:xfrm>
                               <a:off x="0" y="0"/>
-                              <a:ext cx="4152900" cy="7305675"/>
+                              <a:ext cx="4152900" cy="4838700"/>
                             </a:xfrm>
                             <a:prstGeom prst="rect">
                               <a:avLst/>
@@ -3646,13 +3710,77 @@
                             <w:txbxContent>
                               <w:p>
                                 <w:pPr>
-                                  <w:spacing w:before="120"/>
+                                  <w:pStyle w:val="Title"/>
+                                </w:pPr>
+                                <w:r>
+                                  <w:t>IT510 Capstone Semester 2 Year 2026</w:t>
+                                </w:r>
+                              </w:p>
+                              <w:p>
+                                <w:pPr>
+                                  <w:pStyle w:val="Subtitle"/>
                                   <w:rPr>
-                                    <w:color w:val="404040" w:themeColor="text1" w:themeTint="BF"/>
-                                    <w:sz w:val="36"/>
-                                    <w:szCs w:val="36"/>
+                                    <w:lang w:val="en-US"/>
                                   </w:rPr>
                                 </w:pPr>
+                                <w:r>
+                                  <w:rPr>
+                                    <w:lang w:val="en-US"/>
+                                  </w:rPr>
+                                  <w:t>AI vs Legacy Digital Forensics Tools – A comparative Efficacy analysis</w:t>
+                                </w:r>
+                              </w:p>
+                              <w:p>
+                                <w:pPr>
+                                  <w:pStyle w:val="Subtitle"/>
+                                  <w:rPr>
+                                    <w:lang w:val="en-US"/>
+                                  </w:rPr>
+                                </w:pPr>
+                                <w:r>
+                                  <w:rPr>
+                                    <w:lang w:val="en-US"/>
+                                  </w:rPr>
+                                  <w:t>Byte Harbor Butchers</w:t>
+                                </w:r>
+                              </w:p>
+                              <w:p>
+                                <w:pPr>
+                                  <w:pStyle w:val="Subtitle"/>
+                                  <w:rPr>
+                                    <w:lang w:val="en-US"/>
+                                  </w:rPr>
+                                </w:pPr>
+                                <w:r>
+                                  <w:rPr>
+                                    <w:lang w:val="en-US"/>
+                                  </w:rPr>
+                                  <w:t>Dave Sushames, Olivia Hey, Matt Baker, Sam Davies</w:t>
+                                </w:r>
+                              </w:p>
+                              <w:p>
+                                <w:pPr>
+                                  <w:pStyle w:val="Subtitle"/>
+                                </w:pPr>
+                                <w:r>
+                                  <w:t xml:space="preserve">Geoff Gordon </w:t>
+                                </w:r>
+                              </w:p>
+                              <w:p>
+                                <w:pPr>
+                                  <w:pStyle w:val="Subtitle"/>
+                                  <w:rPr>
+                                    <w:lang w:val="en-US"/>
+                                  </w:rPr>
+                                </w:pPr>
+                                <w:r>
+                                  <w:t xml:space="preserve">Whitireia and </w:t>
+                                </w:r>
+                                <w:proofErr w:type="spellStart"/>
+                                <w:r>
+                                  <w:t>WelTec</w:t>
+                                </w:r>
+                                <w:proofErr w:type="spellEnd"/>
                               </w:p>
                             </w:txbxContent>
                           </wps:txbx>
@@ -3676,18 +3804,82 @@
               </mc:Choice>
               <mc:Fallback>
                 <w:pict>
-                  <v:shape w14:anchorId="3BA73E4B" id="Text Box 30" o:spid="_x0000_s1027" type="#_x0000_t202" style="position:absolute;margin-left:275.8pt;margin-top:147pt;width:327pt;height:575.25pt;z-index:251660288;visibility:visible;mso-wrap-style:square;mso-width-percent:0;mso-height-percent:0;mso-wrap-distance-left:9pt;mso-wrap-distance-top:0;mso-wrap-distance-right:9pt;mso-wrap-distance-bottom:0;mso-position-horizontal:right;mso-position-horizontal-relative:margin;mso-position-vertical:absolute;mso-position-vertical-relative:page;mso-width-percent:0;mso-height-percent:0;mso-width-relative:page;mso-height-relative:margin;v-text-anchor:top" o:gfxdata="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" filled="f" stroked="f" strokeweight=".5pt">
+                  <v:shape w14:anchorId="3BA73E4B" id="Text Box 30" o:spid="_x0000_s1027" type="#_x0000_t202" style="position:absolute;margin-left:275.8pt;margin-top:147pt;width:327pt;height:381pt;z-index:251660288;visibility:visible;mso-wrap-style:square;mso-width-percent:0;mso-height-percent:0;mso-wrap-distance-left:9pt;mso-wrap-distance-top:0;mso-wrap-distance-right:9pt;mso-wrap-distance-bottom:0;mso-position-horizontal:right;mso-position-horizontal-relative:margin;mso-position-vertical:absolute;mso-position-vertical-relative:page;mso-width-percent:0;mso-height-percent:0;mso-width-relative:page;mso-height-relative:margin;v-text-anchor:top" o:gfxdata="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" filled="f" stroked="f" strokeweight=".5pt">
                     <v:textbox inset="0,0,0,0">
                       <w:txbxContent>
                         <w:p>
                           <w:pPr>
-                            <w:spacing w:before="120"/>
+                            <w:pStyle w:val="Title"/>
+                          </w:pPr>
+                          <w:r>
+                            <w:t>IT510 Capstone Semester 2 Year 2026</w:t>
+                          </w:r>
+                        </w:p>
+                        <w:p>
+                          <w:pPr>
+                            <w:pStyle w:val="Subtitle"/>
                             <w:rPr>
-                              <w:color w:val="404040" w:themeColor="text1" w:themeTint="BF"/>
-                              <w:sz w:val="36"/>
-                              <w:szCs w:val="36"/>
+                              <w:lang w:val="en-US"/>
                             </w:rPr>
                           </w:pPr>
+                          <w:r>
+                            <w:rPr>
+                              <w:lang w:val="en-US"/>
+                            </w:rPr>
+                            <w:t>AI vs Legacy Digital Forensics Tools – A comparative Efficacy analysis</w:t>
+                          </w:r>
+                        </w:p>
+                        <w:p>
+                          <w:pPr>
+                            <w:pStyle w:val="Subtitle"/>
+                            <w:rPr>
+                              <w:lang w:val="en-US"/>
+                            </w:rPr>
+                          </w:pPr>
+                          <w:r>
+                            <w:rPr>
+                              <w:lang w:val="en-US"/>
+                            </w:rPr>
+                            <w:t>Byte Harbor Butchers</w:t>
+                          </w:r>
+                        </w:p>
+                        <w:p>
+                          <w:pPr>
+                            <w:pStyle w:val="Subtitle"/>
+                            <w:rPr>
+                              <w:lang w:val="en-US"/>
+                            </w:rPr>
+                          </w:pPr>
+                          <w:r>
+                            <w:rPr>
+                              <w:lang w:val="en-US"/>
+                            </w:rPr>
+                            <w:t>Dave Sushames, Olivia Hey, Matt Baker, Sam Davies</w:t>
+                          </w:r>
+                        </w:p>
+                        <w:p>
+                          <w:pPr>
+                            <w:pStyle w:val="Subtitle"/>
+                          </w:pPr>
+                          <w:r>
+                            <w:t xml:space="preserve">Geoff Gordon </w:t>
+                          </w:r>
+                        </w:p>
+                        <w:p>
+                          <w:pPr>
+                            <w:pStyle w:val="Subtitle"/>
+                            <w:rPr>
+                              <w:lang w:val="en-US"/>
+                            </w:rPr>
+                          </w:pPr>
+                          <w:r>
+                            <w:t xml:space="preserve">Whitireia and </w:t>
+                          </w:r>
+                          <w:proofErr w:type="spellStart"/>
+                          <w:r>
+                            <w:t>WelTec</w:t>
+                          </w:r>
+                          <w:proofErr w:type="spellEnd"/>
                         </w:p>
                       </w:txbxContent>
                     </v:textbox>
@@ -3761,7 +3953,7 @@
           <w:r>
             <w:fldChar w:fldCharType="separate"/>
           </w:r>
-          <w:hyperlink w:anchor="_Toc236991241" w:history="1">
+          <w:hyperlink w:anchor="_Toc236998454" w:history="1">
             <w:r>
               <w:rPr>
                 <w:rStyle w:val="Hyperlink"/>
@@ -3788,7 +3980,7 @@
                 <w:noProof/>
                 <w:webHidden/>
               </w:rPr>
-              <w:instrText xml:space="preserve"> PAGEREF _Toc236991241 \h </w:instrText>
+              <w:instrText xml:space="preserve"> PAGEREF _Toc236998454 \h </w:instrText>
             </w:r>
             <w:r>
               <w:rPr>
@@ -3835,7 +4027,7 @@
               <w14:ligatures w14:val="standardContextual"/>
             </w:rPr>
           </w:pPr>
-          <w:hyperlink w:anchor="_Toc236991242" w:history="1">
+          <w:hyperlink w:anchor="_Toc236998455" w:history="1">
             <w:r>
               <w:rPr>
                 <w:rStyle w:val="Hyperlink"/>
@@ -3862,7 +4054,7 @@
                 <w:noProof/>
                 <w:webHidden/>
               </w:rPr>
-              <w:instrText xml:space="preserve"> PAGEREF _Toc236991242 \h </w:instrText>
+              <w:instrText xml:space="preserve"> PAGEREF _Toc236998455 \h </w:instrText>
             </w:r>
             <w:r>
               <w:rPr>
@@ -3909,7 +4101,7 @@
               <w14:ligatures w14:val="standardContextual"/>
             </w:rPr>
           </w:pPr>
-          <w:hyperlink w:anchor="_Toc236991243" w:history="1">
+          <w:hyperlink w:anchor="_Toc236998456" w:history="1">
             <w:r>
               <w:rPr>
                 <w:rStyle w:val="Hyperlink"/>
@@ -3936,7 +4128,7 @@
                 <w:noProof/>
                 <w:webHidden/>
               </w:rPr>
-              <w:instrText xml:space="preserve"> PAGEREF _Toc236991243 \h </w:instrText>
+              <w:instrText xml:space="preserve"> PAGEREF _Toc236998456 \h </w:instrText>
             </w:r>
             <w:r>
               <w:rPr>
@@ -3983,7 +4175,7 @@
               <w14:ligatures w14:val="standardContextual"/>
             </w:rPr>
           </w:pPr>
-          <w:hyperlink w:anchor="_Toc236991244" w:history="1">
+          <w:hyperlink w:anchor="_Toc236998457" w:history="1">
             <w:r>
               <w:rPr>
                 <w:rStyle w:val="Hyperlink"/>
@@ -4010,7 +4202,7 @@
                 <w:noProof/>
                 <w:webHidden/>
               </w:rPr>
-              <w:instrText xml:space="preserve"> PAGEREF _Toc236991244 \h </w:instrText>
+              <w:instrText xml:space="preserve"> PAGEREF _Toc236998457 \h </w:instrText>
             </w:r>
             <w:r>
               <w:rPr>
@@ -4057,7 +4249,7 @@
               <w14:ligatures w14:val="standardContextual"/>
             </w:rPr>
           </w:pPr>
-          <w:hyperlink w:anchor="_Toc236991245" w:history="1">
+          <w:hyperlink w:anchor="_Toc236998458" w:history="1">
             <w:r>
               <w:rPr>
                 <w:rStyle w:val="Hyperlink"/>
@@ -4084,7 +4276,7 @@
                 <w:noProof/>
                 <w:webHidden/>
               </w:rPr>
-              <w:instrText xml:space="preserve"> PAGEREF _Toc236991245 \h </w:instrText>
+              <w:instrText xml:space="preserve"> PAGEREF _Toc236998458 \h </w:instrText>
             </w:r>
             <w:r>
               <w:rPr>
@@ -4131,7 +4323,7 @@
               <w14:ligatures w14:val="standardContextual"/>
             </w:rPr>
           </w:pPr>
-          <w:hyperlink w:anchor="_Toc236991246" w:history="1">
+          <w:hyperlink w:anchor="_Toc236998459" w:history="1">
             <w:r>
               <w:rPr>
                 <w:rStyle w:val="Hyperlink"/>
@@ -4158,7 +4350,7 @@
                 <w:noProof/>
                 <w:webHidden/>
               </w:rPr>
-              <w:instrText xml:space="preserve"> PAGEREF _Toc236991246 \h </w:instrText>
+              <w:instrText xml:space="preserve"> PAGEREF _Toc236998459 \h </w:instrText>
             </w:r>
             <w:r>
               <w:rPr>
@@ -4178,7 +4370,7 @@
                 <w:noProof/>
                 <w:webHidden/>
               </w:rPr>
-              <w:t>2</w:t>
+              <w:t>3</w:t>
             </w:r>
             <w:r>
               <w:rPr>
@@ -4205,7 +4397,7 @@
               <w14:ligatures w14:val="standardContextual"/>
             </w:rPr>
           </w:pPr>
-          <w:hyperlink w:anchor="_Toc236991247" w:history="1">
+          <w:hyperlink w:anchor="_Toc236998460" w:history="1">
             <w:r>
               <w:rPr>
                 <w:rStyle w:val="Hyperlink"/>
@@ -4232,7 +4424,7 @@
                 <w:noProof/>
                 <w:webHidden/>
               </w:rPr>
-              <w:instrText xml:space="preserve"> PAGEREF _Toc236991247 \h </w:instrText>
+              <w:instrText xml:space="preserve"> PAGEREF _Toc236998460 \h </w:instrText>
             </w:r>
             <w:r>
               <w:rPr>
@@ -4279,7 +4471,7 @@
               <w14:ligatures w14:val="standardContextual"/>
             </w:rPr>
           </w:pPr>
-          <w:hyperlink w:anchor="_Toc236991248" w:history="1">
+          <w:hyperlink w:anchor="_Toc236998461" w:history="1">
             <w:r>
               <w:rPr>
                 <w:rStyle w:val="Hyperlink"/>
@@ -4306,7 +4498,155 @@
                 <w:noProof/>
                 <w:webHidden/>
               </w:rPr>
-              <w:instrText xml:space="preserve"> PAGEREF _Toc236991248 \h </w:instrText>
+              <w:instrText xml:space="preserve"> PAGEREF _Toc236998461 \h </w:instrText>
+            </w:r>
+            <w:r>
+              <w:rPr>
+                <w:noProof/>
+                <w:webHidden/>
+              </w:rPr>
+            </w:r>
+            <w:r>
+              <w:rPr>
+                <w:noProof/>
+                <w:webHidden/>
+              </w:rPr>
+              <w:fldChar w:fldCharType="separate"/>
+            </w:r>
+            <w:r>
+              <w:rPr>
+                <w:noProof/>
+                <w:webHidden/>
+              </w:rPr>
+              <w:t>4</w:t>
+            </w:r>
+            <w:r>
+              <w:rPr>
+                <w:noProof/>
+                <w:webHidden/>
+              </w:rPr>
+              <w:fldChar w:fldCharType="end"/>
+            </w:r>
+          </w:hyperlink>
+        </w:p>
+        <w:p>
+          <w:pPr>
+            <w:pStyle w:val="TOC3"/>
+            <w:tabs>
+              <w:tab w:val="right" w:leader="dot" w:pos="10456"/>
+            </w:tabs>
+            <w:rPr>
+              <w:rFonts w:asciiTheme="minorHAnsi" w:eastAsiaTheme="minorEastAsia" w:hAnsiTheme="minorHAnsi"/>
+              <w:noProof/>
+              <w:kern w:val="2"/>
+              <w:sz w:val="24"/>
+              <w:szCs w:val="24"/>
+              <w:lang w:val="en-NZ" w:eastAsia="en-NZ"/>
+              <w14:ligatures w14:val="standardContextual"/>
+            </w:rPr>
+          </w:pPr>
+          <w:hyperlink w:anchor="_Toc236998462" w:history="1">
+            <w:r>
+              <w:rPr>
+                <w:rStyle w:val="Hyperlink"/>
+                <w:noProof/>
+              </w:rPr>
+              <w:t>Kanban</w:t>
+            </w:r>
+            <w:r>
+              <w:rPr>
+                <w:noProof/>
+                <w:webHidden/>
+              </w:rPr>
+              <w:tab/>
+            </w:r>
+            <w:r>
+              <w:rPr>
+                <w:noProof/>
+                <w:webHidden/>
+              </w:rPr>
+              <w:fldChar w:fldCharType="begin"/>
+            </w:r>
+            <w:r>
+              <w:rPr>
+                <w:noProof/>
+                <w:webHidden/>
+              </w:rPr>
+              <w:instrText xml:space="preserve"> PAGEREF _Toc236998462 \h </w:instrText>
+            </w:r>
+            <w:r>
+              <w:rPr>
+                <w:noProof/>
+                <w:webHidden/>
+              </w:rPr>
+            </w:r>
+            <w:r>
+              <w:rPr>
+                <w:noProof/>
+                <w:webHidden/>
+              </w:rPr>
+              <w:fldChar w:fldCharType="separate"/>
+            </w:r>
+            <w:r>
+              <w:rPr>
+                <w:noProof/>
+                <w:webHidden/>
+              </w:rPr>
+              <w:t>4</w:t>
+            </w:r>
+            <w:r>
+              <w:rPr>
+                <w:noProof/>
+                <w:webHidden/>
+              </w:rPr>
+              <w:fldChar w:fldCharType="end"/>
+            </w:r>
+          </w:hyperlink>
+        </w:p>
+        <w:p>
+          <w:pPr>
+            <w:pStyle w:val="TOC3"/>
+            <w:tabs>
+              <w:tab w:val="right" w:leader="dot" w:pos="10456"/>
+            </w:tabs>
+            <w:rPr>
+              <w:rFonts w:asciiTheme="minorHAnsi" w:eastAsiaTheme="minorEastAsia" w:hAnsiTheme="minorHAnsi"/>
+              <w:noProof/>
+              <w:kern w:val="2"/>
+              <w:sz w:val="24"/>
+              <w:szCs w:val="24"/>
+              <w:lang w:val="en-NZ" w:eastAsia="en-NZ"/>
+              <w14:ligatures w14:val="standardContextual"/>
+            </w:rPr>
+          </w:pPr>
+          <w:hyperlink w:anchor="_Toc236998463" w:history="1">
+            <w:r>
+              <w:rPr>
+                <w:rStyle w:val="Hyperlink"/>
+                <w:noProof/>
+              </w:rPr>
+              <w:t>NIST CTFF</w:t>
+            </w:r>
+            <w:r>
+              <w:rPr>
+                <w:noProof/>
+                <w:webHidden/>
+              </w:rPr>
+              <w:tab/>
+            </w:r>
+            <w:r>
+              <w:rPr>
+                <w:noProof/>
+                <w:webHidden/>
+              </w:rPr>
+              <w:fldChar w:fldCharType="begin"/>
+            </w:r>
+            <w:r>
+              <w:rPr>
+                <w:noProof/>
+                <w:webHidden/>
+              </w:rPr>
+              <w:instrText xml:space="preserve"> PAGEREF _Toc236998463 \h </w:instrText>
             </w:r>
             <w:r>
               <w:rPr>
@@ -4353,13 +4693,13 @@
               <w14:ligatures w14:val="standardContextual"/>
             </w:rPr>
           </w:pPr>
-          <w:hyperlink w:anchor="_Toc236991249" w:history="1">
+          <w:hyperlink w:anchor="_Toc236998464" w:history="1">
             <w:r>
               <w:rPr>
                 <w:rStyle w:val="Hyperlink"/>
                 <w:noProof/>
               </w:rPr>
-              <w:t>Kanban</w:t>
+              <w:t>Technologies</w:t>
             </w:r>
             <w:r>
               <w:rPr>
@@ -4380,7 +4720,7 @@
                 <w:noProof/>
                 <w:webHidden/>
               </w:rPr>
-              <w:instrText xml:space="preserve"> PAGEREF _Toc236991249 \h </w:instrText>
+              <w:instrText xml:space="preserve"> PAGEREF _Toc236998464 \h </w:instrText>
             </w:r>
             <w:r>
               <w:rPr>
@@ -4427,13 +4767,13 @@
               <w14:ligatures w14:val="standardContextual"/>
             </w:rPr>
           </w:pPr>
-          <w:hyperlink w:anchor="_Toc236991250" w:history="1">
+          <w:hyperlink w:anchor="_Toc236998465" w:history="1">
             <w:r>
               <w:rPr>
                 <w:rStyle w:val="Hyperlink"/>
                 <w:noProof/>
               </w:rPr>
-              <w:t>Technologies</w:t>
+              <w:t>Project budget</w:t>
             </w:r>
             <w:r>
               <w:rPr>
@@ -4454,7 +4794,7 @@
                 <w:noProof/>
                 <w:webHidden/>
               </w:rPr>
-              <w:instrText xml:space="preserve"> PAGEREF _Toc236991250 \h </w:instrText>
+              <w:instrText xml:space="preserve"> PAGEREF _Toc236998465 \h </w:instrText>
             </w:r>
             <w:r>
               <w:rPr>
@@ -4475,6 +4815,80 @@
                 <w:webHidden/>
               </w:rPr>
               <w:t>4</w:t>
+            </w:r>
+            <w:r>
+              <w:rPr>
+                <w:noProof/>
+                <w:webHidden/>
+              </w:rPr>
+              <w:fldChar w:fldCharType="end"/>
+            </w:r>
+          </w:hyperlink>
+        </w:p>
+        <w:p>
+          <w:pPr>
+            <w:pStyle w:val="TOC1"/>
+            <w:tabs>
+              <w:tab w:val="right" w:leader="dot" w:pos="10456"/>
+            </w:tabs>
+            <w:rPr>
+              <w:rFonts w:asciiTheme="minorHAnsi" w:eastAsiaTheme="minorEastAsia" w:hAnsiTheme="minorHAnsi"/>
+              <w:noProof/>
+              <w:kern w:val="2"/>
+              <w:sz w:val="24"/>
+              <w:szCs w:val="24"/>
+              <w:lang w:val="en-NZ" w:eastAsia="en-NZ"/>
+              <w14:ligatures w14:val="standardContextual"/>
+            </w:rPr>
+          </w:pPr>
+          <w:hyperlink w:anchor="_Toc236998466" w:history="1">
+            <w:r>
+              <w:rPr>
+                <w:rStyle w:val="Hyperlink"/>
+                <w:noProof/>
+              </w:rPr>
+              <w:t>Project Personnel</w:t>
+            </w:r>
+            <w:r>
+              <w:rPr>
+                <w:noProof/>
+                <w:webHidden/>
+              </w:rPr>
+              <w:tab/>
+            </w:r>
+            <w:r>
+              <w:rPr>
+                <w:noProof/>
+                <w:webHidden/>
+              </w:rPr>
+              <w:fldChar w:fldCharType="begin"/>
+            </w:r>
+            <w:r>
+              <w:rPr>
+                <w:noProof/>
+                <w:webHidden/>
+              </w:rPr>
+              <w:instrText xml:space="preserve"> PAGEREF _Toc236998466 \h </w:instrText>
+            </w:r>
+            <w:r>
+              <w:rPr>
+                <w:noProof/>
+                <w:webHidden/>
+              </w:rPr>
+            </w:r>
+            <w:r>
+              <w:rPr>
+                <w:noProof/>
+                <w:webHidden/>
+              </w:rPr>
+              <w:fldChar w:fldCharType="separate"/>
+            </w:r>
+            <w:r>
+              <w:rPr>
+                <w:noProof/>
+                <w:webHidden/>
+              </w:rPr>
+              <w:t>5</w:t>
             </w:r>
             <w:r>
               <w:rPr>
@@ -4501,13 +4915,13 @@
               <w14:ligatures w14:val="standardContextual"/>
             </w:rPr>
           </w:pPr>
-          <w:hyperlink w:anchor="_Toc236991251" w:history="1">
+          <w:hyperlink w:anchor="_Toc236998467" w:history="1">
             <w:r>
               <w:rPr>
                 <w:rStyle w:val="Hyperlink"/>
                 <w:noProof/>
               </w:rPr>
-              <w:t>Project budget</w:t>
+              <w:t>Client details including organisation</w:t>
             </w:r>
             <w:r>
               <w:rPr>
@@ -4528,7 +4942,7 @@
                 <w:noProof/>
                 <w:webHidden/>
               </w:rPr>
-              <w:instrText xml:space="preserve"> PAGEREF _Toc236991251 \h </w:instrText>
+              <w:instrText xml:space="preserve"> PAGEREF _Toc236998467 \h </w:instrText>
             </w:r>
             <w:r>
               <w:rPr>
@@ -4548,7 +4962,377 @@
                 <w:noProof/>
                 <w:webHidden/>
               </w:rPr>
-              <w:t>4</w:t>
+              <w:t>5</w:t>
+            </w:r>
+            <w:r>
+              <w:rPr>
+                <w:noProof/>
+                <w:webHidden/>
+              </w:rPr>
+              <w:fldChar w:fldCharType="end"/>
+            </w:r>
+          </w:hyperlink>
+        </w:p>
+        <w:p>
+          <w:pPr>
+            <w:pStyle w:val="TOC2"/>
+            <w:tabs>
+              <w:tab w:val="right" w:leader="dot" w:pos="10456"/>
+            </w:tabs>
+            <w:rPr>
+              <w:rFonts w:asciiTheme="minorHAnsi" w:eastAsiaTheme="minorEastAsia" w:hAnsiTheme="minorHAnsi"/>
+              <w:noProof/>
+              <w:kern w:val="2"/>
+              <w:sz w:val="24"/>
+              <w:szCs w:val="24"/>
+              <w:lang w:val="en-NZ" w:eastAsia="en-NZ"/>
+              <w14:ligatures w14:val="standardContextual"/>
+            </w:rPr>
+          </w:pPr>
+          <w:hyperlink w:anchor="_Toc236998468" w:history="1">
+            <w:r>
+              <w:rPr>
+                <w:rStyle w:val="Hyperlink"/>
+                <w:noProof/>
+              </w:rPr>
+              <w:t>Group Members</w:t>
+            </w:r>
+            <w:r>
+              <w:rPr>
+                <w:noProof/>
+                <w:webHidden/>
+              </w:rPr>
+              <w:tab/>
+            </w:r>
+            <w:r>
+              <w:rPr>
+                <w:noProof/>
+                <w:webHidden/>
+              </w:rPr>
+              <w:fldChar w:fldCharType="begin"/>
+            </w:r>
+            <w:r>
+              <w:rPr>
+                <w:noProof/>
+                <w:webHidden/>
+              </w:rPr>
+              <w:instrText xml:space="preserve"> PAGEREF _Toc236998468 \h </w:instrText>
+            </w:r>
+            <w:r>
+              <w:rPr>
+                <w:noProof/>
+                <w:webHidden/>
+              </w:rPr>
+            </w:r>
+            <w:r>
+              <w:rPr>
+                <w:noProof/>
+                <w:webHidden/>
+              </w:rPr>
+              <w:fldChar w:fldCharType="separate"/>
+            </w:r>
+            <w:r>
+              <w:rPr>
+                <w:noProof/>
+                <w:webHidden/>
+              </w:rPr>
+              <w:t>5</w:t>
+            </w:r>
+            <w:r>
+              <w:rPr>
+                <w:noProof/>
+                <w:webHidden/>
+              </w:rPr>
+              <w:fldChar w:fldCharType="end"/>
+            </w:r>
+          </w:hyperlink>
+        </w:p>
+        <w:p>
+          <w:pPr>
+            <w:pStyle w:val="TOC2"/>
+            <w:tabs>
+              <w:tab w:val="right" w:leader="dot" w:pos="10456"/>
+            </w:tabs>
+            <w:rPr>
+              <w:rFonts w:asciiTheme="minorHAnsi" w:eastAsiaTheme="minorEastAsia" w:hAnsiTheme="minorHAnsi"/>
+              <w:noProof/>
+              <w:kern w:val="2"/>
+              <w:sz w:val="24"/>
+              <w:szCs w:val="24"/>
+              <w:lang w:val="en-NZ" w:eastAsia="en-NZ"/>
+              <w14:ligatures w14:val="standardContextual"/>
+            </w:rPr>
+          </w:pPr>
+          <w:hyperlink w:anchor="_Toc236998469" w:history="1">
+            <w:r>
+              <w:rPr>
+                <w:rStyle w:val="Hyperlink"/>
+                <w:noProof/>
+              </w:rPr>
+              <w:t>Project Advisor</w:t>
+            </w:r>
+            <w:r>
+              <w:rPr>
+                <w:noProof/>
+                <w:webHidden/>
+              </w:rPr>
+              <w:tab/>
+            </w:r>
+            <w:r>
+              <w:rPr>
+                <w:noProof/>
+                <w:webHidden/>
+              </w:rPr>
+              <w:fldChar w:fldCharType="begin"/>
+            </w:r>
+            <w:r>
+              <w:rPr>
+                <w:noProof/>
+                <w:webHidden/>
+              </w:rPr>
+              <w:instrText xml:space="preserve"> PAGEREF _Toc236998469 \h </w:instrText>
+            </w:r>
+            <w:r>
+              <w:rPr>
+                <w:noProof/>
+                <w:webHidden/>
+              </w:rPr>
+            </w:r>
+            <w:r>
+              <w:rPr>
+                <w:noProof/>
+                <w:webHidden/>
+              </w:rPr>
+              <w:fldChar w:fldCharType="separate"/>
+            </w:r>
+            <w:r>
+              <w:rPr>
+                <w:noProof/>
+                <w:webHidden/>
+              </w:rPr>
+              <w:t>5</w:t>
+            </w:r>
+            <w:r>
+              <w:rPr>
+                <w:noProof/>
+                <w:webHidden/>
+              </w:rPr>
+              <w:fldChar w:fldCharType="end"/>
+            </w:r>
+          </w:hyperlink>
+        </w:p>
+        <w:p>
+          <w:pPr>
+            <w:pStyle w:val="TOC3"/>
+            <w:tabs>
+              <w:tab w:val="right" w:leader="dot" w:pos="10456"/>
+            </w:tabs>
+            <w:rPr>
+              <w:rFonts w:asciiTheme="minorHAnsi" w:eastAsiaTheme="minorEastAsia" w:hAnsiTheme="minorHAnsi"/>
+              <w:noProof/>
+              <w:kern w:val="2"/>
+              <w:sz w:val="24"/>
+              <w:szCs w:val="24"/>
+              <w:lang w:val="en-NZ" w:eastAsia="en-NZ"/>
+              <w14:ligatures w14:val="standardContextual"/>
+            </w:rPr>
+          </w:pPr>
+          <w:hyperlink w:anchor="_Toc236998470" w:history="1">
+            <w:r>
+              <w:rPr>
+                <w:rStyle w:val="Hyperlink"/>
+                <w:noProof/>
+              </w:rPr>
+              <w:t>Communication plan</w:t>
+            </w:r>
+            <w:r>
+              <w:rPr>
+                <w:noProof/>
+                <w:webHidden/>
+              </w:rPr>
+              <w:tab/>
+            </w:r>
+            <w:r>
+              <w:rPr>
+                <w:noProof/>
+                <w:webHidden/>
+              </w:rPr>
+              <w:fldChar w:fldCharType="begin"/>
+            </w:r>
+            <w:r>
+              <w:rPr>
+                <w:noProof/>
+                <w:webHidden/>
+              </w:rPr>
+              <w:instrText xml:space="preserve"> PAGEREF _Toc236998470 \h </w:instrText>
+            </w:r>
+            <w:r>
+              <w:rPr>
+                <w:noProof/>
+                <w:webHidden/>
+              </w:rPr>
+            </w:r>
+            <w:r>
+              <w:rPr>
+                <w:noProof/>
+                <w:webHidden/>
+              </w:rPr>
+              <w:fldChar w:fldCharType="separate"/>
+            </w:r>
+            <w:r>
+              <w:rPr>
+                <w:noProof/>
+                <w:webHidden/>
+              </w:rPr>
+              <w:t>5</w:t>
+            </w:r>
+            <w:r>
+              <w:rPr>
+                <w:noProof/>
+                <w:webHidden/>
+              </w:rPr>
+              <w:fldChar w:fldCharType="end"/>
+            </w:r>
+          </w:hyperlink>
+        </w:p>
+        <w:p>
+          <w:pPr>
+            <w:pStyle w:val="TOC2"/>
+            <w:tabs>
+              <w:tab w:val="right" w:leader="dot" w:pos="10456"/>
+            </w:tabs>
+            <w:rPr>
+              <w:rFonts w:asciiTheme="minorHAnsi" w:eastAsiaTheme="minorEastAsia" w:hAnsiTheme="minorHAnsi"/>
+              <w:noProof/>
+              <w:kern w:val="2"/>
+              <w:sz w:val="24"/>
+              <w:szCs w:val="24"/>
+              <w:lang w:val="en-NZ" w:eastAsia="en-NZ"/>
+              <w14:ligatures w14:val="standardContextual"/>
+            </w:rPr>
+          </w:pPr>
+          <w:hyperlink w:anchor="_Toc236998471" w:history="1">
+            <w:r>
+              <w:rPr>
+                <w:rStyle w:val="Hyperlink"/>
+                <w:noProof/>
+              </w:rPr>
+              <w:t>General Conflict of Interest statement</w:t>
+            </w:r>
+            <w:r>
+              <w:rPr>
+                <w:noProof/>
+                <w:webHidden/>
+              </w:rPr>
+              <w:tab/>
+            </w:r>
+            <w:r>
+              <w:rPr>
+                <w:noProof/>
+                <w:webHidden/>
+              </w:rPr>
+              <w:fldChar w:fldCharType="begin"/>
+            </w:r>
+            <w:r>
+              <w:rPr>
+                <w:noProof/>
+                <w:webHidden/>
+              </w:rPr>
+              <w:instrText xml:space="preserve"> PAGEREF _Toc236998471 \h </w:instrText>
+            </w:r>
+            <w:r>
+              <w:rPr>
+                <w:noProof/>
+                <w:webHidden/>
+              </w:rPr>
+            </w:r>
+            <w:r>
+              <w:rPr>
+                <w:noProof/>
+                <w:webHidden/>
+              </w:rPr>
+              <w:fldChar w:fldCharType="separate"/>
+            </w:r>
+            <w:r>
+              <w:rPr>
+                <w:noProof/>
+                <w:webHidden/>
+              </w:rPr>
+              <w:t>6</w:t>
+            </w:r>
+            <w:r>
+              <w:rPr>
+                <w:noProof/>
+                <w:webHidden/>
+              </w:rPr>
+              <w:fldChar w:fldCharType="end"/>
+            </w:r>
+          </w:hyperlink>
+        </w:p>
+        <w:p>
+          <w:pPr>
+            <w:pStyle w:val="TOC2"/>
+            <w:tabs>
+              <w:tab w:val="right" w:leader="dot" w:pos="10456"/>
+            </w:tabs>
+            <w:rPr>
+              <w:rFonts w:asciiTheme="minorHAnsi" w:eastAsiaTheme="minorEastAsia" w:hAnsiTheme="minorHAnsi"/>
+              <w:noProof/>
+              <w:kern w:val="2"/>
+              <w:sz w:val="24"/>
+              <w:szCs w:val="24"/>
+              <w:lang w:val="en-NZ" w:eastAsia="en-NZ"/>
+              <w14:ligatures w14:val="standardContextual"/>
+            </w:rPr>
+          </w:pPr>
+          <w:hyperlink w:anchor="_Toc236998472" w:history="1">
+            <w:r>
+              <w:rPr>
+                <w:rStyle w:val="Hyperlink"/>
+                <w:noProof/>
+              </w:rPr>
+              <w:t>RACI assessment matrix</w:t>
+            </w:r>
+            <w:r>
+              <w:rPr>
+                <w:noProof/>
+                <w:webHidden/>
+              </w:rPr>
+              <w:tab/>
+            </w:r>
+            <w:r>
+              <w:rPr>
+                <w:noProof/>
+                <w:webHidden/>
+              </w:rPr>
+              <w:fldChar w:fldCharType="begin"/>
+            </w:r>
+            <w:r>
+              <w:rPr>
+                <w:noProof/>
+                <w:webHidden/>
+              </w:rPr>
+              <w:instrText xml:space="preserve"> PAGEREF _Toc236998472 \h </w:instrText>
+            </w:r>
+            <w:r>
+              <w:rPr>
+                <w:noProof/>
+                <w:webHidden/>
+              </w:rPr>
+            </w:r>
+            <w:r>
+              <w:rPr>
+                <w:noProof/>
+                <w:webHidden/>
+              </w:rPr>
+              <w:fldChar w:fldCharType="separate"/>
+            </w:r>
+            <w:r>
+              <w:rPr>
+                <w:noProof/>
+                <w:webHidden/>
+              </w:rPr>
+              <w:t>6</w:t>
             </w:r>
             <w:r>
               <w:rPr>
@@ -4575,13 +5359,13 @@
               <w14:ligatures w14:val="standardContextual"/>
             </w:rPr>
           </w:pPr>
-          <w:hyperlink w:anchor="_Toc236991252" w:history="1">
+          <w:hyperlink w:anchor="_Toc236998473" w:history="1">
             <w:r>
               <w:rPr>
                 <w:rStyle w:val="Hyperlink"/>
                 <w:noProof/>
               </w:rPr>
-              <w:t>Project Personnel</w:t>
+              <w:t>Project timeline and milestones</w:t>
             </w:r>
             <w:r>
               <w:rPr>
@@ -4602,7 +5386,7 @@
                 <w:noProof/>
                 <w:webHidden/>
               </w:rPr>
-              <w:instrText xml:space="preserve"> PAGEREF _Toc236991252 \h </w:instrText>
+              <w:instrText xml:space="preserve"> PAGEREF _Toc236998473 \h </w:instrText>
             </w:r>
             <w:r>
               <w:rPr>
@@ -4622,7 +5406,229 @@
                 <w:noProof/>
                 <w:webHidden/>
               </w:rPr>
-              <w:t>5</w:t>
+              <w:t>8</w:t>
+            </w:r>
+            <w:r>
+              <w:rPr>
+                <w:noProof/>
+                <w:webHidden/>
+              </w:rPr>
+              <w:fldChar w:fldCharType="end"/>
+            </w:r>
+          </w:hyperlink>
+        </w:p>
+        <w:p>
+          <w:pPr>
+            <w:pStyle w:val="TOC1"/>
+            <w:tabs>
+              <w:tab w:val="right" w:leader="dot" w:pos="10456"/>
+            </w:tabs>
+            <w:rPr>
+              <w:rFonts w:asciiTheme="minorHAnsi" w:eastAsiaTheme="minorEastAsia" w:hAnsiTheme="minorHAnsi"/>
+              <w:noProof/>
+              <w:kern w:val="2"/>
+              <w:sz w:val="24"/>
+              <w:szCs w:val="24"/>
+              <w:lang w:val="en-NZ" w:eastAsia="en-NZ"/>
+              <w14:ligatures w14:val="standardContextual"/>
+            </w:rPr>
+          </w:pPr>
+          <w:hyperlink w:anchor="_Toc236998474" w:history="1">
+            <w:r>
+              <w:rPr>
+                <w:rStyle w:val="Hyperlink"/>
+                <w:noProof/>
+              </w:rPr>
+              <w:t>Project Risk Analysis</w:t>
+            </w:r>
+            <w:r>
+              <w:rPr>
+                <w:noProof/>
+                <w:webHidden/>
+              </w:rPr>
+              <w:tab/>
+            </w:r>
+            <w:r>
+              <w:rPr>
+                <w:noProof/>
+                <w:webHidden/>
+              </w:rPr>
+              <w:fldChar w:fldCharType="begin"/>
+            </w:r>
+            <w:r>
+              <w:rPr>
+                <w:noProof/>
+                <w:webHidden/>
+              </w:rPr>
+              <w:instrText xml:space="preserve"> PAGEREF _Toc236998474 \h </w:instrText>
+            </w:r>
+            <w:r>
+              <w:rPr>
+                <w:noProof/>
+                <w:webHidden/>
+              </w:rPr>
+            </w:r>
+            <w:r>
+              <w:rPr>
+                <w:noProof/>
+                <w:webHidden/>
+              </w:rPr>
+              <w:fldChar w:fldCharType="separate"/>
+            </w:r>
+            <w:r>
+              <w:rPr>
+                <w:noProof/>
+                <w:webHidden/>
+              </w:rPr>
+              <w:t>8</w:t>
+            </w:r>
+            <w:r>
+              <w:rPr>
+                <w:noProof/>
+                <w:webHidden/>
+              </w:rPr>
+              <w:fldChar w:fldCharType="end"/>
+            </w:r>
+          </w:hyperlink>
+        </w:p>
+        <w:p>
+          <w:pPr>
+            <w:pStyle w:val="TOC1"/>
+            <w:tabs>
+              <w:tab w:val="right" w:leader="dot" w:pos="10456"/>
+            </w:tabs>
+            <w:rPr>
+              <w:rFonts w:asciiTheme="minorHAnsi" w:eastAsiaTheme="minorEastAsia" w:hAnsiTheme="minorHAnsi"/>
+              <w:noProof/>
+              <w:kern w:val="2"/>
+              <w:sz w:val="24"/>
+              <w:szCs w:val="24"/>
+              <w:lang w:val="en-NZ" w:eastAsia="en-NZ"/>
+              <w14:ligatures w14:val="standardContextual"/>
+            </w:rPr>
+          </w:pPr>
+          <w:hyperlink w:anchor="_Toc236998475" w:history="1">
+            <w:r>
+              <w:rPr>
+                <w:rStyle w:val="Hyperlink"/>
+                <w:noProof/>
+              </w:rPr>
+              <w:t>References</w:t>
+            </w:r>
+            <w:r>
+              <w:rPr>
+                <w:noProof/>
+                <w:webHidden/>
+              </w:rPr>
+              <w:tab/>
+            </w:r>
+            <w:r>
+              <w:rPr>
+                <w:noProof/>
+                <w:webHidden/>
+              </w:rPr>
+              <w:fldChar w:fldCharType="begin"/>
+            </w:r>
+            <w:r>
+              <w:rPr>
+                <w:noProof/>
+                <w:webHidden/>
+              </w:rPr>
+              <w:instrText xml:space="preserve"> PAGEREF _Toc236998475 \h </w:instrText>
+            </w:r>
+            <w:r>
+              <w:rPr>
+                <w:noProof/>
+                <w:webHidden/>
+              </w:rPr>
+            </w:r>
+            <w:r>
+              <w:rPr>
+                <w:noProof/>
+                <w:webHidden/>
+              </w:rPr>
+              <w:fldChar w:fldCharType="separate"/>
+            </w:r>
+            <w:r>
+              <w:rPr>
+                <w:noProof/>
+                <w:webHidden/>
+              </w:rPr>
+              <w:t>12</w:t>
+            </w:r>
+            <w:r>
+              <w:rPr>
+                <w:noProof/>
+                <w:webHidden/>
+              </w:rPr>
+              <w:fldChar w:fldCharType="end"/>
+            </w:r>
+          </w:hyperlink>
+        </w:p>
+        <w:p>
+          <w:pPr>
+            <w:pStyle w:val="TOC1"/>
+            <w:tabs>
+              <w:tab w:val="right" w:leader="dot" w:pos="10456"/>
+            </w:tabs>
+            <w:rPr>
+              <w:rFonts w:asciiTheme="minorHAnsi" w:eastAsiaTheme="minorEastAsia" w:hAnsiTheme="minorHAnsi"/>
+              <w:noProof/>
+              <w:kern w:val="2"/>
+              <w:sz w:val="24"/>
+              <w:szCs w:val="24"/>
+              <w:lang w:val="en-NZ" w:eastAsia="en-NZ"/>
+              <w14:ligatures w14:val="standardContextual"/>
+            </w:rPr>
+          </w:pPr>
+          <w:hyperlink w:anchor="_Toc236998476" w:history="1">
+            <w:r>
+              <w:rPr>
+                <w:rStyle w:val="Hyperlink"/>
+                <w:noProof/>
+              </w:rPr>
+              <w:t>Appendices</w:t>
+            </w:r>
+            <w:r>
+              <w:rPr>
+                <w:noProof/>
+                <w:webHidden/>
+              </w:rPr>
+              <w:tab/>
+            </w:r>
+            <w:r>
+              <w:rPr>
+                <w:noProof/>
+                <w:webHidden/>
+              </w:rPr>
+              <w:fldChar w:fldCharType="begin"/>
+            </w:r>
+            <w:r>
+              <w:rPr>
+                <w:noProof/>
+                <w:webHidden/>
+              </w:rPr>
+              <w:instrText xml:space="preserve"> PAGEREF _Toc236998476 \h </w:instrText>
+            </w:r>
+            <w:r>
+              <w:rPr>
+                <w:noProof/>
+                <w:webHidden/>
+              </w:rPr>
+            </w:r>
+            <w:r>
+              <w:rPr>
+                <w:noProof/>
+                <w:webHidden/>
+              </w:rPr>
+              <w:fldChar w:fldCharType="separate"/>
+            </w:r>
+            <w:r>
+              <w:rPr>
+                <w:noProof/>
+                <w:webHidden/>
+              </w:rPr>
+              <w:t>13</w:t>
             </w:r>
             <w:r>
               <w:rPr>
@@ -4649,13 +5655,13 @@
               <w14:ligatures w14:val="standardContextual"/>
             </w:rPr>
           </w:pPr>
-          <w:hyperlink w:anchor="_Toc236991253" w:history="1">
+          <w:hyperlink w:anchor="_Toc236998477" w:history="1">
             <w:r>
               <w:rPr>
                 <w:rStyle w:val="Hyperlink"/>
                 <w:noProof/>
               </w:rPr>
-              <w:t>Client details including organisation</w:t>
+              <w:t>Appendix A</w:t>
             </w:r>
             <w:r>
               <w:rPr>
@@ -4676,7 +5682,7 @@
                 <w:noProof/>
                 <w:webHidden/>
               </w:rPr>
-              <w:instrText xml:space="preserve"> PAGEREF _Toc236991253 \h </w:instrText>
+              <w:instrText xml:space="preserve"> PAGEREF _Toc236998477 \h </w:instrText>
             </w:r>
             <w:r>
               <w:rPr>
@@ -4696,7 +5702,7 @@
                 <w:noProof/>
                 <w:webHidden/>
               </w:rPr>
-              <w:t>5</w:t>
+              <w:t>13</w:t>
             </w:r>
             <w:r>
               <w:rPr>
@@ -4723,13 +5729,13 @@
               <w14:ligatures w14:val="standardContextual"/>
             </w:rPr>
           </w:pPr>
-          <w:hyperlink w:anchor="_Toc236991254" w:history="1">
+          <w:hyperlink w:anchor="_Toc236998478" w:history="1">
             <w:r>
               <w:rPr>
                 <w:rStyle w:val="Hyperlink"/>
                 <w:noProof/>
               </w:rPr>
-              <w:t>Group Members</w:t>
+              <w:t>Appendix B</w:t>
             </w:r>
             <w:r>
               <w:rPr>
@@ -4750,7 +5756,7 @@
                 <w:noProof/>
                 <w:webHidden/>
               </w:rPr>
-              <w:instrText xml:space="preserve"> PAGEREF _Toc236991254 \h </w:instrText>
+              <w:instrText xml:space="preserve"> PAGEREF _Toc236998478 \h </w:instrText>
             </w:r>
             <w:r>
               <w:rPr>
@@ -4770,7 +5776,531 @@
                 <w:noProof/>
                 <w:webHidden/>
               </w:rPr>
-              <w:t>5</w:t>
+              <w:t>14</w:t>
+            </w:r>
+            <w:r>
+              <w:rPr>
+                <w:noProof/>
+                <w:webHidden/>
+              </w:rPr>
+              <w:fldChar w:fldCharType="end"/>
+            </w:r>
+          </w:hyperlink>
+        </w:p>
+        <w:p>
+          <w:pPr>
+            <w:pStyle w:val="TOC1"/>
+            <w:tabs>
+              <w:tab w:val="right" w:leader="dot" w:pos="10456"/>
+            </w:tabs>
+            <w:rPr>
+              <w:rFonts w:asciiTheme="minorHAnsi" w:eastAsiaTheme="minorEastAsia" w:hAnsiTheme="minorHAnsi"/>
+              <w:noProof/>
+              <w:kern w:val="2"/>
+              <w:sz w:val="24"/>
+              <w:szCs w:val="24"/>
+              <w:lang w:val="en-NZ" w:eastAsia="en-NZ"/>
+              <w14:ligatures w14:val="standardContextual"/>
+            </w:rPr>
+          </w:pPr>
+          <w:hyperlink w:anchor="_Toc236998479" w:history="1">
+            <w:r>
+              <w:rPr>
+                <w:rStyle w:val="Hyperlink"/>
+                <w:noProof/>
+              </w:rPr>
+              <w:t>The Parties</w:t>
+            </w:r>
+            <w:r>
+              <w:rPr>
+                <w:noProof/>
+                <w:webHidden/>
+              </w:rPr>
+              <w:tab/>
+            </w:r>
+            <w:r>
+              <w:rPr>
+                <w:noProof/>
+                <w:webHidden/>
+              </w:rPr>
+              <w:fldChar w:fldCharType="begin"/>
+            </w:r>
+            <w:r>
+              <w:rPr>
+                <w:noProof/>
+                <w:webHidden/>
+              </w:rPr>
+              <w:instrText xml:space="preserve"> PAGEREF _Toc236998479 \h </w:instrText>
+            </w:r>
+            <w:r>
+              <w:rPr>
+                <w:noProof/>
+                <w:webHidden/>
+              </w:rPr>
+            </w:r>
+            <w:r>
+              <w:rPr>
+                <w:noProof/>
+                <w:webHidden/>
+              </w:rPr>
+              <w:fldChar w:fldCharType="separate"/>
+            </w:r>
+            <w:r>
+              <w:rPr>
+                <w:noProof/>
+                <w:webHidden/>
+              </w:rPr>
+              <w:t>14</w:t>
+            </w:r>
+            <w:r>
+              <w:rPr>
+                <w:noProof/>
+                <w:webHidden/>
+              </w:rPr>
+              <w:fldChar w:fldCharType="end"/>
+            </w:r>
+          </w:hyperlink>
+        </w:p>
+        <w:p>
+          <w:pPr>
+            <w:pStyle w:val="TOC1"/>
+            <w:tabs>
+              <w:tab w:val="right" w:leader="dot" w:pos="10456"/>
+            </w:tabs>
+            <w:rPr>
+              <w:rFonts w:asciiTheme="minorHAnsi" w:eastAsiaTheme="minorEastAsia" w:hAnsiTheme="minorHAnsi"/>
+              <w:noProof/>
+              <w:kern w:val="2"/>
+              <w:sz w:val="24"/>
+              <w:szCs w:val="24"/>
+              <w:lang w:val="en-NZ" w:eastAsia="en-NZ"/>
+              <w14:ligatures w14:val="standardContextual"/>
+            </w:rPr>
+          </w:pPr>
+          <w:hyperlink w:anchor="_Toc236998480" w:history="1">
+            <w:r>
+              <w:rPr>
+                <w:rStyle w:val="Hyperlink"/>
+                <w:noProof/>
+              </w:rPr>
+              <w:t>2. Undertakings</w:t>
+            </w:r>
+            <w:r>
+              <w:rPr>
+                <w:noProof/>
+                <w:webHidden/>
+              </w:rPr>
+              <w:tab/>
+            </w:r>
+            <w:r>
+              <w:rPr>
+                <w:noProof/>
+                <w:webHidden/>
+              </w:rPr>
+              <w:fldChar w:fldCharType="begin"/>
+            </w:r>
+            <w:r>
+              <w:rPr>
+                <w:noProof/>
+                <w:webHidden/>
+              </w:rPr>
+              <w:instrText xml:space="preserve"> PAGEREF _Toc236998480 \h </w:instrText>
+            </w:r>
+            <w:r>
+              <w:rPr>
+                <w:noProof/>
+                <w:webHidden/>
+              </w:rPr>
+            </w:r>
+            <w:r>
+              <w:rPr>
+                <w:noProof/>
+                <w:webHidden/>
+              </w:rPr>
+              <w:fldChar w:fldCharType="separate"/>
+            </w:r>
+            <w:r>
+              <w:rPr>
+                <w:noProof/>
+                <w:webHidden/>
+              </w:rPr>
+              <w:t>15</w:t>
+            </w:r>
+            <w:r>
+              <w:rPr>
+                <w:noProof/>
+                <w:webHidden/>
+              </w:rPr>
+              <w:fldChar w:fldCharType="end"/>
+            </w:r>
+          </w:hyperlink>
+        </w:p>
+        <w:p>
+          <w:pPr>
+            <w:pStyle w:val="TOC1"/>
+            <w:tabs>
+              <w:tab w:val="left" w:pos="440"/>
+              <w:tab w:val="right" w:leader="dot" w:pos="10456"/>
+            </w:tabs>
+            <w:rPr>
+              <w:rFonts w:asciiTheme="minorHAnsi" w:eastAsiaTheme="minorEastAsia" w:hAnsiTheme="minorHAnsi"/>
+              <w:noProof/>
+              <w:kern w:val="2"/>
+              <w:sz w:val="24"/>
+              <w:szCs w:val="24"/>
+              <w:lang w:val="en-NZ" w:eastAsia="en-NZ"/>
+              <w14:ligatures w14:val="standardContextual"/>
+            </w:rPr>
+          </w:pPr>
+          <w:hyperlink w:anchor="_Toc236998481" w:history="1">
+            <w:r>
+              <w:rPr>
+                <w:rStyle w:val="Hyperlink"/>
+                <w:noProof/>
+              </w:rPr>
+              <w:t xml:space="preserve">3 </w:t>
+            </w:r>
+            <w:r>
+              <w:rPr>
+                <w:rFonts w:asciiTheme="minorHAnsi" w:eastAsiaTheme="minorEastAsia" w:hAnsiTheme="minorHAnsi"/>
+                <w:noProof/>
+                <w:kern w:val="2"/>
+                <w:sz w:val="24"/>
+                <w:szCs w:val="24"/>
+                <w:lang w:val="en-NZ" w:eastAsia="en-NZ"/>
+                <w14:ligatures w14:val="standardContextual"/>
+              </w:rPr>
+              <w:tab/>
+            </w:r>
+            <w:r>
+              <w:rPr>
+                <w:rStyle w:val="Hyperlink"/>
+                <w:noProof/>
+              </w:rPr>
+              <w:t>Copyright, Patents, Trade Marks and other Intellectual Property Rights</w:t>
+            </w:r>
+            <w:r>
+              <w:rPr>
+                <w:noProof/>
+                <w:webHidden/>
+              </w:rPr>
+              <w:tab/>
+            </w:r>
+            <w:r>
+              <w:rPr>
+                <w:noProof/>
+                <w:webHidden/>
+              </w:rPr>
+              <w:fldChar w:fldCharType="begin"/>
+            </w:r>
+            <w:r>
+              <w:rPr>
+                <w:noProof/>
+                <w:webHidden/>
+              </w:rPr>
+              <w:instrText xml:space="preserve"> PAGEREF _Toc236998481 \h </w:instrText>
+            </w:r>
+            <w:r>
+              <w:rPr>
+                <w:noProof/>
+                <w:webHidden/>
+              </w:rPr>
+            </w:r>
+            <w:r>
+              <w:rPr>
+                <w:noProof/>
+                <w:webHidden/>
+              </w:rPr>
+              <w:fldChar w:fldCharType="separate"/>
+            </w:r>
+            <w:r>
+              <w:rPr>
+                <w:noProof/>
+                <w:webHidden/>
+              </w:rPr>
+              <w:t>15</w:t>
+            </w:r>
+            <w:r>
+              <w:rPr>
+                <w:noProof/>
+                <w:webHidden/>
+              </w:rPr>
+              <w:fldChar w:fldCharType="end"/>
+            </w:r>
+          </w:hyperlink>
+        </w:p>
+        <w:p>
+          <w:pPr>
+            <w:pStyle w:val="TOC1"/>
+            <w:tabs>
+              <w:tab w:val="left" w:pos="440"/>
+              <w:tab w:val="right" w:leader="dot" w:pos="10456"/>
+            </w:tabs>
+            <w:rPr>
+              <w:rFonts w:asciiTheme="minorHAnsi" w:eastAsiaTheme="minorEastAsia" w:hAnsiTheme="minorHAnsi"/>
+              <w:noProof/>
+              <w:kern w:val="2"/>
+              <w:sz w:val="24"/>
+              <w:szCs w:val="24"/>
+              <w:lang w:val="en-NZ" w:eastAsia="en-NZ"/>
+              <w14:ligatures w14:val="standardContextual"/>
+            </w:rPr>
+          </w:pPr>
+          <w:hyperlink w:anchor="_Toc236998482" w:history="1">
+            <w:r>
+              <w:rPr>
+                <w:rStyle w:val="Hyperlink"/>
+                <w:noProof/>
+              </w:rPr>
+              <w:t xml:space="preserve">4 </w:t>
+            </w:r>
+            <w:r>
+              <w:rPr>
+                <w:rFonts w:asciiTheme="minorHAnsi" w:eastAsiaTheme="minorEastAsia" w:hAnsiTheme="minorHAnsi"/>
+                <w:noProof/>
+                <w:kern w:val="2"/>
+                <w:sz w:val="24"/>
+                <w:szCs w:val="24"/>
+                <w:lang w:val="en-NZ" w:eastAsia="en-NZ"/>
+                <w14:ligatures w14:val="standardContextual"/>
+              </w:rPr>
+              <w:tab/>
+            </w:r>
+            <w:r>
+              <w:rPr>
+                <w:rStyle w:val="Hyperlink"/>
+                <w:noProof/>
+              </w:rPr>
+              <w:t>Confidential Information</w:t>
+            </w:r>
+            <w:r>
+              <w:rPr>
+                <w:noProof/>
+                <w:webHidden/>
+              </w:rPr>
+              <w:tab/>
+            </w:r>
+            <w:r>
+              <w:rPr>
+                <w:noProof/>
+                <w:webHidden/>
+              </w:rPr>
+              <w:fldChar w:fldCharType="begin"/>
+            </w:r>
+            <w:r>
+              <w:rPr>
+                <w:noProof/>
+                <w:webHidden/>
+              </w:rPr>
+              <w:instrText xml:space="preserve"> PAGEREF _Toc236998482 \h </w:instrText>
+            </w:r>
+            <w:r>
+              <w:rPr>
+                <w:noProof/>
+                <w:webHidden/>
+              </w:rPr>
+            </w:r>
+            <w:r>
+              <w:rPr>
+                <w:noProof/>
+                <w:webHidden/>
+              </w:rPr>
+              <w:fldChar w:fldCharType="separate"/>
+            </w:r>
+            <w:r>
+              <w:rPr>
+                <w:noProof/>
+                <w:webHidden/>
+              </w:rPr>
+              <w:t>15</w:t>
+            </w:r>
+            <w:r>
+              <w:rPr>
+                <w:noProof/>
+                <w:webHidden/>
+              </w:rPr>
+              <w:fldChar w:fldCharType="end"/>
+            </w:r>
+          </w:hyperlink>
+        </w:p>
+        <w:p>
+          <w:pPr>
+            <w:pStyle w:val="TOC1"/>
+            <w:tabs>
+              <w:tab w:val="left" w:pos="440"/>
+              <w:tab w:val="right" w:leader="dot" w:pos="10456"/>
+            </w:tabs>
+            <w:rPr>
+              <w:rFonts w:asciiTheme="minorHAnsi" w:eastAsiaTheme="minorEastAsia" w:hAnsiTheme="minorHAnsi"/>
+              <w:noProof/>
+              <w:kern w:val="2"/>
+              <w:sz w:val="24"/>
+              <w:szCs w:val="24"/>
+              <w:lang w:val="en-NZ" w:eastAsia="en-NZ"/>
+              <w14:ligatures w14:val="standardContextual"/>
+            </w:rPr>
+          </w:pPr>
+          <w:hyperlink w:anchor="_Toc236998483" w:history="1">
+            <w:r>
+              <w:rPr>
+                <w:rStyle w:val="Hyperlink"/>
+                <w:noProof/>
+              </w:rPr>
+              <w:t xml:space="preserve">5 </w:t>
+            </w:r>
+            <w:r>
+              <w:rPr>
+                <w:rFonts w:asciiTheme="minorHAnsi" w:eastAsiaTheme="minorEastAsia" w:hAnsiTheme="minorHAnsi"/>
+                <w:noProof/>
+                <w:kern w:val="2"/>
+                <w:sz w:val="24"/>
+                <w:szCs w:val="24"/>
+                <w:lang w:val="en-NZ" w:eastAsia="en-NZ"/>
+                <w14:ligatures w14:val="standardContextual"/>
+              </w:rPr>
+              <w:tab/>
+            </w:r>
+            <w:r>
+              <w:rPr>
+                <w:rStyle w:val="Hyperlink"/>
+                <w:noProof/>
+              </w:rPr>
+              <w:t>Intellectual Property Rights</w:t>
+            </w:r>
+            <w:r>
+              <w:rPr>
+                <w:noProof/>
+                <w:webHidden/>
+              </w:rPr>
+              <w:tab/>
+            </w:r>
+            <w:r>
+              <w:rPr>
+                <w:noProof/>
+                <w:webHidden/>
+              </w:rPr>
+              <w:fldChar w:fldCharType="begin"/>
+            </w:r>
+            <w:r>
+              <w:rPr>
+                <w:noProof/>
+                <w:webHidden/>
+              </w:rPr>
+              <w:instrText xml:space="preserve"> PAGEREF _Toc236998483 \h </w:instrText>
+            </w:r>
+            <w:r>
+              <w:rPr>
+                <w:noProof/>
+                <w:webHidden/>
+              </w:rPr>
+            </w:r>
+            <w:r>
+              <w:rPr>
+                <w:noProof/>
+                <w:webHidden/>
+              </w:rPr>
+              <w:fldChar w:fldCharType="separate"/>
+            </w:r>
+            <w:r>
+              <w:rPr>
+                <w:noProof/>
+                <w:webHidden/>
+              </w:rPr>
+              <w:t>16</w:t>
+            </w:r>
+            <w:r>
+              <w:rPr>
+                <w:noProof/>
+                <w:webHidden/>
+              </w:rPr>
+              <w:fldChar w:fldCharType="end"/>
+            </w:r>
+          </w:hyperlink>
+        </w:p>
+        <w:p>
+          <w:pPr>
+            <w:pStyle w:val="TOC1"/>
+            <w:tabs>
+              <w:tab w:val="left" w:pos="440"/>
+              <w:tab w:val="right" w:leader="dot" w:pos="10456"/>
+            </w:tabs>
+            <w:rPr>
+              <w:rFonts w:asciiTheme="minorHAnsi" w:eastAsiaTheme="minorEastAsia" w:hAnsiTheme="minorHAnsi"/>
+              <w:noProof/>
+              <w:kern w:val="2"/>
+              <w:sz w:val="24"/>
+              <w:szCs w:val="24"/>
+              <w:lang w:val="en-NZ" w:eastAsia="en-NZ"/>
+              <w14:ligatures w14:val="standardContextual"/>
+            </w:rPr>
+          </w:pPr>
+          <w:hyperlink w:anchor="_Toc236998484" w:history="1">
+            <w:r>
+              <w:rPr>
+                <w:rStyle w:val="Hyperlink"/>
+                <w:noProof/>
+              </w:rPr>
+              <w:t xml:space="preserve">6 </w:t>
+            </w:r>
+            <w:r>
+              <w:rPr>
+                <w:rFonts w:asciiTheme="minorHAnsi" w:eastAsiaTheme="minorEastAsia" w:hAnsiTheme="minorHAnsi"/>
+                <w:noProof/>
+                <w:kern w:val="2"/>
+                <w:sz w:val="24"/>
+                <w:szCs w:val="24"/>
+                <w:lang w:val="en-NZ" w:eastAsia="en-NZ"/>
+                <w14:ligatures w14:val="standardContextual"/>
+              </w:rPr>
+              <w:tab/>
+            </w:r>
+            <w:r>
+              <w:rPr>
+                <w:rStyle w:val="Hyperlink"/>
+                <w:noProof/>
+              </w:rPr>
+              <w:t>Signatures</w:t>
+            </w:r>
+            <w:r>
+              <w:rPr>
+                <w:noProof/>
+                <w:webHidden/>
+              </w:rPr>
+              <w:tab/>
+            </w:r>
+            <w:r>
+              <w:rPr>
+                <w:noProof/>
+                <w:webHidden/>
+              </w:rPr>
+              <w:fldChar w:fldCharType="begin"/>
+            </w:r>
+            <w:r>
+              <w:rPr>
+                <w:noProof/>
+                <w:webHidden/>
+              </w:rPr>
+              <w:instrText xml:space="preserve"> PAGEREF _Toc236998484 \h </w:instrText>
+            </w:r>
+            <w:r>
+              <w:rPr>
+                <w:noProof/>
+                <w:webHidden/>
+              </w:rPr>
+            </w:r>
+            <w:r>
+              <w:rPr>
+                <w:noProof/>
+                <w:webHidden/>
+              </w:rPr>
+              <w:fldChar w:fldCharType="separate"/>
+            </w:r>
+            <w:r>
+              <w:rPr>
+                <w:noProof/>
+                <w:webHidden/>
+              </w:rPr>
+              <w:t>16</w:t>
             </w:r>
             <w:r>
               <w:rPr>
@@ -4797,13 +6327,13 @@
               <w14:ligatures w14:val="standardContextual"/>
             </w:rPr>
           </w:pPr>
-          <w:hyperlink w:anchor="_Toc236991255" w:history="1">
+          <w:hyperlink w:anchor="_Toc236998485" w:history="1">
             <w:r>
               <w:rPr>
                 <w:rStyle w:val="Hyperlink"/>
                 <w:noProof/>
               </w:rPr>
-              <w:t>Project Advisor</w:t>
+              <w:t>Appendix C</w:t>
             </w:r>
             <w:r>
               <w:rPr>
@@ -4824,7 +6354,7 @@
                 <w:noProof/>
                 <w:webHidden/>
               </w:rPr>
-              <w:instrText xml:space="preserve"> PAGEREF _Toc236991255 \h </w:instrText>
+              <w:instrText xml:space="preserve"> PAGEREF _Toc236998485 \h </w:instrText>
             </w:r>
             <w:r>
               <w:rPr>
@@ -4844,7 +6374,7 @@
                 <w:noProof/>
                 <w:webHidden/>
               </w:rPr>
-              <w:t>5</w:t>
+              <w:t>17</w:t>
             </w:r>
             <w:r>
               <w:rPr>
@@ -4871,13 +6401,13 @@
               <w14:ligatures w14:val="standardContextual"/>
             </w:rPr>
           </w:pPr>
-          <w:hyperlink w:anchor="_Toc236991256" w:history="1">
+          <w:hyperlink w:anchor="_Toc236998486" w:history="1">
             <w:r>
               <w:rPr>
                 <w:rStyle w:val="Hyperlink"/>
                 <w:noProof/>
               </w:rPr>
-              <w:t>General Conflict of Interest statement</w:t>
+              <w:t>Appendix D</w:t>
             </w:r>
             <w:r>
               <w:rPr>
@@ -4898,7 +6428,7 @@
                 <w:noProof/>
                 <w:webHidden/>
               </w:rPr>
-              <w:instrText xml:space="preserve"> PAGEREF _Toc236991256 \h </w:instrText>
+              <w:instrText xml:space="preserve"> PAGEREF _Toc236998486 \h </w:instrText>
             </w:r>
             <w:r>
               <w:rPr>
@@ -4918,1197 +6448,7 @@
                 <w:noProof/>
                 <w:webHidden/>
               </w:rPr>
-              <w:t>6</w:t>
-            </w:r>
-            <w:r>
-              <w:rPr>
-                <w:noProof/>
-                <w:webHidden/>
-              </w:rPr>
-              <w:fldChar w:fldCharType="end"/>
-            </w:r>
-          </w:hyperlink>
-        </w:p>
-        <w:p>
-          <w:pPr>
-            <w:pStyle w:val="TOC2"/>
-            <w:tabs>
-              <w:tab w:val="right" w:leader="dot" w:pos="10456"/>
-            </w:tabs>
-            <w:rPr>
-              <w:rFonts w:asciiTheme="minorHAnsi" w:eastAsiaTheme="minorEastAsia" w:hAnsiTheme="minorHAnsi"/>
-              <w:noProof/>
-              <w:kern w:val="2"/>
-              <w:sz w:val="24"/>
-              <w:szCs w:val="24"/>
-              <w:lang w:val="en-NZ" w:eastAsia="en-NZ"/>
-              <w14:ligatures w14:val="standardContextual"/>
-            </w:rPr>
-          </w:pPr>
-          <w:hyperlink w:anchor="_Toc236991257" w:history="1">
-            <w:r>
-              <w:rPr>
-                <w:rStyle w:val="Hyperlink"/>
-                <w:noProof/>
-              </w:rPr>
-              <w:t>RACI assessment matrix</w:t>
-            </w:r>
-            <w:r>
-              <w:rPr>
-                <w:noProof/>
-                <w:webHidden/>
-              </w:rPr>
-              <w:tab/>
-            </w:r>
-            <w:r>
-              <w:rPr>
-                <w:noProof/>
-                <w:webHidden/>
-              </w:rPr>
-              <w:fldChar w:fldCharType="begin"/>
-            </w:r>
-            <w:r>
-              <w:rPr>
-                <w:noProof/>
-                <w:webHidden/>
-              </w:rPr>
-              <w:instrText xml:space="preserve"> PAGEREF _Toc236991257 \h </w:instrText>
-            </w:r>
-            <w:r>
-              <w:rPr>
-                <w:noProof/>
-                <w:webHidden/>
-              </w:rPr>
-            </w:r>
-            <w:r>
-              <w:rPr>
-                <w:noProof/>
-                <w:webHidden/>
-              </w:rPr>
-              <w:fldChar w:fldCharType="separate"/>
-            </w:r>
-            <w:r>
-              <w:rPr>
-                <w:noProof/>
-                <w:webHidden/>
-              </w:rPr>
-              <w:t>6</w:t>
-            </w:r>
-            <w:r>
-              <w:rPr>
-                <w:noProof/>
-                <w:webHidden/>
-              </w:rPr>
-              <w:fldChar w:fldCharType="end"/>
-            </w:r>
-          </w:hyperlink>
-        </w:p>
-        <w:p>
-          <w:pPr>
-            <w:pStyle w:val="TOC1"/>
-            <w:tabs>
-              <w:tab w:val="right" w:leader="dot" w:pos="10456"/>
-            </w:tabs>
-            <w:rPr>
-              <w:rFonts w:asciiTheme="minorHAnsi" w:eastAsiaTheme="minorEastAsia" w:hAnsiTheme="minorHAnsi"/>
-              <w:noProof/>
-              <w:kern w:val="2"/>
-              <w:sz w:val="24"/>
-              <w:szCs w:val="24"/>
-              <w:lang w:val="en-NZ" w:eastAsia="en-NZ"/>
-              <w14:ligatures w14:val="standardContextual"/>
-            </w:rPr>
-          </w:pPr>
-          <w:hyperlink w:anchor="_Toc236991258" w:history="1">
-            <w:r>
-              <w:rPr>
-                <w:rStyle w:val="Hyperlink"/>
-                <w:noProof/>
-              </w:rPr>
-              <w:t>Project timeline and milestones</w:t>
-            </w:r>
-            <w:r>
-              <w:rPr>
-                <w:noProof/>
-                <w:webHidden/>
-              </w:rPr>
-              <w:tab/>
-            </w:r>
-            <w:r>
-              <w:rPr>
-                <w:noProof/>
-                <w:webHidden/>
-              </w:rPr>
-              <w:fldChar w:fldCharType="begin"/>
-            </w:r>
-            <w:r>
-              <w:rPr>
-                <w:noProof/>
-                <w:webHidden/>
-              </w:rPr>
-              <w:instrText xml:space="preserve"> PAGEREF _Toc236991258 \h </w:instrText>
-            </w:r>
-            <w:r>
-              <w:rPr>
-                <w:noProof/>
-                <w:webHidden/>
-              </w:rPr>
-            </w:r>
-            <w:r>
-              <w:rPr>
-                <w:noProof/>
-                <w:webHidden/>
-              </w:rPr>
-              <w:fldChar w:fldCharType="separate"/>
-            </w:r>
-            <w:r>
-              <w:rPr>
-                <w:noProof/>
-                <w:webHidden/>
-              </w:rPr>
-              <w:t>8</w:t>
-            </w:r>
-            <w:r>
-              <w:rPr>
-                <w:noProof/>
-                <w:webHidden/>
-              </w:rPr>
-              <w:fldChar w:fldCharType="end"/>
-            </w:r>
-          </w:hyperlink>
-        </w:p>
-        <w:p>
-          <w:pPr>
-            <w:pStyle w:val="TOC1"/>
-            <w:tabs>
-              <w:tab w:val="right" w:leader="dot" w:pos="10456"/>
-            </w:tabs>
-            <w:rPr>
-              <w:rFonts w:asciiTheme="minorHAnsi" w:eastAsiaTheme="minorEastAsia" w:hAnsiTheme="minorHAnsi"/>
-              <w:noProof/>
-              <w:kern w:val="2"/>
-              <w:sz w:val="24"/>
-              <w:szCs w:val="24"/>
-              <w:lang w:val="en-NZ" w:eastAsia="en-NZ"/>
-              <w14:ligatures w14:val="standardContextual"/>
-            </w:rPr>
-          </w:pPr>
-          <w:hyperlink w:anchor="_Toc236991259" w:history="1">
-            <w:r>
-              <w:rPr>
-                <w:rStyle w:val="Hyperlink"/>
-                <w:noProof/>
-              </w:rPr>
-              <w:t>Project Risk Analysis</w:t>
-            </w:r>
-            <w:r>
-              <w:rPr>
-                <w:noProof/>
-                <w:webHidden/>
-              </w:rPr>
-              <w:tab/>
-            </w:r>
-            <w:r>
-              <w:rPr>
-                <w:noProof/>
-                <w:webHidden/>
-              </w:rPr>
-              <w:fldChar w:fldCharType="begin"/>
-            </w:r>
-            <w:r>
-              <w:rPr>
-                <w:noProof/>
-                <w:webHidden/>
-              </w:rPr>
-              <w:instrText xml:space="preserve"> PAGEREF _Toc236991259 \h </w:instrText>
-            </w:r>
-            <w:r>
-              <w:rPr>
-                <w:noProof/>
-                <w:webHidden/>
-              </w:rPr>
-            </w:r>
-            <w:r>
-              <w:rPr>
-                <w:noProof/>
-                <w:webHidden/>
-              </w:rPr>
-              <w:fldChar w:fldCharType="separate"/>
-            </w:r>
-            <w:r>
-              <w:rPr>
-                <w:noProof/>
-                <w:webHidden/>
-              </w:rPr>
-              <w:t>8</w:t>
-            </w:r>
-            <w:r>
-              <w:rPr>
-                <w:noProof/>
-                <w:webHidden/>
-              </w:rPr>
-              <w:fldChar w:fldCharType="end"/>
-            </w:r>
-          </w:hyperlink>
-        </w:p>
-        <w:p>
-          <w:pPr>
-            <w:pStyle w:val="TOC1"/>
-            <w:tabs>
-              <w:tab w:val="right" w:leader="dot" w:pos="10456"/>
-            </w:tabs>
-            <w:rPr>
-              <w:rFonts w:asciiTheme="minorHAnsi" w:eastAsiaTheme="minorEastAsia" w:hAnsiTheme="minorHAnsi"/>
-              <w:noProof/>
-              <w:kern w:val="2"/>
-              <w:sz w:val="24"/>
-              <w:szCs w:val="24"/>
-              <w:lang w:val="en-NZ" w:eastAsia="en-NZ"/>
-              <w14:ligatures w14:val="standardContextual"/>
-            </w:rPr>
-          </w:pPr>
-          <w:hyperlink w:anchor="_Toc236991260" w:history="1">
-            <w:r>
-              <w:rPr>
-                <w:rStyle w:val="Hyperlink"/>
-                <w:noProof/>
-              </w:rPr>
-              <w:t>References</w:t>
-            </w:r>
-            <w:r>
-              <w:rPr>
-                <w:noProof/>
-                <w:webHidden/>
-              </w:rPr>
-              <w:tab/>
-            </w:r>
-            <w:r>
-              <w:rPr>
-                <w:noProof/>
-                <w:webHidden/>
-              </w:rPr>
-              <w:fldChar w:fldCharType="begin"/>
-            </w:r>
-            <w:r>
-              <w:rPr>
-                <w:noProof/>
-                <w:webHidden/>
-              </w:rPr>
-              <w:instrText xml:space="preserve"> PAGEREF _Toc236991260 \h </w:instrText>
-            </w:r>
-            <w:r>
-              <w:rPr>
-                <w:noProof/>
-                <w:webHidden/>
-              </w:rPr>
-            </w:r>
-            <w:r>
-              <w:rPr>
-                <w:noProof/>
-                <w:webHidden/>
-              </w:rPr>
-              <w:fldChar w:fldCharType="separate"/>
-            </w:r>
-            <w:r>
-              <w:rPr>
-                <w:noProof/>
-                <w:webHidden/>
-              </w:rPr>
-              <w:t>12</w:t>
-            </w:r>
-            <w:r>
-              <w:rPr>
-                <w:noProof/>
-                <w:webHidden/>
-              </w:rPr>
-              <w:fldChar w:fldCharType="end"/>
-            </w:r>
-          </w:hyperlink>
-        </w:p>
-        <w:p>
-          <w:pPr>
-            <w:pStyle w:val="TOC1"/>
-            <w:tabs>
-              <w:tab w:val="right" w:leader="dot" w:pos="10456"/>
-            </w:tabs>
-            <w:rPr>
-              <w:rFonts w:asciiTheme="minorHAnsi" w:eastAsiaTheme="minorEastAsia" w:hAnsiTheme="minorHAnsi"/>
-              <w:noProof/>
-              <w:kern w:val="2"/>
-              <w:sz w:val="24"/>
-              <w:szCs w:val="24"/>
-              <w:lang w:val="en-NZ" w:eastAsia="en-NZ"/>
-              <w14:ligatures w14:val="standardContextual"/>
-            </w:rPr>
-          </w:pPr>
-          <w:hyperlink w:anchor="_Toc236991261" w:history="1">
-            <w:r>
-              <w:rPr>
-                <w:rStyle w:val="Hyperlink"/>
-                <w:noProof/>
-              </w:rPr>
-              <w:t>Appendices</w:t>
-            </w:r>
-            <w:r>
-              <w:rPr>
-                <w:noProof/>
-                <w:webHidden/>
-              </w:rPr>
-              <w:tab/>
-            </w:r>
-            <w:r>
-              <w:rPr>
-                <w:noProof/>
-                <w:webHidden/>
-              </w:rPr>
-              <w:fldChar w:fldCharType="begin"/>
-            </w:r>
-            <w:r>
-              <w:rPr>
-                <w:noProof/>
-                <w:webHidden/>
-              </w:rPr>
-              <w:instrText xml:space="preserve"> PAGEREF _Toc236991261 \h </w:instrText>
-            </w:r>
-            <w:r>
-              <w:rPr>
-                <w:noProof/>
-                <w:webHidden/>
-              </w:rPr>
-            </w:r>
-            <w:r>
-              <w:rPr>
-                <w:noProof/>
-                <w:webHidden/>
-              </w:rPr>
-              <w:fldChar w:fldCharType="separate"/>
-            </w:r>
-            <w:r>
-              <w:rPr>
-                <w:noProof/>
-                <w:webHidden/>
-              </w:rPr>
-              <w:t>13</w:t>
-            </w:r>
-            <w:r>
-              <w:rPr>
-                <w:noProof/>
-                <w:webHidden/>
-              </w:rPr>
-              <w:fldChar w:fldCharType="end"/>
-            </w:r>
-          </w:hyperlink>
-        </w:p>
-        <w:p>
-          <w:pPr>
-            <w:pStyle w:val="TOC2"/>
-            <w:tabs>
-              <w:tab w:val="right" w:leader="dot" w:pos="10456"/>
-            </w:tabs>
-            <w:rPr>
-              <w:rFonts w:asciiTheme="minorHAnsi" w:eastAsiaTheme="minorEastAsia" w:hAnsiTheme="minorHAnsi"/>
-              <w:noProof/>
-              <w:kern w:val="2"/>
-              <w:sz w:val="24"/>
-              <w:szCs w:val="24"/>
-              <w:lang w:val="en-NZ" w:eastAsia="en-NZ"/>
-              <w14:ligatures w14:val="standardContextual"/>
-            </w:rPr>
-          </w:pPr>
-          <w:hyperlink w:anchor="_Toc236991262" w:history="1">
-            <w:r>
-              <w:rPr>
-                <w:rStyle w:val="Hyperlink"/>
-                <w:noProof/>
-              </w:rPr>
-              <w:t>Appendix A</w:t>
-            </w:r>
-            <w:r>
-              <w:rPr>
-                <w:noProof/>
-                <w:webHidden/>
-              </w:rPr>
-              <w:tab/>
-            </w:r>
-            <w:r>
-              <w:rPr>
-                <w:noProof/>
-                <w:webHidden/>
-              </w:rPr>
-              <w:fldChar w:fldCharType="begin"/>
-            </w:r>
-            <w:r>
-              <w:rPr>
-                <w:noProof/>
-                <w:webHidden/>
-              </w:rPr>
-              <w:instrText xml:space="preserve"> PAGEREF _Toc236991262 \h </w:instrText>
-            </w:r>
-            <w:r>
-              <w:rPr>
-                <w:noProof/>
-                <w:webHidden/>
-              </w:rPr>
-            </w:r>
-            <w:r>
-              <w:rPr>
-                <w:noProof/>
-                <w:webHidden/>
-              </w:rPr>
-              <w:fldChar w:fldCharType="separate"/>
-            </w:r>
-            <w:r>
-              <w:rPr>
-                <w:noProof/>
-                <w:webHidden/>
-              </w:rPr>
-              <w:t>13</w:t>
-            </w:r>
-            <w:r>
-              <w:rPr>
-                <w:noProof/>
-                <w:webHidden/>
-              </w:rPr>
-              <w:fldChar w:fldCharType="end"/>
-            </w:r>
-          </w:hyperlink>
-        </w:p>
-        <w:p>
-          <w:pPr>
-            <w:pStyle w:val="TOC2"/>
-            <w:tabs>
-              <w:tab w:val="right" w:leader="dot" w:pos="10456"/>
-            </w:tabs>
-            <w:rPr>
-              <w:rFonts w:asciiTheme="minorHAnsi" w:eastAsiaTheme="minorEastAsia" w:hAnsiTheme="minorHAnsi"/>
-              <w:noProof/>
-              <w:kern w:val="2"/>
-              <w:sz w:val="24"/>
-              <w:szCs w:val="24"/>
-              <w:lang w:val="en-NZ" w:eastAsia="en-NZ"/>
-              <w14:ligatures w14:val="standardContextual"/>
-            </w:rPr>
-          </w:pPr>
-          <w:hyperlink w:anchor="_Toc236991263" w:history="1">
-            <w:r>
-              <w:rPr>
-                <w:rStyle w:val="Hyperlink"/>
-                <w:noProof/>
-              </w:rPr>
-              <w:t>Appendix B</w:t>
-            </w:r>
-            <w:r>
-              <w:rPr>
-                <w:noProof/>
-                <w:webHidden/>
-              </w:rPr>
-              <w:tab/>
-            </w:r>
-            <w:r>
-              <w:rPr>
-                <w:noProof/>
-                <w:webHidden/>
-              </w:rPr>
-              <w:fldChar w:fldCharType="begin"/>
-            </w:r>
-            <w:r>
-              <w:rPr>
-                <w:noProof/>
-                <w:webHidden/>
-              </w:rPr>
-              <w:instrText xml:space="preserve"> PAGEREF _Toc236991263 \h </w:instrText>
-            </w:r>
-            <w:r>
-              <w:rPr>
-                <w:noProof/>
-                <w:webHidden/>
-              </w:rPr>
-            </w:r>
-            <w:r>
-              <w:rPr>
-                <w:noProof/>
-                <w:webHidden/>
-              </w:rPr>
-              <w:fldChar w:fldCharType="separate"/>
-            </w:r>
-            <w:r>
-              <w:rPr>
-                <w:noProof/>
-                <w:webHidden/>
-              </w:rPr>
-              <w:t>14</w:t>
-            </w:r>
-            <w:r>
-              <w:rPr>
-                <w:noProof/>
-                <w:webHidden/>
-              </w:rPr>
-              <w:fldChar w:fldCharType="end"/>
-            </w:r>
-          </w:hyperlink>
-        </w:p>
-        <w:p>
-          <w:pPr>
-            <w:pStyle w:val="TOC1"/>
-            <w:tabs>
-              <w:tab w:val="right" w:leader="dot" w:pos="10456"/>
-            </w:tabs>
-            <w:rPr>
-              <w:rFonts w:asciiTheme="minorHAnsi" w:eastAsiaTheme="minorEastAsia" w:hAnsiTheme="minorHAnsi"/>
-              <w:noProof/>
-              <w:kern w:val="2"/>
-              <w:sz w:val="24"/>
-              <w:szCs w:val="24"/>
-              <w:lang w:val="en-NZ" w:eastAsia="en-NZ"/>
-              <w14:ligatures w14:val="standardContextual"/>
-            </w:rPr>
-          </w:pPr>
-          <w:hyperlink w:anchor="_Toc236991264" w:history="1">
-            <w:r>
-              <w:rPr>
-                <w:rStyle w:val="Hyperlink"/>
-                <w:noProof/>
-              </w:rPr>
-              <w:t>The Parties</w:t>
-            </w:r>
-            <w:r>
-              <w:rPr>
-                <w:noProof/>
-                <w:webHidden/>
-              </w:rPr>
-              <w:tab/>
-            </w:r>
-            <w:r>
-              <w:rPr>
-                <w:noProof/>
-                <w:webHidden/>
-              </w:rPr>
-              <w:fldChar w:fldCharType="begin"/>
-            </w:r>
-            <w:r>
-              <w:rPr>
-                <w:noProof/>
-                <w:webHidden/>
-              </w:rPr>
-              <w:instrText xml:space="preserve"> PAGEREF _Toc236991264 \h </w:instrText>
-            </w:r>
-            <w:r>
-              <w:rPr>
-                <w:noProof/>
-                <w:webHidden/>
-              </w:rPr>
-            </w:r>
-            <w:r>
-              <w:rPr>
-                <w:noProof/>
-                <w:webHidden/>
-              </w:rPr>
-              <w:fldChar w:fldCharType="separate"/>
-            </w:r>
-            <w:r>
-              <w:rPr>
-                <w:noProof/>
-                <w:webHidden/>
-              </w:rPr>
-              <w:t>14</w:t>
-            </w:r>
-            <w:r>
-              <w:rPr>
-                <w:noProof/>
-                <w:webHidden/>
-              </w:rPr>
-              <w:fldChar w:fldCharType="end"/>
-            </w:r>
-          </w:hyperlink>
-        </w:p>
-        <w:p>
-          <w:pPr>
-            <w:pStyle w:val="TOC1"/>
-            <w:tabs>
-              <w:tab w:val="right" w:leader="dot" w:pos="10456"/>
-            </w:tabs>
-            <w:rPr>
-              <w:rFonts w:asciiTheme="minorHAnsi" w:eastAsiaTheme="minorEastAsia" w:hAnsiTheme="minorHAnsi"/>
-              <w:noProof/>
-              <w:kern w:val="2"/>
-              <w:sz w:val="24"/>
-              <w:szCs w:val="24"/>
-              <w:lang w:val="en-NZ" w:eastAsia="en-NZ"/>
-              <w14:ligatures w14:val="standardContextual"/>
-            </w:rPr>
-          </w:pPr>
-          <w:hyperlink w:anchor="_Toc236991265" w:history="1">
-            <w:r>
-              <w:rPr>
-                <w:rStyle w:val="Hyperlink"/>
-                <w:noProof/>
-              </w:rPr>
-              <w:t>2. Undertakings</w:t>
-            </w:r>
-            <w:r>
-              <w:rPr>
-                <w:noProof/>
-                <w:webHidden/>
-              </w:rPr>
-              <w:tab/>
-            </w:r>
-            <w:r>
-              <w:rPr>
-                <w:noProof/>
-                <w:webHidden/>
-              </w:rPr>
-              <w:fldChar w:fldCharType="begin"/>
-            </w:r>
-            <w:r>
-              <w:rPr>
-                <w:noProof/>
-                <w:webHidden/>
-              </w:rPr>
-              <w:instrText xml:space="preserve"> PAGEREF _Toc236991265 \h </w:instrText>
-            </w:r>
-            <w:r>
-              <w:rPr>
-                <w:noProof/>
-                <w:webHidden/>
-              </w:rPr>
-            </w:r>
-            <w:r>
-              <w:rPr>
-                <w:noProof/>
-                <w:webHidden/>
-              </w:rPr>
-              <w:fldChar w:fldCharType="separate"/>
-            </w:r>
-            <w:r>
-              <w:rPr>
-                <w:noProof/>
-                <w:webHidden/>
-              </w:rPr>
-              <w:t>15</w:t>
-            </w:r>
-            <w:r>
-              <w:rPr>
-                <w:noProof/>
-                <w:webHidden/>
-              </w:rPr>
-              <w:fldChar w:fldCharType="end"/>
-            </w:r>
-          </w:hyperlink>
-        </w:p>
-        <w:p>
-          <w:pPr>
-            <w:pStyle w:val="TOC1"/>
-            <w:tabs>
-              <w:tab w:val="left" w:pos="480"/>
-              <w:tab w:val="right" w:leader="dot" w:pos="10456"/>
-            </w:tabs>
-            <w:rPr>
-              <w:rFonts w:asciiTheme="minorHAnsi" w:eastAsiaTheme="minorEastAsia" w:hAnsiTheme="minorHAnsi"/>
-              <w:noProof/>
-              <w:kern w:val="2"/>
-              <w:sz w:val="24"/>
-              <w:szCs w:val="24"/>
-              <w:lang w:val="en-NZ" w:eastAsia="en-NZ"/>
-              <w14:ligatures w14:val="standardContextual"/>
-            </w:rPr>
-          </w:pPr>
-          <w:hyperlink w:anchor="_Toc236991266" w:history="1">
-            <w:r>
-              <w:rPr>
-                <w:rStyle w:val="Hyperlink"/>
-                <w:noProof/>
-              </w:rPr>
-              <w:t xml:space="preserve">3 </w:t>
-            </w:r>
-            <w:r>
-              <w:rPr>
-                <w:rFonts w:asciiTheme="minorHAnsi" w:eastAsiaTheme="minorEastAsia" w:hAnsiTheme="minorHAnsi"/>
-                <w:noProof/>
-                <w:kern w:val="2"/>
-                <w:sz w:val="24"/>
-                <w:szCs w:val="24"/>
-                <w:lang w:val="en-NZ" w:eastAsia="en-NZ"/>
-                <w14:ligatures w14:val="standardContextual"/>
-              </w:rPr>
-              <w:tab/>
-            </w:r>
-            <w:r>
-              <w:rPr>
-                <w:rStyle w:val="Hyperlink"/>
-                <w:noProof/>
-              </w:rPr>
-              <w:t>Copyright, Patents, Trade Marks and other Intellectual Property Rights</w:t>
-            </w:r>
-            <w:r>
-              <w:rPr>
-                <w:noProof/>
-                <w:webHidden/>
-              </w:rPr>
-              <w:tab/>
-            </w:r>
-            <w:r>
-              <w:rPr>
-                <w:noProof/>
-                <w:webHidden/>
-              </w:rPr>
-              <w:fldChar w:fldCharType="begin"/>
-            </w:r>
-            <w:r>
-              <w:rPr>
-                <w:noProof/>
-                <w:webHidden/>
-              </w:rPr>
-              <w:instrText xml:space="preserve"> PAGEREF _Toc236991266 \h </w:instrText>
-            </w:r>
-            <w:r>
-              <w:rPr>
-                <w:noProof/>
-                <w:webHidden/>
-              </w:rPr>
-            </w:r>
-            <w:r>
-              <w:rPr>
-                <w:noProof/>
-                <w:webHidden/>
-              </w:rPr>
-              <w:fldChar w:fldCharType="separate"/>
-            </w:r>
-            <w:r>
-              <w:rPr>
-                <w:noProof/>
-                <w:webHidden/>
-              </w:rPr>
-              <w:t>16</w:t>
-            </w:r>
-            <w:r>
-              <w:rPr>
-                <w:noProof/>
-                <w:webHidden/>
-              </w:rPr>
-              <w:fldChar w:fldCharType="end"/>
-            </w:r>
-          </w:hyperlink>
-        </w:p>
-        <w:p>
-          <w:pPr>
-            <w:pStyle w:val="TOC1"/>
-            <w:tabs>
-              <w:tab w:val="left" w:pos="480"/>
-              <w:tab w:val="right" w:leader="dot" w:pos="10456"/>
-            </w:tabs>
-            <w:rPr>
-              <w:rFonts w:asciiTheme="minorHAnsi" w:eastAsiaTheme="minorEastAsia" w:hAnsiTheme="minorHAnsi"/>
-              <w:noProof/>
-              <w:kern w:val="2"/>
-              <w:sz w:val="24"/>
-              <w:szCs w:val="24"/>
-              <w:lang w:val="en-NZ" w:eastAsia="en-NZ"/>
-              <w14:ligatures w14:val="standardContextual"/>
-            </w:rPr>
-          </w:pPr>
-          <w:hyperlink w:anchor="_Toc236991267" w:history="1">
-            <w:r>
-              <w:rPr>
-                <w:rStyle w:val="Hyperlink"/>
-                <w:noProof/>
-              </w:rPr>
-              <w:t xml:space="preserve">4 </w:t>
-            </w:r>
-            <w:r>
-              <w:rPr>
-                <w:rFonts w:asciiTheme="minorHAnsi" w:eastAsiaTheme="minorEastAsia" w:hAnsiTheme="minorHAnsi"/>
-                <w:noProof/>
-                <w:kern w:val="2"/>
-                <w:sz w:val="24"/>
-                <w:szCs w:val="24"/>
-                <w:lang w:val="en-NZ" w:eastAsia="en-NZ"/>
-                <w14:ligatures w14:val="standardContextual"/>
-              </w:rPr>
-              <w:tab/>
-            </w:r>
-            <w:r>
-              <w:rPr>
-                <w:rStyle w:val="Hyperlink"/>
-                <w:noProof/>
-              </w:rPr>
-              <w:t>Confidential Information</w:t>
-            </w:r>
-            <w:r>
-              <w:rPr>
-                <w:noProof/>
-                <w:webHidden/>
-              </w:rPr>
-              <w:tab/>
-            </w:r>
-            <w:r>
-              <w:rPr>
-                <w:noProof/>
-                <w:webHidden/>
-              </w:rPr>
-              <w:fldChar w:fldCharType="begin"/>
-            </w:r>
-            <w:r>
-              <w:rPr>
-                <w:noProof/>
-                <w:webHidden/>
-              </w:rPr>
-              <w:instrText xml:space="preserve"> PAGEREF _Toc236991267 \h </w:instrText>
-            </w:r>
-            <w:r>
-              <w:rPr>
-                <w:noProof/>
-                <w:webHidden/>
-              </w:rPr>
-            </w:r>
-            <w:r>
-              <w:rPr>
-                <w:noProof/>
-                <w:webHidden/>
-              </w:rPr>
-              <w:fldChar w:fldCharType="separate"/>
-            </w:r>
-            <w:r>
-              <w:rPr>
-                <w:noProof/>
-                <w:webHidden/>
-              </w:rPr>
-              <w:t>16</w:t>
-            </w:r>
-            <w:r>
-              <w:rPr>
-                <w:noProof/>
-                <w:webHidden/>
-              </w:rPr>
-              <w:fldChar w:fldCharType="end"/>
-            </w:r>
-          </w:hyperlink>
-        </w:p>
-        <w:p>
-          <w:pPr>
-            <w:pStyle w:val="TOC1"/>
-            <w:tabs>
-              <w:tab w:val="left" w:pos="480"/>
-              <w:tab w:val="right" w:leader="dot" w:pos="10456"/>
-            </w:tabs>
-            <w:rPr>
-              <w:rFonts w:asciiTheme="minorHAnsi" w:eastAsiaTheme="minorEastAsia" w:hAnsiTheme="minorHAnsi"/>
-              <w:noProof/>
-              <w:kern w:val="2"/>
-              <w:sz w:val="24"/>
-              <w:szCs w:val="24"/>
-              <w:lang w:val="en-NZ" w:eastAsia="en-NZ"/>
-              <w14:ligatures w14:val="standardContextual"/>
-            </w:rPr>
-          </w:pPr>
-          <w:hyperlink w:anchor="_Toc236991268" w:history="1">
-            <w:r>
-              <w:rPr>
-                <w:rStyle w:val="Hyperlink"/>
-                <w:noProof/>
-              </w:rPr>
-              <w:t xml:space="preserve">5 </w:t>
-            </w:r>
-            <w:r>
-              <w:rPr>
-                <w:rFonts w:asciiTheme="minorHAnsi" w:eastAsiaTheme="minorEastAsia" w:hAnsiTheme="minorHAnsi"/>
-                <w:noProof/>
-                <w:kern w:val="2"/>
-                <w:sz w:val="24"/>
-                <w:szCs w:val="24"/>
-                <w:lang w:val="en-NZ" w:eastAsia="en-NZ"/>
-                <w14:ligatures w14:val="standardContextual"/>
-              </w:rPr>
-              <w:tab/>
-            </w:r>
-            <w:r>
-              <w:rPr>
-                <w:rStyle w:val="Hyperlink"/>
-                <w:noProof/>
-              </w:rPr>
-              <w:t>Intellectual Property Rights</w:t>
-            </w:r>
-            <w:r>
-              <w:rPr>
-                <w:noProof/>
-                <w:webHidden/>
-              </w:rPr>
-              <w:tab/>
-            </w:r>
-            <w:r>
-              <w:rPr>
-                <w:noProof/>
-                <w:webHidden/>
-              </w:rPr>
-              <w:fldChar w:fldCharType="begin"/>
-            </w:r>
-            <w:r>
-              <w:rPr>
-                <w:noProof/>
-                <w:webHidden/>
-              </w:rPr>
-              <w:instrText xml:space="preserve"> PAGEREF _Toc236991268 \h </w:instrText>
-            </w:r>
-            <w:r>
-              <w:rPr>
-                <w:noProof/>
-                <w:webHidden/>
-              </w:rPr>
-            </w:r>
-            <w:r>
-              <w:rPr>
-                <w:noProof/>
-                <w:webHidden/>
-              </w:rPr>
-              <w:fldChar w:fldCharType="separate"/>
-            </w:r>
-            <w:r>
-              <w:rPr>
-                <w:noProof/>
-                <w:webHidden/>
-              </w:rPr>
               <w:t>17</w:t>
-            </w:r>
-            <w:r>
-              <w:rPr>
-                <w:noProof/>
-                <w:webHidden/>
-              </w:rPr>
-              <w:fldChar w:fldCharType="end"/>
-            </w:r>
-          </w:hyperlink>
-        </w:p>
-        <w:p>
-          <w:pPr>
-            <w:pStyle w:val="TOC1"/>
-            <w:tabs>
-              <w:tab w:val="left" w:pos="480"/>
-              <w:tab w:val="right" w:leader="dot" w:pos="10456"/>
-            </w:tabs>
-            <w:rPr>
-              <w:rFonts w:asciiTheme="minorHAnsi" w:eastAsiaTheme="minorEastAsia" w:hAnsiTheme="minorHAnsi"/>
-              <w:noProof/>
-              <w:kern w:val="2"/>
-              <w:sz w:val="24"/>
-              <w:szCs w:val="24"/>
-              <w:lang w:val="en-NZ" w:eastAsia="en-NZ"/>
-              <w14:ligatures w14:val="standardContextual"/>
-            </w:rPr>
-          </w:pPr>
-          <w:hyperlink w:anchor="_Toc236991269" w:history="1">
-            <w:r>
-              <w:rPr>
-                <w:rStyle w:val="Hyperlink"/>
-                <w:noProof/>
-              </w:rPr>
-              <w:t xml:space="preserve">6 </w:t>
-            </w:r>
-            <w:r>
-              <w:rPr>
-                <w:rFonts w:asciiTheme="minorHAnsi" w:eastAsiaTheme="minorEastAsia" w:hAnsiTheme="minorHAnsi"/>
-                <w:noProof/>
-                <w:kern w:val="2"/>
-                <w:sz w:val="24"/>
-                <w:szCs w:val="24"/>
-                <w:lang w:val="en-NZ" w:eastAsia="en-NZ"/>
-                <w14:ligatures w14:val="standardContextual"/>
-              </w:rPr>
-              <w:tab/>
-            </w:r>
-            <w:r>
-              <w:rPr>
-                <w:rStyle w:val="Hyperlink"/>
-                <w:noProof/>
-              </w:rPr>
-              <w:t>Signatures</w:t>
-            </w:r>
-            <w:r>
-              <w:rPr>
-                <w:noProof/>
-                <w:webHidden/>
-              </w:rPr>
-              <w:tab/>
-            </w:r>
-            <w:r>
-              <w:rPr>
-                <w:noProof/>
-                <w:webHidden/>
-              </w:rPr>
-              <w:fldChar w:fldCharType="begin"/>
-            </w:r>
-            <w:r>
-              <w:rPr>
-                <w:noProof/>
-                <w:webHidden/>
-              </w:rPr>
-              <w:instrText xml:space="preserve"> PAGEREF _Toc236991269 \h </w:instrText>
-            </w:r>
-            <w:r>
-              <w:rPr>
-                <w:noProof/>
-                <w:webHidden/>
-              </w:rPr>
-            </w:r>
-            <w:r>
-              <w:rPr>
-                <w:noProof/>
-                <w:webHidden/>
-              </w:rPr>
-              <w:fldChar w:fldCharType="separate"/>
-            </w:r>
-            <w:r>
-              <w:rPr>
-                <w:noProof/>
-                <w:webHidden/>
-              </w:rPr>
-              <w:t>18</w:t>
-            </w:r>
-            <w:r>
-              <w:rPr>
-                <w:noProof/>
-                <w:webHidden/>
-              </w:rPr>
-              <w:fldChar w:fldCharType="end"/>
-            </w:r>
-          </w:hyperlink>
-        </w:p>
-        <w:p>
-          <w:pPr>
-            <w:pStyle w:val="TOC2"/>
-            <w:tabs>
-              <w:tab w:val="right" w:leader="dot" w:pos="10456"/>
-            </w:tabs>
-            <w:rPr>
-              <w:rFonts w:asciiTheme="minorHAnsi" w:eastAsiaTheme="minorEastAsia" w:hAnsiTheme="minorHAnsi"/>
-              <w:noProof/>
-              <w:kern w:val="2"/>
-              <w:sz w:val="24"/>
-              <w:szCs w:val="24"/>
-              <w:lang w:val="en-NZ" w:eastAsia="en-NZ"/>
-              <w14:ligatures w14:val="standardContextual"/>
-            </w:rPr>
-          </w:pPr>
-          <w:hyperlink w:anchor="_Toc236991270" w:history="1">
-            <w:r>
-              <w:rPr>
-                <w:rStyle w:val="Hyperlink"/>
-                <w:noProof/>
-              </w:rPr>
-              <w:t>Appendix C</w:t>
-            </w:r>
-            <w:r>
-              <w:rPr>
-                <w:noProof/>
-                <w:webHidden/>
-              </w:rPr>
-              <w:tab/>
-            </w:r>
-            <w:r>
-              <w:rPr>
-                <w:noProof/>
-                <w:webHidden/>
-              </w:rPr>
-              <w:fldChar w:fldCharType="begin"/>
-            </w:r>
-            <w:r>
-              <w:rPr>
-                <w:noProof/>
-                <w:webHidden/>
-              </w:rPr>
-              <w:instrText xml:space="preserve"> PAGEREF _Toc236991270 \h </w:instrText>
-            </w:r>
-            <w:r>
-              <w:rPr>
-                <w:noProof/>
-                <w:webHidden/>
-              </w:rPr>
-            </w:r>
-            <w:r>
-              <w:rPr>
-                <w:noProof/>
-                <w:webHidden/>
-              </w:rPr>
-              <w:fldChar w:fldCharType="separate"/>
-            </w:r>
-            <w:r>
-              <w:rPr>
-                <w:noProof/>
-                <w:webHidden/>
-              </w:rPr>
-              <w:t>19</w:t>
-            </w:r>
-            <w:r>
-              <w:rPr>
-                <w:noProof/>
-                <w:webHidden/>
-              </w:rPr>
-              <w:fldChar w:fldCharType="end"/>
-            </w:r>
-          </w:hyperlink>
-        </w:p>
-        <w:p>
-          <w:pPr>
-            <w:pStyle w:val="TOC2"/>
-            <w:tabs>
-              <w:tab w:val="right" w:leader="dot" w:pos="10456"/>
-            </w:tabs>
-            <w:rPr>
-              <w:rFonts w:asciiTheme="minorHAnsi" w:eastAsiaTheme="minorEastAsia" w:hAnsiTheme="minorHAnsi"/>
-              <w:noProof/>
-              <w:kern w:val="2"/>
-              <w:sz w:val="24"/>
-              <w:szCs w:val="24"/>
-              <w:lang w:val="en-NZ" w:eastAsia="en-NZ"/>
-              <w14:ligatures w14:val="standardContextual"/>
-            </w:rPr>
-          </w:pPr>
-          <w:hyperlink w:anchor="_Toc236991271" w:history="1">
-            <w:r>
-              <w:rPr>
-                <w:rStyle w:val="Hyperlink"/>
-                <w:noProof/>
-              </w:rPr>
-              <w:t>Appendix D</w:t>
-            </w:r>
-            <w:r>
-              <w:rPr>
-                <w:noProof/>
-                <w:webHidden/>
-              </w:rPr>
-              <w:tab/>
-            </w:r>
-            <w:r>
-              <w:rPr>
-                <w:noProof/>
-                <w:webHidden/>
-              </w:rPr>
-              <w:fldChar w:fldCharType="begin"/>
-            </w:r>
-            <w:r>
-              <w:rPr>
-                <w:noProof/>
-                <w:webHidden/>
-              </w:rPr>
-              <w:instrText xml:space="preserve"> PAGEREF _Toc236991271 \h </w:instrText>
-            </w:r>
-            <w:r>
-              <w:rPr>
-                <w:noProof/>
-                <w:webHidden/>
-              </w:rPr>
-            </w:r>
-            <w:r>
-              <w:rPr>
-                <w:noProof/>
-                <w:webHidden/>
-              </w:rPr>
-              <w:fldChar w:fldCharType="separate"/>
-            </w:r>
-            <w:r>
-              <w:rPr>
-                <w:noProof/>
-                <w:webHidden/>
-              </w:rPr>
-              <w:t>19</w:t>
             </w:r>
             <w:r>
               <w:rPr>
@@ -6133,13 +6473,11 @@
     </w:sdt>
     <w:p/>
     <w:p/>
-    <w:p/>
-    <w:p/>
     <w:p>
       <w:pPr>
         <w:pStyle w:val="Heading1"/>
       </w:pPr>
-      <w:bookmarkStart w:id="0" w:name="_Toc236991241"/>
+      <w:bookmarkStart w:id="0" w:name="_Toc236998454"/>
       <w:r>
         <w:lastRenderedPageBreak/>
         <w:t>Project Objective</w:t>
@@ -6150,7 +6488,7 @@
       <w:pPr>
         <w:pStyle w:val="Heading2"/>
       </w:pPr>
-      <w:bookmarkStart w:id="1" w:name="_Toc236991242"/>
+      <w:bookmarkStart w:id="1" w:name="_Toc236998455"/>
       <w:r>
         <w:t>Client background</w:t>
       </w:r>
@@ -6219,10 +6557,18 @@
         <w:pStyle w:val="TNR"/>
       </w:pPr>
       <w:r>
-        <w:t xml:space="preserve">The key problem they would like solved is the comparison of traditional forensic tools to AI versions of forensic tools so that we may develop an analysis of whether or not AI is a worthwhile venture for forensics or if it uses an unreasonable </w:t>
+        <w:t xml:space="preserve">The key problem they would like solved is the comparison of traditional forensic tools to AI versions of forensic tools so that we may develop an analysis of </w:t>
       </w:r>
       <w:proofErr w:type="gramStart"/>
       <w:r>
+        <w:t>whether or not</w:t>
+      </w:r>
+      <w:proofErr w:type="gramEnd"/>
+      <w:r>
+        <w:t xml:space="preserve"> AI is a worthwhile venture for forensics or if it uses an unreasonable </w:t>
+      </w:r>
+      <w:proofErr w:type="gramStart"/>
+      <w:r>
         <w:t>amount</w:t>
       </w:r>
       <w:proofErr w:type="gramEnd"/>
@@ -6234,7 +6580,7 @@
       <w:pPr>
         <w:pStyle w:val="Heading2"/>
       </w:pPr>
-      <w:bookmarkStart w:id="2" w:name="_Toc236991243"/>
+      <w:bookmarkStart w:id="2" w:name="_Toc236998456"/>
       <w:r>
         <w:t>Deliverables</w:t>
       </w:r>
@@ -6252,7 +6598,7 @@
       <w:pPr>
         <w:pStyle w:val="Heading2"/>
       </w:pPr>
-      <w:bookmarkStart w:id="3" w:name="_Toc236991244"/>
+      <w:bookmarkStart w:id="3" w:name="_Toc236998457"/>
       <w:r>
         <w:t>Must haves</w:t>
       </w:r>
@@ -6270,7 +6616,7 @@
       <w:pPr>
         <w:pStyle w:val="Heading2"/>
       </w:pPr>
-      <w:bookmarkStart w:id="4" w:name="_Toc236991245"/>
+      <w:bookmarkStart w:id="4" w:name="_Toc236998458"/>
       <w:r>
         <w:t>Nice to haves</w:t>
       </w:r>
@@ -6327,57 +6673,9 @@
     <w:p>
       <w:pPr>
         <w:pStyle w:val="TNR"/>
-        <w:rPr>
-          <w:color w:val="EE0000"/>
-        </w:rPr>
-      </w:pPr>
-      <w:r>
-        <w:rPr>
-          <w:color w:val="EE0000"/>
-        </w:rPr>
-        <w:t xml:space="preserve">As </w:t>
-      </w:r>
-      <w:r>
-        <w:rPr>
-          <w:color w:val="EE0000"/>
-        </w:rPr>
-        <w:t xml:space="preserve">Digital forensics is often categorised within incident response, we </w:t>
-      </w:r>
-      <w:r>
-        <w:rPr>
-          <w:color w:val="EE0000"/>
-        </w:rPr>
-        <w:t xml:space="preserve">may touch upon </w:t>
-      </w:r>
-      <w:r>
-        <w:rPr>
-          <w:color w:val="EE0000"/>
-        </w:rPr>
-        <w:t xml:space="preserve">evidence collection aspects, but will not </w:t>
-      </w:r>
-      <w:r>
-        <w:rPr>
-          <w:color w:val="EE0000"/>
-        </w:rPr>
-        <w:t xml:space="preserve">be addressing any </w:t>
-      </w:r>
-      <w:r>
-        <w:rPr>
-          <w:color w:val="EE0000"/>
-        </w:rPr>
-        <w:t>time-sensitive aspects of incident response</w:t>
-      </w:r>
-      <w:r>
-        <w:rPr>
-          <w:color w:val="EE0000"/>
-        </w:rPr>
-        <w:t xml:space="preserve">, as we are not </w:t>
-      </w:r>
-      <w:r>
-        <w:rPr>
-          <w:color w:val="EE0000"/>
-        </w:rPr>
-        <w:t xml:space="preserve">responding to any incident nor are performing forensics for any third party besides our client, Geoff Gordon. </w:t>
+      </w:pPr>
+      <w:r>
+        <w:t>We are not interested in our model’s abilities to generate reports, or come to conclusions based on our evidence, our investigation into the efficacy of these tools is in their empirical capacity. Essentially their usefulness to an examiner as opposed to an investigator.</w:t>
       </w:r>
     </w:p>
     <w:p>
@@ -6389,7 +6687,7 @@
       <w:pPr>
         <w:pStyle w:val="Heading2"/>
       </w:pPr>
-      <w:bookmarkStart w:id="5" w:name="_Toc236991246"/>
+      <w:bookmarkStart w:id="5" w:name="_Toc236998459"/>
       <w:r>
         <w:lastRenderedPageBreak/>
         <w:t>Scope</w:t>
@@ -6600,7 +6898,7 @@
       <w:pPr>
         <w:pStyle w:val="Heading1"/>
       </w:pPr>
-      <w:bookmarkStart w:id="6" w:name="_Toc236991247"/>
+      <w:bookmarkStart w:id="6" w:name="_Toc236998460"/>
       <w:r>
         <w:lastRenderedPageBreak/>
         <w:t>Project Plan</w:t>
@@ -6611,7 +6909,7 @@
       <w:pPr>
         <w:pStyle w:val="Heading2"/>
       </w:pPr>
-      <w:bookmarkStart w:id="7" w:name="_Toc236991248"/>
+      <w:bookmarkStart w:id="7" w:name="_Toc236998461"/>
       <w:r>
         <w:t>Methodology</w:t>
       </w:r>
@@ -6621,9 +6919,11 @@
       <w:pPr>
         <w:pStyle w:val="Heading3"/>
       </w:pPr>
+      <w:bookmarkStart w:id="8" w:name="_Toc236998462"/>
       <w:r>
         <w:t>Kanban</w:t>
       </w:r>
+      <w:bookmarkEnd w:id="8"/>
     </w:p>
     <w:p>
       <w:pPr>
@@ -6670,9 +6970,11 @@
       <w:pPr>
         <w:pStyle w:val="Heading3"/>
       </w:pPr>
+      <w:bookmarkStart w:id="9" w:name="_Toc236998463"/>
       <w:r>
         <w:t>NIST CTFF</w:t>
       </w:r>
+      <w:bookmarkEnd w:id="9"/>
     </w:p>
     <w:p>
       <w:pPr>
@@ -6682,13 +6984,7 @@
         <w:t xml:space="preserve">The Testing Methodology that we have selected is the Computer Forensic Tool Testing </w:t>
       </w:r>
       <w:r>
-        <w:t>(</w:t>
-      </w:r>
-      <w:r>
-        <w:t>CFTT</w:t>
-      </w:r>
-      <w:r>
-        <w:t>) p</w:t>
+        <w:t>(CFTT) p</w:t>
       </w:r>
       <w:r>
         <w:t xml:space="preserve">rocess by </w:t>
@@ -6856,11 +7152,11 @@
       <w:pPr>
         <w:pStyle w:val="Heading2"/>
       </w:pPr>
-      <w:bookmarkStart w:id="8" w:name="_Toc236991250"/>
+      <w:bookmarkStart w:id="10" w:name="_Toc236998464"/>
       <w:r>
         <w:t>Technologies</w:t>
       </w:r>
-      <w:bookmarkEnd w:id="8"/>
+      <w:bookmarkEnd w:id="10"/>
     </w:p>
     <w:p>
       <w:pPr>
@@ -6937,11 +7233,11 @@
       <w:pPr>
         <w:pStyle w:val="Heading2"/>
       </w:pPr>
-      <w:bookmarkStart w:id="9" w:name="_Toc236991251"/>
+      <w:bookmarkStart w:id="11" w:name="_Toc236998465"/>
       <w:r>
         <w:t>Project budget</w:t>
       </w:r>
-      <w:bookmarkEnd w:id="9"/>
+      <w:bookmarkEnd w:id="11"/>
     </w:p>
     <w:p>
       <w:pPr>
@@ -6987,62 +7283,62 @@
       <w:pPr>
         <w:pStyle w:val="Heading1"/>
       </w:pPr>
-      <w:bookmarkStart w:id="10" w:name="_Toc236665775"/>
-      <w:bookmarkStart w:id="11" w:name="_Toc236991252"/>
+      <w:bookmarkStart w:id="12" w:name="_Toc236665775"/>
+      <w:bookmarkStart w:id="13" w:name="_Toc236998466"/>
       <w:r>
         <w:lastRenderedPageBreak/>
         <w:t>Project Personnel</w:t>
       </w:r>
-      <w:bookmarkEnd w:id="10"/>
-      <w:bookmarkEnd w:id="11"/>
-    </w:p>
-    <w:p>
-      <w:pPr>
-        <w:pStyle w:val="Heading2"/>
-      </w:pPr>
-      <w:bookmarkStart w:id="12" w:name="_Toc236665776"/>
-      <w:bookmarkStart w:id="13" w:name="_Toc236991253"/>
-      <w:r>
-        <w:t>Client details including organisation</w:t>
-      </w:r>
       <w:bookmarkEnd w:id="12"/>
       <w:bookmarkEnd w:id="13"/>
     </w:p>
     <w:p>
       <w:pPr>
-        <w:pStyle w:val="TNR"/>
-      </w:pPr>
-      <w:r>
-        <w:t xml:space="preserve">Geoff Gordon is a staff member of </w:t>
-      </w:r>
-      <w:proofErr w:type="spellStart"/>
-      <w:r>
-        <w:t>WelTec</w:t>
-      </w:r>
-      <w:proofErr w:type="spellEnd"/>
-      <w:r>
-        <w:t>, he provides technical networking expertise in the context of the tertiary environment. He has familiarity, curiosity and deep interest in AI models and their behaviour, as well as their associated hardware/platforms. He is interested in whether AI is has a place in the field of digital forensics.</w:t>
-      </w:r>
-    </w:p>
-    <w:p>
-      <w:pPr>
-        <w:pStyle w:val="TNR"/>
-      </w:pPr>
-      <w:r>
-        <w:t xml:space="preserve">Geoff has been the client on multiple previous capstone IT projects with a focus on AI. One example is an AI chatbot for IT support at the school. </w:t>
-      </w:r>
-    </w:p>
-    <w:p>
-      <w:pPr>
         <w:pStyle w:val="Heading2"/>
       </w:pPr>
-      <w:bookmarkStart w:id="14" w:name="_Toc236665777"/>
-      <w:bookmarkStart w:id="15" w:name="_Toc236991254"/>
-      <w:r>
-        <w:t>Group Members</w:t>
+      <w:bookmarkStart w:id="14" w:name="_Toc236665776"/>
+      <w:bookmarkStart w:id="15" w:name="_Toc236998467"/>
+      <w:r>
+        <w:t>Client details including organisation</w:t>
       </w:r>
       <w:bookmarkEnd w:id="14"/>
       <w:bookmarkEnd w:id="15"/>
+    </w:p>
+    <w:p>
+      <w:pPr>
+        <w:pStyle w:val="TNR"/>
+      </w:pPr>
+      <w:r>
+        <w:t xml:space="preserve">Geoff Gordon is a staff member of </w:t>
+      </w:r>
+      <w:proofErr w:type="spellStart"/>
+      <w:r>
+        <w:t>WelTec</w:t>
+      </w:r>
+      <w:proofErr w:type="spellEnd"/>
+      <w:r>
+        <w:t>, he provides technical networking expertise in the context of the tertiary environment. He has familiarity, curiosity and deep interest in AI models and their behaviour, as well as their associated hardware/platforms. He is interested in whether AI is has a place in the field of digital forensics.</w:t>
+      </w:r>
+    </w:p>
+    <w:p>
+      <w:pPr>
+        <w:pStyle w:val="TNR"/>
+      </w:pPr>
+      <w:r>
+        <w:t xml:space="preserve">Geoff has been the client on multiple previous capstone IT projects with a focus on AI. One example is an AI chatbot for IT support at the school. </w:t>
+      </w:r>
+    </w:p>
+    <w:p>
+      <w:pPr>
+        <w:pStyle w:val="Heading2"/>
+      </w:pPr>
+      <w:bookmarkStart w:id="16" w:name="_Toc236665777"/>
+      <w:bookmarkStart w:id="17" w:name="_Toc236998468"/>
+      <w:r>
+        <w:t>Group Members</w:t>
+      </w:r>
+      <w:bookmarkEnd w:id="16"/>
+      <w:bookmarkEnd w:id="17"/>
     </w:p>
     <w:tbl>
       <w:tblPr>
@@ -7272,13 +7568,13 @@
       <w:pPr>
         <w:pStyle w:val="Heading2"/>
       </w:pPr>
-      <w:bookmarkStart w:id="16" w:name="_Toc236665778"/>
-      <w:bookmarkStart w:id="17" w:name="_Toc236991255"/>
+      <w:bookmarkStart w:id="18" w:name="_Toc236665778"/>
+      <w:bookmarkStart w:id="19" w:name="_Toc236998469"/>
       <w:r>
         <w:t>Project Advisor</w:t>
       </w:r>
-      <w:bookmarkEnd w:id="16"/>
-      <w:bookmarkEnd w:id="17"/>
+      <w:bookmarkEnd w:id="18"/>
+      <w:bookmarkEnd w:id="19"/>
     </w:p>
     <w:p>
       <w:pPr>
@@ -7292,11 +7588,13 @@
       <w:pPr>
         <w:pStyle w:val="Heading3"/>
       </w:pPr>
-      <w:bookmarkStart w:id="18" w:name="_Toc236665779"/>
+      <w:bookmarkStart w:id="20" w:name="_Toc236665779"/>
+      <w:bookmarkStart w:id="21" w:name="_Toc236998470"/>
       <w:r>
         <w:t>Communication plan</w:t>
       </w:r>
-      <w:bookmarkEnd w:id="18"/>
+      <w:bookmarkEnd w:id="20"/>
+      <w:bookmarkEnd w:id="21"/>
     </w:p>
     <w:tbl>
       <w:tblPr>
@@ -7644,16 +7942,16 @@
       <w:pPr>
         <w:pStyle w:val="Heading2"/>
       </w:pPr>
-      <w:bookmarkStart w:id="19" w:name="_Toc236665780"/>
-      <w:bookmarkStart w:id="20" w:name="_Toc236991256"/>
+      <w:bookmarkStart w:id="22" w:name="_Toc236665780"/>
+      <w:bookmarkStart w:id="23" w:name="_Toc236998471"/>
       <w:r>
         <w:t xml:space="preserve">General </w:t>
       </w:r>
       <w:r>
         <w:t>Conflict of Interest statement</w:t>
       </w:r>
-      <w:bookmarkEnd w:id="19"/>
-      <w:bookmarkEnd w:id="20"/>
+      <w:bookmarkEnd w:id="22"/>
+      <w:bookmarkEnd w:id="23"/>
     </w:p>
     <w:p>
       <w:pPr>
@@ -7699,13 +7997,13 @@
       <w:pPr>
         <w:pStyle w:val="Heading2"/>
       </w:pPr>
-      <w:bookmarkStart w:id="21" w:name="_Toc236665781"/>
-      <w:bookmarkStart w:id="22" w:name="_Toc236991257"/>
+      <w:bookmarkStart w:id="24" w:name="_Toc236665781"/>
+      <w:bookmarkStart w:id="25" w:name="_Toc236998472"/>
       <w:r>
         <w:t>RACI assessment matrix</w:t>
       </w:r>
-      <w:bookmarkEnd w:id="21"/>
-      <w:bookmarkEnd w:id="22"/>
+      <w:bookmarkEnd w:id="24"/>
+      <w:bookmarkEnd w:id="25"/>
     </w:p>
     <w:p>
       <w:pPr>
@@ -8723,7 +9021,7 @@
       <w:pPr>
         <w:pStyle w:val="Heading1"/>
       </w:pPr>
-      <w:bookmarkStart w:id="23" w:name="_Toc236991258"/>
+      <w:bookmarkStart w:id="26" w:name="_Toc236998473"/>
       <w:r>
         <w:lastRenderedPageBreak/>
         <w:t>P</w:t>
@@ -8731,7 +9029,7 @@
       <w:r>
         <w:t>roject timeline and milestones</w:t>
       </w:r>
-      <w:bookmarkEnd w:id="23"/>
+      <w:bookmarkEnd w:id="26"/>
     </w:p>
     <w:p>
       <w:pPr>
@@ -8983,11 +9281,11 @@
       <w:pPr>
         <w:pStyle w:val="Heading1"/>
       </w:pPr>
-      <w:bookmarkStart w:id="24" w:name="_Toc236991259"/>
+      <w:bookmarkStart w:id="27" w:name="_Toc236998474"/>
       <w:r>
         <w:t>Project Risk Analysis</w:t>
       </w:r>
-      <w:bookmarkEnd w:id="24"/>
+      <w:bookmarkEnd w:id="27"/>
     </w:p>
     <w:tbl>
       <w:tblPr>
@@ -10799,11 +11097,11 @@
     <w:p/>
     <w:p/>
     <w:p/>
-    <w:bookmarkStart w:id="25" w:name="_Toc236991260" w:displacedByCustomXml="next"/>
+    <w:bookmarkStart w:id="28" w:name="_Toc236998475" w:displacedByCustomXml="next"/>
     <w:sdt>
       <w:sdtPr>
         <w:rPr>
-          <w:rFonts w:eastAsiaTheme="minorHAnsi" w:cstheme="minorBidi"/>
+          <w:rFonts w:ascii="Times New Roman" w:eastAsiaTheme="minorHAnsi" w:hAnsi="Times New Roman" w:cstheme="minorBidi"/>
           <w:b w:val="0"/>
           <w:bCs w:val="0"/>
           <w:kern w:val="0"/>
@@ -10821,7 +11119,6 @@
       </w:sdtPr>
       <w:sdtEndPr>
         <w:rPr>
-          <w:rFonts w:ascii="Times New Roman" w:hAnsi="Times New Roman"/>
           <w:sz w:val="24"/>
           <w:lang w:val="en-NZ"/>
         </w:rPr>
@@ -10834,14 +11131,13 @@
           <w:r>
             <w:t>References</w:t>
           </w:r>
-          <w:bookmarkEnd w:id="25"/>
+          <w:bookmarkEnd w:id="28"/>
         </w:p>
         <w:sdt>
           <w:sdtPr>
             <w:id w:val="-573587230"/>
             <w:bibliography/>
           </w:sdtPr>
-          <w:sdtEndPr/>
           <w:sdtContent>
             <w:p>
               <w:pPr>
@@ -11105,22 +11401,22 @@
       <w:pPr>
         <w:pStyle w:val="Heading1"/>
       </w:pPr>
-      <w:bookmarkStart w:id="26" w:name="_Toc236991261"/>
+      <w:bookmarkStart w:id="29" w:name="_Toc236998476"/>
       <w:r>
         <w:lastRenderedPageBreak/>
         <w:t>Appendices</w:t>
       </w:r>
-      <w:bookmarkEnd w:id="26"/>
+      <w:bookmarkEnd w:id="29"/>
     </w:p>
     <w:p>
       <w:pPr>
         <w:pStyle w:val="Heading2"/>
       </w:pPr>
-      <w:bookmarkStart w:id="27" w:name="_Toc236991262"/>
+      <w:bookmarkStart w:id="30" w:name="_Toc236998477"/>
       <w:r>
         <w:t>Appendix A</w:t>
       </w:r>
-      <w:bookmarkEnd w:id="27"/>
+      <w:bookmarkEnd w:id="30"/>
     </w:p>
     <w:p>
       <w:pPr>
@@ -11155,7 +11451,7 @@
                     <pic:cNvPicPr/>
                   </pic:nvPicPr>
                   <pic:blipFill>
-                    <a:blip r:embed="rId9"/>
+                    <a:blip r:embed="rId10"/>
                     <a:stretch>
                       <a:fillRect/>
                     </a:stretch>
@@ -11352,11 +11648,11 @@
       <w:pPr>
         <w:pStyle w:val="Heading2"/>
       </w:pPr>
-      <w:bookmarkStart w:id="28" w:name="_Toc236991263"/>
+      <w:bookmarkStart w:id="31" w:name="_Toc236998478"/>
       <w:r>
         <w:t>Appendix B</w:t>
       </w:r>
-      <w:bookmarkEnd w:id="28"/>
+      <w:bookmarkEnd w:id="31"/>
     </w:p>
     <w:p>
       <w:pPr>
@@ -11513,11 +11809,11 @@
         <w:pStyle w:val="Heading1"/>
         <w:ind w:left="279"/>
       </w:pPr>
-      <w:bookmarkStart w:id="29" w:name="_Toc236991264"/>
+      <w:bookmarkStart w:id="32" w:name="_Toc236998479"/>
       <w:r>
         <w:t>The Parties</w:t>
       </w:r>
-      <w:bookmarkEnd w:id="29"/>
+      <w:bookmarkEnd w:id="32"/>
       <w:r>
         <w:t xml:space="preserve"> </w:t>
       </w:r>
@@ -11784,12 +12080,12 @@
         <w:pStyle w:val="Heading1"/>
         <w:ind w:left="279"/>
       </w:pPr>
-      <w:bookmarkStart w:id="30" w:name="_Toc236991265"/>
+      <w:bookmarkStart w:id="33" w:name="_Toc236998480"/>
       <w:r>
         <w:lastRenderedPageBreak/>
         <w:t>2. Undertakings</w:t>
       </w:r>
-      <w:bookmarkEnd w:id="30"/>
+      <w:bookmarkEnd w:id="33"/>
       <w:r>
         <w:t xml:space="preserve"> </w:t>
       </w:r>
@@ -11894,7 +12190,7 @@
           <w:tab w:val="center" w:pos="4390"/>
         </w:tabs>
       </w:pPr>
-      <w:bookmarkStart w:id="31" w:name="_Toc236991266"/>
+      <w:bookmarkStart w:id="34" w:name="_Toc236998481"/>
       <w:r>
         <w:t xml:space="preserve">3 </w:t>
       </w:r>
@@ -11910,7 +12206,7 @@
       <w:r>
         <w:t xml:space="preserve"> and other Intellectual Property Rights</w:t>
       </w:r>
-      <w:bookmarkEnd w:id="31"/>
+      <w:bookmarkEnd w:id="34"/>
       <w:r>
         <w:t xml:space="preserve"> </w:t>
       </w:r>
@@ -11931,7 +12227,7 @@
           <w:tab w:val="center" w:pos="1980"/>
         </w:tabs>
       </w:pPr>
-      <w:bookmarkStart w:id="32" w:name="_Toc236991267"/>
+      <w:bookmarkStart w:id="35" w:name="_Toc236998482"/>
       <w:r>
         <w:t xml:space="preserve">4 </w:t>
       </w:r>
@@ -11939,7 +12235,7 @@
         <w:tab/>
         <w:t>Confidential Information</w:t>
       </w:r>
-      <w:bookmarkEnd w:id="32"/>
+      <w:bookmarkEnd w:id="35"/>
       <w:r>
         <w:t xml:space="preserve"> </w:t>
       </w:r>
@@ -12080,7 +12376,7 @@
           <w:tab w:val="center" w:pos="2141"/>
         </w:tabs>
       </w:pPr>
-      <w:bookmarkStart w:id="33" w:name="_Toc236991268"/>
+      <w:bookmarkStart w:id="36" w:name="_Toc236998483"/>
       <w:r>
         <w:lastRenderedPageBreak/>
         <w:t xml:space="preserve">5 </w:t>
@@ -12089,7 +12385,7 @@
         <w:tab/>
         <w:t>Intellectual Property Rights</w:t>
       </w:r>
-      <w:bookmarkEnd w:id="33"/>
+      <w:bookmarkEnd w:id="36"/>
       <w:r>
         <w:t xml:space="preserve"> </w:t>
       </w:r>
@@ -12099,7 +12395,15 @@
         <w:ind w:left="696" w:hanging="427"/>
       </w:pPr>
       <w:r>
-        <w:t xml:space="preserve">5.1 The parties agree that both the Faculty and the Student(s) may use the intellectual property rights that are created as a result of the Project work undertaken by each Student for the Organisation for portfolio purposes to promote the </w:t>
+        <w:t xml:space="preserve">5.1 The parties agree that both the Faculty and the Student(s) may use the intellectual property rights that are created </w:t>
+      </w:r>
+      <w:proofErr w:type="gramStart"/>
+      <w:r>
+        <w:t>as a result of</w:t>
+      </w:r>
+      <w:proofErr w:type="gramEnd"/>
+      <w:r>
+        <w:t xml:space="preserve"> the Project work undertaken by each Student for the Organisation for portfolio purposes to promote the </w:t>
       </w:r>
       <w:proofErr w:type="gramStart"/>
       <w:r>
@@ -12176,7 +12480,7 @@
                     </pic:cNvPicPr>
                   </pic:nvPicPr>
                   <pic:blipFill>
-                    <a:blip r:embed="rId10" cstate="print">
+                    <a:blip r:embed="rId11" cstate="print">
                       <a:extLst>
                         <a:ext uri="{28A0092B-C50C-407E-A947-70E740481C1C}">
                           <a14:useLocalDpi xmlns:a14="http://schemas.microsoft.com/office/drawing/2010/main" val="0"/>
@@ -12401,7 +12705,7 @@
           <w:tab w:val="center" w:pos="1633"/>
         </w:tabs>
       </w:pPr>
-      <w:bookmarkStart w:id="34" w:name="_Toc236991269"/>
+      <w:bookmarkStart w:id="37" w:name="_Toc236998484"/>
       <w:r>
         <w:t xml:space="preserve">6 </w:t>
       </w:r>
@@ -12409,7 +12713,7 @@
         <w:tab/>
         <w:t>Signatures</w:t>
       </w:r>
-      <w:bookmarkEnd w:id="34"/>
+      <w:bookmarkEnd w:id="37"/>
       <w:r>
         <w:t xml:space="preserve"> </w:t>
       </w:r>
@@ -13290,12 +13594,12 @@
       <w:pPr>
         <w:pStyle w:val="Heading2"/>
       </w:pPr>
-      <w:bookmarkStart w:id="35" w:name="_Toc236991270"/>
+      <w:bookmarkStart w:id="38" w:name="_Toc236998485"/>
       <w:r>
         <w:lastRenderedPageBreak/>
         <w:t>Appendix C</w:t>
       </w:r>
-      <w:bookmarkEnd w:id="35"/>
+      <w:bookmarkEnd w:id="38"/>
     </w:p>
     <w:p>
       <w:pPr>
@@ -13315,11 +13619,11 @@
       <w:pPr>
         <w:pStyle w:val="Heading2"/>
       </w:pPr>
-      <w:bookmarkStart w:id="36" w:name="_Toc236991271"/>
+      <w:bookmarkStart w:id="39" w:name="_Toc236998486"/>
       <w:r>
         <w:t>Appendix D</w:t>
       </w:r>
-      <w:bookmarkEnd w:id="36"/>
+      <w:bookmarkEnd w:id="39"/>
     </w:p>
     <w:p>
       <w:pPr>
@@ -13385,7 +13689,7 @@
       </w:pPr>
     </w:p>
     <w:sectPr>
-      <w:footerReference w:type="default" r:id="rId11"/>
+      <w:footerReference w:type="default" r:id="rId12"/>
       <w:pgSz w:w="11906" w:h="16838"/>
       <w:pgMar w:top="720" w:right="720" w:bottom="720" w:left="720" w:header="708" w:footer="708" w:gutter="0"/>
       <w:pgNumType w:start="0"/>
@@ -13432,7 +13736,6 @@
         <w:docPartUnique/>
       </w:docPartObj>
     </w:sdtPr>
-    <w:sdtEndPr/>
     <w:sdtContent>
       <w:p>
         <w:pPr>
@@ -15201,7 +15504,6 @@
   <w:style w:type="character" w:default="1" w:styleId="DefaultParagraphFont">
     <w:name w:val="Default Paragraph Font"/>
     <w:uiPriority w:val="1"/>
-    <w:semiHidden/>
     <w:unhideWhenUsed/>
   </w:style>
   <w:style w:type="table" w:default="1" w:styleId="TableNormal">
@@ -15821,6 +16123,19 @@
       <w:u w:val="single"/>
     </w:rPr>
   </w:style>
+  <w:style w:type="paragraph" w:styleId="TOC3">
+    <w:name w:val="toc 3"/>
+    <w:basedOn w:val="Normal"/>
+    <w:next w:val="Normal"/>
+    <w:autoRedefine/>
+    <w:uiPriority w:val="39"/>
+    <w:unhideWhenUsed/>
+    <w:rsid w:val="001A6F0F"/>
+    <w:pPr>
+      <w:spacing w:after="100"/>
+      <w:ind w:left="440"/>
+    </w:pPr>
+  </w:style>
 </w:styles>
 </file>
 

</xml_diff>